<commit_message>
Expand leg notation in Word subscripts and superscripts
</commit_message>
<xml_diff>
--- a/Article.docx
+++ b/Article.docx
@@ -1517,7 +1517,7 @@
                 <w:b w:val="0"/>
                 <w:i w:val="0"/>
               </w:rPr>
-              <m:t>l</m:t>
+              <m:t>leg</m:t>
             </m:r>
           </m:e>
           <m:sub>
@@ -1809,7 +1809,7 @@
                 <w:b w:val="0"/>
                 <w:i w:val="0"/>
               </w:rPr>
-              <m:t>l</m:t>
+              <m:t>leg</m:t>
             </m:r>
           </m:sub>
         </m:sSub>
@@ -1862,7 +1862,7 @@
                 <w:b w:val="0"/>
                 <w:i w:val="0"/>
               </w:rPr>
-              <m:t>l</m:t>
+              <m:t>leg</m:t>
             </m:r>
             <m:r>
               <m:rPr>
@@ -1923,7 +1923,7 @@
                 <w:b w:val="0"/>
                 <w:i w:val="0"/>
               </w:rPr>
-              <m:t>l</m:t>
+              <m:t>leg</m:t>
             </m:r>
             <m:r>
               <m:rPr>
@@ -2114,7 +2114,7 @@
                 <w:b w:val="0"/>
                 <w:i w:val="0"/>
               </w:rPr>
-              <m:t>l</m:t>
+              <m:t>leg</m:t>
             </m:r>
           </m:sup>
         </m:sSubSup>
@@ -2807,7 +2807,7 @@
                       <w:b w:val="0"/>
                       <w:i w:val="0"/>
                     </w:rPr>
-                    <m:t>l</m:t>
+                    <m:t>leg</m:t>
                   </m:r>
                   <m:r>
                     <m:rPr>
@@ -2868,7 +2868,7 @@
                       <w:b w:val="0"/>
                       <w:i w:val="0"/>
                     </w:rPr>
-                    <m:t>l</m:t>
+                    <m:t>leg</m:t>
                   </m:r>
                   <m:r>
                     <m:rPr>
@@ -3034,7 +3034,7 @@
                       <w:b w:val="0"/>
                       <w:i w:val="0"/>
                     </w:rPr>
-                    <m:t>l</m:t>
+                    <m:t>leg</m:t>
                   </m:r>
                 </m:sub>
               </m:sSub>
@@ -3578,7 +3578,7 @@
                             <w:b w:val="0"/>
                             <w:i w:val="0"/>
                           </w:rPr>
-                          <m:t>l</m:t>
+                          <m:t>leg</m:t>
                         </m:r>
                         <m:r>
                           <m:rPr>
@@ -3687,7 +3687,7 @@
                             <w:b w:val="0"/>
                             <w:i w:val="0"/>
                           </w:rPr>
-                          <m:t>l</m:t>
+                          <m:t>leg</m:t>
                         </m:r>
                         <m:r>
                           <m:rPr>
@@ -3748,7 +3748,7 @@
                             <w:b w:val="0"/>
                             <w:i w:val="0"/>
                           </w:rPr>
-                          <m:t>l</m:t>
+                          <m:t>leg</m:t>
                         </m:r>
                         <m:r>
                           <m:rPr>
@@ -3912,7 +3912,7 @@
                             <w:b w:val="0"/>
                             <w:i w:val="0"/>
                           </w:rPr>
-                          <m:t>l</m:t>
+                          <m:t>leg</m:t>
                         </m:r>
                         <m:r>
                           <m:rPr>
@@ -4021,7 +4021,7 @@
                             <w:b w:val="0"/>
                             <w:i w:val="0"/>
                           </w:rPr>
-                          <m:t>l</m:t>
+                          <m:t>leg</m:t>
                         </m:r>
                         <m:r>
                           <m:rPr>
@@ -4082,7 +4082,7 @@
                             <w:b w:val="0"/>
                             <w:i w:val="0"/>
                           </w:rPr>
-                          <m:t>l</m:t>
+                          <m:t>leg</m:t>
                         </m:r>
                         <m:r>
                           <m:rPr>
@@ -4265,7 +4265,7 @@
                             <w:b w:val="0"/>
                             <w:i w:val="0"/>
                           </w:rPr>
-                          <m:t>l</m:t>
+                          <m:t>leg</m:t>
                         </m:r>
                       </m:sub>
                     </m:sSub>
@@ -4415,7 +4415,7 @@
                             <w:b w:val="0"/>
                             <w:i w:val="0"/>
                           </w:rPr>
-                          <m:t>l</m:t>
+                          <m:t>leg</m:t>
                         </m:r>
                       </m:sub>
                     </m:sSub>
@@ -4563,7 +4563,7 @@
                                 <w:b w:val="0"/>
                                 <w:i w:val="0"/>
                               </w:rPr>
-                              <m:t>l</m:t>
+                              <m:t>leg</m:t>
                             </m:r>
                           </m:sub>
                           <m:sup>
@@ -4632,7 +4632,7 @@
                                 <w:b w:val="0"/>
                                 <w:i w:val="0"/>
                               </w:rPr>
-                              <m:t>l</m:t>
+                              <m:t>leg</m:t>
                             </m:r>
                           </m:sub>
                         </m:sSub>
@@ -4676,7 +4676,7 @@
                             <w:b w:val="0"/>
                             <w:i w:val="0"/>
                           </w:rPr>
-                          <m:t>l</m:t>
+                          <m:t>leg</m:t>
                         </m:r>
                       </m:sub>
                     </m:sSub>
@@ -4902,7 +4902,7 @@
                 <w:b w:val="0"/>
                 <w:i w:val="0"/>
               </w:rPr>
-              <m:t>l</m:t>
+              <m:t>leg</m:t>
             </m:r>
           </m:sub>
         </m:sSub>
@@ -5019,7 +5019,7 @@
                 <w:b w:val="0"/>
                 <w:i w:val="0"/>
               </w:rPr>
-              <m:t>l</m:t>
+              <m:t>leg</m:t>
             </m:r>
           </m:sub>
         </m:sSub>
@@ -5083,7 +5083,7 @@
                 <w:b w:val="0"/>
                 <w:i w:val="0"/>
               </w:rPr>
-              <m:t>l</m:t>
+              <m:t>leg</m:t>
             </m:r>
           </m:sub>
         </m:sSub>
@@ -5123,7 +5123,7 @@
                 <w:b w:val="0"/>
                 <w:i w:val="0"/>
               </w:rPr>
-              <m:t>l</m:t>
+              <m:t>leg</m:t>
             </m:r>
           </m:sub>
         </m:sSub>
@@ -5163,7 +5163,7 @@
                 <w:b w:val="0"/>
                 <w:i w:val="0"/>
               </w:rPr>
-              <m:t>l</m:t>
+              <m:t>leg</m:t>
             </m:r>
           </m:sub>
         </m:sSub>
@@ -5255,7 +5255,7 @@
                             <w:b w:val="0"/>
                             <w:i w:val="0"/>
                           </w:rPr>
-                          <m:t>l</m:t>
+                          <m:t>leg</m:t>
                         </m:r>
                         <m:r>
                           <m:rPr>
@@ -5354,7 +5354,7 @@
                             <w:b w:val="0"/>
                             <w:i w:val="0"/>
                           </w:rPr>
-                          <m:t>l</m:t>
+                          <m:t>leg</m:t>
                         </m:r>
                       </m:sub>
                     </m:sSub>
@@ -5396,7 +5396,7 @@
                             <w:b w:val="0"/>
                             <w:i w:val="0"/>
                           </w:rPr>
-                          <m:t>l</m:t>
+                          <m:t>leg</m:t>
                         </m:r>
                         <m:r>
                           <m:rPr>
@@ -5553,7 +5553,7 @@
                                 <w:b w:val="0"/>
                                 <w:i w:val="0"/>
                               </w:rPr>
-                              <m:t>l</m:t>
+                              <m:t>leg</m:t>
                             </m:r>
                           </m:sub>
                         </m:sSub>
@@ -5676,12 +5676,14 @@
                                 <w:b w:val="0"/>
                                 <w:i w:val="0"/>
                               </w:rPr>
-                              <m:t>l</m:t>
+                              <m:t>leg</m:t>
                             </m:r>
                           </m:sub>
                         </m:sSub>
                       </m:e>
                     </m:d>
+                  </m:e>
+                  <m:e>
                     <m:r>
                       <m:rPr>
                         <m:sty m:val="p"/>
@@ -5718,7 +5720,7 @@
                             <w:b w:val="0"/>
                             <w:i w:val="0"/>
                           </w:rPr>
-                          <m:t>l</m:t>
+                          <m:t>leg</m:t>
                         </m:r>
                       </m:sub>
                     </m:sSub>
@@ -5915,7 +5917,7 @@
                 <w:b w:val="0"/>
                 <w:i w:val="0"/>
               </w:rPr>
-              <m:t>l</m:t>
+              <m:t>leg</m:t>
             </m:r>
           </m:sub>
         </m:sSub>
@@ -6036,7 +6038,7 @@
                 <w:b w:val="0"/>
                 <w:i w:val="0"/>
               </w:rPr>
-              <m:t>l</m:t>
+              <m:t>leg</m:t>
             </m:r>
           </m:sub>
         </m:sSub>
@@ -6101,7 +6103,7 @@
                 <w:b w:val="0"/>
                 <w:i w:val="0"/>
               </w:rPr>
-              <m:t>l</m:t>
+              <m:t>leg</m:t>
             </m:r>
             <m:r>
               <m:rPr>
@@ -6256,7 +6258,7 @@
                 <w:b w:val="0"/>
                 <w:i w:val="0"/>
               </w:rPr>
-              <m:t>l</m:t>
+              <m:t>leg</m:t>
             </m:r>
             <m:r>
               <m:rPr>
@@ -6361,7 +6363,7 @@
                 <w:b w:val="0"/>
                 <w:i w:val="0"/>
               </w:rPr>
-              <m:t>l</m:t>
+              <m:t>leg</m:t>
             </m:r>
             <m:r>
               <m:rPr>
@@ -6479,7 +6481,7 @@
                 <w:b w:val="0"/>
                 <w:i w:val="0"/>
               </w:rPr>
-              <m:t>l</m:t>
+              <m:t>leg</m:t>
             </m:r>
             <m:r>
               <m:rPr>
@@ -6540,7 +6542,7 @@
                 <w:b w:val="0"/>
                 <w:i w:val="0"/>
               </w:rPr>
-              <m:t>l</m:t>
+              <m:t>leg</m:t>
             </m:r>
             <m:r>
               <m:rPr>
@@ -6671,7 +6673,7 @@
                 <w:b w:val="0"/>
                 <w:i w:val="0"/>
               </w:rPr>
-              <m:t>l</m:t>
+              <m:t>leg</m:t>
             </m:r>
             <m:r>
               <m:rPr>
@@ -6732,7 +6734,7 @@
                 <w:b w:val="0"/>
                 <w:i w:val="0"/>
               </w:rPr>
-              <m:t>l</m:t>
+              <m:t>leg</m:t>
             </m:r>
             <m:r>
               <m:rPr>
@@ -6868,7 +6870,7 @@
                         <w:b w:val="0"/>
                         <w:i w:val="0"/>
                       </w:rPr>
-                      <m:t>l</m:t>
+                      <m:t>leg</m:t>
                     </m:r>
                   </m:sub>
                 </m:sSub>
@@ -6946,7 +6948,7 @@
                             <w:b w:val="0"/>
                             <w:i w:val="0"/>
                           </w:rPr>
-                          <m:t>l</m:t>
+                          <m:t>leg</m:t>
                         </m:r>
                       </m:sup>
                     </m:sSubSup>
@@ -6993,7 +6995,7 @@
                             <w:b w:val="0"/>
                             <w:i w:val="0"/>
                           </w:rPr>
-                          <m:t>l</m:t>
+                          <m:t>leg</m:t>
                         </m:r>
                       </m:sub>
                     </m:sSub>
@@ -11506,7 +11508,7 @@
                         <w:b w:val="0"/>
                         <w:i w:val="0"/>
                       </w:rPr>
-                      <m:t>l</m:t>
+                      <m:t>leg</m:t>
                     </m:r>
                   </m:sub>
                 </m:sSub>
@@ -11596,7 +11598,7 @@
                         <w:b w:val="0"/>
                         <w:i w:val="0"/>
                       </w:rPr>
-                      <m:t>l</m:t>
+                      <m:t>leg</m:t>
                     </m:r>
                   </m:sub>
                 </m:sSub>
@@ -11922,7 +11924,7 @@
                 <w:b w:val="0"/>
                 <w:i w:val="0"/>
               </w:rPr>
-              <m:t>l</m:t>
+              <m:t>leg</m:t>
             </m:r>
           </m:sub>
         </m:sSub>
@@ -12022,7 +12024,7 @@
                 <w:b w:val="0"/>
                 <w:i w:val="0"/>
               </w:rPr>
-              <m:t>l</m:t>
+              <m:t>leg</m:t>
             </m:r>
           </m:sub>
         </m:sSub>
@@ -12192,7 +12194,7 @@
                 <w:b w:val="0"/>
                 <w:i w:val="0"/>
               </w:rPr>
-              <m:t>l</m:t>
+              <m:t>leg</m:t>
             </m:r>
             <m:r>
               <m:rPr>
@@ -12253,7 +12255,7 @@
                 <w:b w:val="0"/>
                 <w:i w:val="0"/>
               </w:rPr>
-              <m:t>l</m:t>
+              <m:t>leg</m:t>
             </m:r>
             <m:r>
               <m:rPr>
@@ -12462,7 +12464,7 @@
                             <w:b w:val="0"/>
                             <w:i w:val="0"/>
                           </w:rPr>
-                          <m:t>l</m:t>
+                          <m:t>leg</m:t>
                         </m:r>
                       </m:sub>
                     </m:sSub>
@@ -12554,7 +12556,7 @@
                             <w:b w:val="0"/>
                             <w:i w:val="0"/>
                           </w:rPr>
-                          <m:t>l</m:t>
+                          <m:t>leg</m:t>
                         </m:r>
                       </m:sub>
                     </m:sSub>
@@ -12594,7 +12596,7 @@
                             <w:b w:val="0"/>
                             <w:i w:val="0"/>
                           </w:rPr>
-                          <m:t>l</m:t>
+                          <m:t>leg</m:t>
                         </m:r>
                       </m:sub>
                     </m:sSub>
@@ -12731,7 +12733,7 @@
                             <w:b w:val="0"/>
                             <w:i w:val="0"/>
                           </w:rPr>
-                          <m:t>l</m:t>
+                          <m:t>leg</m:t>
                         </m:r>
                       </m:sub>
                     </m:sSub>
@@ -12930,7 +12932,7 @@
                             <w:b w:val="0"/>
                             <w:i w:val="0"/>
                           </w:rPr>
-                          <m:t>l</m:t>
+                          <m:t>leg</m:t>
                         </m:r>
                       </m:sub>
                       <m:sup>
@@ -13394,7 +13396,7 @@
                 <w:b w:val="0"/>
                 <w:i w:val="0"/>
               </w:rPr>
-              <m:t>l</m:t>
+              <m:t>leg</m:t>
             </m:r>
           </m:sub>
         </m:sSub>
@@ -13494,7 +13496,7 @@
                 <w:b w:val="0"/>
                 <w:i w:val="0"/>
               </w:rPr>
-              <m:t>l</m:t>
+              <m:t>leg</m:t>
             </m:r>
           </m:sub>
         </m:sSub>
@@ -20946,7 +20948,7 @@
                         <w:b w:val="0"/>
                         <w:i w:val="0"/>
                       </w:rPr>
-                      <m:t>l</m:t>
+                      <m:t>leg</m:t>
                     </m:r>
                   </m:sub>
                   <m:sup>

</xml_diff>

<commit_message>
Insert existing leg coordinate figure into Fig. 2 in Word
</commit_message>
<xml_diff>
--- a/Article.docx
+++ b/Article.docx
@@ -2155,7 +2155,7 @@
           <w:sz w:val="20"/>
           <w:szCs w:val="20"/>
         </w:rPr>
-        <w:t>预留相应坐标图。</w:t>
+        <w:t>给出单腿结构与坐标系示意。</w:t>
       </w:r>
     </w:p>
     <w:p>
@@ -2163,21 +2163,53 @@
         <w:keepNext/>
         <w:keepLines/>
         <w:numPr>
-          <w:ilvl w:val="0"/>
           <w:numId w:val="0"/>
         </w:numPr>
-        <w:pBdr>
-          <w:top w:val="single" w:color="B0B0B0" w:sz="4" w:space="1"/>
-          <w:left w:val="single" w:color="B0B0B0" w:sz="4" w:space="1"/>
-          <w:bottom w:val="single" w:color="B0B0B0" w:sz="4" w:space="1"/>
-          <w:right w:val="single" w:color="B0B0B0" w:sz="4" w:space="1"/>
-        </w:pBdr>
         <w:snapToGrid w:val="0"/>
-        <w:spacing w:before="0" w:after="0" w:line="1644" w:lineRule="exact"/>
-        <w:jc w:val="both"/>
+        <w:spacing w:before="60" w:after="60" w:line="240" w:lineRule="auto"/>
+        <w:ind w:left="0" w:right="0" w:firstLine="0"/>
+        <w:jc w:val="center"/>
       </w:pPr>
       <w:bookmarkStart w:id="27" w:name="_GoBack"/>
       <w:bookmarkEnd w:id="27"/>
+      <w:r>
+        <w:drawing>
+          <wp:inline distT="0" distB="0" distL="0" distR="0">
+            <wp:extent cx="1620000" cy="2447057"/>
+            <wp:docPr id="24" name="Fig. 2" descr="单腿结构与坐标系示意图"/>
+            <wp:cNvGraphicFramePr>
+              <a:graphicFrameLocks xmlns:a="http://schemas.openxmlformats.org/drawingml/2006/main" noChangeAspect="1"/>
+            </wp:cNvGraphicFramePr>
+            <a:graphic xmlns:a="http://schemas.openxmlformats.org/drawingml/2006/main">
+              <a:graphicData uri="http://schemas.openxmlformats.org/drawingml/2006/picture">
+                <pic:pic xmlns:pic="http://schemas.openxmlformats.org/drawingml/2006/picture">
+                  <pic:nvPicPr>
+                    <pic:cNvPr id="24" name="leg_coordinates.png"/>
+                    <pic:cNvPicPr>
+                      <a:picLocks noChangeAspect="1"/>
+                    </pic:cNvPicPr>
+                  </pic:nvPicPr>
+                  <pic:blipFill>
+                    <a:blip r:embed="rId8"/>
+                    <a:stretch>
+                      <a:fillRect/>
+                    </a:stretch>
+                  </pic:blipFill>
+                  <pic:spPr>
+                    <a:xfrm>
+                      <a:off x="0" y="0"/>
+                      <a:ext cx="1620000" cy="2447057"/>
+                    </a:xfrm>
+                    <a:prstGeom prst="rect">
+                      <a:avLst/>
+                    </a:prstGeom>
+                  </pic:spPr>
+                </pic:pic>
+              </a:graphicData>
+            </a:graphic>
+          </wp:inline>
+        </w:drawing>
+      </w:r>
     </w:p>
     <w:p>
       <w:pPr>
@@ -2199,7 +2231,7 @@
           <w:rFonts w:hint="eastAsia"/>
           <w:iCs/>
         </w:rPr>
-        <w:t>单腿坐标系、关节角零位与轮心位置（留白；现有示意图角度基准需与正文统一）。</w:t>
+        <w:t>单腿结构与坐标系示意（图中角度标记沿用原图，解算零位以正文为准）。</w:t>
       </w:r>
     </w:p>
     <w:p>

</xml_diff>

<commit_message>
Rename wheel free-body illustration to clearer Chinese wording
</commit_message>
<xml_diff>
--- a/Article.docx
+++ b/Article.docx
@@ -9498,7 +9498,7 @@
           <w:sz w:val="20"/>
           <w:szCs w:val="20"/>
         </w:rPr>
-        <w:t>预留轮体自由体图。</w:t>
+        <w:t>预留车轮受力示意图。</w:t>
       </w:r>
     </w:p>
     <w:p>
@@ -9542,7 +9542,7 @@
           <w:rFonts w:hint="eastAsia"/>
           <w:iCs/>
         </w:rPr>
-        <w:t>轮体自由体、接触力与轴端反作用力矩（留白，待补图）。</w:t>
+        <w:t>车轮受力示意图：接触力与轴端反作用力矩（留白，待补图）。</w:t>
       </w:r>
     </w:p>
     <w:p>

</xml_diff>

<commit_message>
Generate wheel force diagram from side view and fill Fig. 4
</commit_message>
<xml_diff>
--- a/Article.docx
+++ b/Article.docx
@@ -9498,7 +9498,7 @@
           <w:sz w:val="20"/>
           <w:szCs w:val="20"/>
         </w:rPr>
-        <w:t>预留车轮受力示意图。</w:t>
+        <w:t>给出车轮受力示意图。</w:t>
       </w:r>
     </w:p>
     <w:p>
@@ -9506,20 +9506,50 @@
         <w:keepNext/>
         <w:keepLines/>
         <w:numPr>
-          <w:ilvl w:val="0"/>
           <w:numId w:val="0"/>
         </w:numPr>
-        <w:pBdr>
-          <w:top w:val="single" w:color="B0B0B0" w:sz="4" w:space="1"/>
-          <w:left w:val="single" w:color="B0B0B0" w:sz="4" w:space="1"/>
-          <w:bottom w:val="single" w:color="B0B0B0" w:sz="4" w:space="1"/>
-          <w:right w:val="single" w:color="B0B0B0" w:sz="4" w:space="1"/>
-        </w:pBdr>
         <w:snapToGrid w:val="0"/>
-        <w:spacing w:before="0" w:after="0" w:line="1644" w:lineRule="exact"/>
+        <w:spacing w:before="60" w:after="60" w:line="240" w:lineRule="auto"/>
+        <w:ind w:left="0" w:right="0" w:firstLine="0"/>
+        <w:jc w:val="center"/>
       </w:pPr>
       <w:r>
-        <w:t> </w:t>
+        <w:drawing>
+          <wp:inline distT="0" distB="0" distL="0" distR="0">
+            <wp:extent cx="2880000" cy="2301126"/>
+            <wp:docPr id="25" name="Fig. 4" descr="车轮受力示意图：接触力、轴端作用力、重力、驱动力矩与力臂"/>
+            <wp:cNvGraphicFramePr>
+              <a:graphicFrameLocks xmlns:a="http://schemas.openxmlformats.org/drawingml/2006/main" noChangeAspect="1"/>
+            </wp:cNvGraphicFramePr>
+            <a:graphic xmlns:a="http://schemas.openxmlformats.org/drawingml/2006/main">
+              <a:graphicData uri="http://schemas.openxmlformats.org/drawingml/2006/picture">
+                <pic:pic xmlns:pic="http://schemas.openxmlformats.org/drawingml/2006/picture">
+                  <pic:nvPicPr>
+                    <pic:cNvPr id="25" name="wheel_free_body.png"/>
+                    <pic:cNvPicPr>
+                      <a:picLocks noChangeAspect="1"/>
+                    </pic:cNvPicPr>
+                  </pic:nvPicPr>
+                  <pic:blipFill>
+                    <a:blip r:embed="rId9"/>
+                    <a:stretch>
+                      <a:fillRect/>
+                    </a:stretch>
+                  </pic:blipFill>
+                  <pic:spPr>
+                    <a:xfrm>
+                      <a:off x="0" y="0"/>
+                      <a:ext cx="2880000" cy="2301126"/>
+                    </a:xfrm>
+                    <a:prstGeom prst="rect">
+                      <a:avLst/>
+                    </a:prstGeom>
+                  </pic:spPr>
+                </pic:pic>
+              </a:graphicData>
+            </a:graphic>
+          </wp:inline>
+        </w:drawing>
       </w:r>
     </w:p>
     <w:p>
@@ -9542,7 +9572,7 @@
           <w:rFonts w:hint="eastAsia"/>
           <w:iCs/>
         </w:rPr>
-        <w:t>车轮受力示意图：接触力与轴端反作用力矩（留白，待补图）。</w:t>
+        <w:t>车轮受力示意图：地面接触力、轴端作用力、重力、驱动力矩及轮心至接触点的力臂。</w:t>
       </w:r>
     </w:p>
     <w:p>

</xml_diff>

<commit_message>
Generate whole-robot contact-force side view and fill Fig. 5
</commit_message>
<xml_diff>
--- a/Article.docx
+++ b/Article.docx
@@ -12880,7 +12880,7 @@
           <w:sz w:val="20"/>
           <w:szCs w:val="20"/>
         </w:rPr>
-        <w:t>预留接触力和质心示意图。</w:t>
+        <w:t>给出接触力和质心的侧视示意图。</w:t>
       </w:r>
     </w:p>
     <w:p>
@@ -12888,20 +12888,50 @@
         <w:keepNext/>
         <w:keepLines/>
         <w:numPr>
-          <w:ilvl w:val="0"/>
           <w:numId w:val="0"/>
         </w:numPr>
-        <w:pBdr>
-          <w:top w:val="single" w:color="B0B0B0" w:sz="4" w:space="1"/>
-          <w:left w:val="single" w:color="B0B0B0" w:sz="4" w:space="1"/>
-          <w:bottom w:val="single" w:color="B0B0B0" w:sz="4" w:space="1"/>
-          <w:right w:val="single" w:color="B0B0B0" w:sz="4" w:space="1"/>
-        </w:pBdr>
         <w:snapToGrid w:val="0"/>
-        <w:spacing w:before="0" w:after="0" w:line="1644" w:lineRule="exact"/>
+        <w:spacing w:before="60" w:after="60" w:line="240" w:lineRule="auto"/>
+        <w:ind w:left="0" w:right="0" w:firstLine="0"/>
+        <w:jc w:val="center"/>
       </w:pPr>
       <w:r>
-        <w:t> </w:t>
+        <w:drawing>
+          <wp:inline distT="0" distB="0" distL="0" distR="0">
+            <wp:extent cx="3060000" cy="1409886"/>
+            <wp:docPr id="26" name="Fig. 5" descr="整机质心与四轮接触力的侧视投影示意图"/>
+            <wp:cNvGraphicFramePr>
+              <a:graphicFrameLocks xmlns:a="http://schemas.openxmlformats.org/drawingml/2006/main" noChangeAspect="1"/>
+            </wp:cNvGraphicFramePr>
+            <a:graphic xmlns:a="http://schemas.openxmlformats.org/drawingml/2006/main">
+              <a:graphicData uri="http://schemas.openxmlformats.org/drawingml/2006/picture">
+                <pic:pic xmlns:pic="http://schemas.openxmlformats.org/drawingml/2006/picture">
+                  <pic:nvPicPr>
+                    <pic:cNvPr id="26" name="whole_robot_contact_forces.png"/>
+                    <pic:cNvPicPr>
+                      <a:picLocks noChangeAspect="1"/>
+                    </pic:cNvPicPr>
+                  </pic:nvPicPr>
+                  <pic:blipFill>
+                    <a:blip r:embed="rId10"/>
+                    <a:stretch>
+                      <a:fillRect/>
+                    </a:stretch>
+                  </pic:blipFill>
+                  <pic:spPr>
+                    <a:xfrm>
+                      <a:off x="0" y="0"/>
+                      <a:ext cx="3060000" cy="1409886"/>
+                    </a:xfrm>
+                    <a:prstGeom prst="rect">
+                      <a:avLst/>
+                    </a:prstGeom>
+                  </pic:spPr>
+                </pic:pic>
+              </a:graphicData>
+            </a:graphic>
+          </wp:inline>
+        </w:drawing>
       </w:r>
     </w:p>
     <w:p>
@@ -12924,7 +12954,7 @@
           <w:rFonts w:hint="eastAsia"/>
           <w:iCs/>
         </w:rPr>
-        <w:t>整机质心、四轮触点及接触力分配（留白，待补图）。</w:t>
+        <w:t>整机质心与四轮接触力的侧视示意。左右对应轮的触点在侧视投影中重合，接触力按前、后两轮组的合力标注；质心位置仅作示意。</w:t>
       </w:r>
     </w:p>
     <w:p>

</xml_diff>

<commit_message>
Redraw Fig. 5 from chassis assembly with high-contrast force annotations
</commit_message>
<xml_diff>
--- a/Article.docx
+++ b/Article.docx
@@ -12880,7 +12880,7 @@
           <w:sz w:val="20"/>
           <w:szCs w:val="20"/>
         </w:rPr>
-        <w:t>给出接触力和质心的侧视示意图。</w:t>
+        <w:t>基于底盘立体构型给出接触力和质心的示意图。</w:t>
       </w:r>
     </w:p>
     <w:p>
@@ -12898,8 +12898,8 @@
       <w:r>
         <w:drawing>
           <wp:inline distT="0" distB="0" distL="0" distR="0">
-            <wp:extent cx="3060000" cy="1409886"/>
-            <wp:docPr id="26" name="Fig. 5" descr="整机质心与四轮接触力的侧视投影示意图"/>
+            <wp:extent cx="3060000" cy="2295000"/>
+            <wp:docPr id="26" name="Fig. 5" descr="基于底盘立体构型的整机质心与四轮接触力示意图"/>
             <wp:cNvGraphicFramePr>
               <a:graphicFrameLocks xmlns:a="http://schemas.openxmlformats.org/drawingml/2006/main" noChangeAspect="1"/>
             </wp:cNvGraphicFramePr>
@@ -12921,7 +12921,7 @@
                   <pic:spPr>
                     <a:xfrm>
                       <a:off x="0" y="0"/>
-                      <a:ext cx="3060000" cy="1409886"/>
+                      <a:ext cx="3060000" cy="2295000"/>
                     </a:xfrm>
                     <a:prstGeom prst="rect">
                       <a:avLst/>
@@ -12954,7 +12954,7 @@
           <w:rFonts w:hint="eastAsia"/>
           <w:iCs/>
         </w:rPr>
-        <w:t>整机质心与四轮接触力的侧视示意。左右对应轮的触点在侧视投影中重合，接触力按前、后两轮组的合力标注；质心位置仅作示意。</w:t>
+        <w:t>基于底盘立体构型的整机质心与四轮接触力示意。各接触力以竖直箭头示意其作用位置，实际方向由接触条件决定；选取第 i 个触点标注接触力及质心至触点的力臂。质心位置仅作示意。</w:t>
       </w:r>
     </w:p>
     <w:p>

</xml_diff>

<commit_message>
Clarify attitude controller symbols and units
</commit_message>
<xml_diff>
--- a/Article.docx
+++ b/Article.docx
@@ -16208,32 +16208,419 @@
           <w:sz w:val="20"/>
           <w:szCs w:val="20"/>
         </w:rPr>
-        <w:t>其中</w:t>
-      </w:r>
-      <w:r>
-        <w:rPr>
-          <w:sz w:val="20"/>
-          <w:szCs w:val="20"/>
-        </w:rPr>
-        <w:t xml:space="preserve"> </w:t>
+        <w:t xml:space="preserve">其中，</w:t>
+      </w:r>
+      <m:oMath>
+        <m:r>
+          <m:rPr>
+            <m:sty m:val="i"/>
+          </m:rPr>
+          <w:rPr>
+            <w:rFonts w:ascii="Cambria Math" w:hAnsi="Cambria Math" w:eastAsia="Cambria Math" w:cs="Cambria Math"/>
+            <w:sz w:val="20"/>
+            <w:szCs w:val="20"/>
+          </w:rPr>
+          <m:t>k</m:t>
+        </m:r>
+      </m:oMath>
+      <w:r>
+        <w:rPr>
+          <w:rFonts w:hint="eastAsia"/>
+          <w:sz w:val="20"/>
+          <w:szCs w:val="20"/>
+        </w:rPr>
+        <w:t xml:space="preserve"> 为采样序号；</w:t>
+      </w:r>
+      <m:oMath>
+        <m:r>
+          <m:rPr>
+            <m:sty m:val="i"/>
+          </m:rPr>
+          <w:rPr>
+            <w:rFonts w:ascii="Cambria Math" w:hAnsi="Cambria Math" w:eastAsia="Cambria Math" w:cs="Cambria Math"/>
+            <w:sz w:val="20"/>
+            <w:szCs w:val="20"/>
+          </w:rPr>
+          <m:t>χ</m:t>
+        </m:r>
+        <m:r>
+          <m:rPr>
+            <m:sty m:val="p"/>
+          </m:rPr>
+          <w:rPr>
+            <w:rFonts w:ascii="Cambria Math" w:hAnsi="Cambria Math" w:eastAsia="Cambria Math" w:cs="Cambria Math"/>
+            <w:sz w:val="20"/>
+            <w:szCs w:val="20"/>
+          </w:rPr>
+          <m:t>[</m:t>
+        </m:r>
+        <m:r>
+          <m:rPr>
+            <m:sty m:val="i"/>
+          </m:rPr>
+          <w:rPr>
+            <w:rFonts w:ascii="Cambria Math" w:hAnsi="Cambria Math" w:eastAsia="Cambria Math" w:cs="Cambria Math"/>
+            <w:sz w:val="20"/>
+            <w:szCs w:val="20"/>
+          </w:rPr>
+          <m:t>k</m:t>
+        </m:r>
+        <m:r>
+          <m:rPr>
+            <m:sty m:val="p"/>
+          </m:rPr>
+          <w:rPr>
+            <w:rFonts w:ascii="Cambria Math" w:hAnsi="Cambria Math" w:eastAsia="Cambria Math" w:cs="Cambria Math"/>
+            <w:sz w:val="20"/>
+            <w:szCs w:val="20"/>
+          </w:rPr>
+          <m:t>]</m:t>
+        </m:r>
+      </m:oMath>
+      <w:r>
+        <w:rPr>
+          <w:rFonts w:hint="eastAsia"/>
+          <w:sz w:val="20"/>
+          <w:szCs w:val="20"/>
+        </w:rPr>
+        <w:t xml:space="preserve"> 和 </w:t>
       </w:r>
       <m:oMath>
         <m:sSub>
-          <m:sSubPr/>
           <m:e>
             <m:r>
-              <m:rPr/>
-              <w:rPr>
-                <w:rFonts w:ascii="Cambria Math" w:hAnsi="Cambria Math" w:eastAsia="Cambria Math" w:cs="Cambria Math"/>
-                <w:sz w:val="20"/>
-                <w:szCs w:val="20"/>
-              </w:rPr>
-              <m:t>u</m:t>
+              <m:rPr>
+                <m:sty m:val="i"/>
+              </m:rPr>
+              <w:rPr>
+                <w:rFonts w:ascii="Cambria Math" w:hAnsi="Cambria Math" w:eastAsia="Cambria Math" w:cs="Cambria Math"/>
+                <w:sz w:val="20"/>
+                <w:szCs w:val="20"/>
+              </w:rPr>
+              <m:t>χ</m:t>
             </m:r>
           </m:e>
           <m:sub>
             <m:r>
-              <m:rPr/>
+              <m:rPr>
+                <m:sty m:val="p"/>
+              </m:rPr>
+              <w:rPr>
+                <w:rFonts w:ascii="Cambria Math" w:hAnsi="Cambria Math" w:eastAsia="Cambria Math" w:cs="Cambria Math"/>
+                <w:sz w:val="20"/>
+                <w:szCs w:val="20"/>
+              </w:rPr>
+              <m:t>d</m:t>
+            </m:r>
+          </m:sub>
+        </m:sSub>
+        <m:r>
+          <m:rPr>
+            <m:sty m:val="p"/>
+          </m:rPr>
+          <w:rPr>
+            <w:rFonts w:ascii="Cambria Math" w:hAnsi="Cambria Math" w:eastAsia="Cambria Math" w:cs="Cambria Math"/>
+            <w:sz w:val="20"/>
+            <w:szCs w:val="20"/>
+          </w:rPr>
+          <m:t>[</m:t>
+        </m:r>
+        <m:r>
+          <m:rPr>
+            <m:sty m:val="i"/>
+          </m:rPr>
+          <w:rPr>
+            <w:rFonts w:ascii="Cambria Math" w:hAnsi="Cambria Math" w:eastAsia="Cambria Math" w:cs="Cambria Math"/>
+            <w:sz w:val="20"/>
+            <w:szCs w:val="20"/>
+          </w:rPr>
+          <m:t>k</m:t>
+        </m:r>
+        <m:r>
+          <m:rPr>
+            <m:sty m:val="p"/>
+          </m:rPr>
+          <w:rPr>
+            <w:rFonts w:ascii="Cambria Math" w:hAnsi="Cambria Math" w:eastAsia="Cambria Math" w:cs="Cambria Math"/>
+            <w:sz w:val="20"/>
+            <w:szCs w:val="20"/>
+          </w:rPr>
+          <m:t>]</m:t>
+        </m:r>
+      </m:oMath>
+      <w:r>
+        <w:rPr>
+          <w:rFonts w:hint="eastAsia"/>
+          <w:sz w:val="20"/>
+          <w:szCs w:val="20"/>
+        </w:rPr>
+        <w:t xml:space="preserve"> 分别为当前与期望姿态角，</w:t>
+      </w:r>
+      <m:oMath>
+        <m:sSub>
+          <m:e>
+            <m:r>
+              <m:rPr>
+                <m:sty m:val="i"/>
+              </m:rPr>
+              <w:rPr>
+                <w:rFonts w:ascii="Cambria Math" w:hAnsi="Cambria Math" w:eastAsia="Cambria Math" w:cs="Cambria Math"/>
+                <w:sz w:val="20"/>
+                <w:szCs w:val="20"/>
+              </w:rPr>
+              <m:t>e</m:t>
+            </m:r>
+          </m:e>
+          <m:sub>
+            <m:r>
+              <m:rPr>
+                <m:sty m:val="i"/>
+              </m:rPr>
+              <w:rPr>
+                <w:rFonts w:ascii="Cambria Math" w:hAnsi="Cambria Math" w:eastAsia="Cambria Math" w:cs="Cambria Math"/>
+                <w:sz w:val="20"/>
+                <w:szCs w:val="20"/>
+              </w:rPr>
+              <m:t>χ</m:t>
+            </m:r>
+          </m:sub>
+        </m:sSub>
+        <m:r>
+          <m:rPr>
+            <m:sty m:val="p"/>
+          </m:rPr>
+          <w:rPr>
+            <w:rFonts w:ascii="Cambria Math" w:hAnsi="Cambria Math" w:eastAsia="Cambria Math" w:cs="Cambria Math"/>
+            <w:sz w:val="20"/>
+            <w:szCs w:val="20"/>
+          </w:rPr>
+          <m:t>[</m:t>
+        </m:r>
+        <m:r>
+          <m:rPr>
+            <m:sty m:val="i"/>
+          </m:rPr>
+          <w:rPr>
+            <w:rFonts w:ascii="Cambria Math" w:hAnsi="Cambria Math" w:eastAsia="Cambria Math" w:cs="Cambria Math"/>
+            <w:sz w:val="20"/>
+            <w:szCs w:val="20"/>
+          </w:rPr>
+          <m:t>k</m:t>
+        </m:r>
+        <m:r>
+          <m:rPr>
+            <m:sty m:val="p"/>
+          </m:rPr>
+          <w:rPr>
+            <w:rFonts w:ascii="Cambria Math" w:hAnsi="Cambria Math" w:eastAsia="Cambria Math" w:cs="Cambria Math"/>
+            <w:sz w:val="20"/>
+            <w:szCs w:val="20"/>
+          </w:rPr>
+          <m:t>]</m:t>
+        </m:r>
+      </m:oMath>
+      <w:r>
+        <w:rPr>
+          <w:rFonts w:hint="eastAsia"/>
+          <w:sz w:val="20"/>
+          <w:szCs w:val="20"/>
+        </w:rPr>
+        <w:t xml:space="preserve"> 为姿态角误差，单位均为 rad。</w:t>
+      </w:r>
+      <m:oMath>
+        <m:acc>
+          <m:accPr>
+            <m:chr m:val="̇"/>
+          </m:accPr>
+          <m:e>
+            <m:r>
+              <m:rPr>
+                <m:sty m:val="i"/>
+              </m:rPr>
+              <w:rPr>
+                <w:rFonts w:ascii="Cambria Math" w:hAnsi="Cambria Math" w:eastAsia="Cambria Math" w:cs="Cambria Math"/>
+                <w:sz w:val="20"/>
+                <w:szCs w:val="20"/>
+              </w:rPr>
+              <m:t>χ</m:t>
+            </m:r>
+          </m:e>
+        </m:acc>
+        <m:r>
+          <m:rPr>
+            <m:sty m:val="p"/>
+          </m:rPr>
+          <w:rPr>
+            <w:rFonts w:ascii="Cambria Math" w:hAnsi="Cambria Math" w:eastAsia="Cambria Math" w:cs="Cambria Math"/>
+            <w:sz w:val="20"/>
+            <w:szCs w:val="20"/>
+          </w:rPr>
+          <m:t>[</m:t>
+        </m:r>
+        <m:r>
+          <m:rPr>
+            <m:sty m:val="i"/>
+          </m:rPr>
+          <w:rPr>
+            <w:rFonts w:ascii="Cambria Math" w:hAnsi="Cambria Math" w:eastAsia="Cambria Math" w:cs="Cambria Math"/>
+            <w:sz w:val="20"/>
+            <w:szCs w:val="20"/>
+          </w:rPr>
+          <m:t>k</m:t>
+        </m:r>
+        <m:r>
+          <m:rPr>
+            <m:sty m:val="p"/>
+          </m:rPr>
+          <w:rPr>
+            <w:rFonts w:ascii="Cambria Math" w:hAnsi="Cambria Math" w:eastAsia="Cambria Math" w:cs="Cambria Math"/>
+            <w:sz w:val="20"/>
+            <w:szCs w:val="20"/>
+          </w:rPr>
+          <m:t>]</m:t>
+        </m:r>
+      </m:oMath>
+      <w:r>
+        <w:rPr>
+          <w:rFonts w:hint="eastAsia"/>
+          <w:sz w:val="20"/>
+          <w:szCs w:val="20"/>
+        </w:rPr>
+        <w:t xml:space="preserve"> 为 IMU 测得的当前角速度，</w:t>
+      </w:r>
+      <m:oMath>
+        <m:acc>
+          <m:accPr>
+            <m:chr m:val="̇"/>
+          </m:accPr>
+          <m:e>
+            <m:sSub>
+              <m:e>
+                <m:r>
+                  <m:rPr>
+                    <m:sty m:val="i"/>
+                  </m:rPr>
+                  <w:rPr>
+                    <w:rFonts w:ascii="Cambria Math" w:hAnsi="Cambria Math" w:eastAsia="Cambria Math" w:cs="Cambria Math"/>
+                    <w:sz w:val="20"/>
+                    <w:szCs w:val="20"/>
+                  </w:rPr>
+                  <m:t>χ</m:t>
+                </m:r>
+              </m:e>
+              <m:sub>
+                <m:r>
+                  <m:rPr>
+                    <m:sty m:val="p"/>
+                  </m:rPr>
+                  <w:rPr>
+                    <w:rFonts w:ascii="Cambria Math" w:hAnsi="Cambria Math" w:eastAsia="Cambria Math" w:cs="Cambria Math"/>
+                    <w:sz w:val="20"/>
+                    <w:szCs w:val="20"/>
+                  </w:rPr>
+                  <m:t>d</m:t>
+                </m:r>
+              </m:sub>
+            </m:sSub>
+          </m:e>
+        </m:acc>
+        <m:r>
+          <m:rPr>
+            <m:sty m:val="p"/>
+          </m:rPr>
+          <w:rPr>
+            <w:rFonts w:ascii="Cambria Math" w:hAnsi="Cambria Math" w:eastAsia="Cambria Math" w:cs="Cambria Math"/>
+            <w:sz w:val="20"/>
+            <w:szCs w:val="20"/>
+          </w:rPr>
+          <m:t>[</m:t>
+        </m:r>
+        <m:r>
+          <m:rPr>
+            <m:sty m:val="i"/>
+          </m:rPr>
+          <w:rPr>
+            <w:rFonts w:ascii="Cambria Math" w:hAnsi="Cambria Math" w:eastAsia="Cambria Math" w:cs="Cambria Math"/>
+            <w:sz w:val="20"/>
+            <w:szCs w:val="20"/>
+          </w:rPr>
+          <m:t>k</m:t>
+        </m:r>
+        <m:r>
+          <m:rPr>
+            <m:sty m:val="p"/>
+          </m:rPr>
+          <w:rPr>
+            <w:rFonts w:ascii="Cambria Math" w:hAnsi="Cambria Math" w:eastAsia="Cambria Math" w:cs="Cambria Math"/>
+            <w:sz w:val="20"/>
+            <w:szCs w:val="20"/>
+          </w:rPr>
+          <m:t>]</m:t>
+        </m:r>
+      </m:oMath>
+      <w:r>
+        <w:rPr>
+          <w:rFonts w:hint="eastAsia"/>
+          <w:sz w:val="20"/>
+          <w:szCs w:val="20"/>
+        </w:rPr>
+        <w:t xml:space="preserve"> 为角度环给出的期望角速度，单位为 rad/s。</w:t>
+      </w:r>
+    </w:p>
+    <w:p>
+      <w:pPr>
+        <w:pStyle w:val="7"/>
+        <w:numPr>
+          <w:ilvl w:val="0"/>
+          <w:numId w:val="0"/>
+        </w:numPr>
+        <w:snapToGrid w:val="0"/>
+        <w:rPr>
+          <w:sz w:val="20"/>
+        </w:rPr>
+      </w:pPr>
+      <m:oMath>
+        <m:sSub>
+          <m:e>
+            <m:r>
+              <m:rPr>
+                <m:sty m:val="i"/>
+              </m:rPr>
+              <w:rPr>
+                <w:rFonts w:ascii="Cambria Math" w:hAnsi="Cambria Math" w:eastAsia="Cambria Math" w:cs="Cambria Math"/>
+                <w:sz w:val="20"/>
+                <w:szCs w:val="20"/>
+              </w:rPr>
+              <m:t>k</m:t>
+            </m:r>
+          </m:e>
+          <m:sub>
+            <m:r>
+              <m:rPr>
+                <m:sty m:val="p"/>
+              </m:rPr>
+              <w:rPr>
+                <w:rFonts w:ascii="Cambria Math" w:hAnsi="Cambria Math" w:eastAsia="Cambria Math" w:cs="Cambria Math"/>
+                <w:sz w:val="20"/>
+                <w:szCs w:val="20"/>
+              </w:rPr>
+              <m:t>p</m:t>
+            </m:r>
+            <m:r>
+              <m:rPr>
+                <m:sty m:val="p"/>
+              </m:rPr>
+              <w:rPr>
+                <w:rFonts w:ascii="Cambria Math" w:hAnsi="Cambria Math" w:eastAsia="Cambria Math" w:cs="Cambria Math"/>
+                <w:sz w:val="20"/>
+                <w:szCs w:val="20"/>
+              </w:rPr>
+              <m:t>,</m:t>
+            </m:r>
+            <m:r>
+              <m:rPr>
+                <m:sty m:val="i"/>
+              </m:rPr>
               <w:rPr>
                 <w:rFonts w:ascii="Cambria Math" w:hAnsi="Cambria Math" w:eastAsia="Cambria Math" w:cs="Cambria Math"/>
                 <w:sz w:val="20"/>
@@ -16246,32 +16633,19 @@
       </m:oMath>
       <w:r>
         <w:rPr>
-          <w:sz w:val="20"/>
-          <w:szCs w:val="20"/>
-        </w:rPr>
-        <w:t xml:space="preserve"> </w:t>
-      </w:r>
-      <w:r>
-        <w:rPr>
           <w:rFonts w:hint="eastAsia"/>
           <w:sz w:val="20"/>
           <w:szCs w:val="20"/>
         </w:rPr>
-        <w:t>是具有长度单位的支撑高度修正量，离散增益</w:t>
-      </w:r>
-      <w:r>
-        <w:rPr>
-          <w:sz w:val="20"/>
-          <w:szCs w:val="20"/>
-        </w:rPr>
-        <w:t xml:space="preserve"> </w:t>
+        <w:t xml:space="preserve"> 为角度环比例增益，将姿态角误差转换为期望角速度；</w:t>
       </w:r>
       <m:oMath>
         <m:sSub>
-          <m:sSubPr/>
           <m:e>
             <m:r>
-              <m:rPr/>
+              <m:rPr>
+                <m:sty m:val="i"/>
+              </m:rPr>
               <w:rPr>
                 <w:rFonts w:ascii="Cambria Math" w:hAnsi="Cambria Math" w:eastAsia="Cambria Math" w:cs="Cambria Math"/>
                 <w:sz w:val="20"/>
@@ -16290,10 +16664,23 @@
                 <w:sz w:val="20"/>
                 <w:szCs w:val="20"/>
               </w:rPr>
-              <m:t>h,</m:t>
-            </m:r>
-            <m:r>
-              <m:rPr/>
+              <m:t>h</m:t>
+            </m:r>
+            <m:r>
+              <m:rPr>
+                <m:sty m:val="p"/>
+              </m:rPr>
+              <w:rPr>
+                <w:rFonts w:ascii="Cambria Math" w:hAnsi="Cambria Math" w:eastAsia="Cambria Math" w:cs="Cambria Math"/>
+                <w:sz w:val="20"/>
+                <w:szCs w:val="20"/>
+              </w:rPr>
+              <m:t>,</m:t>
+            </m:r>
+            <m:r>
+              <m:rPr>
+                <m:sty m:val="i"/>
+              </m:rPr>
               <w:rPr>
                 <w:rFonts w:ascii="Cambria Math" w:hAnsi="Cambria Math" w:eastAsia="Cambria Math" w:cs="Cambria Math"/>
                 <w:sz w:val="20"/>
@@ -16306,48 +16693,267 @@
       </m:oMath>
       <w:r>
         <w:rPr>
-          <w:sz w:val="20"/>
-          <w:szCs w:val="20"/>
-        </w:rPr>
-        <w:t xml:space="preserve"> </w:t>
-      </w:r>
-      <w:r>
-        <w:rPr>
           <w:rFonts w:hint="eastAsia"/>
           <w:sz w:val="20"/>
           <w:szCs w:val="20"/>
         </w:rPr>
-        <w:t>包含采样周期的影响。原稿预留的增量式</w:t>
-      </w:r>
-      <w:r>
-        <w:rPr>
-          <w:sz w:val="20"/>
-          <w:szCs w:val="20"/>
-        </w:rPr>
-        <w:t xml:space="preserve"> PID </w:t>
-      </w:r>
+        <w:t xml:space="preserve"> 为角速度环的离散增益，将角速度误差转换为本周期的高度修正增量 </w:t>
+      </w:r>
+      <m:oMath>
+        <m:r>
+          <m:rPr>
+            <m:sty m:val="p"/>
+          </m:rPr>
+          <w:rPr>
+            <w:rFonts w:ascii="Cambria Math" w:hAnsi="Cambria Math" w:eastAsia="Cambria Math" w:cs="Cambria Math"/>
+            <w:sz w:val="20"/>
+            <w:szCs w:val="20"/>
+          </w:rPr>
+          <m:t>Δ</m:t>
+        </m:r>
+        <m:sSub>
+          <m:e>
+            <m:r>
+              <m:rPr>
+                <m:sty m:val="i"/>
+              </m:rPr>
+              <w:rPr>
+                <w:rFonts w:ascii="Cambria Math" w:hAnsi="Cambria Math" w:eastAsia="Cambria Math" w:cs="Cambria Math"/>
+                <w:sz w:val="20"/>
+                <w:szCs w:val="20"/>
+              </w:rPr>
+              <m:t>u</m:t>
+            </m:r>
+          </m:e>
+          <m:sub>
+            <m:r>
+              <m:rPr>
+                <m:sty m:val="i"/>
+              </m:rPr>
+              <w:rPr>
+                <w:rFonts w:ascii="Cambria Math" w:hAnsi="Cambria Math" w:eastAsia="Cambria Math" w:cs="Cambria Math"/>
+                <w:sz w:val="20"/>
+                <w:szCs w:val="20"/>
+              </w:rPr>
+              <m:t>χ</m:t>
+            </m:r>
+          </m:sub>
+        </m:sSub>
+        <m:r>
+          <m:rPr>
+            <m:sty m:val="p"/>
+          </m:rPr>
+          <w:rPr>
+            <w:rFonts w:ascii="Cambria Math" w:hAnsi="Cambria Math" w:eastAsia="Cambria Math" w:cs="Cambria Math"/>
+            <w:sz w:val="20"/>
+            <w:szCs w:val="20"/>
+          </w:rPr>
+          <m:t>[</m:t>
+        </m:r>
+        <m:r>
+          <m:rPr>
+            <m:sty m:val="i"/>
+          </m:rPr>
+          <w:rPr>
+            <w:rFonts w:ascii="Cambria Math" w:hAnsi="Cambria Math" w:eastAsia="Cambria Math" w:cs="Cambria Math"/>
+            <w:sz w:val="20"/>
+            <w:szCs w:val="20"/>
+          </w:rPr>
+          <m:t>k</m:t>
+        </m:r>
+        <m:r>
+          <m:rPr>
+            <m:sty m:val="p"/>
+          </m:rPr>
+          <w:rPr>
+            <w:rFonts w:ascii="Cambria Math" w:hAnsi="Cambria Math" w:eastAsia="Cambria Math" w:cs="Cambria Math"/>
+            <w:sz w:val="20"/>
+            <w:szCs w:val="20"/>
+          </w:rPr>
+          <m:t>]</m:t>
+        </m:r>
+      </m:oMath>
       <w:r>
         <w:rPr>
           <w:rFonts w:hint="eastAsia"/>
           <w:sz w:val="20"/>
           <w:szCs w:val="20"/>
         </w:rPr>
-        <w:t>可作为这一增量调节接口的通用扩展；若采用离散</w:t>
-      </w:r>
-      <w:r>
-        <w:rPr>
-          <w:sz w:val="20"/>
-          <w:szCs w:val="20"/>
-        </w:rPr>
-        <w:t xml:space="preserve"> </w:t>
-      </w:r>
+        <w:t xml:space="preserve">，已包含采样周期的影响。</w:t>
+      </w:r>
+      <m:oMath>
+        <m:sSub>
+          <m:e>
+            <m:r>
+              <m:rPr>
+                <m:sty m:val="i"/>
+              </m:rPr>
+              <w:rPr>
+                <w:rFonts w:ascii="Cambria Math" w:hAnsi="Cambria Math" w:eastAsia="Cambria Math" w:cs="Cambria Math"/>
+                <w:sz w:val="20"/>
+                <w:szCs w:val="20"/>
+              </w:rPr>
+              <m:t>u</m:t>
+            </m:r>
+          </m:e>
+          <m:sub>
+            <m:r>
+              <m:rPr>
+                <m:sty m:val="i"/>
+              </m:rPr>
+              <w:rPr>
+                <w:rFonts w:ascii="Cambria Math" w:hAnsi="Cambria Math" w:eastAsia="Cambria Math" w:cs="Cambria Math"/>
+                <w:sz w:val="20"/>
+                <w:szCs w:val="20"/>
+              </w:rPr>
+              <m:t>χ</m:t>
+            </m:r>
+          </m:sub>
+        </m:sSub>
+        <m:r>
+          <m:rPr>
+            <m:sty m:val="p"/>
+          </m:rPr>
+          <w:rPr>
+            <w:rFonts w:ascii="Cambria Math" w:hAnsi="Cambria Math" w:eastAsia="Cambria Math" w:cs="Cambria Math"/>
+            <w:sz w:val="20"/>
+            <w:szCs w:val="20"/>
+          </w:rPr>
+          <m:t>[</m:t>
+        </m:r>
+        <m:r>
+          <m:rPr>
+            <m:sty m:val="i"/>
+          </m:rPr>
+          <w:rPr>
+            <w:rFonts w:ascii="Cambria Math" w:hAnsi="Cambria Math" w:eastAsia="Cambria Math" w:cs="Cambria Math"/>
+            <w:sz w:val="20"/>
+            <w:szCs w:val="20"/>
+          </w:rPr>
+          <m:t>k</m:t>
+        </m:r>
+        <m:r>
+          <m:rPr>
+            <m:sty m:val="p"/>
+          </m:rPr>
+          <w:rPr>
+            <w:rFonts w:ascii="Cambria Math" w:hAnsi="Cambria Math" w:eastAsia="Cambria Math" w:cs="Cambria Math"/>
+            <w:sz w:val="20"/>
+            <w:szCs w:val="20"/>
+          </w:rPr>
+          <m:t>]</m:t>
+        </m:r>
+      </m:oMath>
       <w:r>
         <w:rPr>
           <w:rFonts w:hint="eastAsia"/>
           <w:sz w:val="20"/>
           <w:szCs w:val="20"/>
         </w:rPr>
-        <w:t>PID，其表达式为</w:t>
+        <w:t xml:space="preserve"> 为累加后的支撑高度修正量，</w:t>
+      </w:r>
+      <m:oMath>
+        <m:sSub>
+          <m:e>
+            <m:r>
+              <m:rPr>
+                <m:sty m:val="i"/>
+              </m:rPr>
+              <w:rPr>
+                <w:rFonts w:ascii="Cambria Math" w:hAnsi="Cambria Math" w:eastAsia="Cambria Math" w:cs="Cambria Math"/>
+                <w:sz w:val="20"/>
+                <w:szCs w:val="20"/>
+              </w:rPr>
+              <m:t>u</m:t>
+            </m:r>
+          </m:e>
+          <m:sub>
+            <m:r>
+              <m:rPr>
+                <m:sty m:val="i"/>
+              </m:rPr>
+              <w:rPr>
+                <w:rFonts w:ascii="Cambria Math" w:hAnsi="Cambria Math" w:eastAsia="Cambria Math" w:cs="Cambria Math"/>
+                <w:sz w:val="20"/>
+                <w:szCs w:val="20"/>
+              </w:rPr>
+              <m:t>χ</m:t>
+            </m:r>
+          </m:sub>
+        </m:sSub>
+        <m:r>
+          <m:rPr>
+            <m:sty m:val="p"/>
+          </m:rPr>
+          <w:rPr>
+            <w:rFonts w:ascii="Cambria Math" w:hAnsi="Cambria Math" w:eastAsia="Cambria Math" w:cs="Cambria Math"/>
+            <w:sz w:val="20"/>
+            <w:szCs w:val="20"/>
+          </w:rPr>
+          <m:t>[</m:t>
+        </m:r>
+        <m:r>
+          <m:rPr>
+            <m:sty m:val="i"/>
+          </m:rPr>
+          <w:rPr>
+            <w:rFonts w:ascii="Cambria Math" w:hAnsi="Cambria Math" w:eastAsia="Cambria Math" w:cs="Cambria Math"/>
+            <w:sz w:val="20"/>
+            <w:szCs w:val="20"/>
+          </w:rPr>
+          <m:t>k</m:t>
+        </m:r>
+        <m:r>
+          <m:rPr>
+            <m:sty m:val="p"/>
+          </m:rPr>
+          <w:rPr>
+            <w:rFonts w:ascii="Cambria Math" w:hAnsi="Cambria Math" w:eastAsia="Cambria Math" w:cs="Cambria Math"/>
+            <w:sz w:val="20"/>
+            <w:szCs w:val="20"/>
+          </w:rPr>
+          <m:t>−1</m:t>
+        </m:r>
+        <m:r>
+          <m:rPr>
+            <m:sty m:val="p"/>
+          </m:rPr>
+          <w:rPr>
+            <w:rFonts w:ascii="Cambria Math" w:hAnsi="Cambria Math" w:eastAsia="Cambria Math" w:cs="Cambria Math"/>
+            <w:sz w:val="20"/>
+            <w:szCs w:val="20"/>
+          </w:rPr>
+          <m:t>]</m:t>
+        </m:r>
+      </m:oMath>
+      <w:r>
+        <w:rPr>
+          <w:rFonts w:hint="eastAsia"/>
+          <w:sz w:val="20"/>
+          <w:szCs w:val="20"/>
+        </w:rPr>
+        <w:t xml:space="preserve"> 为上一周期的值；高度修正量及其增量的单位均为 m。</w:t>
+      </w:r>
+    </w:p>
+    <w:p>
+      <w:pPr>
+        <w:pStyle w:val="7"/>
+        <w:numPr>
+          <w:ilvl w:val="0"/>
+          <w:numId w:val="0"/>
+        </w:numPr>
+        <w:snapToGrid w:val="0"/>
+        <w:rPr>
+          <w:sz w:val="20"/>
+        </w:rPr>
+      </w:pPr>
+      <w:r>
+        <w:rPr>
+          <w:rFonts w:hint="eastAsia"/>
+          <w:sz w:val="20"/>
+          <w:szCs w:val="20"/>
+        </w:rPr>
+        <w:t xml:space="preserve">原稿预留的增量式 PID 可作为这一增量调节接口的通用扩展；若采用离散 PID，其表达式为</w:t>
       </w:r>
     </w:p>
     <w:tbl>
@@ -17174,21 +17780,15 @@
           <w:sz w:val="20"/>
           <w:szCs w:val="20"/>
         </w:rPr>
-        <w:t>这里</w:t>
-      </w:r>
-      <w:r>
-        <w:rPr>
-          <w:sz w:val="20"/>
-          <w:szCs w:val="20"/>
-        </w:rPr>
-        <w:t xml:space="preserve"> </w:t>
+        <w:t xml:space="preserve">这里，</w:t>
       </w:r>
       <m:oMath>
         <m:sSub>
-          <m:sSubPr/>
           <m:e>
             <m:r>
-              <m:rPr/>
+              <m:rPr>
+                <m:sty m:val="i"/>
+              </m:rPr>
               <w:rPr>
                 <w:rFonts w:ascii="Cambria Math" w:hAnsi="Cambria Math" w:eastAsia="Cambria Math" w:cs="Cambria Math"/>
                 <w:sz w:val="20"/>
@@ -17214,61 +17814,191 @@
       </m:oMath>
       <w:r>
         <w:rPr>
-          <w:sz w:val="20"/>
-          <w:szCs w:val="20"/>
-        </w:rPr>
-        <w:t xml:space="preserve"> </w:t>
-      </w:r>
-      <w:r>
-        <w:rPr>
           <w:rFonts w:hint="eastAsia"/>
           <w:sz w:val="20"/>
           <w:szCs w:val="20"/>
         </w:rPr>
-        <w:t>为采样周期；各增益包含从角度误差到高度修正的量纲。该通用式不意味着报告已经验证了非零积分、微分增益的完整</w:t>
-      </w:r>
-      <w:r>
-        <w:rPr>
-          <w:sz w:val="20"/>
-          <w:szCs w:val="20"/>
-        </w:rPr>
-        <w:t xml:space="preserve"> PID </w:t>
-      </w:r>
+        <w:t xml:space="preserve"> 为采样周期，单位为 s；</w:t>
+      </w:r>
+      <m:oMath>
+        <m:sSub>
+          <m:e>
+            <m:r>
+              <m:rPr>
+                <m:sty m:val="i"/>
+              </m:rPr>
+              <w:rPr>
+                <w:rFonts w:ascii="Cambria Math" w:hAnsi="Cambria Math" w:eastAsia="Cambria Math" w:cs="Cambria Math"/>
+                <w:sz w:val="20"/>
+                <w:szCs w:val="20"/>
+              </w:rPr>
+              <m:t>K</m:t>
+            </m:r>
+          </m:e>
+          <m:sub>
+            <m:r>
+              <m:rPr>
+                <m:sty m:val="p"/>
+              </m:rPr>
+              <w:rPr>
+                <w:rFonts w:ascii="Cambria Math" w:hAnsi="Cambria Math" w:eastAsia="Cambria Math" w:cs="Cambria Math"/>
+                <w:sz w:val="20"/>
+                <w:szCs w:val="20"/>
+              </w:rPr>
+              <m:t>P</m:t>
+            </m:r>
+            <m:r>
+              <m:rPr>
+                <m:sty m:val="p"/>
+              </m:rPr>
+              <w:rPr>
+                <w:rFonts w:ascii="Cambria Math" w:hAnsi="Cambria Math" w:eastAsia="Cambria Math" w:cs="Cambria Math"/>
+                <w:sz w:val="20"/>
+                <w:szCs w:val="20"/>
+              </w:rPr>
+              <m:t>,</m:t>
+            </m:r>
+            <m:r>
+              <m:rPr>
+                <m:sty m:val="i"/>
+              </m:rPr>
+              <w:rPr>
+                <w:rFonts w:ascii="Cambria Math" w:hAnsi="Cambria Math" w:eastAsia="Cambria Math" w:cs="Cambria Math"/>
+                <w:sz w:val="20"/>
+                <w:szCs w:val="20"/>
+              </w:rPr>
+              <m:t>χ</m:t>
+            </m:r>
+          </m:sub>
+        </m:sSub>
+      </m:oMath>
       <w:r>
         <w:rPr>
           <w:rFonts w:hint="eastAsia"/>
           <w:sz w:val="20"/>
           <w:szCs w:val="20"/>
         </w:rPr>
-        <w:t>实现。</w:t>
-      </w:r>
-    </w:p>
-    <w:p>
-      <w:pPr>
-        <w:pStyle w:val="7"/>
-        <w:numPr>
-          <w:ilvl w:val="0"/>
-          <w:numId w:val="0"/>
-        </w:numPr>
-        <w:snapToGrid w:val="0"/>
-        <w:rPr>
-          <w:sz w:val="20"/>
-        </w:rPr>
-      </w:pPr>
+        <w:t xml:space="preserve">、</w:t>
+      </w:r>
+      <m:oMath>
+        <m:sSub>
+          <m:e>
+            <m:r>
+              <m:rPr>
+                <m:sty m:val="i"/>
+              </m:rPr>
+              <w:rPr>
+                <w:rFonts w:ascii="Cambria Math" w:hAnsi="Cambria Math" w:eastAsia="Cambria Math" w:cs="Cambria Math"/>
+                <w:sz w:val="20"/>
+                <w:szCs w:val="20"/>
+              </w:rPr>
+              <m:t>K</m:t>
+            </m:r>
+          </m:e>
+          <m:sub>
+            <m:r>
+              <m:rPr>
+                <m:sty m:val="p"/>
+              </m:rPr>
+              <w:rPr>
+                <w:rFonts w:ascii="Cambria Math" w:hAnsi="Cambria Math" w:eastAsia="Cambria Math" w:cs="Cambria Math"/>
+                <w:sz w:val="20"/>
+                <w:szCs w:val="20"/>
+              </w:rPr>
+              <m:t>I</m:t>
+            </m:r>
+            <m:r>
+              <m:rPr>
+                <m:sty m:val="p"/>
+              </m:rPr>
+              <w:rPr>
+                <w:rFonts w:ascii="Cambria Math" w:hAnsi="Cambria Math" w:eastAsia="Cambria Math" w:cs="Cambria Math"/>
+                <w:sz w:val="20"/>
+                <w:szCs w:val="20"/>
+              </w:rPr>
+              <m:t>,</m:t>
+            </m:r>
+            <m:r>
+              <m:rPr>
+                <m:sty m:val="i"/>
+              </m:rPr>
+              <w:rPr>
+                <w:rFonts w:ascii="Cambria Math" w:hAnsi="Cambria Math" w:eastAsia="Cambria Math" w:cs="Cambria Math"/>
+                <w:sz w:val="20"/>
+                <w:szCs w:val="20"/>
+              </w:rPr>
+              <m:t>χ</m:t>
+            </m:r>
+          </m:sub>
+        </m:sSub>
+      </m:oMath>
       <w:r>
         <w:rPr>
           <w:rFonts w:hint="eastAsia"/>
           <w:sz w:val="20"/>
           <w:szCs w:val="20"/>
         </w:rPr>
-        <w:t>设名义轮心平面坐标为</w:t>
-      </w:r>
-      <w:r>
-        <w:rPr>
-          <w:sz w:val="20"/>
-          <w:szCs w:val="20"/>
-        </w:rPr>
-        <w:t xml:space="preserve"> </w:t>
+        <w:t xml:space="preserve">、</w:t>
+      </w:r>
+      <m:oMath>
+        <m:sSub>
+          <m:e>
+            <m:r>
+              <m:rPr>
+                <m:sty m:val="i"/>
+              </m:rPr>
+              <w:rPr>
+                <w:rFonts w:ascii="Cambria Math" w:hAnsi="Cambria Math" w:eastAsia="Cambria Math" w:cs="Cambria Math"/>
+                <w:sz w:val="20"/>
+                <w:szCs w:val="20"/>
+              </w:rPr>
+              <m:t>K</m:t>
+            </m:r>
+          </m:e>
+          <m:sub>
+            <m:r>
+              <m:rPr>
+                <m:sty m:val="p"/>
+              </m:rPr>
+              <w:rPr>
+                <w:rFonts w:ascii="Cambria Math" w:hAnsi="Cambria Math" w:eastAsia="Cambria Math" w:cs="Cambria Math"/>
+                <w:sz w:val="20"/>
+                <w:szCs w:val="20"/>
+              </w:rPr>
+              <m:t>D</m:t>
+            </m:r>
+            <m:r>
+              <m:rPr>
+                <m:sty m:val="p"/>
+              </m:rPr>
+              <w:rPr>
+                <w:rFonts w:ascii="Cambria Math" w:hAnsi="Cambria Math" w:eastAsia="Cambria Math" w:cs="Cambria Math"/>
+                <w:sz w:val="20"/>
+                <w:szCs w:val="20"/>
+              </w:rPr>
+              <m:t>,</m:t>
+            </m:r>
+            <m:r>
+              <m:rPr>
+                <m:sty m:val="i"/>
+              </m:rPr>
+              <w:rPr>
+                <w:rFonts w:ascii="Cambria Math" w:hAnsi="Cambria Math" w:eastAsia="Cambria Math" w:cs="Cambria Math"/>
+                <w:sz w:val="20"/>
+                <w:szCs w:val="20"/>
+              </w:rPr>
+              <m:t>χ</m:t>
+            </m:r>
+          </m:sub>
+        </m:sSub>
+      </m:oMath>
+      <w:r>
+        <w:rPr>
+          <w:rFonts w:hint="eastAsia"/>
+          <w:sz w:val="20"/>
+          <w:szCs w:val="20"/>
+        </w:rPr>
+        <w:t xml:space="preserve"> 分别为比例、积分、微分增益，其单位应使输出 </w:t>
       </w:r>
       <m:oMath>
         <m:r>
@@ -17280,30 +18010,33 @@
             <w:sz w:val="20"/>
             <w:szCs w:val="20"/>
           </w:rPr>
-          <m:t>(</m:t>
+          <m:t>Δ</m:t>
         </m:r>
         <m:sSub>
-          <m:sSubPr/>
           <m:e>
             <m:r>
-              <m:rPr/>
-              <w:rPr>
-                <w:rFonts w:ascii="Cambria Math" w:hAnsi="Cambria Math" w:eastAsia="Cambria Math" w:cs="Cambria Math"/>
-                <w:sz w:val="20"/>
-                <w:szCs w:val="20"/>
-              </w:rPr>
-              <m:t>x</m:t>
+              <m:rPr>
+                <m:sty m:val="i"/>
+              </m:rPr>
+              <w:rPr>
+                <w:rFonts w:ascii="Cambria Math" w:hAnsi="Cambria Math" w:eastAsia="Cambria Math" w:cs="Cambria Math"/>
+                <w:sz w:val="20"/>
+                <w:szCs w:val="20"/>
+              </w:rPr>
+              <m:t>u</m:t>
             </m:r>
           </m:e>
           <m:sub>
             <m:r>
-              <m:rPr/>
-              <w:rPr>
-                <w:rFonts w:ascii="Cambria Math" w:hAnsi="Cambria Math" w:eastAsia="Cambria Math" w:cs="Cambria Math"/>
-                <w:sz w:val="20"/>
-                <w:szCs w:val="20"/>
-              </w:rPr>
-              <m:t>i</m:t>
+              <m:rPr>
+                <m:sty m:val="i"/>
+              </m:rPr>
+              <w:rPr>
+                <w:rFonts w:ascii="Cambria Math" w:hAnsi="Cambria Math" w:eastAsia="Cambria Math" w:cs="Cambria Math"/>
+                <w:sz w:val="20"/>
+                <w:szCs w:val="20"/>
+              </w:rPr>
+              <m:t>χ</m:t>
             </m:r>
           </m:sub>
         </m:sSub>
@@ -17316,33 +18049,19 @@
             <w:sz w:val="20"/>
             <w:szCs w:val="20"/>
           </w:rPr>
-          <m:t>,</m:t>
+          <m:t>[</m:t>
         </m:r>
-        <m:sSub>
-          <m:sSubPr/>
-          <m:e>
-            <m:r>
-              <m:rPr/>
-              <w:rPr>
-                <w:rFonts w:ascii="Cambria Math" w:hAnsi="Cambria Math" w:eastAsia="Cambria Math" w:cs="Cambria Math"/>
-                <w:sz w:val="20"/>
-                <w:szCs w:val="20"/>
-              </w:rPr>
-              <m:t>y</m:t>
-            </m:r>
-          </m:e>
-          <m:sub>
-            <m:r>
-              <m:rPr/>
-              <w:rPr>
-                <w:rFonts w:ascii="Cambria Math" w:hAnsi="Cambria Math" w:eastAsia="Cambria Math" w:cs="Cambria Math"/>
-                <w:sz w:val="20"/>
-                <w:szCs w:val="20"/>
-              </w:rPr>
-              <m:t>i</m:t>
-            </m:r>
-          </m:sub>
-        </m:sSub>
+        <m:r>
+          <m:rPr>
+            <m:sty m:val="i"/>
+          </m:rPr>
+          <w:rPr>
+            <w:rFonts w:ascii="Cambria Math" w:hAnsi="Cambria Math" w:eastAsia="Cambria Math" w:cs="Cambria Math"/>
+            <w:sz w:val="20"/>
+            <w:szCs w:val="20"/>
+          </w:rPr>
+          <m:t>k</m:t>
+        </m:r>
         <m:r>
           <m:rPr>
             <m:sty m:val="p"/>
@@ -17352,7 +18071,7 @@
             <w:sz w:val="20"/>
             <w:szCs w:val="20"/>
           </w:rPr>
-          <m:t>)</m:t>
+          <m:t>]</m:t>
         </m:r>
       </m:oMath>
       <w:r>
@@ -17361,65 +18080,139 @@
           <w:sz w:val="20"/>
           <w:szCs w:val="20"/>
         </w:rPr>
-        <w:t>，取四腿近似对称分布，前后、左右半间距分别为</w:t>
-      </w:r>
-      <w:r>
-        <w:rPr>
-          <w:sz w:val="20"/>
-          <w:szCs w:val="20"/>
-        </w:rPr>
-        <w:t xml:space="preserve"> </w:t>
+        <w:t xml:space="preserve"> 的单位为 m。式（19）是可选扩展，不意味着报告已验证非零积分、微分增益的完整 PID 实现。</w:t>
+      </w:r>
+    </w:p>
+    <w:p>
+      <w:pPr>
+        <w:pStyle w:val="7"/>
+        <w:numPr>
+          <w:ilvl w:val="0"/>
+          <w:numId w:val="0"/>
+        </w:numPr>
+        <w:snapToGrid w:val="0"/>
+        <w:rPr>
+          <w:sz w:val="20"/>
+        </w:rPr>
+      </w:pPr>
+      <w:r>
+        <w:rPr>
+          <w:rFonts w:hint="eastAsia"/>
+          <w:sz w:val="20"/>
+          <w:szCs w:val="20"/>
+        </w:rPr>
+        <w:t xml:space="preserve">在机体系中，</w:t>
       </w:r>
       <m:oMath>
         <m:sSub>
-          <m:sSubPr/>
           <m:e>
             <m:r>
-              <m:rPr/>
-              <w:rPr>
-                <w:rFonts w:ascii="Cambria Math" w:hAnsi="Cambria Math" w:eastAsia="Cambria Math" w:cs="Cambria Math"/>
-                <w:sz w:val="20"/>
-                <w:szCs w:val="20"/>
-              </w:rPr>
-              <m:t>a</m:t>
+              <m:rPr>
+                <m:sty m:val="i"/>
+              </m:rPr>
+              <w:rPr>
+                <w:rFonts w:ascii="Cambria Math" w:hAnsi="Cambria Math" w:eastAsia="Cambria Math" w:cs="Cambria Math"/>
+                <w:sz w:val="20"/>
+                <w:szCs w:val="20"/>
+              </w:rPr>
+              <m:t>x</m:t>
             </m:r>
           </m:e>
           <m:sub>
             <m:r>
               <m:rPr>
-                <m:sty m:val="p"/>
+                <m:sty m:val="i"/>
               </m:rPr>
               <w:rPr>
                 <w:rFonts w:ascii="Cambria Math" w:hAnsi="Cambria Math" w:eastAsia="Cambria Math" w:cs="Cambria Math"/>
                 <w:sz w:val="20"/>
                 <w:szCs w:val="20"/>
               </w:rPr>
-              <m:t>b</m:t>
+              <m:t>i</m:t>
             </m:r>
           </m:sub>
         </m:sSub>
+      </m:oMath>
+      <w:r>
+        <w:rPr>
+          <w:rFonts w:hint="eastAsia"/>
+          <w:sz w:val="20"/>
+          <w:szCs w:val="20"/>
+        </w:rPr>
+        <w:t xml:space="preserve">、</w:t>
+      </w:r>
+      <m:oMath>
+        <m:sSub>
+          <m:e>
+            <m:r>
+              <m:rPr>
+                <m:sty m:val="i"/>
+              </m:rPr>
+              <w:rPr>
+                <w:rFonts w:ascii="Cambria Math" w:hAnsi="Cambria Math" w:eastAsia="Cambria Math" w:cs="Cambria Math"/>
+                <w:sz w:val="20"/>
+                <w:szCs w:val="20"/>
+              </w:rPr>
+              <m:t>y</m:t>
+            </m:r>
+          </m:e>
+          <m:sub>
+            <m:r>
+              <m:rPr>
+                <m:sty m:val="i"/>
+              </m:rPr>
+              <w:rPr>
+                <w:rFonts w:ascii="Cambria Math" w:hAnsi="Cambria Math" w:eastAsia="Cambria Math" w:cs="Cambria Math"/>
+                <w:sz w:val="20"/>
+                <w:szCs w:val="20"/>
+              </w:rPr>
+              <m:t>i</m:t>
+            </m:r>
+          </m:sub>
+        </m:sSub>
+      </m:oMath>
+      <w:r>
+        <w:rPr>
+          <w:rFonts w:hint="eastAsia"/>
+          <w:sz w:val="20"/>
+          <w:szCs w:val="20"/>
+        </w:rPr>
+        <w:t xml:space="preserve"> 分别为第 </w:t>
+      </w:r>
+      <m:oMath>
         <m:r>
           <m:rPr>
-            <m:sty m:val="p"/>
+            <m:sty m:val="i"/>
           </m:rPr>
           <w:rPr>
             <w:rFonts w:ascii="Cambria Math" w:hAnsi="Cambria Math" w:eastAsia="Cambria Math" w:cs="Cambria Math"/>
             <w:sz w:val="20"/>
             <w:szCs w:val="20"/>
           </w:rPr>
-          <m:t>,</m:t>
+          <m:t>i</m:t>
         </m:r>
+      </m:oMath>
+      <w:r>
+        <w:rPr>
+          <w:rFonts w:hint="eastAsia"/>
+          <w:sz w:val="20"/>
+          <w:szCs w:val="20"/>
+        </w:rPr>
+        <w:t xml:space="preserve"> 个轮心的名义前向、左向坐标。取四腿近似对称分布，</w:t>
+      </w:r>
+      <m:oMath>
         <m:sSub>
-          <m:sSubPr/>
           <m:e>
             <m:r>
-              <m:rPr/>
-              <w:rPr>
-                <w:rFonts w:ascii="Cambria Math" w:hAnsi="Cambria Math" w:eastAsia="Cambria Math" w:cs="Cambria Math"/>
-                <w:sz w:val="20"/>
-                <w:szCs w:val="20"/>
-              </w:rPr>
-              <m:t>b</m:t>
+              <m:rPr>
+                <m:sty m:val="i"/>
+              </m:rPr>
+              <w:rPr>
+                <w:rFonts w:ascii="Cambria Math" w:hAnsi="Cambria Math" w:eastAsia="Cambria Math" w:cs="Cambria Math"/>
+                <w:sz w:val="20"/>
+                <w:szCs w:val="20"/>
+              </w:rPr>
+              <m:t>a</m:t>
             </m:r>
           </m:e>
           <m:sub>
@@ -17436,26 +18229,6 @@
             </m:r>
           </m:sub>
         </m:sSub>
-        <m:r>
-          <m:rPr>
-            <m:sty m:val="p"/>
-          </m:rPr>
-          <w:rPr>
-            <w:rFonts w:ascii="Cambria Math" w:hAnsi="Cambria Math" w:eastAsia="Cambria Math" w:cs="Cambria Math"/>
-            <w:sz w:val="20"/>
-            <w:szCs w:val="20"/>
-          </w:rPr>
-          <m:t>&gt;</m:t>
-        </m:r>
-        <m:r>
-          <m:rPr/>
-          <w:rPr>
-            <w:rFonts w:ascii="Cambria Math" w:hAnsi="Cambria Math" w:eastAsia="Cambria Math" w:cs="Cambria Math"/>
-            <w:sz w:val="20"/>
-            <w:szCs w:val="20"/>
-          </w:rPr>
-          <m:t>0</m:t>
-        </m:r>
       </m:oMath>
       <w:r>
         <w:rPr>
@@ -17463,7 +18236,45 @@
           <w:sz w:val="20"/>
           <w:szCs w:val="20"/>
         </w:rPr>
-        <w:t>。在小姿态角和触点高度暂时固定的条件下，可将修正分配为</w:t>
+        <w:t xml:space="preserve">、</w:t>
+      </w:r>
+      <m:oMath>
+        <m:sSub>
+          <m:e>
+            <m:r>
+              <m:rPr>
+                <m:sty m:val="i"/>
+              </m:rPr>
+              <w:rPr>
+                <w:rFonts w:ascii="Cambria Math" w:hAnsi="Cambria Math" w:eastAsia="Cambria Math" w:cs="Cambria Math"/>
+                <w:sz w:val="20"/>
+                <w:szCs w:val="20"/>
+              </w:rPr>
+              <m:t>b</m:t>
+            </m:r>
+          </m:e>
+          <m:sub>
+            <m:r>
+              <m:rPr>
+                <m:sty m:val="p"/>
+              </m:rPr>
+              <w:rPr>
+                <w:rFonts w:ascii="Cambria Math" w:hAnsi="Cambria Math" w:eastAsia="Cambria Math" w:cs="Cambria Math"/>
+                <w:sz w:val="20"/>
+                <w:szCs w:val="20"/>
+              </w:rPr>
+              <m:t>b</m:t>
+            </m:r>
+          </m:sub>
+        </m:sSub>
+      </m:oMath>
+      <w:r>
+        <w:rPr>
+          <w:rFonts w:hint="eastAsia"/>
+          <w:sz w:val="20"/>
+          <w:szCs w:val="20"/>
+        </w:rPr>
+        <w:t xml:space="preserve"> 分别为前后、左右轮心间距的一半，均为正值，单位为 m。在小姿态角和触点高度暂时固定的条件下，可将修正分配为</w:t>
       </w:r>
     </w:p>
     <w:tbl>
@@ -17922,21 +18733,15 @@
           <w:sz w:val="20"/>
           <w:szCs w:val="20"/>
         </w:rPr>
-        <w:t>此处</w:t>
-      </w:r>
-      <w:r>
-        <w:rPr>
-          <w:sz w:val="20"/>
-          <w:szCs w:val="20"/>
-        </w:rPr>
-        <w:t xml:space="preserve"> </w:t>
+        <w:t xml:space="preserve">其中，</w:t>
       </w:r>
       <m:oMath>
-        <m:sSubSup>
-          <m:sSubSupPr/>
+        <m:sSub>
           <m:e>
             <m:r>
-              <m:rPr/>
+              <m:rPr>
+                <m:sty m:val="i"/>
+              </m:rPr>
               <w:rPr>
                 <w:rFonts w:ascii="Cambria Math" w:hAnsi="Cambria Math" w:eastAsia="Cambria Math" w:cs="Cambria Math"/>
                 <w:sz w:val="20"/>
@@ -17946,17 +18751,6 @@
             </m:r>
           </m:e>
           <m:sub>
-            <m:r>
-              <m:rPr/>
-              <w:rPr>
-                <w:rFonts w:ascii="Cambria Math" w:hAnsi="Cambria Math" w:eastAsia="Cambria Math" w:cs="Cambria Math"/>
-                <w:sz w:val="20"/>
-                <w:szCs w:val="20"/>
-              </w:rPr>
-              <m:t>i</m:t>
-            </m:r>
-          </m:sub>
-          <m:sup>
             <m:r>
               <m:rPr>
                 <m:sty m:val="p"/>
@@ -17966,48 +18760,52 @@
                 <w:sz w:val="20"/>
                 <w:szCs w:val="20"/>
               </w:rPr>
-              <m:t>d</m:t>
-            </m:r>
-          </m:sup>
-        </m:sSubSup>
+              <m:t>0</m:t>
+            </m:r>
+          </m:sub>
+        </m:sSub>
       </m:oMath>
       <w:r>
         <w:rPr>
-          <w:sz w:val="20"/>
-          <w:szCs w:val="20"/>
-        </w:rPr>
-        <w:t xml:space="preserve"> </w:t>
-      </w:r>
-      <w:r>
-        <w:rPr>
           <w:rFonts w:hint="eastAsia"/>
           <w:sz w:val="20"/>
           <w:szCs w:val="20"/>
         </w:rPr>
-        <w:t>为向下的支撑高度，腿基系相应目标为</w:t>
-      </w:r>
-      <w:r>
-        <w:rPr>
-          <w:sz w:val="20"/>
-          <w:szCs w:val="20"/>
-        </w:rPr>
-        <w:t xml:space="preserve"> </w:t>
+        <w:t xml:space="preserve"> 为名义支撑高度，</w:t>
       </w:r>
       <m:oMath>
-        <m:sSubSup>
-          <m:sSubSupPr/>
+        <m:sSup>
           <m:e>
-            <m:r>
-              <m:rPr/>
-              <w:rPr>
-                <w:rFonts w:ascii="Cambria Math" w:hAnsi="Cambria Math" w:eastAsia="Cambria Math" w:cs="Cambria Math"/>
-                <w:sz w:val="20"/>
-                <w:szCs w:val="20"/>
-              </w:rPr>
-              <m:t>y</m:t>
-            </m:r>
+            <m:sSub>
+              <m:e>
+                <m:r>
+                  <m:rPr>
+                    <m:sty m:val="i"/>
+                  </m:rPr>
+                  <w:rPr>
+                    <w:rFonts w:ascii="Cambria Math" w:hAnsi="Cambria Math" w:eastAsia="Cambria Math" w:cs="Cambria Math"/>
+                    <w:sz w:val="20"/>
+                    <w:szCs w:val="20"/>
+                  </w:rPr>
+                  <m:t>h</m:t>
+                </m:r>
+              </m:e>
+              <m:sub>
+                <m:r>
+                  <m:rPr>
+                    <m:sty m:val="i"/>
+                  </m:rPr>
+                  <w:rPr>
+                    <w:rFonts w:ascii="Cambria Math" w:hAnsi="Cambria Math" w:eastAsia="Cambria Math" w:cs="Cambria Math"/>
+                    <w:sz w:val="20"/>
+                    <w:szCs w:val="20"/>
+                  </w:rPr>
+                  <m:t>i</m:t>
+                </m:r>
+              </m:sub>
+            </m:sSub>
           </m:e>
-          <m:sub>
+          <m:sup>
             <m:r>
               <m:rPr>
                 <m:sty m:val="p"/>
@@ -18017,67 +18815,170 @@
                 <w:sz w:val="20"/>
                 <w:szCs w:val="20"/>
               </w:rPr>
-              <m:t>a,</m:t>
-            </m:r>
-            <m:r>
-              <m:rPr/>
-              <w:rPr>
-                <w:rFonts w:ascii="Cambria Math" w:hAnsi="Cambria Math" w:eastAsia="Cambria Math" w:cs="Cambria Math"/>
-                <w:sz w:val="20"/>
-                <w:szCs w:val="20"/>
-              </w:rPr>
-              <m:t>i</m:t>
-            </m:r>
-          </m:sub>
-          <m:sup>
-            <m:r>
-              <m:rPr>
-                <m:sty m:val="p"/>
-              </m:rPr>
-              <w:rPr>
-                <w:rFonts w:ascii="Cambria Math" w:hAnsi="Cambria Math" w:eastAsia="Cambria Math" w:cs="Cambria Math"/>
-                <w:sz w:val="20"/>
-                <w:szCs w:val="20"/>
-              </w:rPr>
               <m:t>d</m:t>
             </m:r>
           </m:sup>
-        </m:sSubSup>
+        </m:sSup>
+      </m:oMath>
+      <w:r>
+        <w:rPr>
+          <w:rFonts w:hint="eastAsia"/>
+          <w:sz w:val="20"/>
+          <w:szCs w:val="20"/>
+        </w:rPr>
+        <w:t xml:space="preserve"> 为第 </w:t>
+      </w:r>
+      <m:oMath>
         <m:r>
           <m:rPr>
-            <m:sty m:val="p"/>
+            <m:sty m:val="i"/>
           </m:rPr>
           <w:rPr>
             <w:rFonts w:ascii="Cambria Math" w:hAnsi="Cambria Math" w:eastAsia="Cambria Math" w:cs="Cambria Math"/>
             <w:sz w:val="20"/>
             <w:szCs w:val="20"/>
           </w:rPr>
-          <m:t>=−</m:t>
+          <m:t>i</m:t>
         </m:r>
-        <m:sSubSup>
-          <m:sSubSupPr/>
+      </m:oMath>
+      <w:r>
+        <w:rPr>
+          <w:rFonts w:hint="eastAsia"/>
+          <w:sz w:val="20"/>
+          <w:szCs w:val="20"/>
+        </w:rPr>
+        <w:t xml:space="preserve"> 条腿的期望支撑高度，均以向下为正、单位为 m；</w:t>
+      </w:r>
+      <m:oMath>
+        <m:sSub>
           <m:e>
             <m:r>
-              <m:rPr/>
-              <w:rPr>
-                <w:rFonts w:ascii="Cambria Math" w:hAnsi="Cambria Math" w:eastAsia="Cambria Math" w:cs="Cambria Math"/>
-                <w:sz w:val="20"/>
-                <w:szCs w:val="20"/>
-              </w:rPr>
-              <m:t>h</m:t>
+              <m:rPr>
+                <m:sty m:val="i"/>
+              </m:rPr>
+              <w:rPr>
+                <w:rFonts w:ascii="Cambria Math" w:hAnsi="Cambria Math" w:eastAsia="Cambria Math" w:cs="Cambria Math"/>
+                <w:sz w:val="20"/>
+                <w:szCs w:val="20"/>
+              </w:rPr>
+              <m:t>u</m:t>
             </m:r>
           </m:e>
           <m:sub>
             <m:r>
-              <m:rPr/>
-              <w:rPr>
-                <w:rFonts w:ascii="Cambria Math" w:hAnsi="Cambria Math" w:eastAsia="Cambria Math" w:cs="Cambria Math"/>
-                <w:sz w:val="20"/>
-                <w:szCs w:val="20"/>
-              </w:rPr>
-              <m:t>i</m:t>
+              <m:rPr>
+                <m:sty m:val="i"/>
+              </m:rPr>
+              <w:rPr>
+                <w:rFonts w:ascii="Cambria Math" w:hAnsi="Cambria Math" w:eastAsia="Cambria Math" w:cs="Cambria Math"/>
+                <w:sz w:val="20"/>
+                <w:szCs w:val="20"/>
+              </w:rPr>
+              <m:t>ϕ</m:t>
             </m:r>
           </m:sub>
+        </m:sSub>
+      </m:oMath>
+      <w:r>
+        <w:rPr>
+          <w:rFonts w:hint="eastAsia"/>
+          <w:sz w:val="20"/>
+          <w:szCs w:val="20"/>
+        </w:rPr>
+        <w:t xml:space="preserve">、</w:t>
+      </w:r>
+      <m:oMath>
+        <m:sSub>
+          <m:e>
+            <m:r>
+              <m:rPr>
+                <m:sty m:val="i"/>
+              </m:rPr>
+              <w:rPr>
+                <w:rFonts w:ascii="Cambria Math" w:hAnsi="Cambria Math" w:eastAsia="Cambria Math" w:cs="Cambria Math"/>
+                <w:sz w:val="20"/>
+                <w:szCs w:val="20"/>
+              </w:rPr>
+              <m:t>u</m:t>
+            </m:r>
+          </m:e>
+          <m:sub>
+            <m:r>
+              <m:rPr>
+                <m:sty m:val="i"/>
+              </m:rPr>
+              <w:rPr>
+                <w:rFonts w:ascii="Cambria Math" w:hAnsi="Cambria Math" w:eastAsia="Cambria Math" w:cs="Cambria Math"/>
+                <w:sz w:val="20"/>
+                <w:szCs w:val="20"/>
+              </w:rPr>
+              <m:t>θ</m:t>
+            </m:r>
+          </m:sub>
+        </m:sSub>
+      </m:oMath>
+      <w:r>
+        <w:rPr>
+          <w:rFonts w:hint="eastAsia"/>
+          <w:sz w:val="20"/>
+          <w:szCs w:val="20"/>
+        </w:rPr>
+        <w:t xml:space="preserve"> 分别为滚转、俯仰控制器输出的高度修正量。腿基系的轮心目标纵坐标为 </w:t>
+      </w:r>
+      <m:oMath>
+        <m:sSup>
+          <m:e>
+            <m:sSub>
+              <m:e>
+                <m:r>
+                  <m:rPr>
+                    <m:sty m:val="i"/>
+                  </m:rPr>
+                  <w:rPr>
+                    <w:rFonts w:ascii="Cambria Math" w:hAnsi="Cambria Math" w:eastAsia="Cambria Math" w:cs="Cambria Math"/>
+                    <w:sz w:val="20"/>
+                    <w:szCs w:val="20"/>
+                  </w:rPr>
+                  <m:t>y</m:t>
+                </m:r>
+              </m:e>
+              <m:sub>
+                <m:r>
+                  <m:rPr>
+                    <m:sty m:val="p"/>
+                  </m:rPr>
+                  <w:rPr>
+                    <w:rFonts w:ascii="Cambria Math" w:hAnsi="Cambria Math" w:eastAsia="Cambria Math" w:cs="Cambria Math"/>
+                    <w:sz w:val="20"/>
+                    <w:szCs w:val="20"/>
+                  </w:rPr>
+                  <m:t>a</m:t>
+                </m:r>
+                <m:r>
+                  <m:rPr>
+                    <m:sty m:val="p"/>
+                  </m:rPr>
+                  <w:rPr>
+                    <w:rFonts w:ascii="Cambria Math" w:hAnsi="Cambria Math" w:eastAsia="Cambria Math" w:cs="Cambria Math"/>
+                    <w:sz w:val="20"/>
+                    <w:szCs w:val="20"/>
+                  </w:rPr>
+                  <m:t>,</m:t>
+                </m:r>
+                <m:r>
+                  <m:rPr>
+                    <m:sty m:val="i"/>
+                  </m:rPr>
+                  <w:rPr>
+                    <w:rFonts w:ascii="Cambria Math" w:hAnsi="Cambria Math" w:eastAsia="Cambria Math" w:cs="Cambria Math"/>
+                    <w:sz w:val="20"/>
+                    <w:szCs w:val="20"/>
+                  </w:rPr>
+                  <m:t>i</m:t>
+                </m:r>
+              </m:sub>
+            </m:sSub>
+          </m:e>
           <m:sup>
             <m:r>
               <m:rPr>
@@ -18091,7 +18992,7 @@
               <m:t>d</m:t>
             </m:r>
           </m:sup>
-        </m:sSubSup>
+        </m:sSup>
       </m:oMath>
       <w:r>
         <w:rPr>
@@ -18099,7 +19000,62 @@
           <w:sz w:val="20"/>
           <w:szCs w:val="20"/>
         </w:rPr>
-        <w:t>。符号关系来自机身滚转与俯仰引起的髋部高度变化；实际坐标安装方向应据此标定。逆运动学随后将轮心目标转换为关节目标。高度、关节角及输出增量均需限幅，饱和时停止向不可达方向累加。</w:t>
+        <w:t xml:space="preserve"> = −</w:t>
+      </w:r>
+      <m:oMath>
+        <m:sSup>
+          <m:e>
+            <m:sSub>
+              <m:e>
+                <m:r>
+                  <m:rPr>
+                    <m:sty m:val="i"/>
+                  </m:rPr>
+                  <w:rPr>
+                    <w:rFonts w:ascii="Cambria Math" w:hAnsi="Cambria Math" w:eastAsia="Cambria Math" w:cs="Cambria Math"/>
+                    <w:sz w:val="20"/>
+                    <w:szCs w:val="20"/>
+                  </w:rPr>
+                  <m:t>h</m:t>
+                </m:r>
+              </m:e>
+              <m:sub>
+                <m:r>
+                  <m:rPr>
+                    <m:sty m:val="i"/>
+                  </m:rPr>
+                  <w:rPr>
+                    <w:rFonts w:ascii="Cambria Math" w:hAnsi="Cambria Math" w:eastAsia="Cambria Math" w:cs="Cambria Math"/>
+                    <w:sz w:val="20"/>
+                    <w:szCs w:val="20"/>
+                  </w:rPr>
+                  <m:t>i</m:t>
+                </m:r>
+              </m:sub>
+            </m:sSub>
+          </m:e>
+          <m:sup>
+            <m:r>
+              <m:rPr>
+                <m:sty m:val="p"/>
+              </m:rPr>
+              <w:rPr>
+                <w:rFonts w:ascii="Cambria Math" w:hAnsi="Cambria Math" w:eastAsia="Cambria Math" w:cs="Cambria Math"/>
+                <w:sz w:val="20"/>
+                <w:szCs w:val="20"/>
+              </w:rPr>
+              <m:t>d</m:t>
+            </m:r>
+          </m:sup>
+        </m:sSup>
+      </m:oMath>
+      <w:r>
+        <w:rPr>
+          <w:rFonts w:hint="eastAsia"/>
+          <w:sz w:val="20"/>
+          <w:szCs w:val="20"/>
+        </w:rPr>
+        <w:t xml:space="preserve">。符号关系来自机身滚转与俯仰引起的髋部高度变化；实际坐标安装方向应据此标定。逆运动学随后将轮心目标转换为关节目标。高度、关节角及输出增量均需限幅，饱和时停止向不可达方向累加。</w:t>
       </w:r>
     </w:p>
     <w:p>

</xml_diff>

<commit_message>
Remove optional PID extension from dual-loop P attitude control
</commit_message>
<xml_diff>
--- a/Article.docx
+++ b/Article.docx
@@ -15255,7 +15255,7 @@
           <w:sz w:val="20"/>
           <w:szCs w:val="20"/>
         </w:rPr>
-        <w:t>及角速度作为反馈。报告采用角度—角速度串级比例控制并累加腿高修正</w:t>
+        <w:t>及角速度作为反馈。本文采用角度—角速度双环 P 控制，并累加腿高修正</w:t>
       </w:r>
       <w:r>
         <w:rPr>
@@ -16697,7 +16697,7 @@
           <w:sz w:val="20"/>
           <w:szCs w:val="20"/>
         </w:rPr>
-        <w:t xml:space="preserve"> 为角速度环的离散增益，将角速度误差转换为本周期的高度修正增量 </w:t>
+        <w:t xml:space="preserve"> 为角速度环比例增益的离散形式，将角速度误差转换为本周期的高度修正增量 </w:t>
       </w:r>
       <m:oMath>
         <m:r>
@@ -16953,1154 +16953,6 @@
           <w:sz w:val="20"/>
           <w:szCs w:val="20"/>
         </w:rPr>
-        <w:t xml:space="preserve">原稿预留的增量式 PID 可作为这一增量调节接口的通用扩展；若采用离散 PID，其表达式为</w:t>
-      </w:r>
-    </w:p>
-    <w:tbl>
-      <w:tblPr>
-        <w:tblStyle w:val="10"/>
-        <w:tblW w:w="4866" w:type="dxa"/>
-        <w:tblCaption w:val="Equation 19"/>
-        <w:tblInd w:w="0" w:type="dxa"/>
-        <w:tblBorders>
-          <w:top w:val="none" w:color="B0B0B0" w:sz="4" w:space="0"/>
-          <w:left w:val="none" w:color="B0B0B0" w:sz="4" w:space="0"/>
-          <w:bottom w:val="none" w:color="B0B0B0" w:sz="4" w:space="0"/>
-          <w:right w:val="none" w:color="B0B0B0" w:sz="4" w:space="0"/>
-          <w:insideH w:val="none" w:color="B0B0B0" w:sz="4" w:space="0"/>
-          <w:insideV w:val="none" w:color="B0B0B0" w:sz="4" w:space="0"/>
-        </w:tblBorders>
-        <w:tblLayout w:type="fixed"/>
-        <w:tblCellMar>
-          <w:top w:w="0" w:type="dxa"/>
-          <w:left w:w="0" w:type="dxa"/>
-          <w:bottom w:w="0" w:type="dxa"/>
-          <w:right w:w="0" w:type="dxa"/>
-        </w:tblCellMar>
-      </w:tblPr>
-      <w:tblGrid>
-        <w:gridCol w:w="4476"/>
-        <w:gridCol w:w="390"/>
-      </w:tblGrid>
-      <w:tr>
-        <w:tblPrEx>
-          <w:tblBorders>
-            <w:top w:val="none" w:color="B0B0B0" w:sz="4" w:space="0"/>
-            <w:left w:val="none" w:color="B0B0B0" w:sz="4" w:space="0"/>
-            <w:bottom w:val="none" w:color="B0B0B0" w:sz="4" w:space="0"/>
-            <w:right w:val="none" w:color="B0B0B0" w:sz="4" w:space="0"/>
-            <w:insideH w:val="none" w:color="B0B0B0" w:sz="4" w:space="0"/>
-            <w:insideV w:val="none" w:color="B0B0B0" w:sz="4" w:space="0"/>
-          </w:tblBorders>
-          <w:tblCellMar>
-            <w:top w:w="0" w:type="dxa"/>
-            <w:left w:w="0" w:type="dxa"/>
-            <w:bottom w:w="0" w:type="dxa"/>
-            <w:right w:w="0" w:type="dxa"/>
-          </w:tblCellMar>
-        </w:tblPrEx>
-        <w:trPr>
-          <w:cantSplit/>
-        </w:trPr>
-        <w:tc>
-          <w:tcPr>
-            <w:tcW w:w="4476" w:type="dxa"/>
-            <w:vAlign w:val="center"/>
-          </w:tcPr>
-          <w:p>
-            <w:pPr>
-              <w:pStyle w:val="17"/>
-              <w:numPr>
-                <w:ilvl w:val="0"/>
-                <w:numId w:val="0"/>
-              </w:numPr>
-              <w:snapToGrid w:val="0"/>
-              <w:spacing w:before="100" w:after="100" w:line="240" w:lineRule="auto"/>
-              <w:ind w:left="0" w:right="0" w:firstLine="0"/>
-              <w:jc w:val="center"/>
-              <w:rPr>
-                <w:sz w:val="18"/>
-              </w:rPr>
-            </w:pPr>
-            <m:oMathPara>
-              <m:oMathParaPr>
-                <m:jc m:val="center"/>
-              </m:oMathParaPr>
-              <m:oMath>
-                <m:eqArr>
-                  <m:eqArrPr/>
-                  <m:e>
-                    <m:r>
-                      <m:rPr>
-                        <m:sty m:val="p"/>
-                      </m:rPr>
-                      <w:rPr>
-                        <w:rFonts w:ascii="Cambria Math" w:hAnsi="Cambria Math" w:eastAsia="Cambria Math" w:cs="Cambria Math"/>
-                        <w:sz w:val="18"/>
-                        <w:szCs w:val="18"/>
-                      </w:rPr>
-                      <m:t>Δ</m:t>
-                    </m:r>
-                    <m:sSub>
-                      <m:sSubPr/>
-                      <m:e>
-                        <m:r>
-                          <m:rPr/>
-                          <w:rPr>
-                            <w:rFonts w:ascii="Cambria Math" w:hAnsi="Cambria Math" w:eastAsia="Cambria Math" w:cs="Cambria Math"/>
-                            <w:sz w:val="18"/>
-                            <w:szCs w:val="18"/>
-                          </w:rPr>
-                          <m:t>u</m:t>
-                        </m:r>
-                      </m:e>
-                      <m:sub>
-                        <m:r>
-                          <m:rPr/>
-                          <w:rPr>
-                            <w:rFonts w:ascii="Cambria Math" w:hAnsi="Cambria Math" w:eastAsia="Cambria Math" w:cs="Cambria Math"/>
-                            <w:sz w:val="18"/>
-                            <w:szCs w:val="18"/>
-                          </w:rPr>
-                          <m:t>χ</m:t>
-                        </m:r>
-                      </m:sub>
-                    </m:sSub>
-                    <m:r>
-                      <m:rPr>
-                        <m:sty m:val="p"/>
-                      </m:rPr>
-                      <w:rPr>
-                        <w:rFonts w:ascii="Cambria Math" w:hAnsi="Cambria Math" w:eastAsia="Cambria Math" w:cs="Cambria Math"/>
-                        <w:sz w:val="18"/>
-                        <w:szCs w:val="18"/>
-                      </w:rPr>
-                      <m:t>[</m:t>
-                    </m:r>
-                    <m:r>
-                      <m:rPr/>
-                      <w:rPr>
-                        <w:rFonts w:ascii="Cambria Math" w:hAnsi="Cambria Math" w:eastAsia="Cambria Math" w:cs="Cambria Math"/>
-                        <w:sz w:val="18"/>
-                        <w:szCs w:val="18"/>
-                      </w:rPr>
-                      <m:t>k</m:t>
-                    </m:r>
-                    <m:r>
-                      <m:rPr>
-                        <m:sty m:val="p"/>
-                      </m:rPr>
-                      <w:rPr>
-                        <w:rFonts w:ascii="Cambria Math" w:hAnsi="Cambria Math" w:eastAsia="Cambria Math" w:cs="Cambria Math"/>
-                        <w:sz w:val="18"/>
-                        <w:szCs w:val="18"/>
-                      </w:rPr>
-                      <m:t>]=</m:t>
-                    </m:r>
-                    <m:r>
-                      <m:rPr/>
-                      <w:rPr>
-                        <w:rFonts w:ascii="Cambria Math" w:hAnsi="Cambria Math" w:eastAsia="Cambria Math" w:cs="Cambria Math"/>
-                        <w:sz w:val="18"/>
-                        <w:szCs w:val="18"/>
-                      </w:rPr>
-                      <m:t>​</m:t>
-                    </m:r>
-                    <m:sSub>
-                      <m:sSubPr/>
-                      <m:e>
-                        <m:r>
-                          <m:rPr/>
-                          <w:rPr>
-                            <w:rFonts w:ascii="Cambria Math" w:hAnsi="Cambria Math" w:eastAsia="Cambria Math" w:cs="Cambria Math"/>
-                            <w:sz w:val="18"/>
-                            <w:szCs w:val="18"/>
-                          </w:rPr>
-                          <m:t>K</m:t>
-                        </m:r>
-                      </m:e>
-                      <m:sub>
-                        <m:r>
-                          <m:rPr>
-                            <m:sty m:val="p"/>
-                          </m:rPr>
-                          <w:rPr>
-                            <w:rFonts w:ascii="Cambria Math" w:hAnsi="Cambria Math" w:eastAsia="Cambria Math" w:cs="Cambria Math"/>
-                            <w:sz w:val="18"/>
-                            <w:szCs w:val="18"/>
-                          </w:rPr>
-                          <m:t>P,</m:t>
-                        </m:r>
-                        <m:r>
-                          <m:rPr/>
-                          <w:rPr>
-                            <w:rFonts w:ascii="Cambria Math" w:hAnsi="Cambria Math" w:eastAsia="Cambria Math" w:cs="Cambria Math"/>
-                            <w:sz w:val="18"/>
-                            <w:szCs w:val="18"/>
-                          </w:rPr>
-                          <m:t>χ</m:t>
-                        </m:r>
-                      </m:sub>
-                    </m:sSub>
-                    <m:r>
-                      <m:rPr>
-                        <m:sty m:val="p"/>
-                      </m:rPr>
-                      <w:rPr>
-                        <w:rFonts w:ascii="Cambria Math" w:hAnsi="Cambria Math" w:eastAsia="Cambria Math" w:cs="Cambria Math"/>
-                        <w:sz w:val="18"/>
-                        <w:szCs w:val="18"/>
-                      </w:rPr>
-                      <m:t>(</m:t>
-                    </m:r>
-                    <m:sSub>
-                      <m:sSubPr/>
-                      <m:e>
-                        <m:r>
-                          <m:rPr/>
-                          <w:rPr>
-                            <w:rFonts w:ascii="Cambria Math" w:hAnsi="Cambria Math" w:eastAsia="Cambria Math" w:cs="Cambria Math"/>
-                            <w:sz w:val="18"/>
-                            <w:szCs w:val="18"/>
-                          </w:rPr>
-                          <m:t>e</m:t>
-                        </m:r>
-                      </m:e>
-                      <m:sub>
-                        <m:r>
-                          <m:rPr/>
-                          <w:rPr>
-                            <w:rFonts w:ascii="Cambria Math" w:hAnsi="Cambria Math" w:eastAsia="Cambria Math" w:cs="Cambria Math"/>
-                            <w:sz w:val="18"/>
-                            <w:szCs w:val="18"/>
-                          </w:rPr>
-                          <m:t>χ</m:t>
-                        </m:r>
-                      </m:sub>
-                    </m:sSub>
-                    <m:r>
-                      <m:rPr>
-                        <m:sty m:val="p"/>
-                      </m:rPr>
-                      <w:rPr>
-                        <w:rFonts w:ascii="Cambria Math" w:hAnsi="Cambria Math" w:eastAsia="Cambria Math" w:cs="Cambria Math"/>
-                        <w:sz w:val="18"/>
-                        <w:szCs w:val="18"/>
-                      </w:rPr>
-                      <m:t>[</m:t>
-                    </m:r>
-                    <m:r>
-                      <m:rPr/>
-                      <w:rPr>
-                        <w:rFonts w:ascii="Cambria Math" w:hAnsi="Cambria Math" w:eastAsia="Cambria Math" w:cs="Cambria Math"/>
-                        <w:sz w:val="18"/>
-                        <w:szCs w:val="18"/>
-                      </w:rPr>
-                      <m:t>k</m:t>
-                    </m:r>
-                    <m:r>
-                      <m:rPr>
-                        <m:sty m:val="p"/>
-                      </m:rPr>
-                      <w:rPr>
-                        <w:rFonts w:ascii="Cambria Math" w:hAnsi="Cambria Math" w:eastAsia="Cambria Math" w:cs="Cambria Math"/>
-                        <w:sz w:val="18"/>
-                        <w:szCs w:val="18"/>
-                      </w:rPr>
-                      <m:t>]−</m:t>
-                    </m:r>
-                    <m:sSub>
-                      <m:sSubPr/>
-                      <m:e>
-                        <m:r>
-                          <m:rPr/>
-                          <w:rPr>
-                            <w:rFonts w:ascii="Cambria Math" w:hAnsi="Cambria Math" w:eastAsia="Cambria Math" w:cs="Cambria Math"/>
-                            <w:sz w:val="18"/>
-                            <w:szCs w:val="18"/>
-                          </w:rPr>
-                          <m:t>e</m:t>
-                        </m:r>
-                      </m:e>
-                      <m:sub>
-                        <m:r>
-                          <m:rPr/>
-                          <w:rPr>
-                            <w:rFonts w:ascii="Cambria Math" w:hAnsi="Cambria Math" w:eastAsia="Cambria Math" w:cs="Cambria Math"/>
-                            <w:sz w:val="18"/>
-                            <w:szCs w:val="18"/>
-                          </w:rPr>
-                          <m:t>χ</m:t>
-                        </m:r>
-                      </m:sub>
-                    </m:sSub>
-                    <m:r>
-                      <m:rPr>
-                        <m:sty m:val="p"/>
-                      </m:rPr>
-                      <w:rPr>
-                        <w:rFonts w:ascii="Cambria Math" w:hAnsi="Cambria Math" w:eastAsia="Cambria Math" w:cs="Cambria Math"/>
-                        <w:sz w:val="18"/>
-                        <w:szCs w:val="18"/>
-                      </w:rPr>
-                      <m:t>[</m:t>
-                    </m:r>
-                    <m:r>
-                      <m:rPr/>
-                      <w:rPr>
-                        <w:rFonts w:ascii="Cambria Math" w:hAnsi="Cambria Math" w:eastAsia="Cambria Math" w:cs="Cambria Math"/>
-                        <w:sz w:val="18"/>
-                        <w:szCs w:val="18"/>
-                      </w:rPr>
-                      <m:t>k</m:t>
-                    </m:r>
-                    <m:r>
-                      <m:rPr>
-                        <m:sty m:val="p"/>
-                      </m:rPr>
-                      <w:rPr>
-                        <w:rFonts w:ascii="Cambria Math" w:hAnsi="Cambria Math" w:eastAsia="Cambria Math" w:cs="Cambria Math"/>
-                        <w:sz w:val="18"/>
-                        <w:szCs w:val="18"/>
-                      </w:rPr>
-                      <m:t>−</m:t>
-                    </m:r>
-                    <m:r>
-                      <m:rPr/>
-                      <w:rPr>
-                        <w:rFonts w:ascii="Cambria Math" w:hAnsi="Cambria Math" w:eastAsia="Cambria Math" w:cs="Cambria Math"/>
-                        <w:sz w:val="18"/>
-                        <w:szCs w:val="18"/>
-                      </w:rPr>
-                      <m:t>1</m:t>
-                    </m:r>
-                    <m:r>
-                      <m:rPr>
-                        <m:sty m:val="p"/>
-                      </m:rPr>
-                      <w:rPr>
-                        <w:rFonts w:ascii="Cambria Math" w:hAnsi="Cambria Math" w:eastAsia="Cambria Math" w:cs="Cambria Math"/>
-                        <w:sz w:val="18"/>
-                        <w:szCs w:val="18"/>
-                      </w:rPr>
-                      <m:t>])</m:t>
-                    </m:r>
-                  </m:e>
-                  <m:e>
-                    <m:r>
-                      <m:rPr>
-                        <m:sty m:val="p"/>
-                      </m:rPr>
-                      <w:rPr>
-                        <w:rFonts w:ascii="Cambria Math" w:hAnsi="Cambria Math" w:eastAsia="Cambria Math" w:cs="Cambria Math"/>
-                        <w:sz w:val="18"/>
-                        <w:szCs w:val="18"/>
-                      </w:rPr>
-                      <m:t>+</m:t>
-                    </m:r>
-                    <m:sSub>
-                      <m:sSubPr/>
-                      <m:e>
-                        <m:r>
-                          <m:rPr/>
-                          <w:rPr>
-                            <w:rFonts w:ascii="Cambria Math" w:hAnsi="Cambria Math" w:eastAsia="Cambria Math" w:cs="Cambria Math"/>
-                            <w:sz w:val="18"/>
-                            <w:szCs w:val="18"/>
-                          </w:rPr>
-                          <m:t>K</m:t>
-                        </m:r>
-                      </m:e>
-                      <m:sub>
-                        <m:r>
-                          <m:rPr>
-                            <m:sty m:val="p"/>
-                          </m:rPr>
-                          <w:rPr>
-                            <w:rFonts w:ascii="Cambria Math" w:hAnsi="Cambria Math" w:eastAsia="Cambria Math" w:cs="Cambria Math"/>
-                            <w:sz w:val="18"/>
-                            <w:szCs w:val="18"/>
-                          </w:rPr>
-                          <m:t>I,</m:t>
-                        </m:r>
-                        <m:r>
-                          <m:rPr/>
-                          <w:rPr>
-                            <w:rFonts w:ascii="Cambria Math" w:hAnsi="Cambria Math" w:eastAsia="Cambria Math" w:cs="Cambria Math"/>
-                            <w:sz w:val="18"/>
-                            <w:szCs w:val="18"/>
-                          </w:rPr>
-                          <m:t>χ</m:t>
-                        </m:r>
-                      </m:sub>
-                    </m:sSub>
-                    <m:sSub>
-                      <m:sSubPr/>
-                      <m:e>
-                        <m:r>
-                          <m:rPr/>
-                          <w:rPr>
-                            <w:rFonts w:ascii="Cambria Math" w:hAnsi="Cambria Math" w:eastAsia="Cambria Math" w:cs="Cambria Math"/>
-                            <w:sz w:val="18"/>
-                            <w:szCs w:val="18"/>
-                          </w:rPr>
-                          <m:t>T</m:t>
-                        </m:r>
-                      </m:e>
-                      <m:sub>
-                        <m:r>
-                          <m:rPr>
-                            <m:sty m:val="p"/>
-                          </m:rPr>
-                          <w:rPr>
-                            <w:rFonts w:ascii="Cambria Math" w:hAnsi="Cambria Math" w:eastAsia="Cambria Math" w:cs="Cambria Math"/>
-                            <w:sz w:val="18"/>
-                            <w:szCs w:val="18"/>
-                          </w:rPr>
-                          <m:t>s</m:t>
-                        </m:r>
-                      </m:sub>
-                    </m:sSub>
-                    <m:sSub>
-                      <m:sSubPr/>
-                      <m:e>
-                        <m:r>
-                          <m:rPr/>
-                          <w:rPr>
-                            <w:rFonts w:ascii="Cambria Math" w:hAnsi="Cambria Math" w:eastAsia="Cambria Math" w:cs="Cambria Math"/>
-                            <w:sz w:val="18"/>
-                            <w:szCs w:val="18"/>
-                          </w:rPr>
-                          <m:t>e</m:t>
-                        </m:r>
-                      </m:e>
-                      <m:sub>
-                        <m:r>
-                          <m:rPr/>
-                          <w:rPr>
-                            <w:rFonts w:ascii="Cambria Math" w:hAnsi="Cambria Math" w:eastAsia="Cambria Math" w:cs="Cambria Math"/>
-                            <w:sz w:val="18"/>
-                            <w:szCs w:val="18"/>
-                          </w:rPr>
-                          <m:t>χ</m:t>
-                        </m:r>
-                      </m:sub>
-                    </m:sSub>
-                    <m:r>
-                      <m:rPr>
-                        <m:sty m:val="p"/>
-                      </m:rPr>
-                      <w:rPr>
-                        <w:rFonts w:ascii="Cambria Math" w:hAnsi="Cambria Math" w:eastAsia="Cambria Math" w:cs="Cambria Math"/>
-                        <w:sz w:val="18"/>
-                        <w:szCs w:val="18"/>
-                      </w:rPr>
-                      <m:t>[</m:t>
-                    </m:r>
-                    <m:r>
-                      <m:rPr/>
-                      <w:rPr>
-                        <w:rFonts w:ascii="Cambria Math" w:hAnsi="Cambria Math" w:eastAsia="Cambria Math" w:cs="Cambria Math"/>
-                        <w:sz w:val="18"/>
-                        <w:szCs w:val="18"/>
-                      </w:rPr>
-                      <m:t>k</m:t>
-                    </m:r>
-                    <m:r>
-                      <m:rPr>
-                        <m:sty m:val="p"/>
-                      </m:rPr>
-                      <w:rPr>
-                        <w:rFonts w:ascii="Cambria Math" w:hAnsi="Cambria Math" w:eastAsia="Cambria Math" w:cs="Cambria Math"/>
-                        <w:sz w:val="18"/>
-                        <w:szCs w:val="18"/>
-                      </w:rPr>
-                      <m:t>]</m:t>
-                    </m:r>
-                  </m:e>
-                  <m:e>
-                    <m:r>
-                      <m:rPr>
-                        <m:sty m:val="p"/>
-                      </m:rPr>
-                      <w:rPr>
-                        <w:rFonts w:ascii="Cambria Math" w:hAnsi="Cambria Math" w:eastAsia="Cambria Math" w:cs="Cambria Math"/>
-                        <w:sz w:val="18"/>
-                        <w:szCs w:val="18"/>
-                      </w:rPr>
-                      <m:t>+</m:t>
-                    </m:r>
-                    <m:f>
-                      <m:fPr/>
-                      <m:num>
-                        <m:sSub>
-                          <m:sSubPr/>
-                          <m:e>
-                            <m:r>
-                              <m:rPr/>
-                              <w:rPr>
-                                <w:rFonts w:ascii="Cambria Math" w:hAnsi="Cambria Math" w:eastAsia="Cambria Math" w:cs="Cambria Math"/>
-                                <w:sz w:val="18"/>
-                                <w:szCs w:val="18"/>
-                              </w:rPr>
-                              <m:t>K</m:t>
-                            </m:r>
-                          </m:e>
-                          <m:sub>
-                            <m:r>
-                              <m:rPr>
-                                <m:sty m:val="p"/>
-                              </m:rPr>
-                              <w:rPr>
-                                <w:rFonts w:ascii="Cambria Math" w:hAnsi="Cambria Math" w:eastAsia="Cambria Math" w:cs="Cambria Math"/>
-                                <w:sz w:val="18"/>
-                                <w:szCs w:val="18"/>
-                              </w:rPr>
-                              <m:t>D,</m:t>
-                            </m:r>
-                            <m:r>
-                              <m:rPr/>
-                              <w:rPr>
-                                <w:rFonts w:ascii="Cambria Math" w:hAnsi="Cambria Math" w:eastAsia="Cambria Math" w:cs="Cambria Math"/>
-                                <w:sz w:val="18"/>
-                                <w:szCs w:val="18"/>
-                              </w:rPr>
-                              <m:t>χ</m:t>
-                            </m:r>
-                          </m:sub>
-                        </m:sSub>
-                      </m:num>
-                      <m:den>
-                        <m:sSub>
-                          <m:sSubPr/>
-                          <m:e>
-                            <m:r>
-                              <m:rPr/>
-                              <w:rPr>
-                                <w:rFonts w:ascii="Cambria Math" w:hAnsi="Cambria Math" w:eastAsia="Cambria Math" w:cs="Cambria Math"/>
-                                <w:sz w:val="18"/>
-                                <w:szCs w:val="18"/>
-                              </w:rPr>
-                              <m:t>T</m:t>
-                            </m:r>
-                          </m:e>
-                          <m:sub>
-                            <m:r>
-                              <m:rPr>
-                                <m:sty m:val="p"/>
-                              </m:rPr>
-                              <w:rPr>
-                                <w:rFonts w:ascii="Cambria Math" w:hAnsi="Cambria Math" w:eastAsia="Cambria Math" w:cs="Cambria Math"/>
-                                <w:sz w:val="18"/>
-                                <w:szCs w:val="18"/>
-                              </w:rPr>
-                              <m:t>s</m:t>
-                            </m:r>
-                          </m:sub>
-                        </m:sSub>
-                      </m:den>
-                    </m:f>
-                    <m:r>
-                      <m:rPr>
-                        <m:sty m:val="p"/>
-                      </m:rPr>
-                      <w:rPr>
-                        <w:rFonts w:ascii="Cambria Math" w:hAnsi="Cambria Math" w:eastAsia="Cambria Math" w:cs="Cambria Math"/>
-                        <w:sz w:val="18"/>
-                        <w:szCs w:val="18"/>
-                      </w:rPr>
-                      <m:t>(</m:t>
-                    </m:r>
-                    <m:sSub>
-                      <m:sSubPr/>
-                      <m:e>
-                        <m:r>
-                          <m:rPr/>
-                          <w:rPr>
-                            <w:rFonts w:ascii="Cambria Math" w:hAnsi="Cambria Math" w:eastAsia="Cambria Math" w:cs="Cambria Math"/>
-                            <w:sz w:val="18"/>
-                            <w:szCs w:val="18"/>
-                          </w:rPr>
-                          <m:t>e</m:t>
-                        </m:r>
-                      </m:e>
-                      <m:sub>
-                        <m:r>
-                          <m:rPr/>
-                          <w:rPr>
-                            <w:rFonts w:ascii="Cambria Math" w:hAnsi="Cambria Math" w:eastAsia="Cambria Math" w:cs="Cambria Math"/>
-                            <w:sz w:val="18"/>
-                            <w:szCs w:val="18"/>
-                          </w:rPr>
-                          <m:t>χ</m:t>
-                        </m:r>
-                      </m:sub>
-                    </m:sSub>
-                    <m:r>
-                      <m:rPr>
-                        <m:sty m:val="p"/>
-                      </m:rPr>
-                      <w:rPr>
-                        <w:rFonts w:ascii="Cambria Math" w:hAnsi="Cambria Math" w:eastAsia="Cambria Math" w:cs="Cambria Math"/>
-                        <w:sz w:val="18"/>
-                        <w:szCs w:val="18"/>
-                      </w:rPr>
-                      <m:t>[</m:t>
-                    </m:r>
-                    <m:r>
-                      <m:rPr/>
-                      <w:rPr>
-                        <w:rFonts w:ascii="Cambria Math" w:hAnsi="Cambria Math" w:eastAsia="Cambria Math" w:cs="Cambria Math"/>
-                        <w:sz w:val="18"/>
-                        <w:szCs w:val="18"/>
-                      </w:rPr>
-                      <m:t>k</m:t>
-                    </m:r>
-                    <m:r>
-                      <m:rPr>
-                        <m:sty m:val="p"/>
-                      </m:rPr>
-                      <w:rPr>
-                        <w:rFonts w:ascii="Cambria Math" w:hAnsi="Cambria Math" w:eastAsia="Cambria Math" w:cs="Cambria Math"/>
-                        <w:sz w:val="18"/>
-                        <w:szCs w:val="18"/>
-                      </w:rPr>
-                      <m:t>]−</m:t>
-                    </m:r>
-                    <m:r>
-                      <m:rPr/>
-                      <w:rPr>
-                        <w:rFonts w:ascii="Cambria Math" w:hAnsi="Cambria Math" w:eastAsia="Cambria Math" w:cs="Cambria Math"/>
-                        <w:sz w:val="18"/>
-                        <w:szCs w:val="18"/>
-                      </w:rPr>
-                      <m:t>2</m:t>
-                    </m:r>
-                    <m:sSub>
-                      <m:sSubPr/>
-                      <m:e>
-                        <m:r>
-                          <m:rPr/>
-                          <w:rPr>
-                            <w:rFonts w:ascii="Cambria Math" w:hAnsi="Cambria Math" w:eastAsia="Cambria Math" w:cs="Cambria Math"/>
-                            <w:sz w:val="18"/>
-                            <w:szCs w:val="18"/>
-                          </w:rPr>
-                          <m:t>e</m:t>
-                        </m:r>
-                      </m:e>
-                      <m:sub>
-                        <m:r>
-                          <m:rPr/>
-                          <w:rPr>
-                            <w:rFonts w:ascii="Cambria Math" w:hAnsi="Cambria Math" w:eastAsia="Cambria Math" w:cs="Cambria Math"/>
-                            <w:sz w:val="18"/>
-                            <w:szCs w:val="18"/>
-                          </w:rPr>
-                          <m:t>χ</m:t>
-                        </m:r>
-                      </m:sub>
-                    </m:sSub>
-                    <m:r>
-                      <m:rPr>
-                        <m:sty m:val="p"/>
-                      </m:rPr>
-                      <w:rPr>
-                        <w:rFonts w:ascii="Cambria Math" w:hAnsi="Cambria Math" w:eastAsia="Cambria Math" w:cs="Cambria Math"/>
-                        <w:sz w:val="18"/>
-                        <w:szCs w:val="18"/>
-                      </w:rPr>
-                      <m:t>[</m:t>
-                    </m:r>
-                    <m:r>
-                      <m:rPr/>
-                      <w:rPr>
-                        <w:rFonts w:ascii="Cambria Math" w:hAnsi="Cambria Math" w:eastAsia="Cambria Math" w:cs="Cambria Math"/>
-                        <w:sz w:val="18"/>
-                        <w:szCs w:val="18"/>
-                      </w:rPr>
-                      <m:t>k</m:t>
-                    </m:r>
-                    <m:r>
-                      <m:rPr>
-                        <m:sty m:val="p"/>
-                      </m:rPr>
-                      <w:rPr>
-                        <w:rFonts w:ascii="Cambria Math" w:hAnsi="Cambria Math" w:eastAsia="Cambria Math" w:cs="Cambria Math"/>
-                        <w:sz w:val="18"/>
-                        <w:szCs w:val="18"/>
-                      </w:rPr>
-                      <m:t>−</m:t>
-                    </m:r>
-                    <m:r>
-                      <m:rPr/>
-                      <w:rPr>
-                        <w:rFonts w:ascii="Cambria Math" w:hAnsi="Cambria Math" w:eastAsia="Cambria Math" w:cs="Cambria Math"/>
-                        <w:sz w:val="18"/>
-                        <w:szCs w:val="18"/>
-                      </w:rPr>
-                      <m:t>1</m:t>
-                    </m:r>
-                    <m:r>
-                      <m:rPr>
-                        <m:sty m:val="p"/>
-                      </m:rPr>
-                      <w:rPr>
-                        <w:rFonts w:ascii="Cambria Math" w:hAnsi="Cambria Math" w:eastAsia="Cambria Math" w:cs="Cambria Math"/>
-                        <w:sz w:val="18"/>
-                        <w:szCs w:val="18"/>
-                      </w:rPr>
-                      <m:t>]+</m:t>
-                    </m:r>
-                    <m:sSub>
-                      <m:sSubPr/>
-                      <m:e>
-                        <m:r>
-                          <m:rPr/>
-                          <w:rPr>
-                            <w:rFonts w:ascii="Cambria Math" w:hAnsi="Cambria Math" w:eastAsia="Cambria Math" w:cs="Cambria Math"/>
-                            <w:sz w:val="18"/>
-                            <w:szCs w:val="18"/>
-                          </w:rPr>
-                          <m:t>e</m:t>
-                        </m:r>
-                      </m:e>
-                      <m:sub>
-                        <m:r>
-                          <m:rPr/>
-                          <w:rPr>
-                            <w:rFonts w:ascii="Cambria Math" w:hAnsi="Cambria Math" w:eastAsia="Cambria Math" w:cs="Cambria Math"/>
-                            <w:sz w:val="18"/>
-                            <w:szCs w:val="18"/>
-                          </w:rPr>
-                          <m:t>χ</m:t>
-                        </m:r>
-                      </m:sub>
-                    </m:sSub>
-                    <m:r>
-                      <m:rPr>
-                        <m:sty m:val="p"/>
-                      </m:rPr>
-                      <w:rPr>
-                        <w:rFonts w:ascii="Cambria Math" w:hAnsi="Cambria Math" w:eastAsia="Cambria Math" w:cs="Cambria Math"/>
-                        <w:sz w:val="18"/>
-                        <w:szCs w:val="18"/>
-                      </w:rPr>
-                      <m:t>[</m:t>
-                    </m:r>
-                    <m:r>
-                      <m:rPr/>
-                      <w:rPr>
-                        <w:rFonts w:ascii="Cambria Math" w:hAnsi="Cambria Math" w:eastAsia="Cambria Math" w:cs="Cambria Math"/>
-                        <w:sz w:val="18"/>
-                        <w:szCs w:val="18"/>
-                      </w:rPr>
-                      <m:t>k</m:t>
-                    </m:r>
-                    <m:r>
-                      <m:rPr>
-                        <m:sty m:val="p"/>
-                      </m:rPr>
-                      <w:rPr>
-                        <w:rFonts w:ascii="Cambria Math" w:hAnsi="Cambria Math" w:eastAsia="Cambria Math" w:cs="Cambria Math"/>
-                        <w:sz w:val="18"/>
-                        <w:szCs w:val="18"/>
-                      </w:rPr>
-                      <m:t>−</m:t>
-                    </m:r>
-                    <m:r>
-                      <m:rPr/>
-                      <w:rPr>
-                        <w:rFonts w:ascii="Cambria Math" w:hAnsi="Cambria Math" w:eastAsia="Cambria Math" w:cs="Cambria Math"/>
-                        <w:sz w:val="18"/>
-                        <w:szCs w:val="18"/>
-                      </w:rPr>
-                      <m:t>2</m:t>
-                    </m:r>
-                    <m:r>
-                      <m:rPr>
-                        <m:sty m:val="p"/>
-                      </m:rPr>
-                      <w:rPr>
-                        <w:rFonts w:ascii="Cambria Math" w:hAnsi="Cambria Math" w:eastAsia="Cambria Math" w:cs="Cambria Math"/>
-                        <w:sz w:val="18"/>
-                        <w:szCs w:val="18"/>
-                      </w:rPr>
-                      <m:t>]).</m:t>
-                    </m:r>
-                  </m:e>
-                </m:eqArr>
-              </m:oMath>
-            </m:oMathPara>
-          </w:p>
-        </w:tc>
-        <w:tc>
-          <w:tcPr>
-            <w:tcW w:w="390" w:type="dxa"/>
-            <w:vAlign w:val="center"/>
-          </w:tcPr>
-          <w:p>
-            <w:pPr>
-              <w:numPr>
-                <w:ilvl w:val="0"/>
-                <w:numId w:val="0"/>
-              </w:numPr>
-              <w:snapToGrid w:val="0"/>
-              <w:jc w:val="right"/>
-              <w:rPr>
-                <w:sz w:val="16"/>
-              </w:rPr>
-            </w:pPr>
-            <w:r>
-              <w:rPr>
-                <w:sz w:val="16"/>
-                <w:szCs w:val="16"/>
-              </w:rPr>
-              <w:t>(19)</w:t>
-            </w:r>
-          </w:p>
-        </w:tc>
-      </w:tr>
-    </w:tbl>
-    <w:p>
-      <w:pPr>
-        <w:pStyle w:val="7"/>
-        <w:numPr>
-          <w:ilvl w:val="0"/>
-          <w:numId w:val="0"/>
-        </w:numPr>
-        <w:snapToGrid w:val="0"/>
-        <w:rPr>
-          <w:sz w:val="20"/>
-        </w:rPr>
-      </w:pPr>
-      <w:r>
-        <w:rPr>
-          <w:rFonts w:hint="eastAsia"/>
-          <w:sz w:val="20"/>
-          <w:szCs w:val="20"/>
-        </w:rPr>
-        <w:t xml:space="preserve">这里，</w:t>
-      </w:r>
-      <m:oMath>
-        <m:sSub>
-          <m:e>
-            <m:r>
-              <m:rPr>
-                <m:sty m:val="i"/>
-              </m:rPr>
-              <w:rPr>
-                <w:rFonts w:ascii="Cambria Math" w:hAnsi="Cambria Math" w:eastAsia="Cambria Math" w:cs="Cambria Math"/>
-                <w:sz w:val="20"/>
-                <w:szCs w:val="20"/>
-              </w:rPr>
-              <m:t>T</m:t>
-            </m:r>
-          </m:e>
-          <m:sub>
-            <m:r>
-              <m:rPr>
-                <m:sty m:val="p"/>
-              </m:rPr>
-              <w:rPr>
-                <w:rFonts w:ascii="Cambria Math" w:hAnsi="Cambria Math" w:eastAsia="Cambria Math" w:cs="Cambria Math"/>
-                <w:sz w:val="20"/>
-                <w:szCs w:val="20"/>
-              </w:rPr>
-              <m:t>s</m:t>
-            </m:r>
-          </m:sub>
-        </m:sSub>
-      </m:oMath>
-      <w:r>
-        <w:rPr>
-          <w:rFonts w:hint="eastAsia"/>
-          <w:sz w:val="20"/>
-          <w:szCs w:val="20"/>
-        </w:rPr>
-        <w:t xml:space="preserve"> 为采样周期，单位为 s；</w:t>
-      </w:r>
-      <m:oMath>
-        <m:sSub>
-          <m:e>
-            <m:r>
-              <m:rPr>
-                <m:sty m:val="i"/>
-              </m:rPr>
-              <w:rPr>
-                <w:rFonts w:ascii="Cambria Math" w:hAnsi="Cambria Math" w:eastAsia="Cambria Math" w:cs="Cambria Math"/>
-                <w:sz w:val="20"/>
-                <w:szCs w:val="20"/>
-              </w:rPr>
-              <m:t>K</m:t>
-            </m:r>
-          </m:e>
-          <m:sub>
-            <m:r>
-              <m:rPr>
-                <m:sty m:val="p"/>
-              </m:rPr>
-              <w:rPr>
-                <w:rFonts w:ascii="Cambria Math" w:hAnsi="Cambria Math" w:eastAsia="Cambria Math" w:cs="Cambria Math"/>
-                <w:sz w:val="20"/>
-                <w:szCs w:val="20"/>
-              </w:rPr>
-              <m:t>P</m:t>
-            </m:r>
-            <m:r>
-              <m:rPr>
-                <m:sty m:val="p"/>
-              </m:rPr>
-              <w:rPr>
-                <w:rFonts w:ascii="Cambria Math" w:hAnsi="Cambria Math" w:eastAsia="Cambria Math" w:cs="Cambria Math"/>
-                <w:sz w:val="20"/>
-                <w:szCs w:val="20"/>
-              </w:rPr>
-              <m:t>,</m:t>
-            </m:r>
-            <m:r>
-              <m:rPr>
-                <m:sty m:val="i"/>
-              </m:rPr>
-              <w:rPr>
-                <w:rFonts w:ascii="Cambria Math" w:hAnsi="Cambria Math" w:eastAsia="Cambria Math" w:cs="Cambria Math"/>
-                <w:sz w:val="20"/>
-                <w:szCs w:val="20"/>
-              </w:rPr>
-              <m:t>χ</m:t>
-            </m:r>
-          </m:sub>
-        </m:sSub>
-      </m:oMath>
-      <w:r>
-        <w:rPr>
-          <w:rFonts w:hint="eastAsia"/>
-          <w:sz w:val="20"/>
-          <w:szCs w:val="20"/>
-        </w:rPr>
-        <w:t xml:space="preserve">、</w:t>
-      </w:r>
-      <m:oMath>
-        <m:sSub>
-          <m:e>
-            <m:r>
-              <m:rPr>
-                <m:sty m:val="i"/>
-              </m:rPr>
-              <w:rPr>
-                <w:rFonts w:ascii="Cambria Math" w:hAnsi="Cambria Math" w:eastAsia="Cambria Math" w:cs="Cambria Math"/>
-                <w:sz w:val="20"/>
-                <w:szCs w:val="20"/>
-              </w:rPr>
-              <m:t>K</m:t>
-            </m:r>
-          </m:e>
-          <m:sub>
-            <m:r>
-              <m:rPr>
-                <m:sty m:val="p"/>
-              </m:rPr>
-              <w:rPr>
-                <w:rFonts w:ascii="Cambria Math" w:hAnsi="Cambria Math" w:eastAsia="Cambria Math" w:cs="Cambria Math"/>
-                <w:sz w:val="20"/>
-                <w:szCs w:val="20"/>
-              </w:rPr>
-              <m:t>I</m:t>
-            </m:r>
-            <m:r>
-              <m:rPr>
-                <m:sty m:val="p"/>
-              </m:rPr>
-              <w:rPr>
-                <w:rFonts w:ascii="Cambria Math" w:hAnsi="Cambria Math" w:eastAsia="Cambria Math" w:cs="Cambria Math"/>
-                <w:sz w:val="20"/>
-                <w:szCs w:val="20"/>
-              </w:rPr>
-              <m:t>,</m:t>
-            </m:r>
-            <m:r>
-              <m:rPr>
-                <m:sty m:val="i"/>
-              </m:rPr>
-              <w:rPr>
-                <w:rFonts w:ascii="Cambria Math" w:hAnsi="Cambria Math" w:eastAsia="Cambria Math" w:cs="Cambria Math"/>
-                <w:sz w:val="20"/>
-                <w:szCs w:val="20"/>
-              </w:rPr>
-              <m:t>χ</m:t>
-            </m:r>
-          </m:sub>
-        </m:sSub>
-      </m:oMath>
-      <w:r>
-        <w:rPr>
-          <w:rFonts w:hint="eastAsia"/>
-          <w:sz w:val="20"/>
-          <w:szCs w:val="20"/>
-        </w:rPr>
-        <w:t xml:space="preserve">、</w:t>
-      </w:r>
-      <m:oMath>
-        <m:sSub>
-          <m:e>
-            <m:r>
-              <m:rPr>
-                <m:sty m:val="i"/>
-              </m:rPr>
-              <w:rPr>
-                <w:rFonts w:ascii="Cambria Math" w:hAnsi="Cambria Math" w:eastAsia="Cambria Math" w:cs="Cambria Math"/>
-                <w:sz w:val="20"/>
-                <w:szCs w:val="20"/>
-              </w:rPr>
-              <m:t>K</m:t>
-            </m:r>
-          </m:e>
-          <m:sub>
-            <m:r>
-              <m:rPr>
-                <m:sty m:val="p"/>
-              </m:rPr>
-              <w:rPr>
-                <w:rFonts w:ascii="Cambria Math" w:hAnsi="Cambria Math" w:eastAsia="Cambria Math" w:cs="Cambria Math"/>
-                <w:sz w:val="20"/>
-                <w:szCs w:val="20"/>
-              </w:rPr>
-              <m:t>D</m:t>
-            </m:r>
-            <m:r>
-              <m:rPr>
-                <m:sty m:val="p"/>
-              </m:rPr>
-              <w:rPr>
-                <w:rFonts w:ascii="Cambria Math" w:hAnsi="Cambria Math" w:eastAsia="Cambria Math" w:cs="Cambria Math"/>
-                <w:sz w:val="20"/>
-                <w:szCs w:val="20"/>
-              </w:rPr>
-              <m:t>,</m:t>
-            </m:r>
-            <m:r>
-              <m:rPr>
-                <m:sty m:val="i"/>
-              </m:rPr>
-              <w:rPr>
-                <w:rFonts w:ascii="Cambria Math" w:hAnsi="Cambria Math" w:eastAsia="Cambria Math" w:cs="Cambria Math"/>
-                <w:sz w:val="20"/>
-                <w:szCs w:val="20"/>
-              </w:rPr>
-              <m:t>χ</m:t>
-            </m:r>
-          </m:sub>
-        </m:sSub>
-      </m:oMath>
-      <w:r>
-        <w:rPr>
-          <w:rFonts w:hint="eastAsia"/>
-          <w:sz w:val="20"/>
-          <w:szCs w:val="20"/>
-        </w:rPr>
-        <w:t xml:space="preserve"> 分别为比例、积分、微分增益，其单位应使输出 </w:t>
-      </w:r>
-      <m:oMath>
-        <m:r>
-          <m:rPr>
-            <m:sty m:val="p"/>
-          </m:rPr>
-          <w:rPr>
-            <w:rFonts w:ascii="Cambria Math" w:hAnsi="Cambria Math" w:eastAsia="Cambria Math" w:cs="Cambria Math"/>
-            <w:sz w:val="20"/>
-            <w:szCs w:val="20"/>
-          </w:rPr>
-          <m:t>Δ</m:t>
-        </m:r>
-        <m:sSub>
-          <m:e>
-            <m:r>
-              <m:rPr>
-                <m:sty m:val="i"/>
-              </m:rPr>
-              <w:rPr>
-                <w:rFonts w:ascii="Cambria Math" w:hAnsi="Cambria Math" w:eastAsia="Cambria Math" w:cs="Cambria Math"/>
-                <w:sz w:val="20"/>
-                <w:szCs w:val="20"/>
-              </w:rPr>
-              <m:t>u</m:t>
-            </m:r>
-          </m:e>
-          <m:sub>
-            <m:r>
-              <m:rPr>
-                <m:sty m:val="i"/>
-              </m:rPr>
-              <w:rPr>
-                <w:rFonts w:ascii="Cambria Math" w:hAnsi="Cambria Math" w:eastAsia="Cambria Math" w:cs="Cambria Math"/>
-                <w:sz w:val="20"/>
-                <w:szCs w:val="20"/>
-              </w:rPr>
-              <m:t>χ</m:t>
-            </m:r>
-          </m:sub>
-        </m:sSub>
-        <m:r>
-          <m:rPr>
-            <m:sty m:val="p"/>
-          </m:rPr>
-          <w:rPr>
-            <w:rFonts w:ascii="Cambria Math" w:hAnsi="Cambria Math" w:eastAsia="Cambria Math" w:cs="Cambria Math"/>
-            <w:sz w:val="20"/>
-            <w:szCs w:val="20"/>
-          </w:rPr>
-          <m:t>[</m:t>
-        </m:r>
-        <m:r>
-          <m:rPr>
-            <m:sty m:val="i"/>
-          </m:rPr>
-          <w:rPr>
-            <w:rFonts w:ascii="Cambria Math" w:hAnsi="Cambria Math" w:eastAsia="Cambria Math" w:cs="Cambria Math"/>
-            <w:sz w:val="20"/>
-            <w:szCs w:val="20"/>
-          </w:rPr>
-          <m:t>k</m:t>
-        </m:r>
-        <m:r>
-          <m:rPr>
-            <m:sty m:val="p"/>
-          </m:rPr>
-          <w:rPr>
-            <w:rFonts w:ascii="Cambria Math" w:hAnsi="Cambria Math" w:eastAsia="Cambria Math" w:cs="Cambria Math"/>
-            <w:sz w:val="20"/>
-            <w:szCs w:val="20"/>
-          </w:rPr>
-          <m:t>]</m:t>
-        </m:r>
-      </m:oMath>
-      <w:r>
-        <w:rPr>
-          <w:rFonts w:hint="eastAsia"/>
-          <w:sz w:val="20"/>
-          <w:szCs w:val="20"/>
-        </w:rPr>
-        <w:t xml:space="preserve"> 的单位为 m。式（19）是可选扩展，不意味着报告已验证非零积分、微分增益的完整 PID 实现。</w:t>
-      </w:r>
-    </w:p>
-    <w:p>
-      <w:pPr>
-        <w:pStyle w:val="7"/>
-        <w:numPr>
-          <w:ilvl w:val="0"/>
-          <w:numId w:val="0"/>
-        </w:numPr>
-        <w:snapToGrid w:val="0"/>
-        <w:rPr>
-          <w:sz w:val="20"/>
-        </w:rPr>
-      </w:pPr>
-      <w:r>
-        <w:rPr>
-          <w:rFonts w:hint="eastAsia"/>
-          <w:sz w:val="20"/>
-          <w:szCs w:val="20"/>
-        </w:rPr>
         <w:t xml:space="preserve">在机体系中，</w:t>
       </w:r>
       <m:oMath>
@@ -18281,7 +17133,7 @@
       <w:tblPr>
         <w:tblStyle w:val="10"/>
         <w:tblW w:w="4866" w:type="dxa"/>
-        <w:tblCaption w:val="Equation 20"/>
+        <w:tblCaption w:val="Equation 19"/>
         <w:tblInd w:w="0" w:type="dxa"/>
         <w:tblBorders>
           <w:top w:val="none" w:color="B0B0B0" w:sz="4" w:space="0"/>
@@ -18709,7 +17561,7 @@
                 <w:sz w:val="16"/>
                 <w:szCs w:val="16"/>
               </w:rPr>
-              <w:t>(20)</w:t>
+              <w:t>(19)</w:t>
             </w:r>
           </w:p>
         </w:tc>
@@ -19120,7 +17972,7 @@
         <w:snapToGrid w:val="0"/>
       </w:pPr>
       <w:r>
-        <w:t>Fig. 6. 底盘姿态控制器闭环方框图。滚转与俯仰分别采用式（18）的串级比例反馈及高度增量累加，两轴修正量经式（20）共同分配至四腿；关节伺服内环合并表示。</w:t>
+        <w:t>Fig. 6. 底盘姿态控制器闭环方框图。滚转与俯仰分别采用式（18）的双环 P 控制及高度增量累加，两轴修正量经式（19）共同分配至四腿；关节伺服内环合并表示。</w:t>
       </w:r>
     </w:p>
     <w:bookmarkEnd w:id="8"/>
@@ -19355,7 +18207,7 @@
       <w:tblPr>
         <w:tblStyle w:val="10"/>
         <w:tblW w:w="4866" w:type="dxa"/>
-        <w:tblCaption w:val="Equation 21"/>
+        <w:tblCaption w:val="Equation 20"/>
         <w:tblInd w:w="0" w:type="dxa"/>
         <w:tblBorders>
           <w:top w:val="none" w:color="B0B0B0" w:sz="4" w:space="0"/>
@@ -19616,7 +18468,7 @@
                 <w:sz w:val="16"/>
                 <w:szCs w:val="16"/>
               </w:rPr>
-              <w:t>(21)</w:t>
+              <w:t>(20)</w:t>
             </w:r>
           </w:p>
         </w:tc>
@@ -20870,7 +19722,7 @@
       <w:tblPr>
         <w:tblStyle w:val="10"/>
         <w:tblW w:w="4866" w:type="dxa"/>
-        <w:tblCaption w:val="Equation 22"/>
+        <w:tblCaption w:val="Equation 21"/>
         <w:tblInd w:w="0" w:type="dxa"/>
         <w:tblBorders>
           <w:top w:val="none" w:color="B0B0B0" w:sz="4" w:space="0"/>
@@ -21705,7 +20557,7 @@
                 <w:sz w:val="16"/>
                 <w:szCs w:val="16"/>
               </w:rPr>
-              <w:t>(22)</w:t>
+              <w:t>(21)</w:t>
             </w:r>
           </w:p>
         </w:tc>
@@ -21903,7 +20755,7 @@
       <w:tblPr>
         <w:tblStyle w:val="10"/>
         <w:tblW w:w="4866" w:type="dxa"/>
-        <w:tblCaption w:val="Equation 23"/>
+        <w:tblCaption w:val="Equation 22"/>
         <w:tblInd w:w="0" w:type="dxa"/>
         <w:tblBorders>
           <w:top w:val="none" w:color="B0B0B0" w:sz="4" w:space="0"/>
@@ -22178,7 +21030,7 @@
                 <w:sz w:val="16"/>
                 <w:szCs w:val="16"/>
               </w:rPr>
-              <w:t>(23)</w:t>
+              <w:t>(22)</w:t>
             </w:r>
           </w:p>
         </w:tc>
@@ -22775,7 +21627,7 @@
       <w:tblPr>
         <w:tblStyle w:val="10"/>
         <w:tblW w:w="4866" w:type="dxa"/>
-        <w:tblCaption w:val="Equation 24"/>
+        <w:tblCaption w:val="Equation 23"/>
         <w:tblInd w:w="0" w:type="dxa"/>
         <w:tblBorders>
           <w:top w:val="none" w:color="B0B0B0" w:sz="4" w:space="0"/>
@@ -23400,7 +22252,7 @@
                 <w:sz w:val="16"/>
                 <w:szCs w:val="16"/>
               </w:rPr>
-              <w:t>(24)</w:t>
+              <w:t>(23)</w:t>
             </w:r>
           </w:p>
         </w:tc>
@@ -25153,7 +24005,7 @@
       <w:tblPr>
         <w:tblStyle w:val="10"/>
         <w:tblW w:w="4866" w:type="dxa"/>
-        <w:tblCaption w:val="Equation 25"/>
+        <w:tblCaption w:val="Equation 24"/>
         <w:tblInd w:w="0" w:type="dxa"/>
         <w:tblBorders>
           <w:top w:val="none" w:color="B0B0B0" w:sz="4" w:space="0"/>
@@ -25595,7 +24447,7 @@
                 <w:sz w:val="16"/>
                 <w:szCs w:val="16"/>
               </w:rPr>
-              <w:t>(25)</w:t>
+              <w:t>(24)</w:t>
             </w:r>
           </w:p>
         </w:tc>
@@ -25626,7 +24478,7 @@
       <w:tblPr>
         <w:tblStyle w:val="10"/>
         <w:tblW w:w="4866" w:type="dxa"/>
-        <w:tblCaption w:val="Equation 26"/>
+        <w:tblCaption w:val="Equation 25"/>
         <w:tblInd w:w="0" w:type="dxa"/>
         <w:tblBorders>
           <w:top w:val="none" w:color="B0B0B0" w:sz="4" w:space="0"/>
@@ -25975,7 +24827,7 @@
                 <w:sz w:val="16"/>
                 <w:szCs w:val="16"/>
               </w:rPr>
-              <w:t>(26)</w:t>
+              <w:t>(25)</w:t>
             </w:r>
           </w:p>
         </w:tc>
@@ -26036,7 +24888,7 @@
       <w:tblPr>
         <w:tblStyle w:val="10"/>
         <w:tblW w:w="4866" w:type="dxa"/>
-        <w:tblCaption w:val="Equation 27"/>
+        <w:tblCaption w:val="Equation 26"/>
         <w:tblInd w:w="0" w:type="dxa"/>
         <w:tblBorders>
           <w:top w:val="none" w:color="B0B0B0" w:sz="4" w:space="0"/>
@@ -26495,7 +25347,7 @@
                 <w:sz w:val="16"/>
                 <w:szCs w:val="16"/>
               </w:rPr>
-              <w:t>(27)</w:t>
+              <w:t>(26)</w:t>
             </w:r>
           </w:p>
         </w:tc>
@@ -26707,7 +25559,7 @@
       <w:tblPr>
         <w:tblStyle w:val="10"/>
         <w:tblW w:w="4866" w:type="dxa"/>
-        <w:tblCaption w:val="Equation 28"/>
+        <w:tblCaption w:val="Equation 27"/>
         <w:tblInd w:w="0" w:type="dxa"/>
         <w:tblBorders>
           <w:top w:val="none" w:color="B0B0B0" w:sz="4" w:space="0"/>
@@ -27721,7 +26573,7 @@
                 <w:sz w:val="16"/>
                 <w:szCs w:val="16"/>
               </w:rPr>
-              <w:t>(28)</w:t>
+              <w:t>(27)</w:t>
             </w:r>
           </w:p>
         </w:tc>
@@ -28035,7 +26887,7 @@
       <w:tblPr>
         <w:tblStyle w:val="10"/>
         <w:tblW w:w="4866" w:type="dxa"/>
-        <w:tblCaption w:val="Equation 29"/>
+        <w:tblCaption w:val="Equation 28"/>
         <w:tblInd w:w="0" w:type="dxa"/>
         <w:tblBorders>
           <w:top w:val="none" w:color="B0B0B0" w:sz="4" w:space="0"/>
@@ -28315,7 +27167,7 @@
                 <w:sz w:val="16"/>
                 <w:szCs w:val="16"/>
               </w:rPr>
-              <w:t>(29)</w:t>
+              <w:t>(28)</w:t>
             </w:r>
           </w:p>
         </w:tc>
@@ -28551,7 +27403,7 @@
       <w:tblPr>
         <w:tblStyle w:val="10"/>
         <w:tblW w:w="4866" w:type="dxa"/>
-        <w:tblCaption w:val="Equation 30"/>
+        <w:tblCaption w:val="Equation 29"/>
         <w:tblInd w:w="0" w:type="dxa"/>
         <w:tblBorders>
           <w:top w:val="none" w:color="B0B0B0" w:sz="4" w:space="0"/>
@@ -29215,7 +28067,7 @@
                 <w:sz w:val="16"/>
                 <w:szCs w:val="16"/>
               </w:rPr>
-              <w:t>(30)</w:t>
+              <w:t>(29)</w:t>
             </w:r>
           </w:p>
         </w:tc>
@@ -29410,7 +28262,7 @@
       <w:tblPr>
         <w:tblStyle w:val="10"/>
         <w:tblW w:w="4866" w:type="dxa"/>
-        <w:tblCaption w:val="Equation 31"/>
+        <w:tblCaption w:val="Equation 30"/>
         <w:tblInd w:w="0" w:type="dxa"/>
         <w:tblBorders>
           <w:top w:val="none" w:color="B0B0B0" w:sz="4" w:space="0"/>
@@ -30226,6 +29078,351 @@
                 <w:sz w:val="16"/>
                 <w:szCs w:val="16"/>
               </w:rPr>
+              <w:t>(30)</w:t>
+            </w:r>
+          </w:p>
+        </w:tc>
+      </w:tr>
+    </w:tbl>
+    <w:p>
+      <w:pPr>
+        <w:pStyle w:val="7"/>
+        <w:numPr>
+          <w:ilvl w:val="0"/>
+          <w:numId w:val="0"/>
+        </w:numPr>
+        <w:snapToGrid w:val="0"/>
+        <w:rPr>
+          <w:sz w:val="20"/>
+        </w:rPr>
+      </w:pPr>
+      <w:r>
+        <w:rPr>
+          <w:rFonts w:hint="eastAsia"/>
+          <w:sz w:val="20"/>
+          <w:szCs w:val="20"/>
+        </w:rPr>
+        <w:t>此表达式要求</w:t>
+      </w:r>
+      <w:r>
+        <w:rPr>
+          <w:sz w:val="20"/>
+          <w:szCs w:val="20"/>
+        </w:rPr>
+        <w:t xml:space="preserve"> </w:t>
+      </w:r>
+      <m:oMath>
+        <m:sSub>
+          <m:sSubPr/>
+          <m:e>
+            <m:r>
+              <m:rPr>
+                <m:sty m:val="b"/>
+              </m:rPr>
+              <w:rPr>
+                <w:rFonts w:ascii="Cambria Math" w:hAnsi="Cambria Math" w:eastAsia="Cambria Math" w:cs="Cambria Math"/>
+                <w:sz w:val="20"/>
+                <w:szCs w:val="20"/>
+              </w:rPr>
+              <m:t>S</m:t>
+            </m:r>
+          </m:e>
+          <m:sub>
+            <m:r>
+              <m:rPr>
+                <m:sty m:val="p"/>
+              </m:rPr>
+              <w:rPr>
+                <w:rFonts w:ascii="Cambria Math" w:hAnsi="Cambria Math" w:eastAsia="Cambria Math" w:cs="Cambria Math"/>
+                <w:sz w:val="20"/>
+                <w:szCs w:val="20"/>
+              </w:rPr>
+              <m:t>D</m:t>
+            </m:r>
+          </m:sub>
+        </m:sSub>
+      </m:oMath>
+      <w:r>
+        <w:rPr>
+          <w:sz w:val="20"/>
+          <w:szCs w:val="20"/>
+        </w:rPr>
+        <w:t xml:space="preserve"> </w:t>
+      </w:r>
+      <w:r>
+        <w:rPr>
+          <w:rFonts w:hint="eastAsia"/>
+          <w:sz w:val="20"/>
+          <w:szCs w:val="20"/>
+        </w:rPr>
+        <w:t>可逆。静力学采用虚功原理：若机构对动平台提供的期望支撑力为</w:t>
+      </w:r>
+      <w:r>
+        <w:rPr>
+          <w:sz w:val="20"/>
+          <w:szCs w:val="20"/>
+        </w:rPr>
+        <w:t xml:space="preserve"> </w:t>
+      </w:r>
+      <m:oMath>
+        <m:sSub>
+          <m:sSubPr/>
+          <m:e>
+            <m:r>
+              <m:rPr>
+                <m:sty m:val="bi"/>
+              </m:rPr>
+              <w:rPr>
+                <w:rFonts w:ascii="Cambria Math" w:hAnsi="Cambria Math" w:eastAsia="Cambria Math" w:cs="Cambria Math"/>
+                <w:sz w:val="20"/>
+                <w:szCs w:val="20"/>
+              </w:rPr>
+              <m:t>f</m:t>
+            </m:r>
+          </m:e>
+          <m:sub>
+            <m:r>
+              <m:rPr>
+                <m:sty m:val="p"/>
+              </m:rPr>
+              <w:rPr>
+                <w:rFonts w:ascii="Cambria Math" w:hAnsi="Cambria Math" w:eastAsia="Cambria Math" w:cs="Cambria Math"/>
+                <w:sz w:val="20"/>
+                <w:szCs w:val="20"/>
+              </w:rPr>
+              <m:t>D</m:t>
+            </m:r>
+          </m:sub>
+        </m:sSub>
+      </m:oMath>
+      <w:r>
+        <w:rPr>
+          <w:rFonts w:hint="eastAsia"/>
+          <w:sz w:val="20"/>
+          <w:szCs w:val="20"/>
+        </w:rPr>
+        <w:t>，对应电机广义力矩为</w:t>
+      </w:r>
+    </w:p>
+    <w:tbl>
+      <w:tblPr>
+        <w:tblStyle w:val="10"/>
+        <w:tblW w:w="4866" w:type="dxa"/>
+        <w:tblCaption w:val="Equation 31"/>
+        <w:tblInd w:w="0" w:type="dxa"/>
+        <w:tblBorders>
+          <w:top w:val="none" w:color="B0B0B0" w:sz="4" w:space="0"/>
+          <w:left w:val="none" w:color="B0B0B0" w:sz="4" w:space="0"/>
+          <w:bottom w:val="none" w:color="B0B0B0" w:sz="4" w:space="0"/>
+          <w:right w:val="none" w:color="B0B0B0" w:sz="4" w:space="0"/>
+          <w:insideH w:val="none" w:color="B0B0B0" w:sz="4" w:space="0"/>
+          <w:insideV w:val="none" w:color="B0B0B0" w:sz="4" w:space="0"/>
+        </w:tblBorders>
+        <w:tblLayout w:type="fixed"/>
+        <w:tblCellMar>
+          <w:top w:w="0" w:type="dxa"/>
+          <w:left w:w="0" w:type="dxa"/>
+          <w:bottom w:w="0" w:type="dxa"/>
+          <w:right w:w="0" w:type="dxa"/>
+        </w:tblCellMar>
+      </w:tblPr>
+      <w:tblGrid>
+        <w:gridCol w:w="4476"/>
+        <w:gridCol w:w="390"/>
+      </w:tblGrid>
+      <w:tr>
+        <w:tblPrEx>
+          <w:tblBorders>
+            <w:top w:val="none" w:color="B0B0B0" w:sz="4" w:space="0"/>
+            <w:left w:val="none" w:color="B0B0B0" w:sz="4" w:space="0"/>
+            <w:bottom w:val="none" w:color="B0B0B0" w:sz="4" w:space="0"/>
+            <w:right w:val="none" w:color="B0B0B0" w:sz="4" w:space="0"/>
+            <w:insideH w:val="none" w:color="B0B0B0" w:sz="4" w:space="0"/>
+            <w:insideV w:val="none" w:color="B0B0B0" w:sz="4" w:space="0"/>
+          </w:tblBorders>
+          <w:tblCellMar>
+            <w:top w:w="0" w:type="dxa"/>
+            <w:left w:w="0" w:type="dxa"/>
+            <w:bottom w:w="0" w:type="dxa"/>
+            <w:right w:w="0" w:type="dxa"/>
+          </w:tblCellMar>
+        </w:tblPrEx>
+        <w:trPr>
+          <w:cantSplit/>
+        </w:trPr>
+        <w:tc>
+          <w:tcPr>
+            <w:tcW w:w="4476" w:type="dxa"/>
+            <w:vAlign w:val="center"/>
+          </w:tcPr>
+          <w:p>
+            <w:pPr>
+              <w:pStyle w:val="17"/>
+              <w:numPr>
+                <w:ilvl w:val="0"/>
+                <w:numId w:val="0"/>
+              </w:numPr>
+              <w:snapToGrid w:val="0"/>
+              <w:spacing w:before="100" w:after="100" w:line="240" w:lineRule="auto"/>
+              <w:ind w:left="0" w:right="0" w:firstLine="0"/>
+              <w:jc w:val="center"/>
+              <w:rPr>
+                <w:sz w:val="18"/>
+              </w:rPr>
+            </w:pPr>
+            <m:oMathPara>
+              <m:oMathParaPr>
+                <m:jc m:val="center"/>
+              </m:oMathParaPr>
+              <m:oMath>
+                <m:sSub>
+                  <m:sSubPr/>
+                  <m:e>
+                    <m:r>
+                      <m:rPr>
+                        <m:sty m:val="bi"/>
+                      </m:rPr>
+                      <w:rPr>
+                        <w:rFonts w:ascii="Cambria Math" w:hAnsi="Cambria Math" w:eastAsia="Cambria Math" w:cs="Cambria Math"/>
+                        <w:sz w:val="18"/>
+                        <w:szCs w:val="18"/>
+                      </w:rPr>
+                      <m:t>τ</m:t>
+                    </m:r>
+                  </m:e>
+                  <m:sub>
+                    <m:r>
+                      <m:rPr>
+                        <m:sty m:val="p"/>
+                      </m:rPr>
+                      <w:rPr>
+                        <w:rFonts w:ascii="Cambria Math" w:hAnsi="Cambria Math" w:eastAsia="Cambria Math" w:cs="Cambria Math"/>
+                        <w:sz w:val="18"/>
+                        <w:szCs w:val="18"/>
+                      </w:rPr>
+                      <m:t>D,ff</m:t>
+                    </m:r>
+                  </m:sub>
+                </m:sSub>
+                <m:r>
+                  <m:rPr>
+                    <m:sty m:val="p"/>
+                  </m:rPr>
+                  <w:rPr>
+                    <w:rFonts w:ascii="Cambria Math" w:hAnsi="Cambria Math" w:eastAsia="Cambria Math" w:cs="Cambria Math"/>
+                    <w:sz w:val="18"/>
+                    <w:szCs w:val="18"/>
+                  </w:rPr>
+                  <m:t>=</m:t>
+                </m:r>
+                <m:sSubSup>
+                  <m:sSubSupPr/>
+                  <m:e>
+                    <m:r>
+                      <m:rPr>
+                        <m:sty m:val="b"/>
+                      </m:rPr>
+                      <w:rPr>
+                        <w:rFonts w:ascii="Cambria Math" w:hAnsi="Cambria Math" w:eastAsia="Cambria Math" w:cs="Cambria Math"/>
+                        <w:sz w:val="18"/>
+                        <w:szCs w:val="18"/>
+                      </w:rPr>
+                      <m:t>J</m:t>
+                    </m:r>
+                  </m:e>
+                  <m:sub>
+                    <m:r>
+                      <m:rPr>
+                        <m:sty m:val="p"/>
+                      </m:rPr>
+                      <w:rPr>
+                        <w:rFonts w:ascii="Cambria Math" w:hAnsi="Cambria Math" w:eastAsia="Cambria Math" w:cs="Cambria Math"/>
+                        <w:sz w:val="18"/>
+                        <w:szCs w:val="18"/>
+                      </w:rPr>
+                      <m:t>D</m:t>
+                    </m:r>
+                  </m:sub>
+                  <m:sup>
+                    <m:r>
+                      <m:rPr>
+                        <m:sty m:val="p"/>
+                      </m:rPr>
+                      <w:rPr>
+                        <w:rFonts w:ascii="Cambria Math" w:hAnsi="Cambria Math" w:eastAsia="Cambria Math" w:cs="Cambria Math"/>
+                        <w:sz w:val="18"/>
+                        <w:szCs w:val="18"/>
+                      </w:rPr>
+                      <m:t>T</m:t>
+                    </m:r>
+                  </m:sup>
+                </m:sSubSup>
+                <m:sSub>
+                  <m:sSubPr/>
+                  <m:e>
+                    <m:r>
+                      <m:rPr>
+                        <m:sty m:val="bi"/>
+                      </m:rPr>
+                      <w:rPr>
+                        <w:rFonts w:ascii="Cambria Math" w:hAnsi="Cambria Math" w:eastAsia="Cambria Math" w:cs="Cambria Math"/>
+                        <w:sz w:val="18"/>
+                        <w:szCs w:val="18"/>
+                      </w:rPr>
+                      <m:t>f</m:t>
+                    </m:r>
+                  </m:e>
+                  <m:sub>
+                    <m:r>
+                      <m:rPr>
+                        <m:sty m:val="p"/>
+                      </m:rPr>
+                      <w:rPr>
+                        <w:rFonts w:ascii="Cambria Math" w:hAnsi="Cambria Math" w:eastAsia="Cambria Math" w:cs="Cambria Math"/>
+                        <w:sz w:val="18"/>
+                        <w:szCs w:val="18"/>
+                      </w:rPr>
+                      <m:t>D</m:t>
+                    </m:r>
+                  </m:sub>
+                </m:sSub>
+                <m:r>
+                  <m:rPr>
+                    <m:sty m:val="p"/>
+                  </m:rPr>
+                  <w:rPr>
+                    <w:rFonts w:ascii="Cambria Math" w:hAnsi="Cambria Math" w:eastAsia="Cambria Math" w:cs="Cambria Math"/>
+                    <w:sz w:val="18"/>
+                    <w:szCs w:val="18"/>
+                  </w:rPr>
+                  <m:t>.</m:t>
+                </m:r>
+              </m:oMath>
+            </m:oMathPara>
+          </w:p>
+        </w:tc>
+        <w:tc>
+          <w:tcPr>
+            <w:tcW w:w="390" w:type="dxa"/>
+            <w:vAlign w:val="center"/>
+          </w:tcPr>
+          <w:p>
+            <w:pPr>
+              <w:numPr>
+                <w:ilvl w:val="0"/>
+                <w:numId w:val="0"/>
+              </w:numPr>
+              <w:snapToGrid w:val="0"/>
+              <w:jc w:val="right"/>
+              <w:rPr>
+                <w:sz w:val="16"/>
+              </w:rPr>
+            </w:pPr>
+            <w:r>
+              <w:rPr>
+                <w:sz w:val="16"/>
+                <w:szCs w:val="16"/>
+              </w:rPr>
               <w:t>(31)</w:t>
             </w:r>
           </w:p>
@@ -30250,7 +29447,7 @@
           <w:sz w:val="20"/>
           <w:szCs w:val="20"/>
         </w:rPr>
-        <w:t>此表达式要求</w:t>
+        <w:t>将动平台与手柄等效质量记为</w:t>
       </w:r>
       <w:r>
         <w:rPr>
@@ -30264,15 +29461,13 @@
           <m:sSubPr/>
           <m:e>
             <m:r>
-              <m:rPr>
-                <m:sty m:val="b"/>
-              </m:rPr>
-              <w:rPr>
-                <w:rFonts w:ascii="Cambria Math" w:hAnsi="Cambria Math" w:eastAsia="Cambria Math" w:cs="Cambria Math"/>
-                <w:sz w:val="20"/>
-                <w:szCs w:val="20"/>
-              </w:rPr>
-              <m:t>S</m:t>
+              <m:rPr/>
+              <w:rPr>
+                <w:rFonts w:ascii="Cambria Math" w:hAnsi="Cambria Math" w:eastAsia="Cambria Math" w:cs="Cambria Math"/>
+                <w:sz w:val="20"/>
+                <w:szCs w:val="20"/>
+              </w:rPr>
+              <m:t>m</m:t>
             </m:r>
           </m:e>
           <m:sub>
@@ -30292,18 +29487,11 @@
       </m:oMath>
       <w:r>
         <w:rPr>
-          <w:sz w:val="20"/>
-          <w:szCs w:val="20"/>
-        </w:rPr>
-        <w:t xml:space="preserve"> </w:t>
-      </w:r>
-      <w:r>
-        <w:rPr>
           <w:rFonts w:hint="eastAsia"/>
           <w:sz w:val="20"/>
           <w:szCs w:val="20"/>
         </w:rPr>
-        <w:t>可逆。静力学采用虚功原理：若机构对动平台提供的期望支撑力为</w:t>
+        <w:t>，重力补偿取</w:t>
       </w:r>
       <w:r>
         <w:rPr>
@@ -30342,6 +29530,55 @@
             </m:r>
           </m:sub>
         </m:sSub>
+        <m:r>
+          <m:rPr>
+            <m:sty m:val="p"/>
+          </m:rPr>
+          <w:rPr>
+            <w:rFonts w:ascii="Cambria Math" w:hAnsi="Cambria Math" w:eastAsia="Cambria Math" w:cs="Cambria Math"/>
+            <w:sz w:val="20"/>
+            <w:szCs w:val="20"/>
+          </w:rPr>
+          <m:t>=−</m:t>
+        </m:r>
+        <m:sSub>
+          <m:sSubPr/>
+          <m:e>
+            <m:r>
+              <m:rPr/>
+              <w:rPr>
+                <w:rFonts w:ascii="Cambria Math" w:hAnsi="Cambria Math" w:eastAsia="Cambria Math" w:cs="Cambria Math"/>
+                <w:sz w:val="20"/>
+                <w:szCs w:val="20"/>
+              </w:rPr>
+              <m:t>m</m:t>
+            </m:r>
+          </m:e>
+          <m:sub>
+            <m:r>
+              <m:rPr>
+                <m:sty m:val="p"/>
+              </m:rPr>
+              <w:rPr>
+                <w:rFonts w:ascii="Cambria Math" w:hAnsi="Cambria Math" w:eastAsia="Cambria Math" w:cs="Cambria Math"/>
+                <w:sz w:val="20"/>
+                <w:szCs w:val="20"/>
+              </w:rPr>
+              <m:t>D</m:t>
+            </m:r>
+          </m:sub>
+        </m:sSub>
+        <m:r>
+          <m:rPr>
+            <m:sty m:val="bi"/>
+          </m:rPr>
+          <w:rPr>
+            <w:rFonts w:ascii="Cambria Math" w:hAnsi="Cambria Math" w:eastAsia="Cambria Math" w:cs="Cambria Math"/>
+            <w:sz w:val="20"/>
+            <w:szCs w:val="20"/>
+          </w:rPr>
+          <m:t>g</m:t>
+        </m:r>
       </m:oMath>
       <w:r>
         <w:rPr>
@@ -30349,7 +29586,166 @@
           <w:sz w:val="20"/>
           <w:szCs w:val="20"/>
         </w:rPr>
-        <w:t>，对应电机广义力矩为</w:t>
+        <w:t>，必要时另加各支链重力项。该方法用于降低手持机构的静态负担。摩擦、参数误差和机构奇异会影响补偿效果，近奇异区域应限制力矩和操作范围。报告提供了补偿效果演示，尚未提供残余手持力的测量。</w:t>
+      </w:r>
+    </w:p>
+    <w:bookmarkEnd w:id="17"/>
+    <w:p>
+      <w:pPr>
+        <w:pStyle w:val="4"/>
+        <w:numPr>
+          <w:ilvl w:val="2"/>
+          <w:numId w:val="0"/>
+        </w:numPr>
+        <w:snapToGrid w:val="0"/>
+      </w:pPr>
+      <w:bookmarkStart w:id="18" w:name="位姿映射与底盘补偿"/>
+      <w:r>
+        <w:t xml:space="preserve">3) </w:t>
+      </w:r>
+      <w:r>
+        <w:rPr>
+          <w:rFonts w:hint="eastAsia"/>
+        </w:rPr>
+        <w:t>位姿映射与底盘补偿</w:t>
+      </w:r>
+    </w:p>
+    <w:p>
+      <w:pPr>
+        <w:pStyle w:val="7"/>
+        <w:numPr>
+          <w:ilvl w:val="0"/>
+          <w:numId w:val="0"/>
+        </w:numPr>
+        <w:snapToGrid w:val="0"/>
+        <w:rPr>
+          <w:sz w:val="20"/>
+        </w:rPr>
+      </w:pPr>
+      <w:r>
+        <w:rPr>
+          <w:rFonts w:hint="eastAsia"/>
+          <w:sz w:val="20"/>
+          <w:szCs w:val="20"/>
+        </w:rPr>
+        <w:t>主端初始化时记录平移零点</w:t>
+      </w:r>
+      <w:r>
+        <w:rPr>
+          <w:sz w:val="20"/>
+          <w:szCs w:val="20"/>
+        </w:rPr>
+        <w:t xml:space="preserve"> </w:t>
+      </w:r>
+      <m:oMath>
+        <m:sSub>
+          <m:sSubPr/>
+          <m:e>
+            <m:r>
+              <m:rPr>
+                <m:sty m:val="bi"/>
+              </m:rPr>
+              <w:rPr>
+                <w:rFonts w:ascii="Cambria Math" w:hAnsi="Cambria Math" w:eastAsia="Cambria Math" w:cs="Cambria Math"/>
+                <w:sz w:val="20"/>
+                <w:szCs w:val="20"/>
+              </w:rPr>
+              <m:t>p</m:t>
+            </m:r>
+          </m:e>
+          <m:sub>
+            <m:r>
+              <m:rPr>
+                <m:sty m:val="p"/>
+              </m:rPr>
+              <w:rPr>
+                <w:rFonts w:ascii="Cambria Math" w:hAnsi="Cambria Math" w:eastAsia="Cambria Math" w:cs="Cambria Math"/>
+                <w:sz w:val="20"/>
+                <w:szCs w:val="20"/>
+              </w:rPr>
+              <m:t>D,</m:t>
+            </m:r>
+            <m:r>
+              <m:rPr/>
+              <w:rPr>
+                <w:rFonts w:ascii="Cambria Math" w:hAnsi="Cambria Math" w:eastAsia="Cambria Math" w:cs="Cambria Math"/>
+                <w:sz w:val="20"/>
+                <w:szCs w:val="20"/>
+              </w:rPr>
+              <m:t>0</m:t>
+            </m:r>
+          </m:sub>
+        </m:sSub>
+      </m:oMath>
+      <w:r>
+        <w:rPr>
+          <w:sz w:val="20"/>
+          <w:szCs w:val="20"/>
+        </w:rPr>
+        <w:t xml:space="preserve"> </w:t>
+      </w:r>
+      <w:r>
+        <w:rPr>
+          <w:rFonts w:hint="eastAsia"/>
+          <w:sz w:val="20"/>
+          <w:szCs w:val="20"/>
+        </w:rPr>
+        <w:t>与从端参考点</w:t>
+      </w:r>
+      <w:r>
+        <w:rPr>
+          <w:sz w:val="20"/>
+          <w:szCs w:val="20"/>
+        </w:rPr>
+        <w:t xml:space="preserve"> </w:t>
+      </w:r>
+      <m:oMath>
+        <m:sSub>
+          <m:sSubPr/>
+          <m:e>
+            <m:r>
+              <m:rPr>
+                <m:sty m:val="bi"/>
+              </m:rPr>
+              <w:rPr>
+                <w:rFonts w:ascii="Cambria Math" w:hAnsi="Cambria Math" w:eastAsia="Cambria Math" w:cs="Cambria Math"/>
+                <w:sz w:val="20"/>
+                <w:szCs w:val="20"/>
+              </w:rPr>
+              <m:t>p</m:t>
+            </m:r>
+          </m:e>
+          <m:sub>
+            <m:r>
+              <m:rPr>
+                <m:sty m:val="p"/>
+              </m:rPr>
+              <w:rPr>
+                <w:rFonts w:ascii="Cambria Math" w:hAnsi="Cambria Math" w:eastAsia="Cambria Math" w:cs="Cambria Math"/>
+                <w:sz w:val="20"/>
+                <w:szCs w:val="20"/>
+              </w:rPr>
+              <m:t>A,</m:t>
+            </m:r>
+            <m:r>
+              <m:rPr/>
+              <w:rPr>
+                <w:rFonts w:ascii="Cambria Math" w:hAnsi="Cambria Math" w:eastAsia="Cambria Math" w:cs="Cambria Math"/>
+                <w:sz w:val="20"/>
+                <w:szCs w:val="20"/>
+              </w:rPr>
+              <m:t>0</m:t>
+            </m:r>
+          </m:sub>
+        </m:sSub>
+      </m:oMath>
+      <w:r>
+        <w:rPr>
+          <w:rFonts w:hint="eastAsia"/>
+          <w:sz w:val="20"/>
+          <w:szCs w:val="20"/>
+        </w:rPr>
+        <w:t>，经坐标对齐后的主从位置映射为</w:t>
       </w:r>
     </w:p>
     <w:tbl>
@@ -30435,7 +29831,7 @@
                         <w:sz w:val="18"/>
                         <w:szCs w:val="18"/>
                       </w:rPr>
-                      <m:t>τ</m:t>
+                      <m:t>p</m:t>
                     </m:r>
                   </m:e>
                   <m:sub>
@@ -30448,7 +29844,7 @@
                         <w:sz w:val="18"/>
                         <w:szCs w:val="18"/>
                       </w:rPr>
-                      <m:t>D,ff</m:t>
+                      <m:t>A,d</m:t>
                     </m:r>
                   </m:sub>
                 </m:sSub>
@@ -30463,19 +29859,19 @@
                   </w:rPr>
                   <m:t>=</m:t>
                 </m:r>
-                <m:sSubSup>
-                  <m:sSubSupPr/>
+                <m:sSub>
+                  <m:sSubPr/>
                   <m:e>
                     <m:r>
                       <m:rPr>
-                        <m:sty m:val="b"/>
+                        <m:sty m:val="bi"/>
                       </m:rPr>
                       <w:rPr>
                         <w:rFonts w:ascii="Cambria Math" w:hAnsi="Cambria Math" w:eastAsia="Cambria Math" w:cs="Cambria Math"/>
                         <w:sz w:val="18"/>
                         <w:szCs w:val="18"/>
                       </w:rPr>
-                      <m:t>J</m:t>
+                      <m:t>p</m:t>
                     </m:r>
                   </m:e>
                   <m:sub>
@@ -30488,49 +29884,16 @@
                         <w:sz w:val="18"/>
                         <w:szCs w:val="18"/>
                       </w:rPr>
-                      <m:t>D</m:t>
-                    </m:r>
-                  </m:sub>
-                  <m:sup>
-                    <m:r>
-                      <m:rPr>
-                        <m:sty m:val="p"/>
-                      </m:rPr>
+                      <m:t>A,</m:t>
+                    </m:r>
+                    <m:r>
+                      <m:rPr/>
                       <w:rPr>
                         <w:rFonts w:ascii="Cambria Math" w:hAnsi="Cambria Math" w:eastAsia="Cambria Math" w:cs="Cambria Math"/>
                         <w:sz w:val="18"/>
                         <w:szCs w:val="18"/>
                       </w:rPr>
-                      <m:t>T</m:t>
-                    </m:r>
-                  </m:sup>
-                </m:sSubSup>
-                <m:sSub>
-                  <m:sSubPr/>
-                  <m:e>
-                    <m:r>
-                      <m:rPr>
-                        <m:sty m:val="bi"/>
-                      </m:rPr>
-                      <w:rPr>
-                        <w:rFonts w:ascii="Cambria Math" w:hAnsi="Cambria Math" w:eastAsia="Cambria Math" w:cs="Cambria Math"/>
-                        <w:sz w:val="18"/>
-                        <w:szCs w:val="18"/>
-                      </w:rPr>
-                      <m:t>f</m:t>
-                    </m:r>
-                  </m:e>
-                  <m:sub>
-                    <m:r>
-                      <m:rPr>
-                        <m:sty m:val="p"/>
-                      </m:rPr>
-                      <w:rPr>
-                        <w:rFonts w:ascii="Cambria Math" w:hAnsi="Cambria Math" w:eastAsia="Cambria Math" w:cs="Cambria Math"/>
-                        <w:sz w:val="18"/>
-                        <w:szCs w:val="18"/>
-                      </w:rPr>
-                      <m:t>D</m:t>
+                      <m:t>0</m:t>
                     </m:r>
                   </m:sub>
                 </m:sSub>
@@ -30543,7 +29906,165 @@
                     <w:sz w:val="18"/>
                     <w:szCs w:val="18"/>
                   </w:rPr>
-                  <m:t>.</m:t>
+                  <m:t>+</m:t>
+                </m:r>
+                <m:sSub>
+                  <m:sSubPr/>
+                  <m:e>
+                    <m:r>
+                      <m:rPr>
+                        <m:sty m:val="b"/>
+                      </m:rPr>
+                      <w:rPr>
+                        <w:rFonts w:ascii="Cambria Math" w:hAnsi="Cambria Math" w:eastAsia="Cambria Math" w:cs="Cambria Math"/>
+                        <w:sz w:val="18"/>
+                        <w:szCs w:val="18"/>
+                      </w:rPr>
+                      <m:t>K</m:t>
+                    </m:r>
+                  </m:e>
+                  <m:sub>
+                    <m:r>
+                      <m:rPr>
+                        <m:sty m:val="p"/>
+                      </m:rPr>
+                      <w:rPr>
+                        <w:rFonts w:ascii="Cambria Math" w:hAnsi="Cambria Math" w:eastAsia="Cambria Math" w:cs="Cambria Math"/>
+                        <w:sz w:val="18"/>
+                        <w:szCs w:val="18"/>
+                      </w:rPr>
+                      <m:t>map</m:t>
+                    </m:r>
+                  </m:sub>
+                </m:sSub>
+                <m:sSub>
+                  <m:sSubPr/>
+                  <m:e>
+                    <m:r>
+                      <m:rPr>
+                        <m:sty m:val="b"/>
+                      </m:rPr>
+                      <w:rPr>
+                        <w:rFonts w:ascii="Cambria Math" w:hAnsi="Cambria Math" w:eastAsia="Cambria Math" w:cs="Cambria Math"/>
+                        <w:sz w:val="18"/>
+                        <w:szCs w:val="18"/>
+                      </w:rPr>
+                      <m:t>R</m:t>
+                    </m:r>
+                  </m:e>
+                  <m:sub>
+                    <m:r>
+                      <m:rPr>
+                        <m:sty m:val="p"/>
+                      </m:rPr>
+                      <w:rPr>
+                        <w:rFonts w:ascii="Cambria Math" w:hAnsi="Cambria Math" w:eastAsia="Cambria Math" w:cs="Cambria Math"/>
+                        <w:sz w:val="18"/>
+                        <w:szCs w:val="18"/>
+                      </w:rPr>
+                      <m:t>AD</m:t>
+                    </m:r>
+                  </m:sub>
+                </m:sSub>
+                <m:r>
+                  <m:rPr>
+                    <m:sty m:val="p"/>
+                  </m:rPr>
+                  <w:rPr>
+                    <w:rFonts w:ascii="Cambria Math" w:hAnsi="Cambria Math" w:eastAsia="Cambria Math" w:cs="Cambria Math"/>
+                    <w:sz w:val="18"/>
+                    <w:szCs w:val="18"/>
+                  </w:rPr>
+                  <m:t>(</m:t>
+                </m:r>
+                <m:sSub>
+                  <m:sSubPr/>
+                  <m:e>
+                    <m:r>
+                      <m:rPr>
+                        <m:sty m:val="bi"/>
+                      </m:rPr>
+                      <w:rPr>
+                        <w:rFonts w:ascii="Cambria Math" w:hAnsi="Cambria Math" w:eastAsia="Cambria Math" w:cs="Cambria Math"/>
+                        <w:sz w:val="18"/>
+                        <w:szCs w:val="18"/>
+                      </w:rPr>
+                      <m:t>p</m:t>
+                    </m:r>
+                  </m:e>
+                  <m:sub>
+                    <m:r>
+                      <m:rPr>
+                        <m:sty m:val="p"/>
+                      </m:rPr>
+                      <w:rPr>
+                        <w:rFonts w:ascii="Cambria Math" w:hAnsi="Cambria Math" w:eastAsia="Cambria Math" w:cs="Cambria Math"/>
+                        <w:sz w:val="18"/>
+                        <w:szCs w:val="18"/>
+                      </w:rPr>
+                      <m:t>D</m:t>
+                    </m:r>
+                  </m:sub>
+                </m:sSub>
+                <m:r>
+                  <m:rPr>
+                    <m:sty m:val="p"/>
+                  </m:rPr>
+                  <w:rPr>
+                    <w:rFonts w:ascii="Cambria Math" w:hAnsi="Cambria Math" w:eastAsia="Cambria Math" w:cs="Cambria Math"/>
+                    <w:sz w:val="18"/>
+                    <w:szCs w:val="18"/>
+                  </w:rPr>
+                  <m:t>−</m:t>
+                </m:r>
+                <m:sSub>
+                  <m:sSubPr/>
+                  <m:e>
+                    <m:r>
+                      <m:rPr>
+                        <m:sty m:val="bi"/>
+                      </m:rPr>
+                      <w:rPr>
+                        <w:rFonts w:ascii="Cambria Math" w:hAnsi="Cambria Math" w:eastAsia="Cambria Math" w:cs="Cambria Math"/>
+                        <w:sz w:val="18"/>
+                        <w:szCs w:val="18"/>
+                      </w:rPr>
+                      <m:t>p</m:t>
+                    </m:r>
+                  </m:e>
+                  <m:sub>
+                    <m:r>
+                      <m:rPr>
+                        <m:sty m:val="p"/>
+                      </m:rPr>
+                      <w:rPr>
+                        <w:rFonts w:ascii="Cambria Math" w:hAnsi="Cambria Math" w:eastAsia="Cambria Math" w:cs="Cambria Math"/>
+                        <w:sz w:val="18"/>
+                        <w:szCs w:val="18"/>
+                      </w:rPr>
+                      <m:t>D,</m:t>
+                    </m:r>
+                    <m:r>
+                      <m:rPr/>
+                      <w:rPr>
+                        <w:rFonts w:ascii="Cambria Math" w:hAnsi="Cambria Math" w:eastAsia="Cambria Math" w:cs="Cambria Math"/>
+                        <w:sz w:val="18"/>
+                        <w:szCs w:val="18"/>
+                      </w:rPr>
+                      <m:t>0</m:t>
+                    </m:r>
+                  </m:sub>
+                </m:sSub>
+                <m:r>
+                  <m:rPr>
+                    <m:sty m:val="p"/>
+                  </m:rPr>
+                  <w:rPr>
+                    <w:rFonts w:ascii="Cambria Math" w:hAnsi="Cambria Math" w:eastAsia="Cambria Math" w:cs="Cambria Math"/>
+                    <w:sz w:val="18"/>
+                    <w:szCs w:val="18"/>
+                  </w:rPr>
+                  <m:t>),</m:t>
                 </m:r>
               </m:oMath>
             </m:oMathPara>
@@ -30595,7 +30116,7 @@
           <w:sz w:val="20"/>
           <w:szCs w:val="20"/>
         </w:rPr>
-        <w:t>将动平台与手柄等效质量记为</w:t>
+        <w:t>其中</w:t>
       </w:r>
       <w:r>
         <w:rPr>
@@ -30609,13 +30130,15 @@
           <m:sSubPr/>
           <m:e>
             <m:r>
-              <m:rPr/>
-              <w:rPr>
-                <w:rFonts w:ascii="Cambria Math" w:hAnsi="Cambria Math" w:eastAsia="Cambria Math" w:cs="Cambria Math"/>
-                <w:sz w:val="20"/>
-                <w:szCs w:val="20"/>
-              </w:rPr>
-              <m:t>m</m:t>
+              <m:rPr>
+                <m:sty m:val="b"/>
+              </m:rPr>
+              <w:rPr>
+                <w:rFonts w:ascii="Cambria Math" w:hAnsi="Cambria Math" w:eastAsia="Cambria Math" w:cs="Cambria Math"/>
+                <w:sz w:val="20"/>
+                <w:szCs w:val="20"/>
+              </w:rPr>
+              <m:t>R</m:t>
             </m:r>
           </m:e>
           <m:sub>
@@ -30628,25 +30151,25 @@
                 <w:sz w:val="20"/>
                 <w:szCs w:val="20"/>
               </w:rPr>
-              <m:t>D</m:t>
+              <m:t>AD</m:t>
             </m:r>
           </m:sub>
         </m:sSub>
       </m:oMath>
       <w:r>
         <w:rPr>
+          <w:sz w:val="20"/>
+          <w:szCs w:val="20"/>
+        </w:rPr>
+        <w:t xml:space="preserve"> </w:t>
+      </w:r>
+      <w:r>
+        <w:rPr>
           <w:rFonts w:hint="eastAsia"/>
           <w:sz w:val="20"/>
           <w:szCs w:val="20"/>
         </w:rPr>
-        <w:t>，重力补偿取</w:t>
-      </w:r>
-      <w:r>
-        <w:rPr>
-          <w:sz w:val="20"/>
-          <w:szCs w:val="20"/>
-        </w:rPr>
-        <w:t xml:space="preserve"> </w:t>
+        <w:t>为固定坐标校准旋转，</w:t>
       </w:r>
       <m:oMath>
         <m:sSub>
@@ -30654,14 +30177,14 @@
           <m:e>
             <m:r>
               <m:rPr>
-                <m:sty m:val="bi"/>
+                <m:sty m:val="b"/>
               </m:rPr>
               <w:rPr>
                 <w:rFonts w:ascii="Cambria Math" w:hAnsi="Cambria Math" w:eastAsia="Cambria Math" w:cs="Cambria Math"/>
                 <w:sz w:val="20"/>
                 <w:szCs w:val="20"/>
               </w:rPr>
-              <m:t>f</m:t>
+              <m:t>K</m:t>
             </m:r>
           </m:e>
           <m:sub>
@@ -30674,7 +30197,7 @@
                 <w:sz w:val="20"/>
                 <w:szCs w:val="20"/>
               </w:rPr>
-              <m:t>D</m:t>
+              <m:t>map</m:t>
             </m:r>
           </m:sub>
         </m:sSub>
@@ -30687,7 +30210,7 @@
             <w:sz w:val="20"/>
             <w:szCs w:val="20"/>
           </w:rPr>
-          <m:t>=−</m:t>
+          <m:t>=diag(</m:t>
         </m:r>
         <m:sSub>
           <m:sSubPr/>
@@ -30699,63 +30222,119 @@
                 <w:sz w:val="20"/>
                 <w:szCs w:val="20"/>
               </w:rPr>
-              <m:t>m</m:t>
+              <m:t>k</m:t>
             </m:r>
           </m:e>
           <m:sub>
             <m:r>
-              <m:rPr>
-                <m:sty m:val="p"/>
-              </m:rPr>
-              <w:rPr>
-                <w:rFonts w:ascii="Cambria Math" w:hAnsi="Cambria Math" w:eastAsia="Cambria Math" w:cs="Cambria Math"/>
-                <w:sz w:val="20"/>
-                <w:szCs w:val="20"/>
-              </w:rPr>
-              <m:t>D</m:t>
+              <m:rPr/>
+              <w:rPr>
+                <w:rFonts w:ascii="Cambria Math" w:hAnsi="Cambria Math" w:eastAsia="Cambria Math" w:cs="Cambria Math"/>
+                <w:sz w:val="20"/>
+                <w:szCs w:val="20"/>
+              </w:rPr>
+              <m:t>x</m:t>
             </m:r>
           </m:sub>
         </m:sSub>
         <m:r>
           <m:rPr>
-            <m:sty m:val="bi"/>
+            <m:sty m:val="p"/>
           </m:rPr>
           <w:rPr>
             <w:rFonts w:ascii="Cambria Math" w:hAnsi="Cambria Math" w:eastAsia="Cambria Math" w:cs="Cambria Math"/>
             <w:sz w:val="20"/>
             <w:szCs w:val="20"/>
           </w:rPr>
-          <m:t>g</m:t>
+          <m:t>,</m:t>
+        </m:r>
+        <m:sSub>
+          <m:sSubPr/>
+          <m:e>
+            <m:r>
+              <m:rPr/>
+              <w:rPr>
+                <w:rFonts w:ascii="Cambria Math" w:hAnsi="Cambria Math" w:eastAsia="Cambria Math" w:cs="Cambria Math"/>
+                <w:sz w:val="20"/>
+                <w:szCs w:val="20"/>
+              </w:rPr>
+              <m:t>k</m:t>
+            </m:r>
+          </m:e>
+          <m:sub>
+            <m:r>
+              <m:rPr/>
+              <w:rPr>
+                <w:rFonts w:ascii="Cambria Math" w:hAnsi="Cambria Math" w:eastAsia="Cambria Math" w:cs="Cambria Math"/>
+                <w:sz w:val="20"/>
+                <w:szCs w:val="20"/>
+              </w:rPr>
+              <m:t>y</m:t>
+            </m:r>
+          </m:sub>
+        </m:sSub>
+        <m:r>
+          <m:rPr>
+            <m:sty m:val="p"/>
+          </m:rPr>
+          <w:rPr>
+            <w:rFonts w:ascii="Cambria Math" w:hAnsi="Cambria Math" w:eastAsia="Cambria Math" w:cs="Cambria Math"/>
+            <w:sz w:val="20"/>
+            <w:szCs w:val="20"/>
+          </w:rPr>
+          <m:t>,</m:t>
+        </m:r>
+        <m:sSub>
+          <m:sSubPr/>
+          <m:e>
+            <m:r>
+              <m:rPr/>
+              <w:rPr>
+                <w:rFonts w:ascii="Cambria Math" w:hAnsi="Cambria Math" w:eastAsia="Cambria Math" w:cs="Cambria Math"/>
+                <w:sz w:val="20"/>
+                <w:szCs w:val="20"/>
+              </w:rPr>
+              <m:t>k</m:t>
+            </m:r>
+          </m:e>
+          <m:sub>
+            <m:r>
+              <m:rPr/>
+              <w:rPr>
+                <w:rFonts w:ascii="Cambria Math" w:hAnsi="Cambria Math" w:eastAsia="Cambria Math" w:cs="Cambria Math"/>
+                <w:sz w:val="20"/>
+                <w:szCs w:val="20"/>
+              </w:rPr>
+              <m:t>z</m:t>
+            </m:r>
+          </m:sub>
+        </m:sSub>
+        <m:r>
+          <m:rPr>
+            <m:sty m:val="p"/>
+          </m:rPr>
+          <w:rPr>
+            <w:rFonts w:ascii="Cambria Math" w:hAnsi="Cambria Math" w:eastAsia="Cambria Math" w:cs="Cambria Math"/>
+            <w:sz w:val="20"/>
+            <w:szCs w:val="20"/>
+          </w:rPr>
+          <m:t>)</m:t>
         </m:r>
       </m:oMath>
       <w:r>
         <w:rPr>
+          <w:sz w:val="20"/>
+          <w:szCs w:val="20"/>
+        </w:rPr>
+        <w:t xml:space="preserve"> </w:t>
+      </w:r>
+      <w:r>
+        <w:rPr>
           <w:rFonts w:hint="eastAsia"/>
           <w:sz w:val="20"/>
           <w:szCs w:val="20"/>
         </w:rPr>
-        <w:t>，必要时另加各支链重力项。该方法用于降低手持机构的静态负担。摩擦、参数误差和机构奇异会影响补偿效果，近奇异区域应限制力矩和操作范围。报告提供了补偿效果演示，尚未提供残余手持力的测量。</w:t>
-      </w:r>
-    </w:p>
-    <w:bookmarkEnd w:id="17"/>
-    <w:p>
-      <w:pPr>
-        <w:pStyle w:val="4"/>
-        <w:numPr>
-          <w:ilvl w:val="2"/>
-          <w:numId w:val="0"/>
-        </w:numPr>
-        <w:snapToGrid w:val="0"/>
-      </w:pPr>
-      <w:bookmarkStart w:id="18" w:name="位姿映射与底盘补偿"/>
-      <w:r>
-        <w:t xml:space="preserve">3) </w:t>
-      </w:r>
-      <w:r>
-        <w:rPr>
-          <w:rFonts w:hint="eastAsia"/>
-        </w:rPr>
-        <w:t>位姿映射与底盘补偿</w:t>
+        <w:t>为无量纲缩放矩阵。较小缩放系数可减小从端对手部位移的响应，但不能消除机械误差。重置按钮更新参考点时，应保持从端目标连续。</w:t>
       </w:r>
     </w:p>
     <w:p>
@@ -30776,7 +30355,7 @@
           <w:sz w:val="20"/>
           <w:szCs w:val="20"/>
         </w:rPr>
-        <w:t>主端初始化时记录平移零点</w:t>
+        <w:t>姿态手柄的三个编码器角记为</w:t>
       </w:r>
       <w:r>
         <w:rPr>
@@ -30798,7 +30377,7 @@
                 <w:sz w:val="20"/>
                 <w:szCs w:val="20"/>
               </w:rPr>
-              <m:t>p</m:t>
+              <m:t>q</m:t>
             </m:r>
           </m:e>
           <m:sub>
@@ -30811,34 +30390,18 @@
                 <w:sz w:val="20"/>
                 <w:szCs w:val="20"/>
               </w:rPr>
-              <m:t>D,</m:t>
-            </m:r>
-            <m:r>
-              <m:rPr/>
-              <w:rPr>
-                <w:rFonts w:ascii="Cambria Math" w:hAnsi="Cambria Math" w:eastAsia="Cambria Math" w:cs="Cambria Math"/>
-                <w:sz w:val="20"/>
-                <w:szCs w:val="20"/>
-              </w:rPr>
-              <m:t>0</m:t>
+              <m:t>h</m:t>
             </m:r>
           </m:sub>
         </m:sSub>
       </m:oMath>
       <w:r>
         <w:rPr>
-          <w:sz w:val="20"/>
-          <w:szCs w:val="20"/>
-        </w:rPr>
-        <w:t xml:space="preserve"> </w:t>
-      </w:r>
-      <w:r>
-        <w:rPr>
           <w:rFonts w:hint="eastAsia"/>
           <w:sz w:val="20"/>
           <w:szCs w:val="20"/>
         </w:rPr>
-        <w:t>与从端参考点</w:t>
+        <w:t>，根据其真实串联转轴顺序求得</w:t>
       </w:r>
       <w:r>
         <w:rPr>
@@ -30853,14 +30416,14 @@
           <m:e>
             <m:r>
               <m:rPr>
-                <m:sty m:val="bi"/>
+                <m:sty m:val="b"/>
               </m:rPr>
               <w:rPr>
                 <w:rFonts w:ascii="Cambria Math" w:hAnsi="Cambria Math" w:eastAsia="Cambria Math" w:cs="Cambria Math"/>
                 <w:sz w:val="20"/>
                 <w:szCs w:val="20"/>
               </w:rPr>
-              <m:t>p</m:t>
+              <m:t>R</m:t>
             </m:r>
           </m:e>
           <m:sub>
@@ -30873,19 +30436,61 @@
                 <w:sz w:val="20"/>
                 <w:szCs w:val="20"/>
               </w:rPr>
-              <m:t>A,</m:t>
-            </m:r>
-            <m:r>
-              <m:rPr/>
-              <w:rPr>
-                <w:rFonts w:ascii="Cambria Math" w:hAnsi="Cambria Math" w:eastAsia="Cambria Math" w:cs="Cambria Math"/>
-                <w:sz w:val="20"/>
-                <w:szCs w:val="20"/>
-              </w:rPr>
-              <m:t>0</m:t>
+              <m:t>h</m:t>
             </m:r>
           </m:sub>
         </m:sSub>
+        <m:r>
+          <m:rPr>
+            <m:sty m:val="p"/>
+          </m:rPr>
+          <w:rPr>
+            <w:rFonts w:ascii="Cambria Math" w:hAnsi="Cambria Math" w:eastAsia="Cambria Math" w:cs="Cambria Math"/>
+            <w:sz w:val="20"/>
+            <w:szCs w:val="20"/>
+          </w:rPr>
+          <m:t>(</m:t>
+        </m:r>
+        <m:sSub>
+          <m:sSubPr/>
+          <m:e>
+            <m:r>
+              <m:rPr>
+                <m:sty m:val="bi"/>
+              </m:rPr>
+              <w:rPr>
+                <w:rFonts w:ascii="Cambria Math" w:hAnsi="Cambria Math" w:eastAsia="Cambria Math" w:cs="Cambria Math"/>
+                <w:sz w:val="20"/>
+                <w:szCs w:val="20"/>
+              </w:rPr>
+              <m:t>q</m:t>
+            </m:r>
+          </m:e>
+          <m:sub>
+            <m:r>
+              <m:rPr>
+                <m:sty m:val="p"/>
+              </m:rPr>
+              <w:rPr>
+                <w:rFonts w:ascii="Cambria Math" w:hAnsi="Cambria Math" w:eastAsia="Cambria Math" w:cs="Cambria Math"/>
+                <w:sz w:val="20"/>
+                <w:szCs w:val="20"/>
+              </w:rPr>
+              <m:t>h</m:t>
+            </m:r>
+          </m:sub>
+        </m:sSub>
+        <m:r>
+          <m:rPr>
+            <m:sty m:val="p"/>
+          </m:rPr>
+          <w:rPr>
+            <w:rFonts w:ascii="Cambria Math" w:hAnsi="Cambria Math" w:eastAsia="Cambria Math" w:cs="Cambria Math"/>
+            <w:sz w:val="20"/>
+            <w:szCs w:val="20"/>
+          </w:rPr>
+          <m:t>)</m:t>
+        </m:r>
       </m:oMath>
       <w:r>
         <w:rPr>
@@ -30893,7 +30498,7 @@
           <w:sz w:val="20"/>
           <w:szCs w:val="20"/>
         </w:rPr>
-        <w:t>，经坐标对齐后的主从位置映射为</w:t>
+        <w:t>，再施加固定安装变换：</w:t>
       </w:r>
     </w:p>
     <w:tbl>
@@ -30972,759 +30577,6 @@
                   <m:e>
                     <m:r>
                       <m:rPr>
-                        <m:sty m:val="bi"/>
-                      </m:rPr>
-                      <w:rPr>
-                        <w:rFonts w:ascii="Cambria Math" w:hAnsi="Cambria Math" w:eastAsia="Cambria Math" w:cs="Cambria Math"/>
-                        <w:sz w:val="18"/>
-                        <w:szCs w:val="18"/>
-                      </w:rPr>
-                      <m:t>p</m:t>
-                    </m:r>
-                  </m:e>
-                  <m:sub>
-                    <m:r>
-                      <m:rPr>
-                        <m:sty m:val="p"/>
-                      </m:rPr>
-                      <w:rPr>
-                        <w:rFonts w:ascii="Cambria Math" w:hAnsi="Cambria Math" w:eastAsia="Cambria Math" w:cs="Cambria Math"/>
-                        <w:sz w:val="18"/>
-                        <w:szCs w:val="18"/>
-                      </w:rPr>
-                      <m:t>A,d</m:t>
-                    </m:r>
-                  </m:sub>
-                </m:sSub>
-                <m:r>
-                  <m:rPr>
-                    <m:sty m:val="p"/>
-                  </m:rPr>
-                  <w:rPr>
-                    <w:rFonts w:ascii="Cambria Math" w:hAnsi="Cambria Math" w:eastAsia="Cambria Math" w:cs="Cambria Math"/>
-                    <w:sz w:val="18"/>
-                    <w:szCs w:val="18"/>
-                  </w:rPr>
-                  <m:t>=</m:t>
-                </m:r>
-                <m:sSub>
-                  <m:sSubPr/>
-                  <m:e>
-                    <m:r>
-                      <m:rPr>
-                        <m:sty m:val="bi"/>
-                      </m:rPr>
-                      <w:rPr>
-                        <w:rFonts w:ascii="Cambria Math" w:hAnsi="Cambria Math" w:eastAsia="Cambria Math" w:cs="Cambria Math"/>
-                        <w:sz w:val="18"/>
-                        <w:szCs w:val="18"/>
-                      </w:rPr>
-                      <m:t>p</m:t>
-                    </m:r>
-                  </m:e>
-                  <m:sub>
-                    <m:r>
-                      <m:rPr>
-                        <m:sty m:val="p"/>
-                      </m:rPr>
-                      <w:rPr>
-                        <w:rFonts w:ascii="Cambria Math" w:hAnsi="Cambria Math" w:eastAsia="Cambria Math" w:cs="Cambria Math"/>
-                        <w:sz w:val="18"/>
-                        <w:szCs w:val="18"/>
-                      </w:rPr>
-                      <m:t>A,</m:t>
-                    </m:r>
-                    <m:r>
-                      <m:rPr/>
-                      <w:rPr>
-                        <w:rFonts w:ascii="Cambria Math" w:hAnsi="Cambria Math" w:eastAsia="Cambria Math" w:cs="Cambria Math"/>
-                        <w:sz w:val="18"/>
-                        <w:szCs w:val="18"/>
-                      </w:rPr>
-                      <m:t>0</m:t>
-                    </m:r>
-                  </m:sub>
-                </m:sSub>
-                <m:r>
-                  <m:rPr>
-                    <m:sty m:val="p"/>
-                  </m:rPr>
-                  <w:rPr>
-                    <w:rFonts w:ascii="Cambria Math" w:hAnsi="Cambria Math" w:eastAsia="Cambria Math" w:cs="Cambria Math"/>
-                    <w:sz w:val="18"/>
-                    <w:szCs w:val="18"/>
-                  </w:rPr>
-                  <m:t>+</m:t>
-                </m:r>
-                <m:sSub>
-                  <m:sSubPr/>
-                  <m:e>
-                    <m:r>
-                      <m:rPr>
-                        <m:sty m:val="b"/>
-                      </m:rPr>
-                      <w:rPr>
-                        <w:rFonts w:ascii="Cambria Math" w:hAnsi="Cambria Math" w:eastAsia="Cambria Math" w:cs="Cambria Math"/>
-                        <w:sz w:val="18"/>
-                        <w:szCs w:val="18"/>
-                      </w:rPr>
-                      <m:t>K</m:t>
-                    </m:r>
-                  </m:e>
-                  <m:sub>
-                    <m:r>
-                      <m:rPr>
-                        <m:sty m:val="p"/>
-                      </m:rPr>
-                      <w:rPr>
-                        <w:rFonts w:ascii="Cambria Math" w:hAnsi="Cambria Math" w:eastAsia="Cambria Math" w:cs="Cambria Math"/>
-                        <w:sz w:val="18"/>
-                        <w:szCs w:val="18"/>
-                      </w:rPr>
-                      <m:t>map</m:t>
-                    </m:r>
-                  </m:sub>
-                </m:sSub>
-                <m:sSub>
-                  <m:sSubPr/>
-                  <m:e>
-                    <m:r>
-                      <m:rPr>
-                        <m:sty m:val="b"/>
-                      </m:rPr>
-                      <w:rPr>
-                        <w:rFonts w:ascii="Cambria Math" w:hAnsi="Cambria Math" w:eastAsia="Cambria Math" w:cs="Cambria Math"/>
-                        <w:sz w:val="18"/>
-                        <w:szCs w:val="18"/>
-                      </w:rPr>
-                      <m:t>R</m:t>
-                    </m:r>
-                  </m:e>
-                  <m:sub>
-                    <m:r>
-                      <m:rPr>
-                        <m:sty m:val="p"/>
-                      </m:rPr>
-                      <w:rPr>
-                        <w:rFonts w:ascii="Cambria Math" w:hAnsi="Cambria Math" w:eastAsia="Cambria Math" w:cs="Cambria Math"/>
-                        <w:sz w:val="18"/>
-                        <w:szCs w:val="18"/>
-                      </w:rPr>
-                      <m:t>AD</m:t>
-                    </m:r>
-                  </m:sub>
-                </m:sSub>
-                <m:r>
-                  <m:rPr>
-                    <m:sty m:val="p"/>
-                  </m:rPr>
-                  <w:rPr>
-                    <w:rFonts w:ascii="Cambria Math" w:hAnsi="Cambria Math" w:eastAsia="Cambria Math" w:cs="Cambria Math"/>
-                    <w:sz w:val="18"/>
-                    <w:szCs w:val="18"/>
-                  </w:rPr>
-                  <m:t>(</m:t>
-                </m:r>
-                <m:sSub>
-                  <m:sSubPr/>
-                  <m:e>
-                    <m:r>
-                      <m:rPr>
-                        <m:sty m:val="bi"/>
-                      </m:rPr>
-                      <w:rPr>
-                        <w:rFonts w:ascii="Cambria Math" w:hAnsi="Cambria Math" w:eastAsia="Cambria Math" w:cs="Cambria Math"/>
-                        <w:sz w:val="18"/>
-                        <w:szCs w:val="18"/>
-                      </w:rPr>
-                      <m:t>p</m:t>
-                    </m:r>
-                  </m:e>
-                  <m:sub>
-                    <m:r>
-                      <m:rPr>
-                        <m:sty m:val="p"/>
-                      </m:rPr>
-                      <w:rPr>
-                        <w:rFonts w:ascii="Cambria Math" w:hAnsi="Cambria Math" w:eastAsia="Cambria Math" w:cs="Cambria Math"/>
-                        <w:sz w:val="18"/>
-                        <w:szCs w:val="18"/>
-                      </w:rPr>
-                      <m:t>D</m:t>
-                    </m:r>
-                  </m:sub>
-                </m:sSub>
-                <m:r>
-                  <m:rPr>
-                    <m:sty m:val="p"/>
-                  </m:rPr>
-                  <w:rPr>
-                    <w:rFonts w:ascii="Cambria Math" w:hAnsi="Cambria Math" w:eastAsia="Cambria Math" w:cs="Cambria Math"/>
-                    <w:sz w:val="18"/>
-                    <w:szCs w:val="18"/>
-                  </w:rPr>
-                  <m:t>−</m:t>
-                </m:r>
-                <m:sSub>
-                  <m:sSubPr/>
-                  <m:e>
-                    <m:r>
-                      <m:rPr>
-                        <m:sty m:val="bi"/>
-                      </m:rPr>
-                      <w:rPr>
-                        <w:rFonts w:ascii="Cambria Math" w:hAnsi="Cambria Math" w:eastAsia="Cambria Math" w:cs="Cambria Math"/>
-                        <w:sz w:val="18"/>
-                        <w:szCs w:val="18"/>
-                      </w:rPr>
-                      <m:t>p</m:t>
-                    </m:r>
-                  </m:e>
-                  <m:sub>
-                    <m:r>
-                      <m:rPr>
-                        <m:sty m:val="p"/>
-                      </m:rPr>
-                      <w:rPr>
-                        <w:rFonts w:ascii="Cambria Math" w:hAnsi="Cambria Math" w:eastAsia="Cambria Math" w:cs="Cambria Math"/>
-                        <w:sz w:val="18"/>
-                        <w:szCs w:val="18"/>
-                      </w:rPr>
-                      <m:t>D,</m:t>
-                    </m:r>
-                    <m:r>
-                      <m:rPr/>
-                      <w:rPr>
-                        <w:rFonts w:ascii="Cambria Math" w:hAnsi="Cambria Math" w:eastAsia="Cambria Math" w:cs="Cambria Math"/>
-                        <w:sz w:val="18"/>
-                        <w:szCs w:val="18"/>
-                      </w:rPr>
-                      <m:t>0</m:t>
-                    </m:r>
-                  </m:sub>
-                </m:sSub>
-                <m:r>
-                  <m:rPr>
-                    <m:sty m:val="p"/>
-                  </m:rPr>
-                  <w:rPr>
-                    <w:rFonts w:ascii="Cambria Math" w:hAnsi="Cambria Math" w:eastAsia="Cambria Math" w:cs="Cambria Math"/>
-                    <w:sz w:val="18"/>
-                    <w:szCs w:val="18"/>
-                  </w:rPr>
-                  <m:t>),</m:t>
-                </m:r>
-              </m:oMath>
-            </m:oMathPara>
-          </w:p>
-        </w:tc>
-        <w:tc>
-          <w:tcPr>
-            <w:tcW w:w="390" w:type="dxa"/>
-            <w:vAlign w:val="center"/>
-          </w:tcPr>
-          <w:p>
-            <w:pPr>
-              <w:numPr>
-                <w:ilvl w:val="0"/>
-                <w:numId w:val="0"/>
-              </w:numPr>
-              <w:snapToGrid w:val="0"/>
-              <w:jc w:val="right"/>
-              <w:rPr>
-                <w:sz w:val="16"/>
-              </w:rPr>
-            </w:pPr>
-            <w:r>
-              <w:rPr>
-                <w:sz w:val="16"/>
-                <w:szCs w:val="16"/>
-              </w:rPr>
-              <w:t>(33)</w:t>
-            </w:r>
-          </w:p>
-        </w:tc>
-      </w:tr>
-    </w:tbl>
-    <w:p>
-      <w:pPr>
-        <w:pStyle w:val="7"/>
-        <w:numPr>
-          <w:ilvl w:val="0"/>
-          <w:numId w:val="0"/>
-        </w:numPr>
-        <w:snapToGrid w:val="0"/>
-        <w:rPr>
-          <w:sz w:val="20"/>
-        </w:rPr>
-      </w:pPr>
-      <w:r>
-        <w:rPr>
-          <w:rFonts w:hint="eastAsia"/>
-          <w:sz w:val="20"/>
-          <w:szCs w:val="20"/>
-        </w:rPr>
-        <w:t>其中</w:t>
-      </w:r>
-      <w:r>
-        <w:rPr>
-          <w:sz w:val="20"/>
-          <w:szCs w:val="20"/>
-        </w:rPr>
-        <w:t xml:space="preserve"> </w:t>
-      </w:r>
-      <m:oMath>
-        <m:sSub>
-          <m:sSubPr/>
-          <m:e>
-            <m:r>
-              <m:rPr>
-                <m:sty m:val="b"/>
-              </m:rPr>
-              <w:rPr>
-                <w:rFonts w:ascii="Cambria Math" w:hAnsi="Cambria Math" w:eastAsia="Cambria Math" w:cs="Cambria Math"/>
-                <w:sz w:val="20"/>
-                <w:szCs w:val="20"/>
-              </w:rPr>
-              <m:t>R</m:t>
-            </m:r>
-          </m:e>
-          <m:sub>
-            <m:r>
-              <m:rPr>
-                <m:sty m:val="p"/>
-              </m:rPr>
-              <w:rPr>
-                <w:rFonts w:ascii="Cambria Math" w:hAnsi="Cambria Math" w:eastAsia="Cambria Math" w:cs="Cambria Math"/>
-                <w:sz w:val="20"/>
-                <w:szCs w:val="20"/>
-              </w:rPr>
-              <m:t>AD</m:t>
-            </m:r>
-          </m:sub>
-        </m:sSub>
-      </m:oMath>
-      <w:r>
-        <w:rPr>
-          <w:sz w:val="20"/>
-          <w:szCs w:val="20"/>
-        </w:rPr>
-        <w:t xml:space="preserve"> </w:t>
-      </w:r>
-      <w:r>
-        <w:rPr>
-          <w:rFonts w:hint="eastAsia"/>
-          <w:sz w:val="20"/>
-          <w:szCs w:val="20"/>
-        </w:rPr>
-        <w:t>为固定坐标校准旋转，</w:t>
-      </w:r>
-      <m:oMath>
-        <m:sSub>
-          <m:sSubPr/>
-          <m:e>
-            <m:r>
-              <m:rPr>
-                <m:sty m:val="b"/>
-              </m:rPr>
-              <w:rPr>
-                <w:rFonts w:ascii="Cambria Math" w:hAnsi="Cambria Math" w:eastAsia="Cambria Math" w:cs="Cambria Math"/>
-                <w:sz w:val="20"/>
-                <w:szCs w:val="20"/>
-              </w:rPr>
-              <m:t>K</m:t>
-            </m:r>
-          </m:e>
-          <m:sub>
-            <m:r>
-              <m:rPr>
-                <m:sty m:val="p"/>
-              </m:rPr>
-              <w:rPr>
-                <w:rFonts w:ascii="Cambria Math" w:hAnsi="Cambria Math" w:eastAsia="Cambria Math" w:cs="Cambria Math"/>
-                <w:sz w:val="20"/>
-                <w:szCs w:val="20"/>
-              </w:rPr>
-              <m:t>map</m:t>
-            </m:r>
-          </m:sub>
-        </m:sSub>
-        <m:r>
-          <m:rPr>
-            <m:sty m:val="p"/>
-          </m:rPr>
-          <w:rPr>
-            <w:rFonts w:ascii="Cambria Math" w:hAnsi="Cambria Math" w:eastAsia="Cambria Math" w:cs="Cambria Math"/>
-            <w:sz w:val="20"/>
-            <w:szCs w:val="20"/>
-          </w:rPr>
-          <m:t>=diag(</m:t>
-        </m:r>
-        <m:sSub>
-          <m:sSubPr/>
-          <m:e>
-            <m:r>
-              <m:rPr/>
-              <w:rPr>
-                <w:rFonts w:ascii="Cambria Math" w:hAnsi="Cambria Math" w:eastAsia="Cambria Math" w:cs="Cambria Math"/>
-                <w:sz w:val="20"/>
-                <w:szCs w:val="20"/>
-              </w:rPr>
-              <m:t>k</m:t>
-            </m:r>
-          </m:e>
-          <m:sub>
-            <m:r>
-              <m:rPr/>
-              <w:rPr>
-                <w:rFonts w:ascii="Cambria Math" w:hAnsi="Cambria Math" w:eastAsia="Cambria Math" w:cs="Cambria Math"/>
-                <w:sz w:val="20"/>
-                <w:szCs w:val="20"/>
-              </w:rPr>
-              <m:t>x</m:t>
-            </m:r>
-          </m:sub>
-        </m:sSub>
-        <m:r>
-          <m:rPr>
-            <m:sty m:val="p"/>
-          </m:rPr>
-          <w:rPr>
-            <w:rFonts w:ascii="Cambria Math" w:hAnsi="Cambria Math" w:eastAsia="Cambria Math" w:cs="Cambria Math"/>
-            <w:sz w:val="20"/>
-            <w:szCs w:val="20"/>
-          </w:rPr>
-          <m:t>,</m:t>
-        </m:r>
-        <m:sSub>
-          <m:sSubPr/>
-          <m:e>
-            <m:r>
-              <m:rPr/>
-              <w:rPr>
-                <w:rFonts w:ascii="Cambria Math" w:hAnsi="Cambria Math" w:eastAsia="Cambria Math" w:cs="Cambria Math"/>
-                <w:sz w:val="20"/>
-                <w:szCs w:val="20"/>
-              </w:rPr>
-              <m:t>k</m:t>
-            </m:r>
-          </m:e>
-          <m:sub>
-            <m:r>
-              <m:rPr/>
-              <w:rPr>
-                <w:rFonts w:ascii="Cambria Math" w:hAnsi="Cambria Math" w:eastAsia="Cambria Math" w:cs="Cambria Math"/>
-                <w:sz w:val="20"/>
-                <w:szCs w:val="20"/>
-              </w:rPr>
-              <m:t>y</m:t>
-            </m:r>
-          </m:sub>
-        </m:sSub>
-        <m:r>
-          <m:rPr>
-            <m:sty m:val="p"/>
-          </m:rPr>
-          <w:rPr>
-            <w:rFonts w:ascii="Cambria Math" w:hAnsi="Cambria Math" w:eastAsia="Cambria Math" w:cs="Cambria Math"/>
-            <w:sz w:val="20"/>
-            <w:szCs w:val="20"/>
-          </w:rPr>
-          <m:t>,</m:t>
-        </m:r>
-        <m:sSub>
-          <m:sSubPr/>
-          <m:e>
-            <m:r>
-              <m:rPr/>
-              <w:rPr>
-                <w:rFonts w:ascii="Cambria Math" w:hAnsi="Cambria Math" w:eastAsia="Cambria Math" w:cs="Cambria Math"/>
-                <w:sz w:val="20"/>
-                <w:szCs w:val="20"/>
-              </w:rPr>
-              <m:t>k</m:t>
-            </m:r>
-          </m:e>
-          <m:sub>
-            <m:r>
-              <m:rPr/>
-              <w:rPr>
-                <w:rFonts w:ascii="Cambria Math" w:hAnsi="Cambria Math" w:eastAsia="Cambria Math" w:cs="Cambria Math"/>
-                <w:sz w:val="20"/>
-                <w:szCs w:val="20"/>
-              </w:rPr>
-              <m:t>z</m:t>
-            </m:r>
-          </m:sub>
-        </m:sSub>
-        <m:r>
-          <m:rPr>
-            <m:sty m:val="p"/>
-          </m:rPr>
-          <w:rPr>
-            <w:rFonts w:ascii="Cambria Math" w:hAnsi="Cambria Math" w:eastAsia="Cambria Math" w:cs="Cambria Math"/>
-            <w:sz w:val="20"/>
-            <w:szCs w:val="20"/>
-          </w:rPr>
-          <m:t>)</m:t>
-        </m:r>
-      </m:oMath>
-      <w:r>
-        <w:rPr>
-          <w:sz w:val="20"/>
-          <w:szCs w:val="20"/>
-        </w:rPr>
-        <w:t xml:space="preserve"> </w:t>
-      </w:r>
-      <w:r>
-        <w:rPr>
-          <w:rFonts w:hint="eastAsia"/>
-          <w:sz w:val="20"/>
-          <w:szCs w:val="20"/>
-        </w:rPr>
-        <w:t>为无量纲缩放矩阵。较小缩放系数可减小从端对手部位移的响应，但不能消除机械误差。重置按钮更新参考点时，应保持从端目标连续。</w:t>
-      </w:r>
-    </w:p>
-    <w:p>
-      <w:pPr>
-        <w:pStyle w:val="7"/>
-        <w:numPr>
-          <w:ilvl w:val="0"/>
-          <w:numId w:val="0"/>
-        </w:numPr>
-        <w:snapToGrid w:val="0"/>
-        <w:rPr>
-          <w:sz w:val="20"/>
-        </w:rPr>
-      </w:pPr>
-      <w:r>
-        <w:rPr>
-          <w:rFonts w:hint="eastAsia"/>
-          <w:sz w:val="20"/>
-          <w:szCs w:val="20"/>
-        </w:rPr>
-        <w:t>姿态手柄的三个编码器角记为</w:t>
-      </w:r>
-      <w:r>
-        <w:rPr>
-          <w:sz w:val="20"/>
-          <w:szCs w:val="20"/>
-        </w:rPr>
-        <w:t xml:space="preserve"> </w:t>
-      </w:r>
-      <m:oMath>
-        <m:sSub>
-          <m:sSubPr/>
-          <m:e>
-            <m:r>
-              <m:rPr>
-                <m:sty m:val="bi"/>
-              </m:rPr>
-              <w:rPr>
-                <w:rFonts w:ascii="Cambria Math" w:hAnsi="Cambria Math" w:eastAsia="Cambria Math" w:cs="Cambria Math"/>
-                <w:sz w:val="20"/>
-                <w:szCs w:val="20"/>
-              </w:rPr>
-              <m:t>q</m:t>
-            </m:r>
-          </m:e>
-          <m:sub>
-            <m:r>
-              <m:rPr>
-                <m:sty m:val="p"/>
-              </m:rPr>
-              <w:rPr>
-                <w:rFonts w:ascii="Cambria Math" w:hAnsi="Cambria Math" w:eastAsia="Cambria Math" w:cs="Cambria Math"/>
-                <w:sz w:val="20"/>
-                <w:szCs w:val="20"/>
-              </w:rPr>
-              <m:t>h</m:t>
-            </m:r>
-          </m:sub>
-        </m:sSub>
-      </m:oMath>
-      <w:r>
-        <w:rPr>
-          <w:rFonts w:hint="eastAsia"/>
-          <w:sz w:val="20"/>
-          <w:szCs w:val="20"/>
-        </w:rPr>
-        <w:t>，根据其真实串联转轴顺序求得</w:t>
-      </w:r>
-      <w:r>
-        <w:rPr>
-          <w:sz w:val="20"/>
-          <w:szCs w:val="20"/>
-        </w:rPr>
-        <w:t xml:space="preserve"> </w:t>
-      </w:r>
-      <m:oMath>
-        <m:sSub>
-          <m:sSubPr/>
-          <m:e>
-            <m:r>
-              <m:rPr>
-                <m:sty m:val="b"/>
-              </m:rPr>
-              <w:rPr>
-                <w:rFonts w:ascii="Cambria Math" w:hAnsi="Cambria Math" w:eastAsia="Cambria Math" w:cs="Cambria Math"/>
-                <w:sz w:val="20"/>
-                <w:szCs w:val="20"/>
-              </w:rPr>
-              <m:t>R</m:t>
-            </m:r>
-          </m:e>
-          <m:sub>
-            <m:r>
-              <m:rPr>
-                <m:sty m:val="p"/>
-              </m:rPr>
-              <w:rPr>
-                <w:rFonts w:ascii="Cambria Math" w:hAnsi="Cambria Math" w:eastAsia="Cambria Math" w:cs="Cambria Math"/>
-                <w:sz w:val="20"/>
-                <w:szCs w:val="20"/>
-              </w:rPr>
-              <m:t>h</m:t>
-            </m:r>
-          </m:sub>
-        </m:sSub>
-        <m:r>
-          <m:rPr>
-            <m:sty m:val="p"/>
-          </m:rPr>
-          <w:rPr>
-            <w:rFonts w:ascii="Cambria Math" w:hAnsi="Cambria Math" w:eastAsia="Cambria Math" w:cs="Cambria Math"/>
-            <w:sz w:val="20"/>
-            <w:szCs w:val="20"/>
-          </w:rPr>
-          <m:t>(</m:t>
-        </m:r>
-        <m:sSub>
-          <m:sSubPr/>
-          <m:e>
-            <m:r>
-              <m:rPr>
-                <m:sty m:val="bi"/>
-              </m:rPr>
-              <w:rPr>
-                <w:rFonts w:ascii="Cambria Math" w:hAnsi="Cambria Math" w:eastAsia="Cambria Math" w:cs="Cambria Math"/>
-                <w:sz w:val="20"/>
-                <w:szCs w:val="20"/>
-              </w:rPr>
-              <m:t>q</m:t>
-            </m:r>
-          </m:e>
-          <m:sub>
-            <m:r>
-              <m:rPr>
-                <m:sty m:val="p"/>
-              </m:rPr>
-              <w:rPr>
-                <w:rFonts w:ascii="Cambria Math" w:hAnsi="Cambria Math" w:eastAsia="Cambria Math" w:cs="Cambria Math"/>
-                <w:sz w:val="20"/>
-                <w:szCs w:val="20"/>
-              </w:rPr>
-              <m:t>h</m:t>
-            </m:r>
-          </m:sub>
-        </m:sSub>
-        <m:r>
-          <m:rPr>
-            <m:sty m:val="p"/>
-          </m:rPr>
-          <w:rPr>
-            <w:rFonts w:ascii="Cambria Math" w:hAnsi="Cambria Math" w:eastAsia="Cambria Math" w:cs="Cambria Math"/>
-            <w:sz w:val="20"/>
-            <w:szCs w:val="20"/>
-          </w:rPr>
-          <m:t>)</m:t>
-        </m:r>
-      </m:oMath>
-      <w:r>
-        <w:rPr>
-          <w:rFonts w:hint="eastAsia"/>
-          <w:sz w:val="20"/>
-          <w:szCs w:val="20"/>
-        </w:rPr>
-        <w:t>，再施加固定安装变换：</w:t>
-      </w:r>
-    </w:p>
-    <w:tbl>
-      <w:tblPr>
-        <w:tblStyle w:val="10"/>
-        <w:tblW w:w="4866" w:type="dxa"/>
-        <w:tblCaption w:val="Equation 34"/>
-        <w:tblInd w:w="0" w:type="dxa"/>
-        <w:tblBorders>
-          <w:top w:val="none" w:color="B0B0B0" w:sz="4" w:space="0"/>
-          <w:left w:val="none" w:color="B0B0B0" w:sz="4" w:space="0"/>
-          <w:bottom w:val="none" w:color="B0B0B0" w:sz="4" w:space="0"/>
-          <w:right w:val="none" w:color="B0B0B0" w:sz="4" w:space="0"/>
-          <w:insideH w:val="none" w:color="B0B0B0" w:sz="4" w:space="0"/>
-          <w:insideV w:val="none" w:color="B0B0B0" w:sz="4" w:space="0"/>
-        </w:tblBorders>
-        <w:tblLayout w:type="fixed"/>
-        <w:tblCellMar>
-          <w:top w:w="0" w:type="dxa"/>
-          <w:left w:w="0" w:type="dxa"/>
-          <w:bottom w:w="0" w:type="dxa"/>
-          <w:right w:w="0" w:type="dxa"/>
-        </w:tblCellMar>
-      </w:tblPr>
-      <w:tblGrid>
-        <w:gridCol w:w="4476"/>
-        <w:gridCol w:w="390"/>
-      </w:tblGrid>
-      <w:tr>
-        <w:tblPrEx>
-          <w:tblBorders>
-            <w:top w:val="none" w:color="B0B0B0" w:sz="4" w:space="0"/>
-            <w:left w:val="none" w:color="B0B0B0" w:sz="4" w:space="0"/>
-            <w:bottom w:val="none" w:color="B0B0B0" w:sz="4" w:space="0"/>
-            <w:right w:val="none" w:color="B0B0B0" w:sz="4" w:space="0"/>
-            <w:insideH w:val="none" w:color="B0B0B0" w:sz="4" w:space="0"/>
-            <w:insideV w:val="none" w:color="B0B0B0" w:sz="4" w:space="0"/>
-          </w:tblBorders>
-          <w:tblCellMar>
-            <w:top w:w="0" w:type="dxa"/>
-            <w:left w:w="0" w:type="dxa"/>
-            <w:bottom w:w="0" w:type="dxa"/>
-            <w:right w:w="0" w:type="dxa"/>
-          </w:tblCellMar>
-        </w:tblPrEx>
-        <w:trPr>
-          <w:cantSplit/>
-        </w:trPr>
-        <w:tc>
-          <w:tcPr>
-            <w:tcW w:w="4476" w:type="dxa"/>
-            <w:vAlign w:val="center"/>
-          </w:tcPr>
-          <w:p>
-            <w:pPr>
-              <w:pStyle w:val="17"/>
-              <w:numPr>
-                <w:ilvl w:val="0"/>
-                <w:numId w:val="0"/>
-              </w:numPr>
-              <w:snapToGrid w:val="0"/>
-              <w:spacing w:before="100" w:after="100" w:line="240" w:lineRule="auto"/>
-              <w:ind w:left="0" w:right="0" w:firstLine="0"/>
-              <w:jc w:val="center"/>
-              <w:rPr>
-                <w:sz w:val="18"/>
-              </w:rPr>
-            </w:pPr>
-            <m:oMathPara>
-              <m:oMathParaPr>
-                <m:jc m:val="center"/>
-              </m:oMathParaPr>
-              <m:oMath>
-                <m:sSub>
-                  <m:sSubPr/>
-                  <m:e>
-                    <m:r>
-                      <m:rPr>
                         <m:sty m:val="b"/>
                       </m:rPr>
                       <w:rPr>
@@ -31953,7 +30805,7 @@
                 <w:sz w:val="16"/>
                 <w:szCs w:val="16"/>
               </w:rPr>
-              <w:t>(34)</w:t>
+              <w:t>(33)</w:t>
             </w:r>
           </w:p>
         </w:tc>
@@ -32059,7 +30911,7 @@
       <w:tblPr>
         <w:tblStyle w:val="10"/>
         <w:tblW w:w="4866" w:type="dxa"/>
-        <w:tblCaption w:val="Equation 35"/>
+        <w:tblCaption w:val="Equation 34"/>
         <w:tblInd w:w="0" w:type="dxa"/>
         <w:tblBorders>
           <w:top w:val="none" w:color="B0B0B0" w:sz="4" w:space="0"/>
@@ -32559,7 +31411,7 @@
                 <w:sz w:val="16"/>
                 <w:szCs w:val="16"/>
               </w:rPr>
-              <w:t>(35)</w:t>
+              <w:t>(34)</w:t>
             </w:r>
           </w:p>
         </w:tc>
@@ -32641,7 +31493,7 @@
       <w:tblPr>
         <w:tblStyle w:val="10"/>
         <w:tblW w:w="4866" w:type="dxa"/>
-        <w:tblCaption w:val="Equation 36"/>
+        <w:tblCaption w:val="Equation 35"/>
         <w:tblInd w:w="0" w:type="dxa"/>
         <w:tblBorders>
           <w:top w:val="none" w:color="B0B0B0" w:sz="4" w:space="0"/>
@@ -33001,7 +31853,7 @@
                 <w:sz w:val="16"/>
                 <w:szCs w:val="16"/>
               </w:rPr>
-              <w:t>(36)</w:t>
+              <w:t>(35)</w:t>
             </w:r>
           </w:p>
         </w:tc>
@@ -33203,7 +32055,7 @@
       <w:tblPr>
         <w:tblStyle w:val="10"/>
         <w:tblW w:w="4866" w:type="dxa"/>
-        <w:tblCaption w:val="Equation 37"/>
+        <w:tblCaption w:val="Equation 36"/>
         <w:tblInd w:w="0" w:type="dxa"/>
         <w:tblBorders>
           <w:top w:val="none" w:color="B0B0B0" w:sz="4" w:space="0"/>
@@ -34014,7 +32866,7 @@
                 <w:sz w:val="16"/>
                 <w:szCs w:val="16"/>
               </w:rPr>
-              <w:t>(37)</w:t>
+              <w:t>(36)</w:t>
             </w:r>
           </w:p>
         </w:tc>
@@ -34072,6 +32924,44 @@
           <w:szCs w:val="20"/>
         </w:rPr>
         <w:t>为样本数，</w:t>
+      </w:r>
+      <m:oMath>
+        <m:sSub>
+          <m:e>
+            <m:r>
+              <m:rPr>
+                <m:sty m:val="i"/>
+              </m:rPr>
+              <w:rPr>
+                <w:rFonts w:ascii="Cambria Math" w:hAnsi="Cambria Math" w:eastAsia="Cambria Math" w:cs="Cambria Math"/>
+                <w:sz w:val="20"/>
+                <w:szCs w:val="20"/>
+              </w:rPr>
+              <m:t>T</m:t>
+            </m:r>
+          </m:e>
+          <m:sub>
+            <m:r>
+              <m:rPr>
+                <m:sty m:val="p"/>
+              </m:rPr>
+              <w:rPr>
+                <w:rFonts w:ascii="Cambria Math" w:hAnsi="Cambria Math" w:eastAsia="Cambria Math" w:cs="Cambria Math"/>
+                <w:sz w:val="20"/>
+                <w:szCs w:val="20"/>
+              </w:rPr>
+              <m:t>s</m:t>
+            </m:r>
+          </m:sub>
+        </m:sSub>
+      </m:oMath>
+      <w:r>
+        <w:rPr>
+          <w:rFonts w:hint="eastAsia"/>
+          <w:sz w:val="20"/>
+          <w:szCs w:val="20"/>
+        </w:rPr>
+        <w:t xml:space="preserve"> 为采样周期（s），</w:t>
       </w:r>
       <m:oMath>
         <m:r>
@@ -36786,7 +35676,7 @@
       <w:tblPr>
         <w:tblStyle w:val="10"/>
         <w:tblW w:w="4866" w:type="dxa"/>
-        <w:tblCaption w:val="Equation 38"/>
+        <w:tblCaption w:val="Equation 37"/>
         <w:tblInd w:w="0" w:type="dxa"/>
         <w:tblBorders>
           <w:top w:val="none" w:color="B0B0B0" w:sz="4" w:space="0"/>
@@ -36975,7 +35865,7 @@
                 <w:sz w:val="16"/>
                 <w:szCs w:val="16"/>
               </w:rPr>
-              <w:t>(38)</w:t>
+              <w:t>(37)</w:t>
             </w:r>
           </w:p>
         </w:tc>

</xml_diff>

<commit_message>
Correct leg-frame wheel-center coordinates in attitude inverse kinematics
</commit_message>
<xml_diff>
--- a/Article.docx
+++ b/Article.docx
@@ -16953,7 +16953,7 @@
           <w:sz w:val="20"/>
           <w:szCs w:val="20"/>
         </w:rPr>
-        <w:t xml:space="preserve">在机体系中，</w:t>
+        <w:t xml:space="preserve">支撑高度按四轮在机体系中的分布进行分配。</w:t>
       </w:r>
       <m:oMath>
         <m:sSub>
@@ -16967,7 +16967,7 @@
                 <w:sz w:val="20"/>
                 <w:szCs w:val="20"/>
               </w:rPr>
-              <m:t>x</m:t>
+              <m:t>p</m:t>
             </m:r>
           </m:e>
           <m:sub>
@@ -16982,6 +16982,28 @@
               </w:rPr>
               <m:t>i</m:t>
             </m:r>
+            <m:r>
+              <m:rPr>
+                <m:sty m:val="p"/>
+              </m:rPr>
+              <w:rPr>
+                <w:rFonts w:ascii="Cambria Math" w:hAnsi="Cambria Math" w:eastAsia="Cambria Math" w:cs="Cambria Math"/>
+                <w:sz w:val="20"/>
+                <w:szCs w:val="20"/>
+              </w:rPr>
+              <m:t>,</m:t>
+            </m:r>
+            <m:r>
+              <m:rPr>
+                <m:sty m:val="p"/>
+              </m:rPr>
+              <w:rPr>
+                <w:rFonts w:ascii="Cambria Math" w:hAnsi="Cambria Math" w:eastAsia="Cambria Math" w:cs="Cambria Math"/>
+                <w:sz w:val="20"/>
+                <w:szCs w:val="20"/>
+              </w:rPr>
+              <m:t>x</m:t>
+            </m:r>
           </m:sub>
         </m:sSub>
       </m:oMath>
@@ -17005,7 +17027,7 @@
                 <w:sz w:val="20"/>
                 <w:szCs w:val="20"/>
               </w:rPr>
-              <m:t>y</m:t>
+              <m:t>p</m:t>
             </m:r>
           </m:e>
           <m:sub>
@@ -17020,6 +17042,28 @@
               </w:rPr>
               <m:t>i</m:t>
             </m:r>
+            <m:r>
+              <m:rPr>
+                <m:sty m:val="p"/>
+              </m:rPr>
+              <w:rPr>
+                <w:rFonts w:ascii="Cambria Math" w:hAnsi="Cambria Math" w:eastAsia="Cambria Math" w:cs="Cambria Math"/>
+                <w:sz w:val="20"/>
+                <w:szCs w:val="20"/>
+              </w:rPr>
+              <m:t>,</m:t>
+            </m:r>
+            <m:r>
+              <m:rPr>
+                <m:sty m:val="p"/>
+              </m:rPr>
+              <w:rPr>
+                <w:rFonts w:ascii="Cambria Math" w:hAnsi="Cambria Math" w:eastAsia="Cambria Math" w:cs="Cambria Math"/>
+                <w:sz w:val="20"/>
+                <w:szCs w:val="20"/>
+              </w:rPr>
+              <m:t>y</m:t>
+            </m:r>
           </m:sub>
         </m:sSub>
       </m:oMath>
@@ -17029,34 +17073,51 @@
           <w:sz w:val="20"/>
           <w:szCs w:val="20"/>
         </w:rPr>
-        <w:t xml:space="preserve"> 分别为第 </w:t>
-      </w:r>
-      <m:oMath>
-        <m:r>
-          <m:rPr>
-            <m:sty m:val="i"/>
-          </m:rPr>
-          <w:rPr>
-            <w:rFonts w:ascii="Cambria Math" w:hAnsi="Cambria Math" w:eastAsia="Cambria Math" w:cs="Cambria Math"/>
-            <w:sz w:val="20"/>
-            <w:szCs w:val="20"/>
-          </w:rPr>
-          <m:t>i</m:t>
-        </m:r>
-      </m:oMath>
-      <w:r>
-        <w:rPr>
-          <w:rFonts w:hint="eastAsia"/>
-          <w:sz w:val="20"/>
-          <w:szCs w:val="20"/>
-        </w:rPr>
-        <w:t xml:space="preserve"> 个轮心的名义前向、左向坐标。取四腿近似对称分布，</w:t>
+        <w:t xml:space="preserve"> 为轮心位置 </w:t>
       </w:r>
       <m:oMath>
         <m:sSub>
           <m:e>
             <m:r>
               <m:rPr>
+                <m:sty m:val="bi"/>
+              </m:rPr>
+              <w:rPr>
+                <w:rFonts w:ascii="Cambria Math" w:hAnsi="Cambria Math" w:eastAsia="Cambria Math" w:cs="Cambria Math"/>
+                <w:sz w:val="20"/>
+                <w:szCs w:val="20"/>
+              </w:rPr>
+              <m:t>p</m:t>
+            </m:r>
+          </m:e>
+          <m:sub>
+            <m:r>
+              <m:rPr>
+                <m:sty m:val="i"/>
+              </m:rPr>
+              <w:rPr>
+                <w:rFonts w:ascii="Cambria Math" w:hAnsi="Cambria Math" w:eastAsia="Cambria Math" w:cs="Cambria Math"/>
+                <w:sz w:val="20"/>
+                <w:szCs w:val="20"/>
+              </w:rPr>
+              <m:t>i</m:t>
+            </m:r>
+          </m:sub>
+        </m:sSub>
+      </m:oMath>
+      <w:r>
+        <w:rPr>
+          <w:rFonts w:hint="eastAsia"/>
+          <w:sz w:val="20"/>
+          <w:szCs w:val="20"/>
+        </w:rPr>
+        <w:t xml:space="preserve"> 的前向、左向分量；</w:t>
+      </w:r>
+      <m:oMath>
+        <m:sSub>
+          <m:e>
+            <m:r>
+              <m:rPr>
                 <m:sty m:val="i"/>
               </m:rPr>
               <w:rPr>
@@ -17126,7 +17187,7 @@
           <w:sz w:val="20"/>
           <w:szCs w:val="20"/>
         </w:rPr>
-        <w:t xml:space="preserve"> 分别为前后、左右轮心间距的一半，均为正值，单位为 m。在小姿态角和触点高度暂时固定的条件下，可将修正分配为</w:t>
+        <w:t xml:space="preserve"> 分别为前后、左右轮心间距的一半，均为正值，上述长度的单位均为 m。在四腿近似对称、小姿态角和触点高度暂时固定的条件下，可将修正分配为</w:t>
       </w:r>
     </w:p>
     <w:tbl>
@@ -17318,7 +17379,7 @@
                             <w:sz w:val="18"/>
                             <w:szCs w:val="18"/>
                           </w:rPr>
-                          <m:t>y</m:t>
+                          <m:t>p</m:t>
                         </m:r>
                       </m:e>
                       <m:sub>
@@ -17330,6 +17391,17 @@
                             <w:szCs w:val="18"/>
                           </w:rPr>
                           <m:t>i</m:t>
+                        </m:r>
+                        <m:r>
+                          <m:rPr>
+                            <m:sty m:val="p"/>
+                          </m:rPr>
+                          <w:rPr>
+                            <w:rFonts w:ascii="Cambria Math" w:hAnsi="Cambria Math" w:eastAsia="Cambria Math" w:cs="Cambria Math"/>
+                            <w:sz w:val="18"/>
+                            <w:szCs w:val="18"/>
+                          </w:rPr>
+                          <m:t>,y</m:t>
                         </m:r>
                       </m:sub>
                     </m:sSub>
@@ -17433,7 +17505,7 @@
                             <w:sz w:val="18"/>
                             <w:szCs w:val="18"/>
                           </w:rPr>
-                          <m:t>x</m:t>
+                          <m:t>p</m:t>
                         </m:r>
                       </m:e>
                       <m:sub>
@@ -17445,6 +17517,17 @@
                             <w:szCs w:val="18"/>
                           </w:rPr>
                           <m:t>i</m:t>
+                        </m:r>
+                        <m:r>
+                          <m:rPr>
+                            <m:sty m:val="p"/>
+                          </m:rPr>
+                          <w:rPr>
+                            <w:rFonts w:ascii="Cambria Math" w:hAnsi="Cambria Math" w:eastAsia="Cambria Math" w:cs="Cambria Math"/>
+                            <w:sz w:val="18"/>
+                            <w:szCs w:val="18"/>
+                          </w:rPr>
+                          <m:t>,x</m:t>
                         </m:r>
                       </m:sub>
                     </m:sSub>
@@ -17775,63 +17858,121 @@
           <w:sz w:val="20"/>
           <w:szCs w:val="20"/>
         </w:rPr>
-        <w:t xml:space="preserve"> 分别为滚转、俯仰控制器输出的高度修正量。腿基系的轮心目标纵坐标为 </w:t>
+        <w:t xml:space="preserve"> 分别为滚转、俯仰控制器输出的高度修正量。转换为关节角度时，</w:t>
       </w:r>
       <m:oMath>
-        <m:sSup>
+        <m:sSub>
           <m:e>
-            <m:sSub>
-              <m:e>
-                <m:r>
-                  <m:rPr>
-                    <m:sty m:val="i"/>
-                  </m:rPr>
-                  <w:rPr>
-                    <w:rFonts w:ascii="Cambria Math" w:hAnsi="Cambria Math" w:eastAsia="Cambria Math" w:cs="Cambria Math"/>
-                    <w:sz w:val="20"/>
-                    <w:szCs w:val="20"/>
-                  </w:rPr>
-                  <m:t>y</m:t>
-                </m:r>
-              </m:e>
-              <m:sub>
-                <m:r>
-                  <m:rPr>
-                    <m:sty m:val="p"/>
-                  </m:rPr>
-                  <w:rPr>
-                    <w:rFonts w:ascii="Cambria Math" w:hAnsi="Cambria Math" w:eastAsia="Cambria Math" w:cs="Cambria Math"/>
-                    <w:sz w:val="20"/>
-                    <w:szCs w:val="20"/>
-                  </w:rPr>
-                  <m:t>a</m:t>
-                </m:r>
-                <m:r>
-                  <m:rPr>
-                    <m:sty m:val="p"/>
-                  </m:rPr>
-                  <w:rPr>
-                    <w:rFonts w:ascii="Cambria Math" w:hAnsi="Cambria Math" w:eastAsia="Cambria Math" w:cs="Cambria Math"/>
-                    <w:sz w:val="20"/>
-                    <w:szCs w:val="20"/>
-                  </w:rPr>
-                  <m:t>,</m:t>
-                </m:r>
-                <m:r>
-                  <m:rPr>
-                    <m:sty m:val="i"/>
-                  </m:rPr>
-                  <w:rPr>
-                    <w:rFonts w:ascii="Cambria Math" w:hAnsi="Cambria Math" w:eastAsia="Cambria Math" w:cs="Cambria Math"/>
-                    <w:sz w:val="20"/>
-                    <w:szCs w:val="20"/>
-                  </w:rPr>
-                  <m:t>i</m:t>
-                </m:r>
-              </m:sub>
-            </m:sSub>
+            <m:r>
+              <m:rPr>
+                <m:sty m:val="i"/>
+              </m:rPr>
+              <w:rPr>
+                <w:rFonts w:ascii="Cambria Math" w:hAnsi="Cambria Math" w:eastAsia="Cambria Math" w:cs="Cambria Math"/>
+                <w:sz w:val="20"/>
+                <w:szCs w:val="20"/>
+              </w:rPr>
+              <m:t>x</m:t>
+            </m:r>
           </m:e>
-          <m:sup>
+          <m:sub>
+            <m:r>
+              <m:rPr>
+                <m:sty m:val="i"/>
+              </m:rPr>
+              <w:rPr>
+                <w:rFonts w:ascii="Cambria Math" w:hAnsi="Cambria Math" w:eastAsia="Cambria Math" w:cs="Cambria Math"/>
+                <w:sz w:val="20"/>
+                <w:szCs w:val="20"/>
+              </w:rPr>
+              <m:t>i</m:t>
+            </m:r>
+          </m:sub>
+        </m:sSub>
+      </m:oMath>
+      <w:r>
+        <w:rPr>
+          <w:rFonts w:hint="eastAsia"/>
+          <w:sz w:val="20"/>
+          <w:szCs w:val="20"/>
+        </w:rPr>
+        <w:t xml:space="preserve">、</w:t>
+      </w:r>
+      <m:oMath>
+        <m:sSub>
+          <m:e>
+            <m:r>
+              <m:rPr>
+                <m:sty m:val="i"/>
+              </m:rPr>
+              <w:rPr>
+                <w:rFonts w:ascii="Cambria Math" w:hAnsi="Cambria Math" w:eastAsia="Cambria Math" w:cs="Cambria Math"/>
+                <w:sz w:val="20"/>
+                <w:szCs w:val="20"/>
+              </w:rPr>
+              <m:t>y</m:t>
+            </m:r>
+          </m:e>
+          <m:sub>
+            <m:r>
+              <m:rPr>
+                <m:sty m:val="i"/>
+              </m:rPr>
+              <w:rPr>
+                <w:rFonts w:ascii="Cambria Math" w:hAnsi="Cambria Math" w:eastAsia="Cambria Math" w:cs="Cambria Math"/>
+                <w:sz w:val="20"/>
+                <w:szCs w:val="20"/>
+              </w:rPr>
+              <m:t>i</m:t>
+            </m:r>
+          </m:sub>
+        </m:sSub>
+      </m:oMath>
+      <w:r>
+        <w:rPr>
+          <w:rFonts w:hint="eastAsia"/>
+          <w:sz w:val="20"/>
+          <w:szCs w:val="20"/>
+        </w:rPr>
+        <w:t xml:space="preserve"> 表示第 </w:t>
+      </w:r>
+      <m:oMath>
+        <m:r>
+          <m:rPr>
+            <m:sty m:val="i"/>
+          </m:rPr>
+          <w:rPr>
+            <w:rFonts w:ascii="Cambria Math" w:hAnsi="Cambria Math" w:eastAsia="Cambria Math" w:cs="Cambria Math"/>
+            <w:sz w:val="20"/>
+            <w:szCs w:val="20"/>
+          </w:rPr>
+          <m:t>i</m:t>
+        </m:r>
+      </m:oMath>
+      <w:r>
+        <w:rPr>
+          <w:rFonts w:hint="eastAsia"/>
+          <w:sz w:val="20"/>
+          <w:szCs w:val="20"/>
+        </w:rPr>
+        <w:t xml:space="preserve"> 个轮心在其腿基坐标系下的目标坐标，分别对应单腿逆运动学中的 </w:t>
+      </w:r>
+      <m:oMath>
+        <m:sSub>
+          <m:e>
+            <m:r>
+              <m:rPr>
+                <m:sty m:val="i"/>
+              </m:rPr>
+              <w:rPr>
+                <w:rFonts w:ascii="Cambria Math" w:hAnsi="Cambria Math" w:eastAsia="Cambria Math" w:cs="Cambria Math"/>
+                <w:sz w:val="20"/>
+                <w:szCs w:val="20"/>
+              </w:rPr>
+              <m:t>x</m:t>
+            </m:r>
+          </m:e>
+          <m:sub>
             <m:r>
               <m:rPr>
                 <m:sty m:val="p"/>
@@ -17841,10 +17982,124 @@
                 <w:sz w:val="20"/>
                 <w:szCs w:val="20"/>
               </w:rPr>
-              <m:t>d</m:t>
-            </m:r>
-          </m:sup>
-        </m:sSup>
+              <m:t>a</m:t>
+            </m:r>
+          </m:sub>
+        </m:sSub>
+      </m:oMath>
+      <w:r>
+        <w:rPr>
+          <w:rFonts w:hint="eastAsia"/>
+          <w:sz w:val="20"/>
+          <w:szCs w:val="20"/>
+        </w:rPr>
+        <w:t xml:space="preserve">、</w:t>
+      </w:r>
+      <m:oMath>
+        <m:sSub>
+          <m:e>
+            <m:r>
+              <m:rPr>
+                <m:sty m:val="i"/>
+              </m:rPr>
+              <w:rPr>
+                <w:rFonts w:ascii="Cambria Math" w:hAnsi="Cambria Math" w:eastAsia="Cambria Math" w:cs="Cambria Math"/>
+                <w:sz w:val="20"/>
+                <w:szCs w:val="20"/>
+              </w:rPr>
+              <m:t>y</m:t>
+            </m:r>
+          </m:e>
+          <m:sub>
+            <m:r>
+              <m:rPr>
+                <m:sty m:val="p"/>
+              </m:rPr>
+              <w:rPr>
+                <w:rFonts w:ascii="Cambria Math" w:hAnsi="Cambria Math" w:eastAsia="Cambria Math" w:cs="Cambria Math"/>
+                <w:sz w:val="20"/>
+                <w:szCs w:val="20"/>
+              </w:rPr>
+              <m:t>a</m:t>
+            </m:r>
+          </m:sub>
+        </m:sSub>
+      </m:oMath>
+      <w:r>
+        <w:rPr>
+          <w:rFonts w:hint="eastAsia"/>
+          <w:sz w:val="20"/>
+          <w:szCs w:val="20"/>
+        </w:rPr>
+        <w:t xml:space="preserve">。姿态调节保持 </w:t>
+      </w:r>
+      <m:oMath>
+        <m:sSub>
+          <m:e>
+            <m:r>
+              <m:rPr>
+                <m:sty m:val="i"/>
+              </m:rPr>
+              <w:rPr>
+                <w:rFonts w:ascii="Cambria Math" w:hAnsi="Cambria Math" w:eastAsia="Cambria Math" w:cs="Cambria Math"/>
+                <w:sz w:val="20"/>
+                <w:szCs w:val="20"/>
+              </w:rPr>
+              <m:t>x</m:t>
+            </m:r>
+          </m:e>
+          <m:sub>
+            <m:r>
+              <m:rPr>
+                <m:sty m:val="i"/>
+              </m:rPr>
+              <w:rPr>
+                <w:rFonts w:ascii="Cambria Math" w:hAnsi="Cambria Math" w:eastAsia="Cambria Math" w:cs="Cambria Math"/>
+                <w:sz w:val="20"/>
+                <w:szCs w:val="20"/>
+              </w:rPr>
+              <m:t>i</m:t>
+            </m:r>
+          </m:sub>
+        </m:sSub>
+      </m:oMath>
+      <w:r>
+        <w:rPr>
+          <w:rFonts w:hint="eastAsia"/>
+          <w:sz w:val="20"/>
+          <w:szCs w:val="20"/>
+        </w:rPr>
+        <w:t xml:space="preserve"> 的设定值，并令 </w:t>
+      </w:r>
+      <m:oMath>
+        <m:sSub>
+          <m:e>
+            <m:r>
+              <m:rPr>
+                <m:sty m:val="i"/>
+              </m:rPr>
+              <w:rPr>
+                <w:rFonts w:ascii="Cambria Math" w:hAnsi="Cambria Math" w:eastAsia="Cambria Math" w:cs="Cambria Math"/>
+                <w:sz w:val="20"/>
+                <w:szCs w:val="20"/>
+              </w:rPr>
+              <m:t>y</m:t>
+            </m:r>
+          </m:e>
+          <m:sub>
+            <m:r>
+              <m:rPr>
+                <m:sty m:val="i"/>
+              </m:rPr>
+              <w:rPr>
+                <w:rFonts w:ascii="Cambria Math" w:hAnsi="Cambria Math" w:eastAsia="Cambria Math" w:cs="Cambria Math"/>
+                <w:sz w:val="20"/>
+                <w:szCs w:val="20"/>
+              </w:rPr>
+              <m:t>i</m:t>
+            </m:r>
+          </m:sub>
+        </m:sSub>
       </m:oMath>
       <w:r>
         <w:rPr>
@@ -17907,7 +18162,7 @@
           <w:sz w:val="20"/>
           <w:szCs w:val="20"/>
         </w:rPr>
-        <w:t xml:space="preserve">。符号关系来自机身滚转与俯仰引起的髋部高度变化；实际坐标安装方向应据此标定。逆运动学随后将轮心目标转换为关节目标。高度、关节角及输出增量均需限幅，饱和时停止向不可达方向累加。</w:t>
+        <w:t xml:space="preserve">，再由单腿逆解得到关节目标。实际坐标安装方向应据此标定；高度、关节角及输出增量均需限幅，饱和时停止向不可达方向累加。</w:t>
       </w:r>
     </w:p>
     <w:p>

</xml_diff>

<commit_message>
Fill Fig. 7 with arm coordinate overlay and coincident frames 2 and 3
</commit_message>
<xml_diff>
--- a/Article.docx
+++ b/Article.docx
@@ -18631,20 +18631,50 @@
         <w:keepNext/>
         <w:keepLines/>
         <w:numPr>
-          <w:ilvl w:val="0"/>
           <w:numId w:val="0"/>
         </w:numPr>
-        <w:pBdr>
-          <w:top w:val="single" w:color="B0B0B0" w:sz="4" w:space="1"/>
-          <w:left w:val="single" w:color="B0B0B0" w:sz="4" w:space="1"/>
-          <w:bottom w:val="single" w:color="B0B0B0" w:sz="4" w:space="1"/>
-          <w:right w:val="single" w:color="B0B0B0" w:sz="4" w:space="1"/>
-        </w:pBdr>
         <w:snapToGrid w:val="0"/>
-        <w:spacing w:before="0" w:after="0" w:line="1644" w:lineRule="exact"/>
+        <w:spacing w:before="60" w:after="60" w:line="240" w:lineRule="auto"/>
+        <w:ind w:left="0" w:right="0" w:firstLine="0"/>
+        <w:jc w:val="center"/>
       </w:pPr>
       <w:r>
-        <w:t> </w:t>
+        <w:drawing>
+          <wp:inline distT="0" distB="0" distL="0" distR="0">
+            <wp:extent cx="3060000" cy="1020000"/>
+            <wp:docPr id="28" name="Fig. 7" descr="机械臂侧视图上的关节坐标系定义"/>
+            <wp:cNvGraphicFramePr>
+              <a:graphicFrameLocks xmlns:a="http://schemas.openxmlformats.org/drawingml/2006/main" noChangeAspect="1"/>
+            </wp:cNvGraphicFramePr>
+            <a:graphic xmlns:a="http://schemas.openxmlformats.org/drawingml/2006/main">
+              <a:graphicData uri="http://schemas.openxmlformats.org/drawingml/2006/picture">
+                <pic:pic xmlns:pic="http://schemas.openxmlformats.org/drawingml/2006/picture">
+                  <pic:nvPicPr>
+                    <pic:cNvPr id="28" name="arm_joint_coordinate_overlay.png"/>
+                    <pic:cNvPicPr>
+                      <a:picLocks noChangeAspect="1"/>
+                    </pic:cNvPicPr>
+                  </pic:nvPicPr>
+                  <pic:blipFill>
+                    <a:blip r:embed="rId12"/>
+                    <a:stretch>
+                      <a:fillRect/>
+                    </a:stretch>
+                  </pic:blipFill>
+                  <pic:spPr>
+                    <a:xfrm>
+                      <a:off x="0" y="0"/>
+                      <a:ext cx="3060000" cy="1020000"/>
+                    </a:xfrm>
+                    <a:prstGeom prst="rect">
+                      <a:avLst/>
+                    </a:prstGeom>
+                  </pic:spPr>
+                </pic:pic>
+              </a:graphicData>
+            </a:graphic>
+          </wp:inline>
+        </w:drawing>
       </w:r>
     </w:p>
     <w:p>
@@ -18667,7 +18697,7 @@
           <w:rFonts w:hint="eastAsia"/>
           <w:iCs/>
         </w:rPr>
-        <w:t>六轴机械臂逆解的关节坐标系与腕心几何（留白，待补图）。</w:t>
+        <w:t>六轴机械臂关节坐标系在侧视图上的对应位置。坐标系 2、3 的原点重合，坐标系 4、5 共用腕部原点；轴方向及编号沿用坐标系定义图。</w:t>
       </w:r>
     </w:p>
     <w:p>

</xml_diff>

<commit_message>
Fill Fig. 8 with English annotations for axes and Delta parallelism
</commit_message>
<xml_diff>
--- a/Article.docx
+++ b/Article.docx
@@ -22457,7 +22457,7 @@
           <w:sz w:val="20"/>
           <w:szCs w:val="20"/>
         </w:rPr>
-        <w:t>预留几何模型和手柄结构，几何参数列于</w:t>
+        <w:t>给出 Delta 机构、三轴手柄及转轴标注，几何参数列于</w:t>
       </w:r>
       <w:r>
         <w:rPr>
@@ -22472,20 +22472,50 @@
         <w:keepNext/>
         <w:keepLines/>
         <w:numPr>
-          <w:ilvl w:val="0"/>
           <w:numId w:val="0"/>
         </w:numPr>
-        <w:pBdr>
-          <w:top w:val="single" w:color="B0B0B0" w:sz="4" w:space="1"/>
-          <w:left w:val="single" w:color="B0B0B0" w:sz="4" w:space="1"/>
-          <w:bottom w:val="single" w:color="B0B0B0" w:sz="4" w:space="1"/>
-          <w:right w:val="single" w:color="B0B0B0" w:sz="4" w:space="1"/>
-        </w:pBdr>
         <w:snapToGrid w:val="0"/>
-        <w:spacing w:before="0" w:after="0" w:line="1644" w:lineRule="exact"/>
+        <w:spacing w:before="60" w:after="60" w:line="240" w:lineRule="auto"/>
+        <w:ind w:left="0" w:right="0" w:firstLine="0"/>
+        <w:jc w:val="center"/>
       </w:pPr>
       <w:r>
-        <w:t> </w:t>
+        <w:drawing>
+          <wp:inline distT="0" distB="0" distL="0" distR="0">
+            <wp:extent cx="3060000" cy="2040000"/>
+            <wp:docPr id="29" name="Fig. 8" descr="Delta 平移机构与三轴姿态手柄的机构、转轴和平行约束示意"/>
+            <wp:cNvGraphicFramePr>
+              <a:graphicFrameLocks xmlns:a="http://schemas.openxmlformats.org/drawingml/2006/main" noChangeAspect="1"/>
+            </wp:cNvGraphicFramePr>
+            <a:graphic xmlns:a="http://schemas.openxmlformats.org/drawingml/2006/main">
+              <a:graphicData uri="http://schemas.openxmlformats.org/drawingml/2006/picture">
+                <pic:pic xmlns:pic="http://schemas.openxmlformats.org/drawingml/2006/picture">
+                  <pic:nvPicPr>
+                    <pic:cNvPr id="29" name="teleoperation_master_annotated.png"/>
+                    <pic:cNvPicPr>
+                      <a:picLocks noChangeAspect="1"/>
+                    </pic:cNvPicPr>
+                  </pic:nvPicPr>
+                  <pic:blipFill>
+                    <a:blip r:embed="rId13"/>
+                    <a:stretch>
+                      <a:fillRect/>
+                    </a:stretch>
+                  </pic:blipFill>
+                  <pic:spPr>
+                    <a:xfrm>
+                      <a:off x="0" y="0"/>
+                      <a:ext cx="3060000" cy="2040000"/>
+                    </a:xfrm>
+                    <a:prstGeom prst="rect">
+                      <a:avLst/>
+                    </a:prstGeom>
+                  </pic:spPr>
+                </pic:pic>
+              </a:graphicData>
+            </a:graphic>
+          </wp:inline>
+        </w:drawing>
       </w:r>
     </w:p>
     <w:p>
@@ -22501,14 +22531,14 @@
         <w:rPr>
           <w:iCs/>
         </w:rPr>
-        <w:t xml:space="preserve">Fig. 8. Delta </w:t>
+        <w:t xml:space="preserve">Fig. 8. </w:t>
       </w:r>
       <w:r>
         <w:rPr>
           <w:rFonts w:hint="eastAsia"/>
           <w:iCs/>
         </w:rPr>
-        <w:t>三支链几何、动平台及三编码器姿态手柄（留白，待补图）。</w:t>
+        <w:t>遥操作主手结构与转轴示意。（a）Delta 平移机构，黄色闭合轮廓突出显示一组平行四边形从动臂；三支链共同约束动平台始终与静平台保持平行。（b）三轴姿态手柄，按安装端至握持端依次标出三个转动关节。红色点划线表示转轴中心线，蓝色标记表示平台平行关系。</w:t>
       </w:r>
     </w:p>
     <w:p>

</xml_diff>

<commit_message>
Draw consistent Delta geometry and add Fig. 9 with base-centered frame
</commit_message>
<xml_diff>
--- a/Article.docx
+++ b/Article.docx
@@ -22595,7 +22595,7 @@
           <w:sz w:val="20"/>
           <w:szCs w:val="20"/>
         </w:rPr>
-        <w:t>静平台坐标系</w:t>
+        <w:t>基座原点位于静平台中心。静平台坐标系</w:t>
       </w:r>
       <w:r>
         <w:rPr>
@@ -23254,6 +23254,79 @@
           <w:szCs w:val="20"/>
         </w:rPr>
         <w:t>工作侧转动为正。</w:t>
+      </w:r>
+      <w:r>
+        <w:rPr>
+          <w:rFonts w:hint="eastAsia"/>
+          <w:sz w:val="20"/>
+          <w:szCs w:val="20"/>
+        </w:rPr>
+        <w:t>几何关系如 Fig. 9 所示；单支链图采用对称构型展示角度与长度定义，虚线段对应式（25）中的等效长度约束。</w:t>
+      </w:r>
+    </w:p>
+    <w:p>
+      <w:pPr>
+        <w:keepNext/>
+        <w:keepLines/>
+        <w:numPr>
+          <w:ilvl w:val="0"/>
+          <w:numId w:val="0"/>
+        </w:numPr>
+        <w:snapToGrid w:val="0"/>
+        <w:spacing w:before="60" w:after="60" w:line="240" w:lineRule="auto"/>
+        <w:ind w:left="0" w:right="0" w:firstLine="0"/>
+        <w:jc w:val="center"/>
+      </w:pPr>
+      <w:r>
+        <w:drawing>
+          <wp:inline distT="0" distB="0" distL="0" distR="0">
+            <wp:extent cx="2880000" cy="7405714"/>
+            <wp:effectExtent l="0" t="0" r="7620" b="8255"/>
+            <wp:docPr id="30" name="Fig. 9" descr="Delta 三支链及单支链几何模型，基座原点位于静平台中心"/>
+            <wp:cNvGraphicFramePr>
+              <a:graphicFrameLocks xmlns:a="http://schemas.openxmlformats.org/drawingml/2006/main" noChangeAspect="1"/>
+            </wp:cNvGraphicFramePr>
+            <a:graphic xmlns:a="http://schemas.openxmlformats.org/drawingml/2006/main">
+              <a:graphicData uri="http://schemas.openxmlformats.org/drawingml/2006/picture">
+                <pic:pic xmlns:pic="http://schemas.openxmlformats.org/drawingml/2006/picture">
+                  <pic:nvPicPr>
+                    <pic:cNvPr id="30" name="Fig. 9" descr="Delta 三支链及单支链几何模型，基座原点位于静平台中心"/>
+                    <pic:cNvPicPr>
+                      <a:picLocks noChangeAspect="1"/>
+                    </pic:cNvPicPr>
+                  </pic:nvPicPr>
+                  <pic:blipFill>
+                    <a:blip r:embed="rId14"/>
+                    <a:stretch>
+                      <a:fillRect/>
+                    </a:stretch>
+                  </pic:blipFill>
+                  <pic:spPr>
+                    <a:xfrm>
+                      <a:off x="0" y="0"/>
+                      <a:ext cx="2880000" cy="7405714"/>
+                    </a:xfrm>
+                    <a:prstGeom prst="rect">
+                      <a:avLst/>
+                    </a:prstGeom>
+                  </pic:spPr>
+                </pic:pic>
+              </a:graphicData>
+            </a:graphic>
+          </wp:inline>
+        </w:drawing>
+      </w:r>
+    </w:p>
+    <w:p>
+      <w:pPr>
+        <w:pStyle w:val="18"/>
+        <w:numPr>
+          <w:numId w:val="0"/>
+        </w:numPr>
+        <w:snapToGrid w:val="0"/>
+      </w:pPr>
+      <w:r>
+        <w:t>Fig. 9. Delta 机械臂几何模型。（a）三支链构型，基座原点 O 位于静平台中心，动平台中心为 P，成对从动杆构成平行四边形并保持两平台平行。（b）对称构型下的单支链剖面，标出平台半径、杆长、主动臂角及等效球心。</w:t>
       </w:r>
     </w:p>
     <w:p>
@@ -36050,7 +36123,7 @@
         <w:rPr>
           <w:iCs/>
         </w:rPr>
-        <w:t xml:space="preserve">Fig. 9. </w:t>
+        <w:t xml:space="preserve">Fig. 10. </w:t>
       </w:r>
       <w:r>
         <w:rPr>
@@ -36130,7 +36203,7 @@
         <w:rPr>
           <w:iCs/>
         </w:rPr>
-        <w:t xml:space="preserve">Fig. 10. </w:t>
+        <w:t xml:space="preserve">Fig. 11. </w:t>
       </w:r>
       <w:r>
         <w:rPr>

</xml_diff>

<commit_message>
Align Delta frame X with platform normal and Z with A1
</commit_message>
<xml_diff>
--- a/Article.docx
+++ b/Article.docx
@@ -22589,21 +22589,6 @@
           <w:sz w:val="20"/>
         </w:rPr>
       </w:pPr>
-      <w:r>
-        <w:rPr>
-          <w:rFonts w:hint="eastAsia"/>
-          <w:sz w:val="20"/>
-          <w:szCs w:val="20"/>
-        </w:rPr>
-        <w:t>基座原点位于静平台中心。静平台坐标系</w:t>
-      </w:r>
-      <w:r>
-        <w:rPr>
-          <w:sz w:val="20"/>
-          <w:szCs w:val="20"/>
-        </w:rPr>
-        <w:t xml:space="preserve"> </w:t>
-      </w:r>
       <m:oMath>
         <m:r>
           <m:rPr>
@@ -22619,69 +22604,193 @@
       </m:oMath>
       <w:r>
         <w:rPr>
-          <w:sz w:val="20"/>
-          <w:szCs w:val="20"/>
-        </w:rPr>
-        <w:t xml:space="preserve"> </w:t>
-      </w:r>
-      <w:r>
-        <w:rPr>
           <w:rFonts w:hint="eastAsia"/>
           <w:sz w:val="20"/>
           <w:szCs w:val="20"/>
         </w:rPr>
-        <w:t>的</w:t>
-      </w:r>
-      <w:r>
-        <w:rPr>
-          <w:sz w:val="20"/>
-          <w:szCs w:val="20"/>
-        </w:rPr>
-        <w:t xml:space="preserve"> </w:t>
+        <w:t xml:space="preserve"> 的原点 O 位于静平台中心。正 </w:t>
       </w:r>
       <m:oMath>
-        <m:r>
-          <m:rPr/>
-          <w:rPr>
-            <w:rFonts w:ascii="Cambria Math" w:hAnsi="Cambria Math" w:eastAsia="Cambria Math" w:cs="Cambria Math"/>
-            <w:sz w:val="20"/>
-            <w:szCs w:val="20"/>
-          </w:rPr>
-          <m:t>z</m:t>
-        </m:r>
+        <m:sSub>
+          <m:e>
+            <m:r>
+              <m:rPr>
+                <m:sty m:val="i"/>
+              </m:rPr>
+              <w:rPr>
+                <w:rFonts w:ascii="Cambria Math" w:hAnsi="Cambria Math" w:eastAsia="Cambria Math" w:cs="Cambria Math"/>
+                <w:sz w:val="20"/>
+                <w:szCs w:val="20"/>
+              </w:rPr>
+              <m:t>x</m:t>
+            </m:r>
+          </m:e>
+          <m:sub>
+            <m:r>
+              <m:rPr>
+                <m:sty m:val="p"/>
+              </m:rPr>
+              <w:rPr>
+                <w:rFonts w:ascii="Cambria Math" w:hAnsi="Cambria Math" w:eastAsia="Cambria Math" w:cs="Cambria Math"/>
+                <w:sz w:val="20"/>
+                <w:szCs w:val="20"/>
+              </w:rPr>
+              <m:t>D</m:t>
+            </m:r>
+          </m:sub>
+        </m:sSub>
       </m:oMath>
       <w:r>
         <w:rPr>
-          <w:sz w:val="20"/>
-          <w:szCs w:val="20"/>
-        </w:rPr>
-        <w:t xml:space="preserve"> </w:t>
-      </w:r>
-      <w:r>
-        <w:rPr>
           <w:rFonts w:hint="eastAsia"/>
           <w:sz w:val="20"/>
           <w:szCs w:val="20"/>
         </w:rPr>
-        <w:t>轴向上，工作侧为</w:t>
-      </w:r>
-      <w:r>
-        <w:rPr>
-          <w:sz w:val="20"/>
-          <w:szCs w:val="20"/>
-        </w:rPr>
-        <w:t xml:space="preserve"> </w:t>
+        <w:t xml:space="preserve"> 轴垂直于静平台，由动平台指向静平台；正 </w:t>
       </w:r>
       <m:oMath>
-        <m:r>
-          <m:rPr/>
-          <w:rPr>
-            <w:rFonts w:ascii="Cambria Math" w:hAnsi="Cambria Math" w:eastAsia="Cambria Math" w:cs="Cambria Math"/>
-            <w:sz w:val="20"/>
-            <w:szCs w:val="20"/>
-          </w:rPr>
-          <m:t>z</m:t>
-        </m:r>
+        <m:sSub>
+          <m:e>
+            <m:r>
+              <m:rPr>
+                <m:sty m:val="i"/>
+              </m:rPr>
+              <w:rPr>
+                <w:rFonts w:ascii="Cambria Math" w:hAnsi="Cambria Math" w:eastAsia="Cambria Math" w:cs="Cambria Math"/>
+                <w:sz w:val="20"/>
+                <w:szCs w:val="20"/>
+              </w:rPr>
+              <m:t>z</m:t>
+            </m:r>
+          </m:e>
+          <m:sub>
+            <m:r>
+              <m:rPr>
+                <m:sty m:val="p"/>
+              </m:rPr>
+              <w:rPr>
+                <w:rFonts w:ascii="Cambria Math" w:hAnsi="Cambria Math" w:eastAsia="Cambria Math" w:cs="Cambria Math"/>
+                <w:sz w:val="20"/>
+                <w:szCs w:val="20"/>
+              </w:rPr>
+              <m:t>D</m:t>
+            </m:r>
+          </m:sub>
+        </m:sSub>
+      </m:oMath>
+      <w:r>
+        <w:rPr>
+          <w:rFonts w:hint="eastAsia"/>
+          <w:sz w:val="20"/>
+          <w:szCs w:val="20"/>
+        </w:rPr>
+        <w:t xml:space="preserve"> 轴在静平台平面内从 O 指向 </w:t>
+      </w:r>
+      <m:oMath>
+        <m:sSub>
+          <m:e>
+            <m:r>
+              <m:rPr>
+                <m:sty m:val="i"/>
+              </m:rPr>
+              <w:rPr>
+                <w:rFonts w:ascii="Cambria Math" w:hAnsi="Cambria Math" w:eastAsia="Cambria Math" w:cs="Cambria Math"/>
+                <w:sz w:val="20"/>
+                <w:szCs w:val="20"/>
+              </w:rPr>
+              <m:t>A</m:t>
+            </m:r>
+          </m:e>
+          <m:sub>
+            <m:r>
+              <m:rPr>
+                <m:sty m:val="p"/>
+              </m:rPr>
+              <w:rPr>
+                <w:rFonts w:ascii="Cambria Math" w:hAnsi="Cambria Math" w:eastAsia="Cambria Math" w:cs="Cambria Math"/>
+                <w:sz w:val="20"/>
+                <w:szCs w:val="20"/>
+              </w:rPr>
+              <m:t>1</m:t>
+            </m:r>
+          </m:sub>
+        </m:sSub>
+      </m:oMath>
+      <w:r>
+        <w:rPr>
+          <w:rFonts w:hint="eastAsia"/>
+          <w:sz w:val="20"/>
+          <w:szCs w:val="20"/>
+        </w:rPr>
+        <w:t xml:space="preserve">；</w:t>
+      </w:r>
+      <m:oMath>
+        <m:sSub>
+          <m:e>
+            <m:r>
+              <m:rPr>
+                <m:sty m:val="i"/>
+              </m:rPr>
+              <w:rPr>
+                <w:rFonts w:ascii="Cambria Math" w:hAnsi="Cambria Math" w:eastAsia="Cambria Math" w:cs="Cambria Math"/>
+                <w:sz w:val="20"/>
+                <w:szCs w:val="20"/>
+              </w:rPr>
+              <m:t>y</m:t>
+            </m:r>
+          </m:e>
+          <m:sub>
+            <m:r>
+              <m:rPr>
+                <m:sty m:val="p"/>
+              </m:rPr>
+              <w:rPr>
+                <w:rFonts w:ascii="Cambria Math" w:hAnsi="Cambria Math" w:eastAsia="Cambria Math" w:cs="Cambria Math"/>
+                <w:sz w:val="20"/>
+                <w:szCs w:val="20"/>
+              </w:rPr>
+              <m:t>D</m:t>
+            </m:r>
+          </m:sub>
+        </m:sSub>
+      </m:oMath>
+      <w:r>
+        <w:rPr>
+          <w:rFonts w:hint="eastAsia"/>
+          <w:sz w:val="20"/>
+          <w:szCs w:val="20"/>
+        </w:rPr>
+        <w:t xml:space="preserve"> 轴按右手系确定，工作侧为 </w:t>
+      </w:r>
+      <m:oMath>
+        <m:sSub>
+          <m:e>
+            <m:r>
+              <m:rPr>
+                <m:sty m:val="i"/>
+              </m:rPr>
+              <w:rPr>
+                <w:rFonts w:ascii="Cambria Math" w:hAnsi="Cambria Math" w:eastAsia="Cambria Math" w:cs="Cambria Math"/>
+                <w:sz w:val="20"/>
+                <w:szCs w:val="20"/>
+              </w:rPr>
+              <m:t>x</m:t>
+            </m:r>
+          </m:e>
+          <m:sub>
+            <m:r>
+              <m:rPr>
+                <m:sty m:val="p"/>
+              </m:rPr>
+              <w:rPr>
+                <w:rFonts w:ascii="Cambria Math" w:hAnsi="Cambria Math" w:eastAsia="Cambria Math" w:cs="Cambria Math"/>
+                <w:sz w:val="20"/>
+                <w:szCs w:val="20"/>
+              </w:rPr>
+              <m:t>D</m:t>
+            </m:r>
+          </m:sub>
+        </m:sSub>
         <m:r>
           <m:rPr>
             <m:sty m:val="p"/>
@@ -22691,16 +22800,7 @@
             <w:sz w:val="20"/>
             <w:szCs w:val="20"/>
           </w:rPr>
-          <m:t>&lt;</m:t>
-        </m:r>
-        <m:r>
-          <m:rPr/>
-          <w:rPr>
-            <w:rFonts w:ascii="Cambria Math" w:hAnsi="Cambria Math" w:eastAsia="Cambria Math" w:cs="Cambria Math"/>
-            <w:sz w:val="20"/>
-            <w:szCs w:val="20"/>
-          </w:rPr>
-          <m:t>0</m:t>
+          <m:t>&lt;0</m:t>
         </m:r>
       </m:oMath>
       <w:r>
@@ -22709,14 +22809,7 @@
           <w:sz w:val="20"/>
           <w:szCs w:val="20"/>
         </w:rPr>
-        <w:t>。静、动平台连接点分布圆半径分别记为</w:t>
-      </w:r>
-      <w:r>
-        <w:rPr>
-          <w:sz w:val="20"/>
-          <w:szCs w:val="20"/>
-        </w:rPr>
-        <w:t xml:space="preserve"> </w:t>
+        <w:t xml:space="preserve">。静、动平台连接点分布圆半径分别记为 </w:t>
       </w:r>
       <m:oMath>
         <m:sSub>
@@ -22791,14 +22884,7 @@
           <w:sz w:val="20"/>
           <w:szCs w:val="20"/>
         </w:rPr>
-        <w:t>，主动臂和从动臂长度为</w:t>
-      </w:r>
-      <w:r>
-        <w:rPr>
-          <w:sz w:val="20"/>
-          <w:szCs w:val="20"/>
-        </w:rPr>
-        <w:t xml:space="preserve"> </w:t>
+        <w:t xml:space="preserve">，主动臂和从动臂长度为 </w:t>
       </w:r>
       <m:oMath>
         <m:sSub>
@@ -22873,14 +22959,83 @@
           <w:sz w:val="20"/>
           <w:szCs w:val="20"/>
         </w:rPr>
-        <w:t>。三支链方位角为</w:t>
-      </w:r>
-      <w:r>
-        <w:rPr>
-          <w:sz w:val="20"/>
-          <w:szCs w:val="20"/>
-        </w:rPr>
-        <w:t xml:space="preserve"> </w:t>
+        <w:t xml:space="preserve">。三支链方位角绕正 </w:t>
+      </w:r>
+      <m:oMath>
+        <m:sSub>
+          <m:e>
+            <m:r>
+              <m:rPr>
+                <m:sty m:val="i"/>
+              </m:rPr>
+              <w:rPr>
+                <w:rFonts w:ascii="Cambria Math" w:hAnsi="Cambria Math" w:eastAsia="Cambria Math" w:cs="Cambria Math"/>
+                <w:sz w:val="20"/>
+                <w:szCs w:val="20"/>
+              </w:rPr>
+              <m:t>x</m:t>
+            </m:r>
+          </m:e>
+          <m:sub>
+            <m:r>
+              <m:rPr>
+                <m:sty m:val="p"/>
+              </m:rPr>
+              <w:rPr>
+                <w:rFonts w:ascii="Cambria Math" w:hAnsi="Cambria Math" w:eastAsia="Cambria Math" w:cs="Cambria Math"/>
+                <w:sz w:val="20"/>
+                <w:szCs w:val="20"/>
+              </w:rPr>
+              <m:t>D</m:t>
+            </m:r>
+          </m:sub>
+        </m:sSub>
+      </m:oMath>
+      <w:r>
+        <w:rPr>
+          <w:rFonts w:hint="eastAsia"/>
+          <w:sz w:val="20"/>
+          <w:szCs w:val="20"/>
+        </w:rPr>
+        <w:t xml:space="preserve"> 轴按右手方向、从正 </w:t>
+      </w:r>
+      <m:oMath>
+        <m:sSub>
+          <m:e>
+            <m:r>
+              <m:rPr>
+                <m:sty m:val="i"/>
+              </m:rPr>
+              <w:rPr>
+                <w:rFonts w:ascii="Cambria Math" w:hAnsi="Cambria Math" w:eastAsia="Cambria Math" w:cs="Cambria Math"/>
+                <w:sz w:val="20"/>
+                <w:szCs w:val="20"/>
+              </w:rPr>
+              <m:t>z</m:t>
+            </m:r>
+          </m:e>
+          <m:sub>
+            <m:r>
+              <m:rPr>
+                <m:sty m:val="p"/>
+              </m:rPr>
+              <w:rPr>
+                <w:rFonts w:ascii="Cambria Math" w:hAnsi="Cambria Math" w:eastAsia="Cambria Math" w:cs="Cambria Math"/>
+                <w:sz w:val="20"/>
+                <w:szCs w:val="20"/>
+              </w:rPr>
+              <m:t>D</m:t>
+            </m:r>
+          </m:sub>
+        </m:sSub>
+      </m:oMath>
+      <w:r>
+        <w:rPr>
+          <w:rFonts w:hint="eastAsia"/>
+          <w:sz w:val="20"/>
+          <w:szCs w:val="20"/>
+        </w:rPr>
+        <w:t xml:space="preserve"> 轴起算：</w:t>
       </w:r>
       <m:oMath>
         <m:sSub>
@@ -22995,18 +23150,10 @@
           <w:sz w:val="20"/>
           <w:szCs w:val="20"/>
         </w:rPr>
-        <w:t>，径向单位矢量为</w:t>
-      </w:r>
-      <w:r>
-        <w:rPr>
-          <w:sz w:val="20"/>
-          <w:szCs w:val="20"/>
-        </w:rPr>
-        <w:t xml:space="preserve"> </w:t>
+        <w:t xml:space="preserve">，径向单位矢量为 </w:t>
       </w:r>
       <m:oMath>
         <m:sSub>
-          <m:sSubPr/>
           <m:e>
             <m:r>
               <m:rPr>
@@ -23022,7 +23169,9 @@
           </m:e>
           <m:sub>
             <m:r>
-              <m:rPr/>
+              <m:rPr>
+                <m:sty m:val="i"/>
+              </m:rPr>
               <w:rPr>
                 <w:rFonts w:ascii="Cambria Math" w:hAnsi="Cambria Math" w:eastAsia="Cambria Math" w:cs="Cambria Math"/>
                 <w:sz w:val="20"/>
@@ -23041,13 +23190,14 @@
             <w:sz w:val="20"/>
             <w:szCs w:val="20"/>
           </w:rPr>
-          <m:t>=[cos</m:t>
+          <m:t>=[0,−sin</m:t>
         </m:r>
         <m:sSub>
-          <m:sSubPr/>
           <m:e>
             <m:r>
-              <m:rPr/>
+              <m:rPr>
+                <m:sty m:val="i"/>
+              </m:rPr>
               <w:rPr>
                 <w:rFonts w:ascii="Cambria Math" w:hAnsi="Cambria Math" w:eastAsia="Cambria Math" w:cs="Cambria Math"/>
                 <w:sz w:val="20"/>
@@ -23058,7 +23208,9 @@
           </m:e>
           <m:sub>
             <m:r>
-              <m:rPr/>
+              <m:rPr>
+                <m:sty m:val="i"/>
+              </m:rPr>
               <w:rPr>
                 <w:rFonts w:ascii="Cambria Math" w:hAnsi="Cambria Math" w:eastAsia="Cambria Math" w:cs="Cambria Math"/>
                 <w:sz w:val="20"/>
@@ -23077,13 +23229,14 @@
             <w:sz w:val="20"/>
             <w:szCs w:val="20"/>
           </w:rPr>
-          <m:t>,sin</m:t>
+          <m:t>,cos</m:t>
         </m:r>
         <m:sSub>
-          <m:sSubPr/>
           <m:e>
             <m:r>
-              <m:rPr/>
+              <m:rPr>
+                <m:sty m:val="i"/>
+              </m:rPr>
               <w:rPr>
                 <w:rFonts w:ascii="Cambria Math" w:hAnsi="Cambria Math" w:eastAsia="Cambria Math" w:cs="Cambria Math"/>
                 <w:sz w:val="20"/>
@@ -23094,7 +23247,9 @@
           </m:e>
           <m:sub>
             <m:r>
-              <m:rPr/>
+              <m:rPr>
+                <m:sty m:val="i"/>
+              </m:rPr>
               <w:rPr>
                 <w:rFonts w:ascii="Cambria Math" w:hAnsi="Cambria Math" w:eastAsia="Cambria Math" w:cs="Cambria Math"/>
                 <w:sz w:val="20"/>
@@ -23104,28 +23259,7 @@
             </m:r>
           </m:sub>
         </m:sSub>
-        <m:r>
-          <m:rPr>
-            <m:sty m:val="p"/>
-          </m:rPr>
-          <w:rPr>
-            <w:rFonts w:ascii="Cambria Math" w:hAnsi="Cambria Math" w:eastAsia="Cambria Math" w:cs="Cambria Math"/>
-            <w:sz w:val="20"/>
-            <w:szCs w:val="20"/>
-          </w:rPr>
-          <m:t>,</m:t>
-        </m:r>
-        <m:r>
-          <m:rPr/>
-          <w:rPr>
-            <w:rFonts w:ascii="Cambria Math" w:hAnsi="Cambria Math" w:eastAsia="Cambria Math" w:cs="Cambria Math"/>
-            <w:sz w:val="20"/>
-            <w:szCs w:val="20"/>
-          </w:rPr>
-          <m:t>0</m:t>
-        </m:r>
         <m:sSup>
-          <m:sSupPr/>
           <m:e>
             <m:r>
               <m:rPr>
@@ -23160,14 +23294,7 @@
           <w:sz w:val="20"/>
           <w:szCs w:val="20"/>
         </w:rPr>
-        <w:t>。主动臂角</w:t>
-      </w:r>
-      <w:r>
-        <w:rPr>
-          <w:sz w:val="20"/>
-          <w:szCs w:val="20"/>
-        </w:rPr>
-        <w:t xml:space="preserve"> </w:t>
+        <w:t xml:space="preserve">。主动臂角 </w:t>
       </w:r>
       <m:oMath>
         <m:sSub>
@@ -23209,59 +23336,49 @@
       </m:oMath>
       <w:r>
         <w:rPr>
-          <w:sz w:val="20"/>
-          <w:szCs w:val="20"/>
-        </w:rPr>
-        <w:t xml:space="preserve"> </w:t>
-      </w:r>
-      <w:r>
-        <w:rPr>
           <w:rFonts w:hint="eastAsia"/>
           <w:sz w:val="20"/>
           <w:szCs w:val="20"/>
         </w:rPr>
-        <w:t>从水平向外方向起算，朝负</w:t>
-      </w:r>
-      <w:r>
-        <w:rPr>
-          <w:sz w:val="20"/>
-          <w:szCs w:val="20"/>
-        </w:rPr>
-        <w:t xml:space="preserve"> </w:t>
+        <w:t xml:space="preserve"> 从静平台平面内的径向外侧方向起算，朝负 </w:t>
       </w:r>
       <m:oMath>
-        <m:r>
-          <m:rPr/>
-          <w:rPr>
-            <w:rFonts w:ascii="Cambria Math" w:hAnsi="Cambria Math" w:eastAsia="Cambria Math" w:cs="Cambria Math"/>
-            <w:sz w:val="20"/>
-            <w:szCs w:val="20"/>
-          </w:rPr>
-          <m:t>z</m:t>
-        </m:r>
+        <m:sSub>
+          <m:e>
+            <m:r>
+              <m:rPr>
+                <m:sty m:val="i"/>
+              </m:rPr>
+              <w:rPr>
+                <w:rFonts w:ascii="Cambria Math" w:hAnsi="Cambria Math" w:eastAsia="Cambria Math" w:cs="Cambria Math"/>
+                <w:sz w:val="20"/>
+                <w:szCs w:val="20"/>
+              </w:rPr>
+              <m:t>x</m:t>
+            </m:r>
+          </m:e>
+          <m:sub>
+            <m:r>
+              <m:rPr>
+                <m:sty m:val="p"/>
+              </m:rPr>
+              <w:rPr>
+                <w:rFonts w:ascii="Cambria Math" w:hAnsi="Cambria Math" w:eastAsia="Cambria Math" w:cs="Cambria Math"/>
+                <w:sz w:val="20"/>
+                <w:szCs w:val="20"/>
+              </w:rPr>
+              <m:t>D</m:t>
+            </m:r>
+          </m:sub>
+        </m:sSub>
       </m:oMath>
       <w:r>
         <w:rPr>
-          <w:sz w:val="20"/>
-          <w:szCs w:val="20"/>
-        </w:rPr>
-        <w:t xml:space="preserve"> </w:t>
-      </w:r>
-      <w:r>
-        <w:rPr>
           <w:rFonts w:hint="eastAsia"/>
           <w:sz w:val="20"/>
           <w:szCs w:val="20"/>
         </w:rPr>
-        <w:t>工作侧转动为正。</w:t>
-      </w:r>
-      <w:r>
-        <w:rPr>
-          <w:rFonts w:hint="eastAsia"/>
-          <w:sz w:val="20"/>
-          <w:szCs w:val="20"/>
-        </w:rPr>
-        <w:t>几何关系如 Fig. 9 所示；单支链图采用对称构型展示角度与长度定义，虚线段对应式（25）中的等效长度约束。</w:t>
+        <w:t xml:space="preserve"> 工作侧转动为正。几何关系如 Fig. 9 所示；单支链图采用对称构型展示角度与长度定义，虚线段对应式（25）中的等效长度约束。</w:t>
       </w:r>
     </w:p>
     <w:p>
@@ -23326,7 +23443,7 @@
         <w:snapToGrid w:val="0"/>
       </w:pPr>
       <w:r>
-        <w:t>Fig. 9. Delta 机械臂几何模型。（a）三支链构型，基座原点 O 位于静平台中心，动平台中心为 P，成对从动杆构成平行四边形并保持两平台平行。（b）对称构型下的单支链剖面，标出平台半径、杆长、主动臂角及等效球心。</w:t>
+        <w:t>Fig. 9. Delta 机械臂几何模型。（a）三支链构型，基座原点 O 位于静平台中心，正 X 轴沿平台法向由动平台指向静平台，正 Z 轴从 O 指向 A1；动平台中心为 P，成对从动杆构成平行四边形并保持两平台平行。（b）对称构型下的单支链剖面，标出平台半径、杆长、主动臂角及等效球心。</w:t>
       </w:r>
     </w:p>
     <w:p>
@@ -24634,7 +24751,7 @@
                         <w:sz w:val="18"/>
                         <w:szCs w:val="18"/>
                       </w:rPr>
-                      <m:t>z</m:t>
+                      <m:t>x</m:t>
                     </m:r>
                   </m:sub>
                 </m:sSub>
@@ -25950,69 +26067,6 @@
                                       <w:sz w:val="18"/>
                                       <w:szCs w:val="18"/>
                                     </w:rPr>
-                                    <m:t>2x</m:t>
-                                  </m:r>
-                                </m:sub>
-                              </m:sSub>
-                              <m:r>
-                                <m:rPr>
-                                  <m:sty m:val="p"/>
-                                </m:rPr>
-                                <w:rPr>
-                                  <w:rFonts w:ascii="Cambria Math" w:hAnsi="Cambria Math" w:eastAsia="Cambria Math" w:cs="Cambria Math"/>
-                                  <w:sz w:val="18"/>
-                                  <w:szCs w:val="18"/>
-                                </w:rPr>
-                                <m:t>−</m:t>
-                              </m:r>
-                              <m:sSub>
-                                <m:sSubPr/>
-                                <m:e>
-                                  <m:r>
-                                    <m:rPr/>
-                                    <w:rPr>
-                                      <w:rFonts w:ascii="Cambria Math" w:hAnsi="Cambria Math" w:eastAsia="Cambria Math" w:cs="Cambria Math"/>
-                                      <w:sz w:val="18"/>
-                                      <w:szCs w:val="18"/>
-                                    </w:rPr>
-                                    <m:t>c</m:t>
-                                  </m:r>
-                                </m:e>
-                                <m:sub>
-                                  <m:r>
-                                    <m:rPr/>
-                                    <w:rPr>
-                                      <w:rFonts w:ascii="Cambria Math" w:hAnsi="Cambria Math" w:eastAsia="Cambria Math" w:cs="Cambria Math"/>
-                                      <w:sz w:val="18"/>
-                                      <w:szCs w:val="18"/>
-                                    </w:rPr>
-                                    <m:t>1x</m:t>
-                                  </m:r>
-                                </m:sub>
-                              </m:sSub>
-                            </m:e>
-                            <m:e>
-                              <m:sSub>
-                                <m:sSubPr/>
-                                <m:e>
-                                  <m:r>
-                                    <m:rPr/>
-                                    <w:rPr>
-                                      <w:rFonts w:ascii="Cambria Math" w:hAnsi="Cambria Math" w:eastAsia="Cambria Math" w:cs="Cambria Math"/>
-                                      <w:sz w:val="18"/>
-                                      <w:szCs w:val="18"/>
-                                    </w:rPr>
-                                    <m:t>c</m:t>
-                                  </m:r>
-                                </m:e>
-                                <m:sub>
-                                  <m:r>
-                                    <m:rPr/>
-                                    <w:rPr>
-                                      <w:rFonts w:ascii="Cambria Math" w:hAnsi="Cambria Math" w:eastAsia="Cambria Math" w:cs="Cambria Math"/>
-                                      <w:sz w:val="18"/>
-                                      <w:szCs w:val="18"/>
-                                    </w:rPr>
                                     <m:t>2y</m:t>
                                   </m:r>
                                 </m:sub>
@@ -26054,8 +26108,6 @@
                                 </m:sub>
                               </m:sSub>
                             </m:e>
-                          </m:mr>
-                          <m:mr>
                             <m:e>
                               <m:sSub>
                                 <m:sSubPr/>
@@ -26078,7 +26130,7 @@
                                       <w:sz w:val="18"/>
                                       <w:szCs w:val="18"/>
                                     </w:rPr>
-                                    <m:t>3x</m:t>
+                                    <m:t>2z</m:t>
                                   </m:r>
                                 </m:sub>
                               </m:sSub>
@@ -26114,11 +26166,13 @@
                                       <w:sz w:val="18"/>
                                       <w:szCs w:val="18"/>
                                     </w:rPr>
-                                    <m:t>1x</m:t>
+                                    <m:t>1z</m:t>
                                   </m:r>
                                 </m:sub>
                               </m:sSub>
                             </m:e>
+                          </m:mr>
+                          <m:mr>
                             <m:e>
                               <m:sSub>
                                 <m:sSubPr/>
@@ -26178,6 +26232,69 @@
                                       <w:szCs w:val="18"/>
                                     </w:rPr>
                                     <m:t>1y</m:t>
+                                  </m:r>
+                                </m:sub>
+                              </m:sSub>
+                            </m:e>
+                            <m:e>
+                              <m:sSub>
+                                <m:sSubPr/>
+                                <m:e>
+                                  <m:r>
+                                    <m:rPr/>
+                                    <w:rPr>
+                                      <w:rFonts w:ascii="Cambria Math" w:hAnsi="Cambria Math" w:eastAsia="Cambria Math" w:cs="Cambria Math"/>
+                                      <w:sz w:val="18"/>
+                                      <w:szCs w:val="18"/>
+                                    </w:rPr>
+                                    <m:t>c</m:t>
+                                  </m:r>
+                                </m:e>
+                                <m:sub>
+                                  <m:r>
+                                    <m:rPr/>
+                                    <w:rPr>
+                                      <w:rFonts w:ascii="Cambria Math" w:hAnsi="Cambria Math" w:eastAsia="Cambria Math" w:cs="Cambria Math"/>
+                                      <w:sz w:val="18"/>
+                                      <w:szCs w:val="18"/>
+                                    </w:rPr>
+                                    <m:t>3z</m:t>
+                                  </m:r>
+                                </m:sub>
+                              </m:sSub>
+                              <m:r>
+                                <m:rPr>
+                                  <m:sty m:val="p"/>
+                                </m:rPr>
+                                <w:rPr>
+                                  <w:rFonts w:ascii="Cambria Math" w:hAnsi="Cambria Math" w:eastAsia="Cambria Math" w:cs="Cambria Math"/>
+                                  <w:sz w:val="18"/>
+                                  <w:szCs w:val="18"/>
+                                </w:rPr>
+                                <m:t>−</m:t>
+                              </m:r>
+                              <m:sSub>
+                                <m:sSubPr/>
+                                <m:e>
+                                  <m:r>
+                                    <m:rPr/>
+                                    <w:rPr>
+                                      <w:rFonts w:ascii="Cambria Math" w:hAnsi="Cambria Math" w:eastAsia="Cambria Math" w:cs="Cambria Math"/>
+                                      <w:sz w:val="18"/>
+                                      <w:szCs w:val="18"/>
+                                    </w:rPr>
+                                    <m:t>c</m:t>
+                                  </m:r>
+                                </m:e>
+                                <m:sub>
+                                  <m:r>
+                                    <m:rPr/>
+                                    <w:rPr>
+                                      <w:rFonts w:ascii="Cambria Math" w:hAnsi="Cambria Math" w:eastAsia="Cambria Math" w:cs="Cambria Math"/>
+                                      <w:sz w:val="18"/>
+                                      <w:szCs w:val="18"/>
+                                    </w:rPr>
+                                    <m:t>1z</m:t>
                                   </m:r>
                                 </m:sub>
                               </m:sSub>
@@ -26623,7 +26740,7 @@
                             <w:sz w:val="18"/>
                             <w:szCs w:val="18"/>
                           </w:rPr>
-                          <m:t>2z</m:t>
+                          <m:t>2x</m:t>
                         </m:r>
                       </m:sub>
                     </m:sSub>
@@ -26659,7 +26776,7 @@
                             <w:sz w:val="18"/>
                             <w:szCs w:val="18"/>
                           </w:rPr>
-                          <m:t>1z</m:t>
+                          <m:t>1x</m:t>
                         </m:r>
                       </m:sub>
                     </m:sSub>
@@ -26695,7 +26812,7 @@
                             <w:sz w:val="18"/>
                             <w:szCs w:val="18"/>
                           </w:rPr>
-                          <m:t>3z</m:t>
+                          <m:t>3x</m:t>
                         </m:r>
                       </m:sub>
                     </m:sSub>
@@ -26731,7 +26848,7 @@
                             <w:sz w:val="18"/>
                             <w:szCs w:val="18"/>
                           </w:rPr>
-                          <m:t>1z</m:t>
+                          <m:t>1x</m:t>
                         </m:r>
                       </m:sub>
                     </m:sSub>
@@ -27205,7 +27322,7 @@
                         <w:sz w:val="18"/>
                         <w:szCs w:val="18"/>
                       </w:rPr>
-                      <m:t>x</m:t>
+                      <m:t>y</m:t>
                     </m:r>
                   </m:e>
                   <m:sub>
@@ -27243,7 +27360,7 @@
                         <w:sz w:val="18"/>
                         <w:szCs w:val="18"/>
                       </w:rPr>
-                      <m:t>y</m:t>
+                      <m:t>z</m:t>
                     </m:r>
                   </m:e>
                   <m:sub>
@@ -27343,7 +27460,7 @@
                         <w:sz w:val="18"/>
                         <w:szCs w:val="18"/>
                       </w:rPr>
-                      <m:t>z</m:t>
+                      <m:t>x</m:t>
                     </m:r>
                   </m:e>
                   <m:sub>
@@ -27468,7 +27585,7 @@
                 <w:sz w:val="20"/>
                 <w:szCs w:val="20"/>
               </w:rPr>
-              <m:t>z</m:t>
+              <m:t>x</m:t>
             </m:r>
           </m:e>
           <m:sub>
@@ -27544,7 +27661,7 @@
                 <w:sz w:val="20"/>
                 <w:szCs w:val="20"/>
               </w:rPr>
-              <m:t>z</m:t>
+              <m:t>x</m:t>
             </m:r>
           </m:e>
           <m:sub>
@@ -27973,7 +28090,7 @@
                                 <w:sz w:val="18"/>
                                 <w:szCs w:val="18"/>
                               </w:rPr>
-                              <m:t>xy</m:t>
+                              <m:t>yz</m:t>
                             </m:r>
                           </m:sub>
                         </m:sSub>
@@ -28009,7 +28126,7 @@
                                 <w:sz w:val="18"/>
                                 <w:szCs w:val="18"/>
                               </w:rPr>
-                              <m:t>1z</m:t>
+                              <m:t>1x</m:t>
                             </m:r>
                           </m:sub>
                         </m:sSub>
@@ -28131,7 +28248,7 @@
                             <w:sz w:val="18"/>
                             <w:szCs w:val="18"/>
                           </w:rPr>
-                          <m:t>xy</m:t>
+                          <m:t>yz</m:t>
                         </m:r>
                       </m:sub>
                     </m:sSub>
@@ -28194,7 +28311,7 @@
                             <w:sz w:val="18"/>
                             <w:szCs w:val="18"/>
                           </w:rPr>
-                          <m:t>1z</m:t>
+                          <m:t>1x</m:t>
                         </m:r>
                       </m:sub>
                       <m:sup>

</xml_diff>

<commit_message>
Make Delta right-handed frame explicit with an unambiguous view
</commit_message>
<xml_diff>
--- a/Article.docx
+++ b/Article.docx
@@ -22760,7 +22760,123 @@
           <w:sz w:val="20"/>
           <w:szCs w:val="20"/>
         </w:rPr>
-        <w:t xml:space="preserve"> 轴按右手系确定，工作侧为 </w:t>
+        <w:t xml:space="preserve"> 轴按右手系确定，三轴单位矢量满足 </w:t>
+      </w:r>
+      <m:oMath>
+        <m:sSub>
+          <m:e>
+            <m:r>
+              <m:rPr>
+                <m:sty m:val="bi"/>
+              </m:rPr>
+              <w:rPr>
+                <w:rFonts w:ascii="Cambria Math" w:hAnsi="Cambria Math" w:eastAsia="Cambria Math" w:cs="Cambria Math"/>
+                <w:sz w:val="20"/>
+                <w:szCs w:val="20"/>
+              </w:rPr>
+              <m:t>e</m:t>
+            </m:r>
+          </m:e>
+          <m:sub>
+            <m:r>
+              <m:rPr>
+                <m:sty m:val="p"/>
+              </m:rPr>
+              <w:rPr>
+                <w:rFonts w:ascii="Cambria Math" w:hAnsi="Cambria Math" w:eastAsia="Cambria Math" w:cs="Cambria Math"/>
+                <w:sz w:val="20"/>
+                <w:szCs w:val="20"/>
+              </w:rPr>
+              <m:t>x</m:t>
+            </m:r>
+          </m:sub>
+        </m:sSub>
+        <m:r>
+          <m:rPr>
+            <m:sty m:val="p"/>
+          </m:rPr>
+          <w:rPr>
+            <w:rFonts w:ascii="Cambria Math" w:hAnsi="Cambria Math" w:eastAsia="Cambria Math" w:cs="Cambria Math"/>
+            <w:sz w:val="20"/>
+            <w:szCs w:val="20"/>
+          </w:rPr>
+          <m:t>×</m:t>
+        </m:r>
+        <m:sSub>
+          <m:e>
+            <m:r>
+              <m:rPr>
+                <m:sty m:val="bi"/>
+              </m:rPr>
+              <w:rPr>
+                <w:rFonts w:ascii="Cambria Math" w:hAnsi="Cambria Math" w:eastAsia="Cambria Math" w:cs="Cambria Math"/>
+                <w:sz w:val="20"/>
+                <w:szCs w:val="20"/>
+              </w:rPr>
+              <m:t>e</m:t>
+            </m:r>
+          </m:e>
+          <m:sub>
+            <m:r>
+              <m:rPr>
+                <m:sty m:val="p"/>
+              </m:rPr>
+              <w:rPr>
+                <w:rFonts w:ascii="Cambria Math" w:hAnsi="Cambria Math" w:eastAsia="Cambria Math" w:cs="Cambria Math"/>
+                <w:sz w:val="20"/>
+                <w:szCs w:val="20"/>
+              </w:rPr>
+              <m:t>y</m:t>
+            </m:r>
+          </m:sub>
+        </m:sSub>
+        <m:r>
+          <m:rPr>
+            <m:sty m:val="p"/>
+          </m:rPr>
+          <w:rPr>
+            <w:rFonts w:ascii="Cambria Math" w:hAnsi="Cambria Math" w:eastAsia="Cambria Math" w:cs="Cambria Math"/>
+            <w:sz w:val="20"/>
+            <w:szCs w:val="20"/>
+          </w:rPr>
+          <m:t>=</m:t>
+        </m:r>
+        <m:sSub>
+          <m:e>
+            <m:r>
+              <m:rPr>
+                <m:sty m:val="bi"/>
+              </m:rPr>
+              <w:rPr>
+                <w:rFonts w:ascii="Cambria Math" w:hAnsi="Cambria Math" w:eastAsia="Cambria Math" w:cs="Cambria Math"/>
+                <w:sz w:val="20"/>
+                <w:szCs w:val="20"/>
+              </w:rPr>
+              <m:t>e</m:t>
+            </m:r>
+          </m:e>
+          <m:sub>
+            <m:r>
+              <m:rPr>
+                <m:sty m:val="p"/>
+              </m:rPr>
+              <w:rPr>
+                <w:rFonts w:ascii="Cambria Math" w:hAnsi="Cambria Math" w:eastAsia="Cambria Math" w:cs="Cambria Math"/>
+                <w:sz w:val="20"/>
+                <w:szCs w:val="20"/>
+              </w:rPr>
+              <m:t>z</m:t>
+            </m:r>
+          </m:sub>
+        </m:sSub>
+      </m:oMath>
+      <w:r>
+        <w:rPr>
+          <w:rFonts w:hint="eastAsia"/>
+          <w:sz w:val="20"/>
+          <w:szCs w:val="20"/>
+        </w:rPr>
+        <w:t xml:space="preserve">，工作侧为 </w:t>
       </w:r>
       <m:oMath>
         <m:sSub>
@@ -23443,7 +23559,7 @@
         <w:snapToGrid w:val="0"/>
       </w:pPr>
       <w:r>
-        <w:t>Fig. 9. Delta 机械臂几何模型。（a）三支链构型，基座原点 O 位于静平台中心，正 X 轴沿平台法向由动平台指向静平台，正 Z 轴从 O 指向 A1；动平台中心为 P，成对从动杆构成平行四边形并保持两平台平行。（b）对称构型下的单支链剖面，标出平台半径、杆长、主动臂角及等效球心。</w:t>
+        <w:t>Fig. 9. Delta 机械臂几何模型。（a）三支链构型，基座原点 O 位于静平台中心，正 X 轴沿平台法向由动平台指向静平台，正 Z 轴从 O 指向 A1，三轴按右手系定义；动平台中心为 P，成对从动杆构成平行四边形并保持两平台平行。（b）对称构型下的单支链剖面，标出平台半径、杆长、主动臂角及等效球心。</w:t>
       </w:r>
     </w:p>
     <w:p>

</xml_diff>

<commit_message>
Simplify Jacobian and torque feedforward section
</commit_message>
<xml_diff>
--- a/Article.docx
+++ b/Article.docx
@@ -28596,18 +28596,10 @@
           <w:sz w:val="20"/>
           <w:szCs w:val="20"/>
         </w:rPr>
-        <w:t>记</w:t>
-      </w:r>
-      <w:r>
-        <w:rPr>
-          <w:sz w:val="20"/>
-          <w:szCs w:val="20"/>
-        </w:rPr>
-        <w:t xml:space="preserve"> </w:t>
+        <w:t xml:space="preserve">记三主动关节角组成的向量为 </w:t>
       </w:r>
       <m:oMath>
         <m:sSub>
-          <m:sSubPr/>
           <m:e>
             <m:r>
               <m:rPr>
@@ -28618,45 +28610,7 @@
                 <w:sz w:val="20"/>
                 <w:szCs w:val="20"/>
               </w:rPr>
-              <m:t>s</m:t>
-            </m:r>
-          </m:e>
-          <m:sub>
-            <m:r>
-              <m:rPr/>
-              <w:rPr>
-                <w:rFonts w:ascii="Cambria Math" w:hAnsi="Cambria Math" w:eastAsia="Cambria Math" w:cs="Cambria Math"/>
-                <w:sz w:val="20"/>
-                <w:szCs w:val="20"/>
-              </w:rPr>
-              <m:t>i</m:t>
-            </m:r>
-          </m:sub>
-        </m:sSub>
-        <m:r>
-          <m:rPr>
-            <m:sty m:val="p"/>
-          </m:rPr>
-          <w:rPr>
-            <w:rFonts w:ascii="Cambria Math" w:hAnsi="Cambria Math" w:eastAsia="Cambria Math" w:cs="Cambria Math"/>
-            <w:sz w:val="20"/>
-            <w:szCs w:val="20"/>
-          </w:rPr>
-          <m:t>=</m:t>
-        </m:r>
-        <m:sSub>
-          <m:sSubPr/>
-          <m:e>
-            <m:r>
-              <m:rPr>
-                <m:sty m:val="bi"/>
-              </m:rPr>
-              <w:rPr>
-                <w:rFonts w:ascii="Cambria Math" w:hAnsi="Cambria Math" w:eastAsia="Cambria Math" w:cs="Cambria Math"/>
-                <w:sz w:val="20"/>
-                <w:szCs w:val="20"/>
-              </w:rPr>
-              <m:t>p</m:t>
+              <m:t>θ</m:t>
             </m:r>
           </m:e>
           <m:sub>
@@ -28673,44 +28627,6 @@
             </m:r>
           </m:sub>
         </m:sSub>
-        <m:r>
-          <m:rPr>
-            <m:sty m:val="p"/>
-          </m:rPr>
-          <w:rPr>
-            <w:rFonts w:ascii="Cambria Math" w:hAnsi="Cambria Math" w:eastAsia="Cambria Math" w:cs="Cambria Math"/>
-            <w:sz w:val="20"/>
-            <w:szCs w:val="20"/>
-          </w:rPr>
-          <m:t>−</m:t>
-        </m:r>
-        <m:sSub>
-          <m:sSubPr/>
-          <m:e>
-            <m:r>
-              <m:rPr>
-                <m:sty m:val="bi"/>
-              </m:rPr>
-              <w:rPr>
-                <w:rFonts w:ascii="Cambria Math" w:hAnsi="Cambria Math" w:eastAsia="Cambria Math" w:cs="Cambria Math"/>
-                <w:sz w:val="20"/>
-                <w:szCs w:val="20"/>
-              </w:rPr>
-              <m:t>c</m:t>
-            </m:r>
-          </m:e>
-          <m:sub>
-            <m:r>
-              <m:rPr/>
-              <w:rPr>
-                <w:rFonts w:ascii="Cambria Math" w:hAnsi="Cambria Math" w:eastAsia="Cambria Math" w:cs="Cambria Math"/>
-                <w:sz w:val="20"/>
-                <w:szCs w:val="20"/>
-              </w:rPr>
-              <m:t>i</m:t>
-            </m:r>
-          </m:sub>
-        </m:sSub>
       </m:oMath>
       <w:r>
         <w:rPr>
@@ -28718,7 +28634,7 @@
           <w:sz w:val="20"/>
           <w:szCs w:val="20"/>
         </w:rPr>
-        <w:t>。对支链约束求导，定义</w:t>
+        <w:t xml:space="preserve">。在非奇异工作区域，动平台位置对关节角的雅可比矩阵及速度关系为</w:t>
       </w:r>
     </w:p>
     <w:tbl>
@@ -28792,22 +28708,70 @@
                 <m:jc m:val="center"/>
               </m:oMathParaPr>
               <m:oMath>
-                <m:eqArr>
-                  <m:eqArrPr/>
+                <m:sSub>
                   <m:e>
+                    <m:r>
+                      <m:rPr>
+                        <m:sty m:val="b"/>
+                      </m:rPr>
+                      <w:rPr>
+                        <w:rFonts w:ascii="Cambria Math" w:hAnsi="Cambria Math" w:eastAsia="Cambria Math" w:cs="Cambria Math"/>
+                        <w:sz w:val="18"/>
+                        <w:szCs w:val="18"/>
+                      </w:rPr>
+                      <m:t>J</m:t>
+                    </m:r>
+                  </m:e>
+                  <m:sub>
+                    <m:r>
+                      <m:rPr>
+                        <m:sty m:val="p"/>
+                      </m:rPr>
+                      <w:rPr>
+                        <w:rFonts w:ascii="Cambria Math" w:hAnsi="Cambria Math" w:eastAsia="Cambria Math" w:cs="Cambria Math"/>
+                        <w:sz w:val="18"/>
+                        <w:szCs w:val="18"/>
+                      </w:rPr>
+                      <m:t>D</m:t>
+                    </m:r>
+                  </m:sub>
+                </m:sSub>
+                <m:r>
+                  <m:rPr>
+                    <m:sty m:val="p"/>
+                  </m:rPr>
+                  <w:rPr>
+                    <w:rFonts w:ascii="Cambria Math" w:hAnsi="Cambria Math" w:eastAsia="Cambria Math" w:cs="Cambria Math"/>
+                    <w:sz w:val="18"/>
+                    <w:szCs w:val="18"/>
+                  </w:rPr>
+                  <m:t>=</m:t>
+                </m:r>
+                <m:f>
+                  <m:num>
+                    <m:r>
+                      <m:rPr>
+                        <m:sty m:val="p"/>
+                      </m:rPr>
+                      <w:rPr>
+                        <w:rFonts w:ascii="Cambria Math" w:hAnsi="Cambria Math" w:eastAsia="Cambria Math" w:cs="Cambria Math"/>
+                        <w:sz w:val="18"/>
+                        <w:szCs w:val="18"/>
+                      </w:rPr>
+                      <m:t>∂</m:t>
+                    </m:r>
                     <m:sSub>
-                      <m:sSubPr/>
                       <m:e>
                         <m:r>
                           <m:rPr>
-                            <m:sty m:val="b"/>
+                            <m:sty m:val="bi"/>
                           </m:rPr>
                           <w:rPr>
                             <w:rFonts w:ascii="Cambria Math" w:hAnsi="Cambria Math" w:eastAsia="Cambria Math" w:cs="Cambria Math"/>
                             <w:sz w:val="18"/>
                             <w:szCs w:val="18"/>
                           </w:rPr>
-                          <m:t>S</m:t>
+                          <m:t>p</m:t>
                         </m:r>
                       </m:e>
                       <m:sub>
@@ -28824,6 +28788,8 @@
                         </m:r>
                       </m:sub>
                     </m:sSub>
+                  </m:num>
+                  <m:den>
                     <m:r>
                       <m:rPr>
                         <m:sty m:val="p"/>
@@ -28833,188 +28799,20 @@
                         <w:sz w:val="18"/>
                         <w:szCs w:val="18"/>
                       </w:rPr>
-                      <m:t>=</m:t>
-                    </m:r>
-                    <m:d>
-                      <m:dPr>
-                        <m:begChr m:val="["/>
-                        <m:sepChr m:val=""/>
-                        <m:endChr m:val="]"/>
-                      </m:dPr>
-                      <m:e>
-                        <m:m>
-                          <m:mPr>
-                            <m:mcs>
-                              <m:mc>
-                                <m:mcPr>
-                                  <m:count m:val="1"/>
-                                  <m:mcJc m:val="center"/>
-                                </m:mcPr>
-                              </m:mc>
-                            </m:mcs>
-                            <m:plcHide m:val="1"/>
-                          </m:mPr>
-                          <m:mr>
-                            <m:e>
-                              <m:sSubSup>
-                                <m:sSubSupPr/>
-                                <m:e>
-                                  <m:r>
-                                    <m:rPr>
-                                      <m:sty m:val="bi"/>
-                                    </m:rPr>
-                                    <w:rPr>
-                                      <w:rFonts w:ascii="Cambria Math" w:hAnsi="Cambria Math" w:eastAsia="Cambria Math" w:cs="Cambria Math"/>
-                                      <w:sz w:val="18"/>
-                                      <w:szCs w:val="18"/>
-                                    </w:rPr>
-                                    <m:t>s</m:t>
-                                  </m:r>
-                                </m:e>
-                                <m:sub>
-                                  <m:r>
-                                    <m:rPr/>
-                                    <w:rPr>
-                                      <w:rFonts w:ascii="Cambria Math" w:hAnsi="Cambria Math" w:eastAsia="Cambria Math" w:cs="Cambria Math"/>
-                                      <w:sz w:val="18"/>
-                                      <w:szCs w:val="18"/>
-                                    </w:rPr>
-                                    <m:t>1</m:t>
-                                  </m:r>
-                                </m:sub>
-                                <m:sup>
-                                  <m:r>
-                                    <m:rPr>
-                                      <m:sty m:val="p"/>
-                                    </m:rPr>
-                                    <w:rPr>
-                                      <w:rFonts w:ascii="Cambria Math" w:hAnsi="Cambria Math" w:eastAsia="Cambria Math" w:cs="Cambria Math"/>
-                                      <w:sz w:val="18"/>
-                                      <w:szCs w:val="18"/>
-                                    </w:rPr>
-                                    <m:t>T</m:t>
-                                  </m:r>
-                                </m:sup>
-                              </m:sSubSup>
-                            </m:e>
-                          </m:mr>
-                          <m:mr>
-                            <m:e>
-                              <m:sSubSup>
-                                <m:sSubSupPr/>
-                                <m:e>
-                                  <m:r>
-                                    <m:rPr>
-                                      <m:sty m:val="bi"/>
-                                    </m:rPr>
-                                    <w:rPr>
-                                      <w:rFonts w:ascii="Cambria Math" w:hAnsi="Cambria Math" w:eastAsia="Cambria Math" w:cs="Cambria Math"/>
-                                      <w:sz w:val="18"/>
-                                      <w:szCs w:val="18"/>
-                                    </w:rPr>
-                                    <m:t>s</m:t>
-                                  </m:r>
-                                </m:e>
-                                <m:sub>
-                                  <m:r>
-                                    <m:rPr/>
-                                    <w:rPr>
-                                      <w:rFonts w:ascii="Cambria Math" w:hAnsi="Cambria Math" w:eastAsia="Cambria Math" w:cs="Cambria Math"/>
-                                      <w:sz w:val="18"/>
-                                      <w:szCs w:val="18"/>
-                                    </w:rPr>
-                                    <m:t>2</m:t>
-                                  </m:r>
-                                </m:sub>
-                                <m:sup>
-                                  <m:r>
-                                    <m:rPr>
-                                      <m:sty m:val="p"/>
-                                    </m:rPr>
-                                    <w:rPr>
-                                      <w:rFonts w:ascii="Cambria Math" w:hAnsi="Cambria Math" w:eastAsia="Cambria Math" w:cs="Cambria Math"/>
-                                      <w:sz w:val="18"/>
-                                      <w:szCs w:val="18"/>
-                                    </w:rPr>
-                                    <m:t>T</m:t>
-                                  </m:r>
-                                </m:sup>
-                              </m:sSubSup>
-                            </m:e>
-                          </m:mr>
-                          <m:mr>
-                            <m:e>
-                              <m:sSubSup>
-                                <m:sSubSupPr/>
-                                <m:e>
-                                  <m:r>
-                                    <m:rPr>
-                                      <m:sty m:val="bi"/>
-                                    </m:rPr>
-                                    <w:rPr>
-                                      <w:rFonts w:ascii="Cambria Math" w:hAnsi="Cambria Math" w:eastAsia="Cambria Math" w:cs="Cambria Math"/>
-                                      <w:sz w:val="18"/>
-                                      <w:szCs w:val="18"/>
-                                    </w:rPr>
-                                    <m:t>s</m:t>
-                                  </m:r>
-                                </m:e>
-                                <m:sub>
-                                  <m:r>
-                                    <m:rPr/>
-                                    <w:rPr>
-                                      <w:rFonts w:ascii="Cambria Math" w:hAnsi="Cambria Math" w:eastAsia="Cambria Math" w:cs="Cambria Math"/>
-                                      <w:sz w:val="18"/>
-                                      <w:szCs w:val="18"/>
-                                    </w:rPr>
-                                    <m:t>3</m:t>
-                                  </m:r>
-                                </m:sub>
-                                <m:sup>
-                                  <m:r>
-                                    <m:rPr>
-                                      <m:sty m:val="p"/>
-                                    </m:rPr>
-                                    <w:rPr>
-                                      <w:rFonts w:ascii="Cambria Math" w:hAnsi="Cambria Math" w:eastAsia="Cambria Math" w:cs="Cambria Math"/>
-                                      <w:sz w:val="18"/>
-                                      <w:szCs w:val="18"/>
-                                    </w:rPr>
-                                    <m:t>T</m:t>
-                                  </m:r>
-                                </m:sup>
-                              </m:sSubSup>
-                            </m:e>
-                          </m:mr>
-                        </m:m>
-                      </m:e>
-                    </m:d>
-                    <m:r>
-                      <m:rPr>
-                        <m:sty m:val="p"/>
-                      </m:rPr>
-                      <w:rPr>
-                        <w:rFonts w:ascii="Cambria Math" w:hAnsi="Cambria Math" w:eastAsia="Cambria Math" w:cs="Cambria Math"/>
-                        <w:sz w:val="18"/>
-                        <w:szCs w:val="18"/>
-                      </w:rPr>
-                      <m:t>,</m:t>
-                    </m:r>
-                  </m:e>
-                  <m:e>
+                      <m:t>∂</m:t>
+                    </m:r>
                     <m:sSub>
-                      <m:sSubPr/>
                       <m:e>
                         <m:r>
                           <m:rPr>
-                            <m:sty m:val="b"/>
+                            <m:sty m:val="bi"/>
                           </m:rPr>
                           <w:rPr>
                             <w:rFonts w:ascii="Cambria Math" w:hAnsi="Cambria Math" w:eastAsia="Cambria Math" w:cs="Cambria Math"/>
                             <w:sz w:val="18"/>
                             <w:szCs w:val="18"/>
                           </w:rPr>
-                          <m:t>D</m:t>
+                          <m:t>θ</m:t>
                         </m:r>
                       </m:e>
                       <m:sub>
@@ -29031,212 +28829,41 @@
                         </m:r>
                       </m:sub>
                     </m:sSub>
-                    <m:r>
-                      <m:rPr>
-                        <m:sty m:val="p"/>
-                      </m:rPr>
-                      <w:rPr>
-                        <w:rFonts w:ascii="Cambria Math" w:hAnsi="Cambria Math" w:eastAsia="Cambria Math" w:cs="Cambria Math"/>
-                        <w:sz w:val="18"/>
-                        <w:szCs w:val="18"/>
-                      </w:rPr>
-                      <m:t>=diag</m:t>
-                    </m:r>
-                    <m:r>
-                      <m:rPr/>
-                      <w:rPr>
-                        <w:rFonts w:ascii="Cambria Math" w:hAnsi="Cambria Math" w:eastAsia="Cambria Math" w:cs="Cambria Math"/>
-                        <w:sz w:val="18"/>
-                        <w:szCs w:val="18"/>
-                      </w:rPr>
-                      <m:t>​</m:t>
-                    </m:r>
-                    <m:sSubSup>
-                      <m:sSubSupPr/>
+                  </m:den>
+                </m:f>
+                <m:r>
+                  <m:rPr>
+                    <m:sty m:val="p"/>
+                  </m:rPr>
+                  <w:rPr>
+                    <w:rFonts w:ascii="Cambria Math" w:hAnsi="Cambria Math" w:eastAsia="Cambria Math" w:cs="Cambria Math"/>
+                    <w:sz w:val="18"/>
+                    <w:szCs w:val="18"/>
+                  </w:rPr>
+                  <m:t>, </m:t>
+                </m:r>
+                <m:sSub>
+                  <m:e>
+                    <m:acc>
+                      <m:accPr>
+                        <m:chr m:val="̇"/>
+                      </m:accPr>
                       <m:e>
-                        <m:d>
-                          <m:dPr>
-                            <m:sepChr m:val=""/>
-                          </m:dPr>
-                          <m:e>
-                            <m:sSubSup>
-                              <m:sSubSupPr/>
-                              <m:e>
-                                <m:r>
-                                  <m:rPr>
-                                    <m:sty m:val="bi"/>
-                                  </m:rPr>
-                                  <w:rPr>
-                                    <w:rFonts w:ascii="Cambria Math" w:hAnsi="Cambria Math" w:eastAsia="Cambria Math" w:cs="Cambria Math"/>
-                                    <w:sz w:val="18"/>
-                                    <w:szCs w:val="18"/>
-                                  </w:rPr>
-                                  <m:t>s</m:t>
-                                </m:r>
-                              </m:e>
-                              <m:sub>
-                                <m:r>
-                                  <m:rPr/>
-                                  <w:rPr>
-                                    <w:rFonts w:ascii="Cambria Math" w:hAnsi="Cambria Math" w:eastAsia="Cambria Math" w:cs="Cambria Math"/>
-                                    <w:sz w:val="18"/>
-                                    <w:szCs w:val="18"/>
-                                  </w:rPr>
-                                  <m:t>i</m:t>
-                                </m:r>
-                              </m:sub>
-                              <m:sup>
-                                <m:r>
-                                  <m:rPr>
-                                    <m:sty m:val="p"/>
-                                  </m:rPr>
-                                  <w:rPr>
-                                    <w:rFonts w:ascii="Cambria Math" w:hAnsi="Cambria Math" w:eastAsia="Cambria Math" w:cs="Cambria Math"/>
-                                    <w:sz w:val="18"/>
-                                    <w:szCs w:val="18"/>
-                                  </w:rPr>
-                                  <m:t>T</m:t>
-                                </m:r>
-                              </m:sup>
-                            </m:sSubSup>
-                            <m:f>
-                              <m:fPr/>
-                              <m:num>
-                                <m:r>
-                                  <m:rPr>
-                                    <m:sty m:val="p"/>
-                                  </m:rPr>
-                                  <w:rPr>
-                                    <w:rFonts w:ascii="Cambria Math" w:hAnsi="Cambria Math" w:eastAsia="Cambria Math" w:cs="Cambria Math"/>
-                                    <w:sz w:val="18"/>
-                                    <w:szCs w:val="18"/>
-                                  </w:rPr>
-                                  <m:t>∂</m:t>
-                                </m:r>
-                                <m:sSub>
-                                  <m:sSubPr/>
-                                  <m:e>
-                                    <m:r>
-                                      <m:rPr>
-                                        <m:sty m:val="bi"/>
-                                      </m:rPr>
-                                      <w:rPr>
-                                        <w:rFonts w:ascii="Cambria Math" w:hAnsi="Cambria Math" w:eastAsia="Cambria Math" w:cs="Cambria Math"/>
-                                        <w:sz w:val="18"/>
-                                        <w:szCs w:val="18"/>
-                                      </w:rPr>
-                                      <m:t>c</m:t>
-                                    </m:r>
-                                  </m:e>
-                                  <m:sub>
-                                    <m:r>
-                                      <m:rPr/>
-                                      <w:rPr>
-                                        <w:rFonts w:ascii="Cambria Math" w:hAnsi="Cambria Math" w:eastAsia="Cambria Math" w:cs="Cambria Math"/>
-                                        <w:sz w:val="18"/>
-                                        <w:szCs w:val="18"/>
-                                      </w:rPr>
-                                      <m:t>i</m:t>
-                                    </m:r>
-                                  </m:sub>
-                                </m:sSub>
-                              </m:num>
-                              <m:den>
-                                <m:r>
-                                  <m:rPr>
-                                    <m:sty m:val="p"/>
-                                  </m:rPr>
-                                  <w:rPr>
-                                    <w:rFonts w:ascii="Cambria Math" w:hAnsi="Cambria Math" w:eastAsia="Cambria Math" w:cs="Cambria Math"/>
-                                    <w:sz w:val="18"/>
-                                    <w:szCs w:val="18"/>
-                                  </w:rPr>
-                                  <m:t>∂</m:t>
-                                </m:r>
-                                <m:sSub>
-                                  <m:sSubPr/>
-                                  <m:e>
-                                    <m:r>
-                                      <m:rPr/>
-                                      <w:rPr>
-                                        <w:rFonts w:ascii="Cambria Math" w:hAnsi="Cambria Math" w:eastAsia="Cambria Math" w:cs="Cambria Math"/>
-                                        <w:sz w:val="18"/>
-                                        <w:szCs w:val="18"/>
-                                      </w:rPr>
-                                      <m:t>θ</m:t>
-                                    </m:r>
-                                  </m:e>
-                                  <m:sub>
-                                    <m:r>
-                                      <m:rPr>
-                                        <m:sty m:val="p"/>
-                                      </m:rPr>
-                                      <w:rPr>
-                                        <w:rFonts w:ascii="Cambria Math" w:hAnsi="Cambria Math" w:eastAsia="Cambria Math" w:cs="Cambria Math"/>
-                                        <w:sz w:val="18"/>
-                                        <w:szCs w:val="18"/>
-                                      </w:rPr>
-                                      <m:t>D,</m:t>
-                                    </m:r>
-                                    <m:r>
-                                      <m:rPr/>
-                                      <w:rPr>
-                                        <w:rFonts w:ascii="Cambria Math" w:hAnsi="Cambria Math" w:eastAsia="Cambria Math" w:cs="Cambria Math"/>
-                                        <w:sz w:val="18"/>
-                                        <w:szCs w:val="18"/>
-                                      </w:rPr>
-                                      <m:t>i</m:t>
-                                    </m:r>
-                                  </m:sub>
-                                </m:sSub>
-                              </m:den>
-                            </m:f>
-                          </m:e>
-                        </m:d>
-                      </m:e>
-                      <m:sub>
-                        <m:r>
-                          <m:rPr/>
-                          <w:rPr>
-                            <w:rFonts w:ascii="Cambria Math" w:hAnsi="Cambria Math" w:eastAsia="Cambria Math" w:cs="Cambria Math"/>
-                            <w:sz w:val="18"/>
-                            <w:szCs w:val="18"/>
-                          </w:rPr>
-                          <m:t>i</m:t>
-                        </m:r>
                         <m:r>
                           <m:rPr>
-                            <m:sty m:val="p"/>
+                            <m:sty m:val="bi"/>
                           </m:rPr>
                           <w:rPr>
                             <w:rFonts w:ascii="Cambria Math" w:hAnsi="Cambria Math" w:eastAsia="Cambria Math" w:cs="Cambria Math"/>
                             <w:sz w:val="18"/>
                             <w:szCs w:val="18"/>
                           </w:rPr>
-                          <m:t>=</m:t>
+                          <m:t>p</m:t>
                         </m:r>
-                        <m:r>
-                          <m:rPr/>
-                          <w:rPr>
-                            <w:rFonts w:ascii="Cambria Math" w:hAnsi="Cambria Math" w:eastAsia="Cambria Math" w:cs="Cambria Math"/>
-                            <w:sz w:val="18"/>
-                            <w:szCs w:val="18"/>
-                          </w:rPr>
-                          <m:t>1</m:t>
-                        </m:r>
-                      </m:sub>
-                      <m:sup>
-                        <m:r>
-                          <m:rPr/>
-                          <w:rPr>
-                            <w:rFonts w:ascii="Cambria Math" w:hAnsi="Cambria Math" w:eastAsia="Cambria Math" w:cs="Cambria Math"/>
-                            <w:sz w:val="18"/>
-                            <w:szCs w:val="18"/>
-                          </w:rPr>
-                          <m:t>3</m:t>
-                        </m:r>
-                      </m:sup>
-                    </m:sSubSup>
+                      </m:e>
+                    </m:acc>
+                  </m:e>
+                  <m:sub>
                     <m:r>
                       <m:rPr>
                         <m:sty m:val="p"/>
@@ -29246,39 +28873,71 @@
                         <w:sz w:val="18"/>
                         <w:szCs w:val="18"/>
                       </w:rPr>
-                      <m:t>,</m:t>
+                      <m:t>D</m:t>
+                    </m:r>
+                  </m:sub>
+                </m:sSub>
+                <m:r>
+                  <m:rPr>
+                    <m:sty m:val="p"/>
+                  </m:rPr>
+                  <w:rPr>
+                    <w:rFonts w:ascii="Cambria Math" w:hAnsi="Cambria Math" w:eastAsia="Cambria Math" w:cs="Cambria Math"/>
+                    <w:sz w:val="18"/>
+                    <w:szCs w:val="18"/>
+                  </w:rPr>
+                  <m:t>=</m:t>
+                </m:r>
+                <m:sSub>
+                  <m:e>
+                    <m:r>
+                      <m:rPr>
+                        <m:sty m:val="b"/>
+                      </m:rPr>
+                      <w:rPr>
+                        <w:rFonts w:ascii="Cambria Math" w:hAnsi="Cambria Math" w:eastAsia="Cambria Math" w:cs="Cambria Math"/>
+                        <w:sz w:val="18"/>
+                        <w:szCs w:val="18"/>
+                      </w:rPr>
+                      <m:t>J</m:t>
                     </m:r>
                   </m:e>
+                  <m:sub>
+                    <m:r>
+                      <m:rPr>
+                        <m:sty m:val="p"/>
+                      </m:rPr>
+                      <w:rPr>
+                        <w:rFonts w:ascii="Cambria Math" w:hAnsi="Cambria Math" w:eastAsia="Cambria Math" w:cs="Cambria Math"/>
+                        <w:sz w:val="18"/>
+                        <w:szCs w:val="18"/>
+                      </w:rPr>
+                      <m:t>D</m:t>
+                    </m:r>
+                  </m:sub>
+                </m:sSub>
+                <m:sSub>
                   <m:e>
-                    <m:sSub>
-                      <m:sSubPr/>
+                    <m:acc>
+                      <m:accPr>
+                        <m:chr m:val="̇"/>
+                      </m:accPr>
                       <m:e>
                         <m:r>
                           <m:rPr>
-                            <m:sty m:val="b"/>
+                            <m:sty m:val="bi"/>
                           </m:rPr>
                           <w:rPr>
                             <w:rFonts w:ascii="Cambria Math" w:hAnsi="Cambria Math" w:eastAsia="Cambria Math" w:cs="Cambria Math"/>
                             <w:sz w:val="18"/>
                             <w:szCs w:val="18"/>
                           </w:rPr>
-                          <m:t>J</m:t>
+                          <m:t>θ</m:t>
                         </m:r>
                       </m:e>
-                      <m:sub>
-                        <m:r>
-                          <m:rPr>
-                            <m:sty m:val="p"/>
-                          </m:rPr>
-                          <w:rPr>
-                            <w:rFonts w:ascii="Cambria Math" w:hAnsi="Cambria Math" w:eastAsia="Cambria Math" w:cs="Cambria Math"/>
-                            <w:sz w:val="18"/>
-                            <w:szCs w:val="18"/>
-                          </w:rPr>
-                          <m:t>D</m:t>
-                        </m:r>
-                      </m:sub>
-                    </m:sSub>
+                    </m:acc>
+                  </m:e>
+                  <m:sub>
                     <m:r>
                       <m:rPr>
                         <m:sty m:val="p"/>
@@ -29288,233 +28947,21 @@
                         <w:sz w:val="18"/>
                         <w:szCs w:val="18"/>
                       </w:rPr>
-                      <m:t>=</m:t>
-                    </m:r>
-                    <m:sSubSup>
-                      <m:sSubSupPr/>
-                      <m:e>
-                        <m:r>
-                          <m:rPr>
-                            <m:sty m:val="b"/>
-                          </m:rPr>
-                          <w:rPr>
-                            <w:rFonts w:ascii="Cambria Math" w:hAnsi="Cambria Math" w:eastAsia="Cambria Math" w:cs="Cambria Math"/>
-                            <w:sz w:val="18"/>
-                            <w:szCs w:val="18"/>
-                          </w:rPr>
-                          <m:t>S</m:t>
-                        </m:r>
-                      </m:e>
-                      <m:sub>
-                        <m:r>
-                          <m:rPr>
-                            <m:sty m:val="p"/>
-                          </m:rPr>
-                          <w:rPr>
-                            <w:rFonts w:ascii="Cambria Math" w:hAnsi="Cambria Math" w:eastAsia="Cambria Math" w:cs="Cambria Math"/>
-                            <w:sz w:val="18"/>
-                            <w:szCs w:val="18"/>
-                          </w:rPr>
-                          <m:t>D</m:t>
-                        </m:r>
-                      </m:sub>
-                      <m:sup>
-                        <m:r>
-                          <m:rPr>
-                            <m:sty m:val="p"/>
-                          </m:rPr>
-                          <w:rPr>
-                            <w:rFonts w:ascii="Cambria Math" w:hAnsi="Cambria Math" w:eastAsia="Cambria Math" w:cs="Cambria Math"/>
-                            <w:sz w:val="18"/>
-                            <w:szCs w:val="18"/>
-                          </w:rPr>
-                          <m:t>−</m:t>
-                        </m:r>
-                        <m:r>
-                          <m:rPr/>
-                          <w:rPr>
-                            <w:rFonts w:ascii="Cambria Math" w:hAnsi="Cambria Math" w:eastAsia="Cambria Math" w:cs="Cambria Math"/>
-                            <w:sz w:val="18"/>
-                            <w:szCs w:val="18"/>
-                          </w:rPr>
-                          <m:t>1</m:t>
-                        </m:r>
-                      </m:sup>
-                    </m:sSubSup>
-                    <m:sSub>
-                      <m:sSubPr/>
-                      <m:e>
-                        <m:r>
-                          <m:rPr>
-                            <m:sty m:val="b"/>
-                          </m:rPr>
-                          <w:rPr>
-                            <w:rFonts w:ascii="Cambria Math" w:hAnsi="Cambria Math" w:eastAsia="Cambria Math" w:cs="Cambria Math"/>
-                            <w:sz w:val="18"/>
-                            <w:szCs w:val="18"/>
-                          </w:rPr>
-                          <m:t>D</m:t>
-                        </m:r>
-                      </m:e>
-                      <m:sub>
-                        <m:r>
-                          <m:rPr>
-                            <m:sty m:val="p"/>
-                          </m:rPr>
-                          <w:rPr>
-                            <w:rFonts w:ascii="Cambria Math" w:hAnsi="Cambria Math" w:eastAsia="Cambria Math" w:cs="Cambria Math"/>
-                            <w:sz w:val="18"/>
-                            <w:szCs w:val="18"/>
-                          </w:rPr>
-                          <m:t>D</m:t>
-                        </m:r>
-                      </m:sub>
-                    </m:sSub>
-                    <m:r>
-                      <m:rPr>
-                        <m:sty m:val="p"/>
-                      </m:rPr>
-                      <w:rPr>
-                        <w:rFonts w:ascii="Cambria Math" w:hAnsi="Cambria Math" w:eastAsia="Cambria Math" w:cs="Cambria Math"/>
-                        <w:sz w:val="18"/>
-                        <w:szCs w:val="18"/>
-                      </w:rPr>
-                      <m:t>,</m:t>
-                    </m:r>
-                    <m:r>
-                      <m:rPr/>
-                      <w:rPr>
-                        <w:rFonts w:ascii="Cambria Math" w:hAnsi="Cambria Math" w:eastAsia="Cambria Math" w:cs="Cambria Math"/>
-                        <w:sz w:val="18"/>
-                        <w:szCs w:val="18"/>
-                      </w:rPr>
-                      <m:t>  </m:t>
-                    </m:r>
-                    <m:sSub>
-                      <m:sSubPr/>
-                      <m:e>
-                        <m:acc>
-                          <m:accPr>
-                            <m:chr m:val="̇"/>
-                          </m:accPr>
-                          <m:e>
-                            <m:r>
-                              <m:rPr>
-                                <m:sty m:val="bi"/>
-                              </m:rPr>
-                              <w:rPr>
-                                <w:rFonts w:ascii="Cambria Math" w:hAnsi="Cambria Math" w:eastAsia="Cambria Math" w:cs="Cambria Math"/>
-                                <w:sz w:val="18"/>
-                                <w:szCs w:val="18"/>
-                              </w:rPr>
-                              <m:t>p</m:t>
-                            </m:r>
-                          </m:e>
-                        </m:acc>
-                      </m:e>
-                      <m:sub>
-                        <m:r>
-                          <m:rPr>
-                            <m:sty m:val="p"/>
-                          </m:rPr>
-                          <w:rPr>
-                            <w:rFonts w:ascii="Cambria Math" w:hAnsi="Cambria Math" w:eastAsia="Cambria Math" w:cs="Cambria Math"/>
-                            <w:sz w:val="18"/>
-                            <w:szCs w:val="18"/>
-                          </w:rPr>
-                          <m:t>D</m:t>
-                        </m:r>
-                      </m:sub>
-                    </m:sSub>
-                    <m:r>
-                      <m:rPr>
-                        <m:sty m:val="p"/>
-                      </m:rPr>
-                      <w:rPr>
-                        <w:rFonts w:ascii="Cambria Math" w:hAnsi="Cambria Math" w:eastAsia="Cambria Math" w:cs="Cambria Math"/>
-                        <w:sz w:val="18"/>
-                        <w:szCs w:val="18"/>
-                      </w:rPr>
-                      <m:t>=</m:t>
-                    </m:r>
-                    <m:sSub>
-                      <m:sSubPr/>
-                      <m:e>
-                        <m:r>
-                          <m:rPr>
-                            <m:sty m:val="b"/>
-                          </m:rPr>
-                          <w:rPr>
-                            <w:rFonts w:ascii="Cambria Math" w:hAnsi="Cambria Math" w:eastAsia="Cambria Math" w:cs="Cambria Math"/>
-                            <w:sz w:val="18"/>
-                            <w:szCs w:val="18"/>
-                          </w:rPr>
-                          <m:t>J</m:t>
-                        </m:r>
-                      </m:e>
-                      <m:sub>
-                        <m:r>
-                          <m:rPr>
-                            <m:sty m:val="p"/>
-                          </m:rPr>
-                          <w:rPr>
-                            <w:rFonts w:ascii="Cambria Math" w:hAnsi="Cambria Math" w:eastAsia="Cambria Math" w:cs="Cambria Math"/>
-                            <w:sz w:val="18"/>
-                            <w:szCs w:val="18"/>
-                          </w:rPr>
-                          <m:t>D</m:t>
-                        </m:r>
-                      </m:sub>
-                    </m:sSub>
-                    <m:sSub>
-                      <m:sSubPr/>
-                      <m:e>
-                        <m:acc>
-                          <m:accPr>
-                            <m:chr m:val="̇"/>
-                          </m:accPr>
-                          <m:e>
-                            <m:r>
-                              <m:rPr>
-                                <m:sty m:val="bi"/>
-                              </m:rPr>
-                              <w:rPr>
-                                <w:rFonts w:ascii="Cambria Math" w:hAnsi="Cambria Math" w:eastAsia="Cambria Math" w:cs="Cambria Math"/>
-                                <w:sz w:val="18"/>
-                                <w:szCs w:val="18"/>
-                              </w:rPr>
-                              <m:t>θ</m:t>
-                            </m:r>
-                          </m:e>
-                        </m:acc>
-                      </m:e>
-                      <m:sub>
-                        <m:r>
-                          <m:rPr>
-                            <m:sty m:val="p"/>
-                          </m:rPr>
-                          <w:rPr>
-                            <w:rFonts w:ascii="Cambria Math" w:hAnsi="Cambria Math" w:eastAsia="Cambria Math" w:cs="Cambria Math"/>
-                            <w:sz w:val="18"/>
-                            <w:szCs w:val="18"/>
-                          </w:rPr>
-                          <m:t>D</m:t>
-                        </m:r>
-                      </m:sub>
-                    </m:sSub>
-                    <m:r>
-                      <m:rPr>
-                        <m:sty m:val="p"/>
-                      </m:rPr>
-                      <w:rPr>
-                        <w:rFonts w:ascii="Cambria Math" w:hAnsi="Cambria Math" w:eastAsia="Cambria Math" w:cs="Cambria Math"/>
-                        <w:sz w:val="18"/>
-                        <w:szCs w:val="18"/>
-                      </w:rPr>
-                      <m:t>.</m:t>
-                    </m:r>
-                  </m:e>
-                </m:eqArr>
+                      <m:t>D</m:t>
+                    </m:r>
+                  </m:sub>
+                </m:sSub>
+                <m:r>
+                  <m:rPr>
+                    <m:sty m:val="p"/>
+                  </m:rPr>
+                  <w:rPr>
+                    <w:rFonts w:ascii="Cambria Math" w:hAnsi="Cambria Math" w:eastAsia="Cambria Math" w:cs="Cambria Math"/>
+                    <w:sz w:val="18"/>
+                    <w:szCs w:val="18"/>
+                  </w:rPr>
+                  <m:t>.</m:t>
+                </m:r>
               </m:oMath>
             </m:oMathPara>
           </w:p>
@@ -29565,29 +29012,21 @@
           <w:sz w:val="20"/>
           <w:szCs w:val="20"/>
         </w:rPr>
-        <w:t>此表达式要求</w:t>
-      </w:r>
-      <w:r>
-        <w:rPr>
-          <w:sz w:val="20"/>
-          <w:szCs w:val="20"/>
-        </w:rPr>
-        <w:t xml:space="preserve"> </w:t>
+        <w:t xml:space="preserve">由虚功原理，动平台的期望支撑力 </w:t>
       </w:r>
       <m:oMath>
         <m:sSub>
-          <m:sSubPr/>
           <m:e>
             <m:r>
               <m:rPr>
-                <m:sty m:val="b"/>
+                <m:sty m:val="bi"/>
               </m:rPr>
               <w:rPr>
                 <w:rFonts w:ascii="Cambria Math" w:hAnsi="Cambria Math" w:eastAsia="Cambria Math" w:cs="Cambria Math"/>
                 <w:sz w:val="20"/>
                 <w:szCs w:val="20"/>
               </w:rPr>
-              <m:t>S</m:t>
+              <m:t>f</m:t>
             </m:r>
           </m:e>
           <m:sub>
@@ -29607,64 +29046,11 @@
       </m:oMath>
       <w:r>
         <w:rPr>
-          <w:sz w:val="20"/>
-          <w:szCs w:val="20"/>
-        </w:rPr>
-        <w:t xml:space="preserve"> </w:t>
-      </w:r>
-      <w:r>
-        <w:rPr>
           <w:rFonts w:hint="eastAsia"/>
           <w:sz w:val="20"/>
           <w:szCs w:val="20"/>
         </w:rPr>
-        <w:t>可逆。静力学采用虚功原理：若机构对动平台提供的期望支撑力为</w:t>
-      </w:r>
-      <w:r>
-        <w:rPr>
-          <w:sz w:val="20"/>
-          <w:szCs w:val="20"/>
-        </w:rPr>
-        <w:t xml:space="preserve"> </w:t>
-      </w:r>
-      <m:oMath>
-        <m:sSub>
-          <m:sSubPr/>
-          <m:e>
-            <m:r>
-              <m:rPr>
-                <m:sty m:val="bi"/>
-              </m:rPr>
-              <w:rPr>
-                <w:rFonts w:ascii="Cambria Math" w:hAnsi="Cambria Math" w:eastAsia="Cambria Math" w:cs="Cambria Math"/>
-                <w:sz w:val="20"/>
-                <w:szCs w:val="20"/>
-              </w:rPr>
-              <m:t>f</m:t>
-            </m:r>
-          </m:e>
-          <m:sub>
-            <m:r>
-              <m:rPr>
-                <m:sty m:val="p"/>
-              </m:rPr>
-              <w:rPr>
-                <w:rFonts w:ascii="Cambria Math" w:hAnsi="Cambria Math" w:eastAsia="Cambria Math" w:cs="Cambria Math"/>
-                <w:sz w:val="20"/>
-                <w:szCs w:val="20"/>
-              </w:rPr>
-              <m:t>D</m:t>
-            </m:r>
-          </m:sub>
-        </m:sSub>
-      </m:oMath>
-      <w:r>
-        <w:rPr>
-          <w:rFonts w:hint="eastAsia"/>
-          <w:sz w:val="20"/>
-          <w:szCs w:val="20"/>
-        </w:rPr>
-        <w:t>，对应电机广义力矩为</w:t>
+        <w:t xml:space="preserve"> 对应的电机前馈力矩为</w:t>
       </w:r>
     </w:p>
     <w:tbl>
@@ -29910,62 +29296,10 @@
           <w:sz w:val="20"/>
           <w:szCs w:val="20"/>
         </w:rPr>
-        <w:t>将动平台与手柄等效质量记为</w:t>
-      </w:r>
-      <w:r>
-        <w:rPr>
-          <w:sz w:val="20"/>
-          <w:szCs w:val="20"/>
-        </w:rPr>
-        <w:t xml:space="preserve"> </w:t>
+        <w:t xml:space="preserve">重力补偿取 </w:t>
       </w:r>
       <m:oMath>
         <m:sSub>
-          <m:sSubPr/>
-          <m:e>
-            <m:r>
-              <m:rPr/>
-              <w:rPr>
-                <w:rFonts w:ascii="Cambria Math" w:hAnsi="Cambria Math" w:eastAsia="Cambria Math" w:cs="Cambria Math"/>
-                <w:sz w:val="20"/>
-                <w:szCs w:val="20"/>
-              </w:rPr>
-              <m:t>m</m:t>
-            </m:r>
-          </m:e>
-          <m:sub>
-            <m:r>
-              <m:rPr>
-                <m:sty m:val="p"/>
-              </m:rPr>
-              <w:rPr>
-                <w:rFonts w:ascii="Cambria Math" w:hAnsi="Cambria Math" w:eastAsia="Cambria Math" w:cs="Cambria Math"/>
-                <w:sz w:val="20"/>
-                <w:szCs w:val="20"/>
-              </w:rPr>
-              <m:t>D</m:t>
-            </m:r>
-          </m:sub>
-        </m:sSub>
-      </m:oMath>
-      <w:r>
-        <w:rPr>
-          <w:rFonts w:hint="eastAsia"/>
-          <w:sz w:val="20"/>
-          <w:szCs w:val="20"/>
-        </w:rPr>
-        <w:t>，重力补偿取</w:t>
-      </w:r>
-      <w:r>
-        <w:rPr>
-          <w:sz w:val="20"/>
-          <w:szCs w:val="20"/>
-        </w:rPr>
-        <w:t xml:space="preserve"> </w:t>
-      </w:r>
-      <m:oMath>
-        <m:sSub>
-          <m:sSubPr/>
           <m:e>
             <m:r>
               <m:rPr>
@@ -30005,10 +29339,11 @@
           <m:t>=−</m:t>
         </m:r>
         <m:sSub>
-          <m:sSubPr/>
           <m:e>
             <m:r>
-              <m:rPr/>
+              <m:rPr>
+                <m:sty m:val="i"/>
+              </m:rPr>
               <w:rPr>
                 <w:rFonts w:ascii="Cambria Math" w:hAnsi="Cambria Math" w:eastAsia="Cambria Math" w:cs="Cambria Math"/>
                 <w:sz w:val="20"/>
@@ -30049,7 +29384,66 @@
           <w:sz w:val="20"/>
           <w:szCs w:val="20"/>
         </w:rPr>
-        <w:t>，必要时另加各支链重力项。该方法用于降低手持机构的静态负担。摩擦、参数误差和机构奇异会影响补偿效果，近奇异区域应限制力矩和操作范围。报告提供了补偿效果演示，尚未提供残余手持力的测量。</w:t>
+        <w:t xml:space="preserve">，其中 </w:t>
+      </w:r>
+      <m:oMath>
+        <m:sSub>
+          <m:e>
+            <m:r>
+              <m:rPr>
+                <m:sty m:val="i"/>
+              </m:rPr>
+              <w:rPr>
+                <w:rFonts w:ascii="Cambria Math" w:hAnsi="Cambria Math" w:eastAsia="Cambria Math" w:cs="Cambria Math"/>
+                <w:sz w:val="20"/>
+                <w:szCs w:val="20"/>
+              </w:rPr>
+              <m:t>m</m:t>
+            </m:r>
+          </m:e>
+          <m:sub>
+            <m:r>
+              <m:rPr>
+                <m:sty m:val="p"/>
+              </m:rPr>
+              <w:rPr>
+                <w:rFonts w:ascii="Cambria Math" w:hAnsi="Cambria Math" w:eastAsia="Cambria Math" w:cs="Cambria Math"/>
+                <w:sz w:val="20"/>
+                <w:szCs w:val="20"/>
+              </w:rPr>
+              <m:t>D</m:t>
+            </m:r>
+          </m:sub>
+        </m:sSub>
+      </m:oMath>
+      <w:r>
+        <w:rPr>
+          <w:rFonts w:hint="eastAsia"/>
+          <w:sz w:val="20"/>
+          <w:szCs w:val="20"/>
+        </w:rPr>
+        <w:t xml:space="preserve"> 为动平台与手柄的等效质量，</w:t>
+      </w:r>
+      <m:oMath>
+        <m:r>
+          <m:rPr>
+            <m:sty m:val="bi"/>
+          </m:rPr>
+          <w:rPr>
+            <w:rFonts w:ascii="Cambria Math" w:hAnsi="Cambria Math" w:eastAsia="Cambria Math" w:cs="Cambria Math"/>
+            <w:sz w:val="20"/>
+            <w:szCs w:val="20"/>
+          </w:rPr>
+          <m:t>g</m:t>
+        </m:r>
+      </m:oMath>
+      <w:r>
+        <w:rPr>
+          <w:rFonts w:hint="eastAsia"/>
+          <w:sz w:val="20"/>
+          <w:szCs w:val="20"/>
+        </w:rPr>
+        <w:t xml:space="preserve"> 为基座坐标系 {D} 下的重力加速度向量；必要时另加支链重力项，以降低手持静态负担。近奇异区域应限制力矩和操作范围。</w:t>
       </w:r>
     </w:p>
     <w:bookmarkEnd w:id="17"/>

</xml_diff>

<commit_message>
Expand master-slave pose mapping and remove chassis compensation
</commit_message>
<xml_diff>
--- a/Article.docx
+++ b/Article.docx
@@ -340,7 +340,7 @@
           <w:sz w:val="20"/>
           <w:szCs w:val="20"/>
         </w:rPr>
-        <w:t>三平移机构和三转动编码器手柄构成异构主端，结合解析逆解及底盘平移补偿完成末端位姿输入。本文对已有记录进行整理和分析，不将尚未完成的约束优化或未测量的性能指标作为实验结果。</w:t>
+        <w:t>三平移机构和三转动编码器手柄构成异构主端，通过主从位姿映射与解析逆解完成末端位姿输入。本文对已有记录进行整理和分析，不将尚未完成的约束优化或未测量的性能指标作为实验结果。</w:t>
       </w:r>
     </w:p>
     <w:bookmarkEnd w:id="2"/>
@@ -29536,7 +29536,7 @@
         </w:numPr>
         <w:snapToGrid w:val="0"/>
       </w:pPr>
-      <w:bookmarkStart w:id="18" w:name="位姿映射与底盘补偿"/>
+      <w:bookmarkStart w:id="18" w:name="位姿映射与关节指令"/>
       <w:r>
         <w:t xml:space="preserve">3) </w:t>
       </w:r>
@@ -29544,7 +29544,7 @@
         <w:rPr>
           <w:rFonts w:hint="eastAsia"/>
         </w:rPr>
-        <w:t>位姿映射与底盘补偿</w:t>
+        <w:t>位姿映射与关节指令</w:t>
       </w:r>
     </w:p>
     <w:p>
@@ -29565,18 +29565,10 @@
           <w:sz w:val="20"/>
           <w:szCs w:val="20"/>
         </w:rPr>
-        <w:t>主端初始化时记录平移零点</w:t>
-      </w:r>
-      <w:r>
-        <w:rPr>
-          <w:sz w:val="20"/>
-          <w:szCs w:val="20"/>
-        </w:rPr>
-        <w:t xml:space="preserve"> </w:t>
+        <w:t xml:space="preserve">主端的位置输入取 Delta 动平台中心 </w:t>
       </w:r>
       <m:oMath>
         <m:sSub>
-          <m:sSubPr/>
           <m:e>
             <m:r>
               <m:rPr>
@@ -29587,7 +29579,7 @@
                 <w:sz w:val="20"/>
                 <w:szCs w:val="20"/>
               </w:rPr>
-              <m:t>p</m:t>
+              <m:t xml:space="preserve">p</m:t>
             </m:r>
           </m:e>
           <m:sub>
@@ -29600,92 +29592,339 @@
                 <w:sz w:val="20"/>
                 <w:szCs w:val="20"/>
               </w:rPr>
-              <m:t>D,</m:t>
-            </m:r>
-            <m:r>
-              <m:rPr/>
-              <w:rPr>
-                <w:rFonts w:ascii="Cambria Math" w:hAnsi="Cambria Math" w:eastAsia="Cambria Math" w:cs="Cambria Math"/>
-                <w:sz w:val="20"/>
-                <w:szCs w:val="20"/>
-              </w:rPr>
-              <m:t>0</m:t>
+              <m:t xml:space="preserve">D</m:t>
+            </m:r>
+          </m:sub>
+        </m:sSub>
+        <m:r>
+          <m:rPr>
+            <m:sty m:val="p"/>
+          </m:rPr>
+          <w:rPr>
+            <w:rFonts w:ascii="Cambria Math" w:hAnsi="Cambria Math" w:eastAsia="Cambria Math" w:cs="Cambria Math"/>
+            <w:sz w:val="20"/>
+            <w:szCs w:val="20"/>
+          </w:rPr>
+          <m:t xml:space="preserve">=</m:t>
+        </m:r>
+        <m:sSup>
+          <m:e>
+            <m:d>
+              <m:dPr>
+                <m:begChr m:val="["/>
+                <m:endChr m:val="]"/>
+              </m:dPr>
+              <m:e>
+                <m:sSub>
+                  <m:e>
+                    <m:r>
+                      <m:rPr>
+                        <m:sty m:val="i"/>
+                      </m:rPr>
+                      <w:rPr>
+                        <w:rFonts w:ascii="Cambria Math" w:hAnsi="Cambria Math" w:eastAsia="Cambria Math" w:cs="Cambria Math"/>
+                        <w:sz w:val="20"/>
+                        <w:szCs w:val="20"/>
+                      </w:rPr>
+                      <m:t xml:space="preserve">x</m:t>
+                    </m:r>
+                  </m:e>
+                  <m:sub>
+                    <m:r>
+                      <m:rPr>
+                        <m:sty m:val="p"/>
+                      </m:rPr>
+                      <w:rPr>
+                        <w:rFonts w:ascii="Cambria Math" w:hAnsi="Cambria Math" w:eastAsia="Cambria Math" w:cs="Cambria Math"/>
+                        <w:sz w:val="20"/>
+                        <w:szCs w:val="20"/>
+                      </w:rPr>
+                      <m:t xml:space="preserve">D</m:t>
+                    </m:r>
+                  </m:sub>
+                </m:sSub>
+                <m:r>
+                  <m:rPr>
+                    <m:sty m:val="p"/>
+                  </m:rPr>
+                  <w:rPr>
+                    <w:rFonts w:ascii="Cambria Math" w:hAnsi="Cambria Math" w:eastAsia="Cambria Math" w:cs="Cambria Math"/>
+                    <w:sz w:val="20"/>
+                    <w:szCs w:val="20"/>
+                  </w:rPr>
+                  <m:t xml:space="preserve">,</m:t>
+                </m:r>
+                <m:sSub>
+                  <m:e>
+                    <m:r>
+                      <m:rPr>
+                        <m:sty m:val="i"/>
+                      </m:rPr>
+                      <w:rPr>
+                        <w:rFonts w:ascii="Cambria Math" w:hAnsi="Cambria Math" w:eastAsia="Cambria Math" w:cs="Cambria Math"/>
+                        <w:sz w:val="20"/>
+                        <w:szCs w:val="20"/>
+                      </w:rPr>
+                      <m:t xml:space="preserve">y</m:t>
+                    </m:r>
+                  </m:e>
+                  <m:sub>
+                    <m:r>
+                      <m:rPr>
+                        <m:sty m:val="p"/>
+                      </m:rPr>
+                      <w:rPr>
+                        <w:rFonts w:ascii="Cambria Math" w:hAnsi="Cambria Math" w:eastAsia="Cambria Math" w:cs="Cambria Math"/>
+                        <w:sz w:val="20"/>
+                        <w:szCs w:val="20"/>
+                      </w:rPr>
+                      <m:t xml:space="preserve">D</m:t>
+                    </m:r>
+                  </m:sub>
+                </m:sSub>
+                <m:r>
+                  <m:rPr>
+                    <m:sty m:val="p"/>
+                  </m:rPr>
+                  <w:rPr>
+                    <w:rFonts w:ascii="Cambria Math" w:hAnsi="Cambria Math" w:eastAsia="Cambria Math" w:cs="Cambria Math"/>
+                    <w:sz w:val="20"/>
+                    <w:szCs w:val="20"/>
+                  </w:rPr>
+                  <m:t xml:space="preserve">,</m:t>
+                </m:r>
+                <m:sSub>
+                  <m:e>
+                    <m:r>
+                      <m:rPr>
+                        <m:sty m:val="i"/>
+                      </m:rPr>
+                      <w:rPr>
+                        <w:rFonts w:ascii="Cambria Math" w:hAnsi="Cambria Math" w:eastAsia="Cambria Math" w:cs="Cambria Math"/>
+                        <w:sz w:val="20"/>
+                        <w:szCs w:val="20"/>
+                      </w:rPr>
+                      <m:t xml:space="preserve">z</m:t>
+                    </m:r>
+                  </m:e>
+                  <m:sub>
+                    <m:r>
+                      <m:rPr>
+                        <m:sty m:val="p"/>
+                      </m:rPr>
+                      <w:rPr>
+                        <w:rFonts w:ascii="Cambria Math" w:hAnsi="Cambria Math" w:eastAsia="Cambria Math" w:cs="Cambria Math"/>
+                        <w:sz w:val="20"/>
+                        <w:szCs w:val="20"/>
+                      </w:rPr>
+                      <m:t xml:space="preserve">D</m:t>
+                    </m:r>
+                  </m:sub>
+                </m:sSub>
+              </m:e>
+            </m:d>
+          </m:e>
+          <m:sup>
+            <m:r>
+              <m:rPr>
+                <m:sty m:val="p"/>
+              </m:rPr>
+              <w:rPr>
+                <w:rFonts w:ascii="Cambria Math" w:hAnsi="Cambria Math" w:eastAsia="Cambria Math" w:cs="Cambria Math"/>
+                <w:sz w:val="20"/>
+                <w:szCs w:val="20"/>
+              </w:rPr>
+              <m:t xml:space="preserve">T</m:t>
+            </m:r>
+          </m:sup>
+        </m:sSup>
+      </m:oMath>
+      <w:r>
+        <w:rPr>
+          <w:rFonts w:hint="eastAsia"/>
+          <w:sz w:val="20"/>
+          <w:szCs w:val="20"/>
+        </w:rPr>
+        <w:t xml:space="preserve">，姿态输入记为滚转、俯仰、偏航角 </w:t>
+      </w:r>
+      <m:oMath>
+        <m:d>
+          <m:dPr>
+            <m:begChr m:val="("/>
+            <m:endChr m:val=")"/>
+          </m:dPr>
+          <m:e>
+            <m:sSub>
+              <m:e>
+                <m:r>
+                  <m:rPr>
+                    <m:sty m:val="i"/>
+                  </m:rPr>
+                  <w:rPr>
+                    <w:rFonts w:ascii="Cambria Math" w:hAnsi="Cambria Math" w:eastAsia="Cambria Math" w:cs="Cambria Math"/>
+                    <w:sz w:val="20"/>
+                    <w:szCs w:val="20"/>
+                  </w:rPr>
+                  <m:t xml:space="preserve">ϕ</m:t>
+                </m:r>
+              </m:e>
+              <m:sub>
+                <m:r>
+                  <m:rPr>
+                    <m:sty m:val="p"/>
+                  </m:rPr>
+                  <w:rPr>
+                    <w:rFonts w:ascii="Cambria Math" w:hAnsi="Cambria Math" w:eastAsia="Cambria Math" w:cs="Cambria Math"/>
+                    <w:sz w:val="20"/>
+                    <w:szCs w:val="20"/>
+                  </w:rPr>
+                  <m:t xml:space="preserve">h</m:t>
+                </m:r>
+              </m:sub>
+            </m:sSub>
+            <m:r>
+              <m:rPr>
+                <m:sty m:val="p"/>
+              </m:rPr>
+              <w:rPr>
+                <w:rFonts w:ascii="Cambria Math" w:hAnsi="Cambria Math" w:eastAsia="Cambria Math" w:cs="Cambria Math"/>
+                <w:sz w:val="20"/>
+                <w:szCs w:val="20"/>
+              </w:rPr>
+              <m:t xml:space="preserve">,</m:t>
+            </m:r>
+            <m:sSub>
+              <m:e>
+                <m:r>
+                  <m:rPr>
+                    <m:sty m:val="i"/>
+                  </m:rPr>
+                  <w:rPr>
+                    <w:rFonts w:ascii="Cambria Math" w:hAnsi="Cambria Math" w:eastAsia="Cambria Math" w:cs="Cambria Math"/>
+                    <w:sz w:val="20"/>
+                    <w:szCs w:val="20"/>
+                  </w:rPr>
+                  <m:t xml:space="preserve">θ</m:t>
+                </m:r>
+              </m:e>
+              <m:sub>
+                <m:r>
+                  <m:rPr>
+                    <m:sty m:val="p"/>
+                  </m:rPr>
+                  <w:rPr>
+                    <w:rFonts w:ascii="Cambria Math" w:hAnsi="Cambria Math" w:eastAsia="Cambria Math" w:cs="Cambria Math"/>
+                    <w:sz w:val="20"/>
+                    <w:szCs w:val="20"/>
+                  </w:rPr>
+                  <m:t xml:space="preserve">h</m:t>
+                </m:r>
+              </m:sub>
+            </m:sSub>
+            <m:r>
+              <m:rPr>
+                <m:sty m:val="p"/>
+              </m:rPr>
+              <w:rPr>
+                <w:rFonts w:ascii="Cambria Math" w:hAnsi="Cambria Math" w:eastAsia="Cambria Math" w:cs="Cambria Math"/>
+                <w:sz w:val="20"/>
+                <w:szCs w:val="20"/>
+              </w:rPr>
+              <m:t xml:space="preserve">,</m:t>
+            </m:r>
+            <m:sSub>
+              <m:e>
+                <m:r>
+                  <m:rPr>
+                    <m:sty m:val="i"/>
+                  </m:rPr>
+                  <w:rPr>
+                    <w:rFonts w:ascii="Cambria Math" w:hAnsi="Cambria Math" w:eastAsia="Cambria Math" w:cs="Cambria Math"/>
+                    <w:sz w:val="20"/>
+                    <w:szCs w:val="20"/>
+                  </w:rPr>
+                  <m:t xml:space="preserve">ψ</m:t>
+                </m:r>
+              </m:e>
+              <m:sub>
+                <m:r>
+                  <m:rPr>
+                    <m:sty m:val="p"/>
+                  </m:rPr>
+                  <w:rPr>
+                    <w:rFonts w:ascii="Cambria Math" w:hAnsi="Cambria Math" w:eastAsia="Cambria Math" w:cs="Cambria Math"/>
+                    <w:sz w:val="20"/>
+                    <w:szCs w:val="20"/>
+                  </w:rPr>
+                  <m:t xml:space="preserve">h</m:t>
+                </m:r>
+              </m:sub>
+            </m:sSub>
+          </m:e>
+        </m:d>
+      </m:oMath>
+      <w:r>
+        <w:rPr>
+          <w:rFonts w:hint="eastAsia"/>
+          <w:sz w:val="20"/>
+          <w:szCs w:val="20"/>
+        </w:rPr>
+        <w:t xml:space="preserve">，单位为 rad。姿态由三编码器手柄的串联正运动学及其相对 </w:t>
+      </w:r>
+      <w:r>
+        <w:rPr>
+          <w:rFonts w:hint="eastAsia"/>
+          <w:sz w:val="20"/>
+          <w:szCs w:val="20"/>
+        </w:rPr>
+        <w:t xml:space="preserve">{D}</w:t>
+      </w:r>
+      <w:r>
+        <w:rPr>
+          <w:rFonts w:hint="eastAsia"/>
+          <w:sz w:val="20"/>
+          <w:szCs w:val="20"/>
+        </w:rPr>
+        <w:t xml:space="preserve"> 的安装变换得到，三个编码器角 </w:t>
+      </w:r>
+      <m:oMath>
+        <m:sSub>
+          <m:e>
+            <m:r>
+              <m:rPr>
+                <m:sty m:val="bi"/>
+              </m:rPr>
+              <w:rPr>
+                <w:rFonts w:ascii="Cambria Math" w:hAnsi="Cambria Math" w:eastAsia="Cambria Math" w:cs="Cambria Math"/>
+                <w:sz w:val="20"/>
+                <w:szCs w:val="20"/>
+              </w:rPr>
+              <m:t xml:space="preserve">q</m:t>
+            </m:r>
+          </m:e>
+          <m:sub>
+            <m:r>
+              <m:rPr>
+                <m:sty m:val="p"/>
+              </m:rPr>
+              <w:rPr>
+                <w:rFonts w:ascii="Cambria Math" w:hAnsi="Cambria Math" w:eastAsia="Cambria Math" w:cs="Cambria Math"/>
+                <w:sz w:val="20"/>
+                <w:szCs w:val="20"/>
+              </w:rPr>
+              <m:t xml:space="preserve">h</m:t>
             </m:r>
           </m:sub>
         </m:sSub>
       </m:oMath>
       <w:r>
         <w:rPr>
-          <w:sz w:val="20"/>
-          <w:szCs w:val="20"/>
-        </w:rPr>
-        <w:t xml:space="preserve"> </w:t>
-      </w:r>
-      <w:r>
-        <w:rPr>
           <w:rFonts w:hint="eastAsia"/>
           <w:sz w:val="20"/>
           <w:szCs w:val="20"/>
         </w:rPr>
-        <w:t>与从端参考点</w:t>
-      </w:r>
-      <w:r>
-        <w:rPr>
-          <w:sz w:val="20"/>
-          <w:szCs w:val="20"/>
-        </w:rPr>
-        <w:t xml:space="preserve"> </w:t>
-      </w:r>
-      <m:oMath>
-        <m:sSub>
-          <m:sSubPr/>
-          <m:e>
-            <m:r>
-              <m:rPr>
-                <m:sty m:val="bi"/>
-              </m:rPr>
-              <w:rPr>
-                <w:rFonts w:ascii="Cambria Math" w:hAnsi="Cambria Math" w:eastAsia="Cambria Math" w:cs="Cambria Math"/>
-                <w:sz w:val="20"/>
-                <w:szCs w:val="20"/>
-              </w:rPr>
-              <m:t>p</m:t>
-            </m:r>
-          </m:e>
-          <m:sub>
-            <m:r>
-              <m:rPr>
-                <m:sty m:val="p"/>
-              </m:rPr>
-              <w:rPr>
-                <w:rFonts w:ascii="Cambria Math" w:hAnsi="Cambria Math" w:eastAsia="Cambria Math" w:cs="Cambria Math"/>
-                <w:sz w:val="20"/>
-                <w:szCs w:val="20"/>
-              </w:rPr>
-              <m:t>A,</m:t>
-            </m:r>
-            <m:r>
-              <m:rPr/>
-              <w:rPr>
-                <w:rFonts w:ascii="Cambria Math" w:hAnsi="Cambria Math" w:eastAsia="Cambria Math" w:cs="Cambria Math"/>
-                <w:sz w:val="20"/>
-                <w:szCs w:val="20"/>
-              </w:rPr>
-              <m:t>0</m:t>
-            </m:r>
-          </m:sub>
-        </m:sSub>
-      </m:oMath>
-      <w:r>
-        <w:rPr>
-          <w:rFonts w:hint="eastAsia"/>
-          <w:sz w:val="20"/>
-          <w:szCs w:val="20"/>
-        </w:rPr>
-        <w:t>，经坐标对齐后的主从位置映射为</w:t>
-      </w:r>
-      <w:bookmarkStart w:id="27" w:name="_GoBack"/>
-      <w:bookmarkEnd w:id="27"/>
+        <w:t xml:space="preserve"> 不直接等于 RPY。本文统一采用固定轴 X–Y–Z 约定，主端旋转矩阵及位姿输入的齐次矩阵为</w:t>
+      </w:r>
     </w:p>
     <w:tbl>
       <w:tblPr>
@@ -29758,22 +29997,37 @@
                 <m:jc m:val="center"/>
               </m:oMathParaPr>
               <m:oMath>
-                <m:sSub>
-                  <m:sSubPr/>
+                <m:eqArr>
+                  <m:eqArrPr/>
                   <m:e>
-                    <m:r>
-                      <m:rPr>
-                        <m:sty m:val="bi"/>
-                      </m:rPr>
-                      <w:rPr>
-                        <w:rFonts w:ascii="Cambria Math" w:hAnsi="Cambria Math" w:eastAsia="Cambria Math" w:cs="Cambria Math"/>
-                        <w:sz w:val="18"/>
-                        <w:szCs w:val="18"/>
-                      </w:rPr>
-                      <m:t>p</m:t>
-                    </m:r>
-                  </m:e>
-                  <m:sub>
+                    <m:sSub>
+                      <m:e>
+                        <m:r>
+                          <m:rPr>
+                            <m:sty m:val="b"/>
+                          </m:rPr>
+                          <w:rPr>
+                            <w:rFonts w:ascii="Cambria Math" w:hAnsi="Cambria Math" w:eastAsia="Cambria Math" w:cs="Cambria Math"/>
+                            <w:sz w:val="18"/>
+                            <w:szCs w:val="18"/>
+                          </w:rPr>
+                          <m:t xml:space="preserve">R</m:t>
+                        </m:r>
+                      </m:e>
+                      <m:sub>
+                        <m:r>
+                          <m:rPr>
+                            <m:sty m:val="p"/>
+                          </m:rPr>
+                          <w:rPr>
+                            <w:rFonts w:ascii="Cambria Math" w:hAnsi="Cambria Math" w:eastAsia="Cambria Math" w:cs="Cambria Math"/>
+                            <w:sz w:val="18"/>
+                            <w:szCs w:val="18"/>
+                          </w:rPr>
+                          <m:t xml:space="preserve">h</m:t>
+                        </m:r>
+                      </m:sub>
+                    </m:sSub>
                     <m:r>
                       <m:rPr>
                         <m:sty m:val="p"/>
@@ -29783,37 +30037,200 @@
                         <w:sz w:val="18"/>
                         <w:szCs w:val="18"/>
                       </w:rPr>
-                      <m:t>A,d</m:t>
+                      <m:t xml:space="preserve">=</m:t>
                     </m:r>
-                  </m:sub>
-                </m:sSub>
-                <m:r>
-                  <m:rPr>
-                    <m:sty m:val="p"/>
-                  </m:rPr>
-                  <w:rPr>
-                    <w:rFonts w:ascii="Cambria Math" w:hAnsi="Cambria Math" w:eastAsia="Cambria Math" w:cs="Cambria Math"/>
-                    <w:sz w:val="18"/>
-                    <w:szCs w:val="18"/>
-                  </w:rPr>
-                  <m:t>=</m:t>
-                </m:r>
-                <m:sSub>
-                  <m:sSubPr/>
-                  <m:e>
-                    <m:r>
-                      <m:rPr>
-                        <m:sty m:val="bi"/>
-                      </m:rPr>
-                      <w:rPr>
-                        <w:rFonts w:ascii="Cambria Math" w:hAnsi="Cambria Math" w:eastAsia="Cambria Math" w:cs="Cambria Math"/>
-                        <w:sz w:val="18"/>
-                        <w:szCs w:val="18"/>
-                      </w:rPr>
-                      <m:t>p</m:t>
-                    </m:r>
-                  </m:e>
-                  <m:sub>
+                    <m:sSub>
+                      <m:e>
+                        <m:r>
+                          <m:rPr>
+                            <m:sty m:val="b"/>
+                          </m:rPr>
+                          <w:rPr>
+                            <w:rFonts w:ascii="Cambria Math" w:hAnsi="Cambria Math" w:eastAsia="Cambria Math" w:cs="Cambria Math"/>
+                            <w:sz w:val="18"/>
+                            <w:szCs w:val="18"/>
+                          </w:rPr>
+                          <m:t xml:space="preserve">R</m:t>
+                        </m:r>
+                      </m:e>
+                      <m:sub>
+                        <m:r>
+                          <m:rPr>
+                            <m:sty m:val="p"/>
+                          </m:rPr>
+                          <w:rPr>
+                            <w:rFonts w:ascii="Cambria Math" w:hAnsi="Cambria Math" w:eastAsia="Cambria Math" w:cs="Cambria Math"/>
+                            <w:sz w:val="18"/>
+                            <w:szCs w:val="18"/>
+                          </w:rPr>
+                          <m:t xml:space="preserve">z</m:t>
+                        </m:r>
+                      </m:sub>
+                    </m:sSub>
+                    <m:d>
+                      <m:dPr>
+                        <m:begChr m:val="("/>
+                        <m:endChr m:val=")"/>
+                      </m:dPr>
+                      <m:e>
+                        <m:sSub>
+                          <m:e>
+                            <m:r>
+                              <m:rPr>
+                                <m:sty m:val="i"/>
+                              </m:rPr>
+                              <w:rPr>
+                                <w:rFonts w:ascii="Cambria Math" w:hAnsi="Cambria Math" w:eastAsia="Cambria Math" w:cs="Cambria Math"/>
+                                <w:sz w:val="18"/>
+                                <w:szCs w:val="18"/>
+                              </w:rPr>
+                              <m:t xml:space="preserve">ψ</m:t>
+                            </m:r>
+                          </m:e>
+                          <m:sub>
+                            <m:r>
+                              <m:rPr>
+                                <m:sty m:val="p"/>
+                              </m:rPr>
+                              <w:rPr>
+                                <w:rFonts w:ascii="Cambria Math" w:hAnsi="Cambria Math" w:eastAsia="Cambria Math" w:cs="Cambria Math"/>
+                                <w:sz w:val="18"/>
+                                <w:szCs w:val="18"/>
+                              </w:rPr>
+                              <m:t xml:space="preserve">h</m:t>
+                            </m:r>
+                          </m:sub>
+                        </m:sSub>
+                      </m:e>
+                    </m:d>
+                    <m:sSub>
+                      <m:e>
+                        <m:r>
+                          <m:rPr>
+                            <m:sty m:val="b"/>
+                          </m:rPr>
+                          <w:rPr>
+                            <w:rFonts w:ascii="Cambria Math" w:hAnsi="Cambria Math" w:eastAsia="Cambria Math" w:cs="Cambria Math"/>
+                            <w:sz w:val="18"/>
+                            <w:szCs w:val="18"/>
+                          </w:rPr>
+                          <m:t xml:space="preserve">R</m:t>
+                        </m:r>
+                      </m:e>
+                      <m:sub>
+                        <m:r>
+                          <m:rPr>
+                            <m:sty m:val="p"/>
+                          </m:rPr>
+                          <w:rPr>
+                            <w:rFonts w:ascii="Cambria Math" w:hAnsi="Cambria Math" w:eastAsia="Cambria Math" w:cs="Cambria Math"/>
+                            <w:sz w:val="18"/>
+                            <w:szCs w:val="18"/>
+                          </w:rPr>
+                          <m:t xml:space="preserve">y</m:t>
+                        </m:r>
+                      </m:sub>
+                    </m:sSub>
+                    <m:d>
+                      <m:dPr>
+                        <m:begChr m:val="("/>
+                        <m:endChr m:val=")"/>
+                      </m:dPr>
+                      <m:e>
+                        <m:sSub>
+                          <m:e>
+                            <m:r>
+                              <m:rPr>
+                                <m:sty m:val="i"/>
+                              </m:rPr>
+                              <w:rPr>
+                                <w:rFonts w:ascii="Cambria Math" w:hAnsi="Cambria Math" w:eastAsia="Cambria Math" w:cs="Cambria Math"/>
+                                <w:sz w:val="18"/>
+                                <w:szCs w:val="18"/>
+                              </w:rPr>
+                              <m:t xml:space="preserve">θ</m:t>
+                            </m:r>
+                          </m:e>
+                          <m:sub>
+                            <m:r>
+                              <m:rPr>
+                                <m:sty m:val="p"/>
+                              </m:rPr>
+                              <w:rPr>
+                                <w:rFonts w:ascii="Cambria Math" w:hAnsi="Cambria Math" w:eastAsia="Cambria Math" w:cs="Cambria Math"/>
+                                <w:sz w:val="18"/>
+                                <w:szCs w:val="18"/>
+                              </w:rPr>
+                              <m:t xml:space="preserve">h</m:t>
+                            </m:r>
+                          </m:sub>
+                        </m:sSub>
+                      </m:e>
+                    </m:d>
+                    <m:sSub>
+                      <m:e>
+                        <m:r>
+                          <m:rPr>
+                            <m:sty m:val="b"/>
+                          </m:rPr>
+                          <w:rPr>
+                            <w:rFonts w:ascii="Cambria Math" w:hAnsi="Cambria Math" w:eastAsia="Cambria Math" w:cs="Cambria Math"/>
+                            <w:sz w:val="18"/>
+                            <w:szCs w:val="18"/>
+                          </w:rPr>
+                          <m:t xml:space="preserve">R</m:t>
+                        </m:r>
+                      </m:e>
+                      <m:sub>
+                        <m:r>
+                          <m:rPr>
+                            <m:sty m:val="p"/>
+                          </m:rPr>
+                          <w:rPr>
+                            <w:rFonts w:ascii="Cambria Math" w:hAnsi="Cambria Math" w:eastAsia="Cambria Math" w:cs="Cambria Math"/>
+                            <w:sz w:val="18"/>
+                            <w:szCs w:val="18"/>
+                          </w:rPr>
+                          <m:t xml:space="preserve">x</m:t>
+                        </m:r>
+                      </m:sub>
+                    </m:sSub>
+                    <m:d>
+                      <m:dPr>
+                        <m:begChr m:val="("/>
+                        <m:endChr m:val=")"/>
+                      </m:dPr>
+                      <m:e>
+                        <m:sSub>
+                          <m:e>
+                            <m:r>
+                              <m:rPr>
+                                <m:sty m:val="i"/>
+                              </m:rPr>
+                              <w:rPr>
+                                <w:rFonts w:ascii="Cambria Math" w:hAnsi="Cambria Math" w:eastAsia="Cambria Math" w:cs="Cambria Math"/>
+                                <w:sz w:val="18"/>
+                                <w:szCs w:val="18"/>
+                              </w:rPr>
+                              <m:t xml:space="preserve">ϕ</m:t>
+                            </m:r>
+                          </m:e>
+                          <m:sub>
+                            <m:r>
+                              <m:rPr>
+                                <m:sty m:val="p"/>
+                              </m:rPr>
+                              <w:rPr>
+                                <w:rFonts w:ascii="Cambria Math" w:hAnsi="Cambria Math" w:eastAsia="Cambria Math" w:cs="Cambria Math"/>
+                                <w:sz w:val="18"/>
+                                <w:szCs w:val="18"/>
+                              </w:rPr>
+                              <m:t xml:space="preserve">h</m:t>
+                            </m:r>
+                          </m:sub>
+                        </m:sSub>
+                      </m:e>
+                    </m:d>
                     <m:r>
                       <m:rPr>
                         <m:sty m:val="p"/>
@@ -29823,46 +30240,38 @@
                         <w:sz w:val="18"/>
                         <w:szCs w:val="18"/>
                       </w:rPr>
-                      <m:t>A,</m:t>
-                    </m:r>
-                    <m:r>
-                      <m:rPr/>
-                      <w:rPr>
-                        <w:rFonts w:ascii="Cambria Math" w:hAnsi="Cambria Math" w:eastAsia="Cambria Math" w:cs="Cambria Math"/>
-                        <w:sz w:val="18"/>
-                        <w:szCs w:val="18"/>
-                      </w:rPr>
-                      <m:t>0</m:t>
-                    </m:r>
-                  </m:sub>
-                </m:sSub>
-                <m:r>
-                  <m:rPr>
-                    <m:sty m:val="p"/>
-                  </m:rPr>
-                  <w:rPr>
-                    <w:rFonts w:ascii="Cambria Math" w:hAnsi="Cambria Math" w:eastAsia="Cambria Math" w:cs="Cambria Math"/>
-                    <w:sz w:val="18"/>
-                    <w:szCs w:val="18"/>
-                  </w:rPr>
-                  <m:t>+</m:t>
-                </m:r>
-                <m:sSub>
-                  <m:sSubPr/>
-                  <m:e>
-                    <m:r>
-                      <m:rPr>
-                        <m:sty m:val="b"/>
-                      </m:rPr>
-                      <w:rPr>
-                        <w:rFonts w:ascii="Cambria Math" w:hAnsi="Cambria Math" w:eastAsia="Cambria Math" w:cs="Cambria Math"/>
-                        <w:sz w:val="18"/>
-                        <w:szCs w:val="18"/>
-                      </w:rPr>
-                      <m:t>K</m:t>
+                      <m:t xml:space="preserve">,</m:t>
                     </m:r>
                   </m:e>
-                  <m:sub>
+                  <m:e>
+                    <m:sSub>
+                      <m:e>
+                        <m:r>
+                          <m:rPr>
+                            <m:sty m:val="b"/>
+                          </m:rPr>
+                          <w:rPr>
+                            <w:rFonts w:ascii="Cambria Math" w:hAnsi="Cambria Math" w:eastAsia="Cambria Math" w:cs="Cambria Math"/>
+                            <w:sz w:val="18"/>
+                            <w:szCs w:val="18"/>
+                          </w:rPr>
+                          <m:t xml:space="preserve">T</m:t>
+                        </m:r>
+                      </m:e>
+                      <m:sub>
+                        <m:r>
+                          <m:rPr>
+                            <m:sty m:val="p"/>
+                          </m:rPr>
+                          <w:rPr>
+                            <w:rFonts w:ascii="Cambria Math" w:hAnsi="Cambria Math" w:eastAsia="Cambria Math" w:cs="Cambria Math"/>
+                            <w:sz w:val="18"/>
+                            <w:szCs w:val="18"/>
+                          </w:rPr>
+                          <m:t xml:space="preserve">Dh</m:t>
+                        </m:r>
+                      </m:sub>
+                    </m:sSub>
                     <m:r>
                       <m:rPr>
                         <m:sty m:val="p"/>
@@ -29872,26 +30281,135 @@
                         <w:sz w:val="18"/>
                         <w:szCs w:val="18"/>
                       </w:rPr>
-                      <m:t>map</m:t>
+                      <m:t xml:space="preserve">=</m:t>
                     </m:r>
-                  </m:sub>
-                </m:sSub>
-                <m:sSub>
-                  <m:sSubPr/>
-                  <m:e>
-                    <m:r>
-                      <m:rPr>
-                        <m:sty m:val="b"/>
-                      </m:rPr>
-                      <w:rPr>
-                        <w:rFonts w:ascii="Cambria Math" w:hAnsi="Cambria Math" w:eastAsia="Cambria Math" w:cs="Cambria Math"/>
-                        <w:sz w:val="18"/>
-                        <w:szCs w:val="18"/>
-                      </w:rPr>
-                      <m:t>R</m:t>
-                    </m:r>
-                  </m:e>
-                  <m:sub>
+                    <m:d>
+                      <m:dPr>
+                        <m:begChr m:val="["/>
+                        <m:endChr m:val="]"/>
+                      </m:dPr>
+                      <m:e>
+                        <m:m>
+                          <m:mPr>
+                            <m:mcs>
+                              <m:mc>
+                                <m:mcPr>
+                                  <m:count m:val="2"/>
+                                  <m:mcJc m:val="center"/>
+                                </m:mcPr>
+                              </m:mc>
+                            </m:mcs>
+                          </m:mPr>
+                          <m:mr>
+                            <m:e>
+                              <m:sSub>
+                                <m:e>
+                                  <m:r>
+                                    <m:rPr>
+                                      <m:sty m:val="b"/>
+                                    </m:rPr>
+                                    <w:rPr>
+                                      <w:rFonts w:ascii="Cambria Math" w:hAnsi="Cambria Math" w:eastAsia="Cambria Math" w:cs="Cambria Math"/>
+                                      <w:sz w:val="18"/>
+                                      <w:szCs w:val="18"/>
+                                    </w:rPr>
+                                    <m:t xml:space="preserve">R</m:t>
+                                  </m:r>
+                                </m:e>
+                                <m:sub>
+                                  <m:r>
+                                    <m:rPr>
+                                      <m:sty m:val="p"/>
+                                    </m:rPr>
+                                    <w:rPr>
+                                      <w:rFonts w:ascii="Cambria Math" w:hAnsi="Cambria Math" w:eastAsia="Cambria Math" w:cs="Cambria Math"/>
+                                      <w:sz w:val="18"/>
+                                      <w:szCs w:val="18"/>
+                                    </w:rPr>
+                                    <m:t xml:space="preserve">h</m:t>
+                                  </m:r>
+                                </m:sub>
+                              </m:sSub>
+                            </m:e>
+                            <m:e>
+                              <m:sSub>
+                                <m:e>
+                                  <m:r>
+                                    <m:rPr>
+                                      <m:sty m:val="bi"/>
+                                    </m:rPr>
+                                    <w:rPr>
+                                      <w:rFonts w:ascii="Cambria Math" w:hAnsi="Cambria Math" w:eastAsia="Cambria Math" w:cs="Cambria Math"/>
+                                      <w:sz w:val="18"/>
+                                      <w:szCs w:val="18"/>
+                                    </w:rPr>
+                                    <m:t xml:space="preserve">p</m:t>
+                                  </m:r>
+                                </m:e>
+                                <m:sub>
+                                  <m:r>
+                                    <m:rPr>
+                                      <m:sty m:val="p"/>
+                                    </m:rPr>
+                                    <w:rPr>
+                                      <w:rFonts w:ascii="Cambria Math" w:hAnsi="Cambria Math" w:eastAsia="Cambria Math" w:cs="Cambria Math"/>
+                                      <w:sz w:val="18"/>
+                                      <w:szCs w:val="18"/>
+                                    </w:rPr>
+                                    <m:t xml:space="preserve">D</m:t>
+                                  </m:r>
+                                </m:sub>
+                              </m:sSub>
+                            </m:e>
+                          </m:mr>
+                          <m:mr>
+                            <m:e>
+                              <m:sSup>
+                                <m:e>
+                                  <m:r>
+                                    <m:rPr>
+                                      <m:sty m:val="bi"/>
+                                    </m:rPr>
+                                    <w:rPr>
+                                      <w:rFonts w:ascii="Cambria Math" w:hAnsi="Cambria Math" w:eastAsia="Cambria Math" w:cs="Cambria Math"/>
+                                      <w:sz w:val="18"/>
+                                      <w:szCs w:val="18"/>
+                                    </w:rPr>
+                                    <m:t xml:space="preserve">0</m:t>
+                                  </m:r>
+                                </m:e>
+                                <m:sup>
+                                  <m:r>
+                                    <m:rPr>
+                                      <m:sty m:val="p"/>
+                                    </m:rPr>
+                                    <w:rPr>
+                                      <w:rFonts w:ascii="Cambria Math" w:hAnsi="Cambria Math" w:eastAsia="Cambria Math" w:cs="Cambria Math"/>
+                                      <w:sz w:val="18"/>
+                                      <w:szCs w:val="18"/>
+                                    </w:rPr>
+                                    <m:t xml:space="preserve">T</m:t>
+                                  </m:r>
+                                </m:sup>
+                              </m:sSup>
+                            </m:e>
+                            <m:e>
+                              <m:r>
+                                <m:rPr>
+                                  <m:sty m:val="p"/>
+                                </m:rPr>
+                                <w:rPr>
+                                  <w:rFonts w:ascii="Cambria Math" w:hAnsi="Cambria Math" w:eastAsia="Cambria Math" w:cs="Cambria Math"/>
+                                  <w:sz w:val="18"/>
+                                  <w:szCs w:val="18"/>
+                                </w:rPr>
+                                <m:t xml:space="preserve">1</m:t>
+                              </m:r>
+                            </m:e>
+                          </m:mr>
+                        </m:m>
+                      </m:e>
+                    </m:d>
                     <m:r>
                       <m:rPr>
                         <m:sty m:val="p"/>
@@ -29901,110 +30419,10 @@
                         <w:sz w:val="18"/>
                         <w:szCs w:val="18"/>
                       </w:rPr>
-                      <m:t>AD</m:t>
-                    </m:r>
-                  </m:sub>
-                </m:sSub>
-                <m:r>
-                  <m:rPr>
-                    <m:sty m:val="p"/>
-                  </m:rPr>
-                  <w:rPr>
-                    <w:rFonts w:ascii="Cambria Math" w:hAnsi="Cambria Math" w:eastAsia="Cambria Math" w:cs="Cambria Math"/>
-                    <w:sz w:val="18"/>
-                    <w:szCs w:val="18"/>
-                  </w:rPr>
-                  <m:t>(</m:t>
-                </m:r>
-                <m:sSub>
-                  <m:sSubPr/>
-                  <m:e>
-                    <m:r>
-                      <m:rPr>
-                        <m:sty m:val="bi"/>
-                      </m:rPr>
-                      <w:rPr>
-                        <w:rFonts w:ascii="Cambria Math" w:hAnsi="Cambria Math" w:eastAsia="Cambria Math" w:cs="Cambria Math"/>
-                        <w:sz w:val="18"/>
-                        <w:szCs w:val="18"/>
-                      </w:rPr>
-                      <m:t>p</m:t>
+                      <m:t xml:space="preserve">.</m:t>
                     </m:r>
                   </m:e>
-                  <m:sub>
-                    <m:r>
-                      <m:rPr>
-                        <m:sty m:val="p"/>
-                      </m:rPr>
-                      <w:rPr>
-                        <w:rFonts w:ascii="Cambria Math" w:hAnsi="Cambria Math" w:eastAsia="Cambria Math" w:cs="Cambria Math"/>
-                        <w:sz w:val="18"/>
-                        <w:szCs w:val="18"/>
-                      </w:rPr>
-                      <m:t>D</m:t>
-                    </m:r>
-                  </m:sub>
-                </m:sSub>
-                <m:r>
-                  <m:rPr>
-                    <m:sty m:val="p"/>
-                  </m:rPr>
-                  <w:rPr>
-                    <w:rFonts w:ascii="Cambria Math" w:hAnsi="Cambria Math" w:eastAsia="Cambria Math" w:cs="Cambria Math"/>
-                    <w:sz w:val="18"/>
-                    <w:szCs w:val="18"/>
-                  </w:rPr>
-                  <m:t>−</m:t>
-                </m:r>
-                <m:sSub>
-                  <m:sSubPr/>
-                  <m:e>
-                    <m:r>
-                      <m:rPr>
-                        <m:sty m:val="bi"/>
-                      </m:rPr>
-                      <w:rPr>
-                        <w:rFonts w:ascii="Cambria Math" w:hAnsi="Cambria Math" w:eastAsia="Cambria Math" w:cs="Cambria Math"/>
-                        <w:sz w:val="18"/>
-                        <w:szCs w:val="18"/>
-                      </w:rPr>
-                      <m:t>p</m:t>
-                    </m:r>
-                  </m:e>
-                  <m:sub>
-                    <m:r>
-                      <m:rPr>
-                        <m:sty m:val="p"/>
-                      </m:rPr>
-                      <w:rPr>
-                        <w:rFonts w:ascii="Cambria Math" w:hAnsi="Cambria Math" w:eastAsia="Cambria Math" w:cs="Cambria Math"/>
-                        <w:sz w:val="18"/>
-                        <w:szCs w:val="18"/>
-                      </w:rPr>
-                      <m:t>D,</m:t>
-                    </m:r>
-                    <m:r>
-                      <m:rPr/>
-                      <w:rPr>
-                        <w:rFonts w:ascii="Cambria Math" w:hAnsi="Cambria Math" w:eastAsia="Cambria Math" w:cs="Cambria Math"/>
-                        <w:sz w:val="18"/>
-                        <w:szCs w:val="18"/>
-                      </w:rPr>
-                      <m:t>0</m:t>
-                    </m:r>
-                  </m:sub>
-                </m:sSub>
-                <m:r>
-                  <m:rPr>
-                    <m:sty m:val="p"/>
-                  </m:rPr>
-                  <w:rPr>
-                    <w:rFonts w:ascii="Cambria Math" w:hAnsi="Cambria Math" w:eastAsia="Cambria Math" w:cs="Cambria Math"/>
-                    <w:sz w:val="18"/>
-                    <w:szCs w:val="18"/>
-                  </w:rPr>
-                  <m:t>),</m:t>
-                </m:r>
+                </m:eqArr>
               </m:oMath>
             </m:oMathPara>
           </w:p>
@@ -30055,52 +30473,7 @@
           <w:sz w:val="20"/>
           <w:szCs w:val="20"/>
         </w:rPr>
-        <w:t>其中</w:t>
-      </w:r>
-      <w:r>
-        <w:rPr>
-          <w:sz w:val="20"/>
-          <w:szCs w:val="20"/>
-        </w:rPr>
-        <w:t xml:space="preserve"> </w:t>
-      </w:r>
-      <m:oMath>
-        <m:sSub>
-          <m:sSubPr/>
-          <m:e>
-            <m:r>
-              <m:rPr>
-                <m:sty m:val="b"/>
-              </m:rPr>
-              <w:rPr>
-                <w:rFonts w:ascii="Cambria Math" w:hAnsi="Cambria Math" w:eastAsia="Cambria Math" w:cs="Cambria Math"/>
-                <w:sz w:val="20"/>
-                <w:szCs w:val="20"/>
-              </w:rPr>
-              <m:t>R</m:t>
-            </m:r>
-          </m:e>
-          <m:sub>
-            <m:r>
-              <m:rPr>
-                <m:sty m:val="p"/>
-              </m:rPr>
-              <w:rPr>
-                <w:rFonts w:ascii="Cambria Math" w:hAnsi="Cambria Math" w:eastAsia="Cambria Math" w:cs="Cambria Math"/>
-                <w:sz w:val="20"/>
-                <w:szCs w:val="20"/>
-              </w:rPr>
-              <m:t>AD</m:t>
-            </m:r>
-          </m:sub>
-        </m:sSub>
-      </m:oMath>
-      <w:r>
-        <w:rPr>
-          <w:sz w:val="20"/>
-          <w:szCs w:val="20"/>
-        </w:rPr>
-        <w:t xml:space="preserve"> </w:t>
+        <w:t xml:space="preserve">其中，旋转矩阵将手柄姿态坐标系的分量变换至 </w:t>
       </w:r>
       <w:r>
         <w:rPr>
@@ -30108,164 +30481,7 @@
           <w:sz w:val="20"/>
           <w:szCs w:val="20"/>
         </w:rPr>
-        <w:t>为固定坐标校准旋转，</w:t>
-      </w:r>
-      <m:oMath>
-        <m:sSub>
-          <m:sSubPr/>
-          <m:e>
-            <m:r>
-              <m:rPr>
-                <m:sty m:val="b"/>
-              </m:rPr>
-              <w:rPr>
-                <w:rFonts w:ascii="Cambria Math" w:hAnsi="Cambria Math" w:eastAsia="Cambria Math" w:cs="Cambria Math"/>
-                <w:sz w:val="20"/>
-                <w:szCs w:val="20"/>
-              </w:rPr>
-              <m:t>K</m:t>
-            </m:r>
-          </m:e>
-          <m:sub>
-            <m:r>
-              <m:rPr>
-                <m:sty m:val="p"/>
-              </m:rPr>
-              <w:rPr>
-                <w:rFonts w:ascii="Cambria Math" w:hAnsi="Cambria Math" w:eastAsia="Cambria Math" w:cs="Cambria Math"/>
-                <w:sz w:val="20"/>
-                <w:szCs w:val="20"/>
-              </w:rPr>
-              <m:t>map</m:t>
-            </m:r>
-          </m:sub>
-        </m:sSub>
-        <m:r>
-          <m:rPr>
-            <m:sty m:val="p"/>
-          </m:rPr>
-          <w:rPr>
-            <w:rFonts w:ascii="Cambria Math" w:hAnsi="Cambria Math" w:eastAsia="Cambria Math" w:cs="Cambria Math"/>
-            <w:sz w:val="20"/>
-            <w:szCs w:val="20"/>
-          </w:rPr>
-          <m:t>=diag(</m:t>
-        </m:r>
-        <m:sSub>
-          <m:sSubPr/>
-          <m:e>
-            <m:r>
-              <m:rPr/>
-              <w:rPr>
-                <w:rFonts w:ascii="Cambria Math" w:hAnsi="Cambria Math" w:eastAsia="Cambria Math" w:cs="Cambria Math"/>
-                <w:sz w:val="20"/>
-                <w:szCs w:val="20"/>
-              </w:rPr>
-              <m:t>k</m:t>
-            </m:r>
-          </m:e>
-          <m:sub>
-            <m:r>
-              <m:rPr/>
-              <w:rPr>
-                <w:rFonts w:ascii="Cambria Math" w:hAnsi="Cambria Math" w:eastAsia="Cambria Math" w:cs="Cambria Math"/>
-                <w:sz w:val="20"/>
-                <w:szCs w:val="20"/>
-              </w:rPr>
-              <m:t>x</m:t>
-            </m:r>
-          </m:sub>
-        </m:sSub>
-        <m:r>
-          <m:rPr>
-            <m:sty m:val="p"/>
-          </m:rPr>
-          <w:rPr>
-            <w:rFonts w:ascii="Cambria Math" w:hAnsi="Cambria Math" w:eastAsia="Cambria Math" w:cs="Cambria Math"/>
-            <w:sz w:val="20"/>
-            <w:szCs w:val="20"/>
-          </w:rPr>
-          <m:t>,</m:t>
-        </m:r>
-        <m:sSub>
-          <m:sSubPr/>
-          <m:e>
-            <m:r>
-              <m:rPr/>
-              <w:rPr>
-                <w:rFonts w:ascii="Cambria Math" w:hAnsi="Cambria Math" w:eastAsia="Cambria Math" w:cs="Cambria Math"/>
-                <w:sz w:val="20"/>
-                <w:szCs w:val="20"/>
-              </w:rPr>
-              <m:t>k</m:t>
-            </m:r>
-          </m:e>
-          <m:sub>
-            <m:r>
-              <m:rPr/>
-              <w:rPr>
-                <w:rFonts w:ascii="Cambria Math" w:hAnsi="Cambria Math" w:eastAsia="Cambria Math" w:cs="Cambria Math"/>
-                <w:sz w:val="20"/>
-                <w:szCs w:val="20"/>
-              </w:rPr>
-              <m:t>y</m:t>
-            </m:r>
-          </m:sub>
-        </m:sSub>
-        <m:r>
-          <m:rPr>
-            <m:sty m:val="p"/>
-          </m:rPr>
-          <w:rPr>
-            <w:rFonts w:ascii="Cambria Math" w:hAnsi="Cambria Math" w:eastAsia="Cambria Math" w:cs="Cambria Math"/>
-            <w:sz w:val="20"/>
-            <w:szCs w:val="20"/>
-          </w:rPr>
-          <m:t>,</m:t>
-        </m:r>
-        <m:sSub>
-          <m:sSubPr/>
-          <m:e>
-            <m:r>
-              <m:rPr/>
-              <w:rPr>
-                <w:rFonts w:ascii="Cambria Math" w:hAnsi="Cambria Math" w:eastAsia="Cambria Math" w:cs="Cambria Math"/>
-                <w:sz w:val="20"/>
-                <w:szCs w:val="20"/>
-              </w:rPr>
-              <m:t>k</m:t>
-            </m:r>
-          </m:e>
-          <m:sub>
-            <m:r>
-              <m:rPr/>
-              <w:rPr>
-                <w:rFonts w:ascii="Cambria Math" w:hAnsi="Cambria Math" w:eastAsia="Cambria Math" w:cs="Cambria Math"/>
-                <w:sz w:val="20"/>
-                <w:szCs w:val="20"/>
-              </w:rPr>
-              <m:t>z</m:t>
-            </m:r>
-          </m:sub>
-        </m:sSub>
-        <m:r>
-          <m:rPr>
-            <m:sty m:val="p"/>
-          </m:rPr>
-          <w:rPr>
-            <w:rFonts w:ascii="Cambria Math" w:hAnsi="Cambria Math" w:eastAsia="Cambria Math" w:cs="Cambria Math"/>
-            <w:sz w:val="20"/>
-            <w:szCs w:val="20"/>
-          </w:rPr>
-          <m:t>)</m:t>
-        </m:r>
-      </m:oMath>
-      <w:r>
-        <w:rPr>
-          <w:sz w:val="20"/>
-          <w:szCs w:val="20"/>
-        </w:rPr>
-        <w:t xml:space="preserve"> </w:t>
+        <w:t xml:space="preserve">{D}</w:t>
       </w:r>
       <w:r>
         <w:rPr>
@@ -30273,7 +30489,7 @@
           <w:sz w:val="20"/>
           <w:szCs w:val="20"/>
         </w:rPr>
-        <w:t>为无量纲缩放矩阵。较小缩放系数可减小从端对手部位移的响应，但不能消除机械误差。重置按钮更新参考点时，应保持从端目标连续。</w:t>
+        <w:t xml:space="preserve">；该姿态坐标系的原点取位置输入点，即动平台中心。式（32）中的三个基本旋转矩阵分别表示绕相应坐标轴的右手正向旋转，乘积等价于固定轴先滚转、再俯仰、最后偏航。</w:t>
       </w:r>
     </w:p>
     <w:p>
@@ -30294,18 +30510,26 @@
           <w:sz w:val="20"/>
           <w:szCs w:val="20"/>
         </w:rPr>
-        <w:t>姿态手柄的三个编码器角记为</w:t>
-      </w:r>
-      <w:r>
-        <w:rPr>
-          <w:sz w:val="20"/>
-          <w:szCs w:val="20"/>
-        </w:rPr>
-        <w:t xml:space="preserve"> </w:t>
+        <w:t xml:space="preserve">将从端机械臂基坐标系记为 </w:t>
+      </w:r>
+      <w:r>
+        <w:rPr>
+          <w:rFonts w:hint="eastAsia"/>
+          <w:sz w:val="20"/>
+          <w:szCs w:val="20"/>
+        </w:rPr>
+        <w:t xml:space="preserve">{A}</w:t>
+      </w:r>
+      <w:r>
+        <w:rPr>
+          <w:rFonts w:hint="eastAsia"/>
+          <w:sz w:val="20"/>
+          <w:szCs w:val="20"/>
+        </w:rPr>
+        <w:t xml:space="preserve">，与 III-C 节的坐标系 0 一致。初始化时记录主端位置零点 </w:t>
       </w:r>
       <m:oMath>
         <m:sSub>
-          <m:sSubPr/>
           <m:e>
             <m:r>
               <m:rPr>
@@ -30316,7 +30540,7 @@
                 <w:sz w:val="20"/>
                 <w:szCs w:val="20"/>
               </w:rPr>
-              <m:t>q</m:t>
+              <m:t xml:space="preserve">p</m:t>
             </m:r>
           </m:e>
           <m:sub>
@@ -30329,7 +30553,7 @@
                 <w:sz w:val="20"/>
                 <w:szCs w:val="20"/>
               </w:rPr>
-              <m:t>h</m:t>
+              <m:t xml:space="preserve">D,0</m:t>
             </m:r>
           </m:sub>
         </m:sSub>
@@ -30340,29 +30564,21 @@
           <w:sz w:val="20"/>
           <w:szCs w:val="20"/>
         </w:rPr>
-        <w:t>，根据其真实串联转轴顺序求得</w:t>
-      </w:r>
-      <w:r>
-        <w:rPr>
-          <w:sz w:val="20"/>
-          <w:szCs w:val="20"/>
-        </w:rPr>
-        <w:t xml:space="preserve"> </w:t>
+        <w:t xml:space="preserve"> 和从端参考位置 </w:t>
       </w:r>
       <m:oMath>
         <m:sSub>
-          <m:sSubPr/>
           <m:e>
             <m:r>
               <m:rPr>
-                <m:sty m:val="b"/>
+                <m:sty m:val="bi"/>
               </m:rPr>
               <w:rPr>
                 <w:rFonts w:ascii="Cambria Math" w:hAnsi="Cambria Math" w:eastAsia="Cambria Math" w:cs="Cambria Math"/>
                 <w:sz w:val="20"/>
                 <w:szCs w:val="20"/>
               </w:rPr>
-              <m:t>R</m:t>
+              <m:t xml:space="preserve">p</m:t>
             </m:r>
           </m:e>
           <m:sub>
@@ -30375,61 +30591,10 @@
                 <w:sz w:val="20"/>
                 <w:szCs w:val="20"/>
               </w:rPr>
-              <m:t>h</m:t>
+              <m:t xml:space="preserve">A,0</m:t>
             </m:r>
           </m:sub>
         </m:sSub>
-        <m:r>
-          <m:rPr>
-            <m:sty m:val="p"/>
-          </m:rPr>
-          <w:rPr>
-            <w:rFonts w:ascii="Cambria Math" w:hAnsi="Cambria Math" w:eastAsia="Cambria Math" w:cs="Cambria Math"/>
-            <w:sz w:val="20"/>
-            <w:szCs w:val="20"/>
-          </w:rPr>
-          <m:t>(</m:t>
-        </m:r>
-        <m:sSub>
-          <m:sSubPr/>
-          <m:e>
-            <m:r>
-              <m:rPr>
-                <m:sty m:val="bi"/>
-              </m:rPr>
-              <w:rPr>
-                <w:rFonts w:ascii="Cambria Math" w:hAnsi="Cambria Math" w:eastAsia="Cambria Math" w:cs="Cambria Math"/>
-                <w:sz w:val="20"/>
-                <w:szCs w:val="20"/>
-              </w:rPr>
-              <m:t>q</m:t>
-            </m:r>
-          </m:e>
-          <m:sub>
-            <m:r>
-              <m:rPr>
-                <m:sty m:val="p"/>
-              </m:rPr>
-              <w:rPr>
-                <w:rFonts w:ascii="Cambria Math" w:hAnsi="Cambria Math" w:eastAsia="Cambria Math" w:cs="Cambria Math"/>
-                <w:sz w:val="20"/>
-                <w:szCs w:val="20"/>
-              </w:rPr>
-              <m:t>h</m:t>
-            </m:r>
-          </m:sub>
-        </m:sSub>
-        <m:r>
-          <m:rPr>
-            <m:sty m:val="p"/>
-          </m:rPr>
-          <w:rPr>
-            <w:rFonts w:ascii="Cambria Math" w:hAnsi="Cambria Math" w:eastAsia="Cambria Math" w:cs="Cambria Math"/>
-            <w:sz w:val="20"/>
-            <w:szCs w:val="20"/>
-          </w:rPr>
-          <m:t>)</m:t>
-        </m:r>
       </m:oMath>
       <w:r>
         <w:rPr>
@@ -30437,7 +30602,7 @@
           <w:sz w:val="20"/>
           <w:szCs w:val="20"/>
         </w:rPr>
-        <w:t>，再施加固定安装变换：</w:t>
+        <w:t xml:space="preserve">，由主端矩阵中的位置、姿态分块计算从端目标：</w:t>
       </w:r>
     </w:p>
     <w:tbl>
@@ -30511,22 +30676,37 @@
                 <m:jc m:val="center"/>
               </m:oMathParaPr>
               <m:oMath>
-                <m:sSub>
-                  <m:sSubPr/>
+                <m:eqArr>
+                  <m:eqArrPr/>
                   <m:e>
-                    <m:r>
-                      <m:rPr>
-                        <m:sty m:val="b"/>
-                      </m:rPr>
-                      <w:rPr>
-                        <w:rFonts w:ascii="Cambria Math" w:hAnsi="Cambria Math" w:eastAsia="Cambria Math" w:cs="Cambria Math"/>
-                        <w:sz w:val="18"/>
-                        <w:szCs w:val="18"/>
-                      </w:rPr>
-                      <m:t>R</m:t>
-                    </m:r>
-                  </m:e>
-                  <m:sub>
+                    <m:sSub>
+                      <m:e>
+                        <m:r>
+                          <m:rPr>
+                            <m:sty m:val="bi"/>
+                          </m:rPr>
+                          <w:rPr>
+                            <w:rFonts w:ascii="Cambria Math" w:hAnsi="Cambria Math" w:eastAsia="Cambria Math" w:cs="Cambria Math"/>
+                            <w:sz w:val="18"/>
+                            <w:szCs w:val="18"/>
+                          </w:rPr>
+                          <m:t xml:space="preserve">p</m:t>
+                        </m:r>
+                      </m:e>
+                      <m:sub>
+                        <m:r>
+                          <m:rPr>
+                            <m:sty m:val="p"/>
+                          </m:rPr>
+                          <w:rPr>
+                            <w:rFonts w:ascii="Cambria Math" w:hAnsi="Cambria Math" w:eastAsia="Cambria Math" w:cs="Cambria Math"/>
+                            <w:sz w:val="18"/>
+                            <w:szCs w:val="18"/>
+                          </w:rPr>
+                          <m:t xml:space="preserve">A,d</m:t>
+                        </m:r>
+                      </m:sub>
+                    </m:sSub>
                     <m:r>
                       <m:rPr>
                         <m:sty m:val="p"/>
@@ -30536,37 +30716,36 @@
                         <w:sz w:val="18"/>
                         <w:szCs w:val="18"/>
                       </w:rPr>
-                      <m:t>A,d</m:t>
+                      <m:t xml:space="preserve">=</m:t>
                     </m:r>
-                  </m:sub>
-                </m:sSub>
-                <m:r>
-                  <m:rPr>
-                    <m:sty m:val="p"/>
-                  </m:rPr>
-                  <w:rPr>
-                    <w:rFonts w:ascii="Cambria Math" w:hAnsi="Cambria Math" w:eastAsia="Cambria Math" w:cs="Cambria Math"/>
-                    <w:sz w:val="18"/>
-                    <w:szCs w:val="18"/>
-                  </w:rPr>
-                  <m:t>=</m:t>
-                </m:r>
-                <m:sSub>
-                  <m:sSubPr/>
-                  <m:e>
-                    <m:r>
-                      <m:rPr>
-                        <m:sty m:val="b"/>
-                      </m:rPr>
-                      <w:rPr>
-                        <w:rFonts w:ascii="Cambria Math" w:hAnsi="Cambria Math" w:eastAsia="Cambria Math" w:cs="Cambria Math"/>
-                        <w:sz w:val="18"/>
-                        <w:szCs w:val="18"/>
-                      </w:rPr>
-                      <m:t>R</m:t>
-                    </m:r>
-                  </m:e>
-                  <m:sub>
+                    <m:sSub>
+                      <m:e>
+                        <m:r>
+                          <m:rPr>
+                            <m:sty m:val="bi"/>
+                          </m:rPr>
+                          <w:rPr>
+                            <w:rFonts w:ascii="Cambria Math" w:hAnsi="Cambria Math" w:eastAsia="Cambria Math" w:cs="Cambria Math"/>
+                            <w:sz w:val="18"/>
+                            <w:szCs w:val="18"/>
+                          </w:rPr>
+                          <m:t xml:space="preserve">p</m:t>
+                        </m:r>
+                      </m:e>
+                      <m:sub>
+                        <m:r>
+                          <m:rPr>
+                            <m:sty m:val="p"/>
+                          </m:rPr>
+                          <w:rPr>
+                            <w:rFonts w:ascii="Cambria Math" w:hAnsi="Cambria Math" w:eastAsia="Cambria Math" w:cs="Cambria Math"/>
+                            <w:sz w:val="18"/>
+                            <w:szCs w:val="18"/>
+                          </w:rPr>
+                          <m:t xml:space="preserve">A,0</m:t>
+                        </m:r>
+                      </m:sub>
+                    </m:sSub>
                     <m:r>
                       <m:rPr>
                         <m:sty m:val="p"/>
@@ -30576,35 +30755,139 @@
                         <w:sz w:val="18"/>
                         <w:szCs w:val="18"/>
                       </w:rPr>
-                      <m:t>cal,</m:t>
+                      <m:t xml:space="preserve">+</m:t>
                     </m:r>
-                    <m:r>
-                      <m:rPr/>
-                      <w:rPr>
-                        <w:rFonts w:ascii="Cambria Math" w:hAnsi="Cambria Math" w:eastAsia="Cambria Math" w:cs="Cambria Math"/>
-                        <w:sz w:val="18"/>
-                        <w:szCs w:val="18"/>
-                      </w:rPr>
-                      <m:t>1</m:t>
-                    </m:r>
-                  </m:sub>
-                </m:sSub>
-                <m:sSub>
-                  <m:sSubPr/>
-                  <m:e>
-                    <m:r>
-                      <m:rPr>
-                        <m:sty m:val="b"/>
-                      </m:rPr>
-                      <w:rPr>
-                        <w:rFonts w:ascii="Cambria Math" w:hAnsi="Cambria Math" w:eastAsia="Cambria Math" w:cs="Cambria Math"/>
-                        <w:sz w:val="18"/>
-                        <w:szCs w:val="18"/>
-                      </w:rPr>
-                      <m:t>R</m:t>
-                    </m:r>
-                  </m:e>
-                  <m:sub>
+                    <m:sSub>
+                      <m:e>
+                        <m:r>
+                          <m:rPr>
+                            <m:sty m:val="b"/>
+                          </m:rPr>
+                          <w:rPr>
+                            <w:rFonts w:ascii="Cambria Math" w:hAnsi="Cambria Math" w:eastAsia="Cambria Math" w:cs="Cambria Math"/>
+                            <w:sz w:val="18"/>
+                            <w:szCs w:val="18"/>
+                          </w:rPr>
+                          <m:t xml:space="preserve">K</m:t>
+                        </m:r>
+                      </m:e>
+                      <m:sub>
+                        <m:r>
+                          <m:rPr>
+                            <m:sty m:val="p"/>
+                          </m:rPr>
+                          <w:rPr>
+                            <w:rFonts w:ascii="Cambria Math" w:hAnsi="Cambria Math" w:eastAsia="Cambria Math" w:cs="Cambria Math"/>
+                            <w:sz w:val="18"/>
+                            <w:szCs w:val="18"/>
+                          </w:rPr>
+                          <m:t xml:space="preserve">map</m:t>
+                        </m:r>
+                      </m:sub>
+                    </m:sSub>
+                    <m:sSub>
+                      <m:e>
+                        <m:r>
+                          <m:rPr>
+                            <m:sty m:val="b"/>
+                          </m:rPr>
+                          <w:rPr>
+                            <w:rFonts w:ascii="Cambria Math" w:hAnsi="Cambria Math" w:eastAsia="Cambria Math" w:cs="Cambria Math"/>
+                            <w:sz w:val="18"/>
+                            <w:szCs w:val="18"/>
+                          </w:rPr>
+                          <m:t xml:space="preserve">R</m:t>
+                        </m:r>
+                      </m:e>
+                      <m:sub>
+                        <m:r>
+                          <m:rPr>
+                            <m:sty m:val="p"/>
+                          </m:rPr>
+                          <w:rPr>
+                            <w:rFonts w:ascii="Cambria Math" w:hAnsi="Cambria Math" w:eastAsia="Cambria Math" w:cs="Cambria Math"/>
+                            <w:sz w:val="18"/>
+                            <w:szCs w:val="18"/>
+                          </w:rPr>
+                          <m:t xml:space="preserve">AD</m:t>
+                        </m:r>
+                      </m:sub>
+                    </m:sSub>
+                    <m:d>
+                      <m:dPr>
+                        <m:begChr m:val="("/>
+                        <m:endChr m:val=")"/>
+                      </m:dPr>
+                      <m:e>
+                        <m:sSub>
+                          <m:e>
+                            <m:r>
+                              <m:rPr>
+                                <m:sty m:val="bi"/>
+                              </m:rPr>
+                              <w:rPr>
+                                <w:rFonts w:ascii="Cambria Math" w:hAnsi="Cambria Math" w:eastAsia="Cambria Math" w:cs="Cambria Math"/>
+                                <w:sz w:val="18"/>
+                                <w:szCs w:val="18"/>
+                              </w:rPr>
+                              <m:t xml:space="preserve">p</m:t>
+                            </m:r>
+                          </m:e>
+                          <m:sub>
+                            <m:r>
+                              <m:rPr>
+                                <m:sty m:val="p"/>
+                              </m:rPr>
+                              <w:rPr>
+                                <w:rFonts w:ascii="Cambria Math" w:hAnsi="Cambria Math" w:eastAsia="Cambria Math" w:cs="Cambria Math"/>
+                                <w:sz w:val="18"/>
+                                <w:szCs w:val="18"/>
+                              </w:rPr>
+                              <m:t xml:space="preserve">D</m:t>
+                            </m:r>
+                          </m:sub>
+                        </m:sSub>
+                        <m:r>
+                          <m:rPr>
+                            <m:sty m:val="p"/>
+                          </m:rPr>
+                          <w:rPr>
+                            <w:rFonts w:ascii="Cambria Math" w:hAnsi="Cambria Math" w:eastAsia="Cambria Math" w:cs="Cambria Math"/>
+                            <w:sz w:val="18"/>
+                            <w:szCs w:val="18"/>
+                          </w:rPr>
+                          <m:t xml:space="preserve">−</m:t>
+                        </m:r>
+                        <m:sSub>
+                          <m:e>
+                            <m:r>
+                              <m:rPr>
+                                <m:sty m:val="bi"/>
+                              </m:rPr>
+                              <w:rPr>
+                                <w:rFonts w:ascii="Cambria Math" w:hAnsi="Cambria Math" w:eastAsia="Cambria Math" w:cs="Cambria Math"/>
+                                <w:sz w:val="18"/>
+                                <w:szCs w:val="18"/>
+                              </w:rPr>
+                              <m:t xml:space="preserve">p</m:t>
+                            </m:r>
+                          </m:e>
+                          <m:sub>
+                            <m:r>
+                              <m:rPr>
+                                <m:sty m:val="p"/>
+                              </m:rPr>
+                              <w:rPr>
+                                <w:rFonts w:ascii="Cambria Math" w:hAnsi="Cambria Math" w:eastAsia="Cambria Math" w:cs="Cambria Math"/>
+                                <w:sz w:val="18"/>
+                                <w:szCs w:val="18"/>
+                              </w:rPr>
+                              <m:t xml:space="preserve">D,0</m:t>
+                            </m:r>
+                          </m:sub>
+                        </m:sSub>
+                      </m:e>
+                    </m:d>
                     <m:r>
                       <m:rPr>
                         <m:sty m:val="p"/>
@@ -30614,37 +30897,38 @@
                         <w:sz w:val="18"/>
                         <w:szCs w:val="18"/>
                       </w:rPr>
-                      <m:t>h</m:t>
-                    </m:r>
-                  </m:sub>
-                </m:sSub>
-                <m:r>
-                  <m:rPr>
-                    <m:sty m:val="p"/>
-                  </m:rPr>
-                  <w:rPr>
-                    <w:rFonts w:ascii="Cambria Math" w:hAnsi="Cambria Math" w:eastAsia="Cambria Math" w:cs="Cambria Math"/>
-                    <w:sz w:val="18"/>
-                    <w:szCs w:val="18"/>
-                  </w:rPr>
-                  <m:t>(</m:t>
-                </m:r>
-                <m:sSub>
-                  <m:sSubPr/>
-                  <m:e>
-                    <m:r>
-                      <m:rPr>
-                        <m:sty m:val="bi"/>
-                      </m:rPr>
-                      <w:rPr>
-                        <w:rFonts w:ascii="Cambria Math" w:hAnsi="Cambria Math" w:eastAsia="Cambria Math" w:cs="Cambria Math"/>
-                        <w:sz w:val="18"/>
-                        <w:szCs w:val="18"/>
-                      </w:rPr>
-                      <m:t>q</m:t>
+                      <m:t xml:space="preserve">,</m:t>
                     </m:r>
                   </m:e>
-                  <m:sub>
+                  <m:e>
+                    <m:sSub>
+                      <m:e>
+                        <m:r>
+                          <m:rPr>
+                            <m:sty m:val="b"/>
+                          </m:rPr>
+                          <w:rPr>
+                            <w:rFonts w:ascii="Cambria Math" w:hAnsi="Cambria Math" w:eastAsia="Cambria Math" w:cs="Cambria Math"/>
+                            <w:sz w:val="18"/>
+                            <w:szCs w:val="18"/>
+                          </w:rPr>
+                          <m:t xml:space="preserve">R</m:t>
+                        </m:r>
+                      </m:e>
+                      <m:sub>
+                        <m:r>
+                          <m:rPr>
+                            <m:sty m:val="p"/>
+                          </m:rPr>
+                          <w:rPr>
+                            <w:rFonts w:ascii="Cambria Math" w:hAnsi="Cambria Math" w:eastAsia="Cambria Math" w:cs="Cambria Math"/>
+                            <w:sz w:val="18"/>
+                            <w:szCs w:val="18"/>
+                          </w:rPr>
+                          <m:t xml:space="preserve">A,d</m:t>
+                        </m:r>
+                      </m:sub>
+                    </m:sSub>
                     <m:r>
                       <m:rPr>
                         <m:sty m:val="p"/>
@@ -30654,37 +30938,92 @@
                         <w:sz w:val="18"/>
                         <w:szCs w:val="18"/>
                       </w:rPr>
-                      <m:t>h</m:t>
+                      <m:t xml:space="preserve">=</m:t>
                     </m:r>
-                  </m:sub>
-                </m:sSub>
-                <m:r>
-                  <m:rPr>
-                    <m:sty m:val="p"/>
-                  </m:rPr>
-                  <w:rPr>
-                    <w:rFonts w:ascii="Cambria Math" w:hAnsi="Cambria Math" w:eastAsia="Cambria Math" w:cs="Cambria Math"/>
-                    <w:sz w:val="18"/>
-                    <w:szCs w:val="18"/>
-                  </w:rPr>
-                  <m:t>)</m:t>
-                </m:r>
-                <m:sSub>
-                  <m:sSubPr/>
-                  <m:e>
-                    <m:r>
-                      <m:rPr>
-                        <m:sty m:val="b"/>
-                      </m:rPr>
-                      <w:rPr>
-                        <w:rFonts w:ascii="Cambria Math" w:hAnsi="Cambria Math" w:eastAsia="Cambria Math" w:cs="Cambria Math"/>
-                        <w:sz w:val="18"/>
-                        <w:szCs w:val="18"/>
-                      </w:rPr>
-                      <m:t>R</m:t>
-                    </m:r>
-                  </m:e>
-                  <m:sub>
+                    <m:sSub>
+                      <m:e>
+                        <m:r>
+                          <m:rPr>
+                            <m:sty m:val="b"/>
+                          </m:rPr>
+                          <w:rPr>
+                            <w:rFonts w:ascii="Cambria Math" w:hAnsi="Cambria Math" w:eastAsia="Cambria Math" w:cs="Cambria Math"/>
+                            <w:sz w:val="18"/>
+                            <w:szCs w:val="18"/>
+                          </w:rPr>
+                          <m:t xml:space="preserve">R</m:t>
+                        </m:r>
+                      </m:e>
+                      <m:sub>
+                        <m:r>
+                          <m:rPr>
+                            <m:sty m:val="p"/>
+                          </m:rPr>
+                          <w:rPr>
+                            <w:rFonts w:ascii="Cambria Math" w:hAnsi="Cambria Math" w:eastAsia="Cambria Math" w:cs="Cambria Math"/>
+                            <w:sz w:val="18"/>
+                            <w:szCs w:val="18"/>
+                          </w:rPr>
+                          <m:t xml:space="preserve">AD</m:t>
+                        </m:r>
+                      </m:sub>
+                    </m:sSub>
+                    <m:sSub>
+                      <m:e>
+                        <m:r>
+                          <m:rPr>
+                            <m:sty m:val="b"/>
+                          </m:rPr>
+                          <w:rPr>
+                            <w:rFonts w:ascii="Cambria Math" w:hAnsi="Cambria Math" w:eastAsia="Cambria Math" w:cs="Cambria Math"/>
+                            <w:sz w:val="18"/>
+                            <w:szCs w:val="18"/>
+                          </w:rPr>
+                          <m:t xml:space="preserve">R</m:t>
+                        </m:r>
+                      </m:e>
+                      <m:sub>
+                        <m:r>
+                          <m:rPr>
+                            <m:sty m:val="p"/>
+                          </m:rPr>
+                          <w:rPr>
+                            <w:rFonts w:ascii="Cambria Math" w:hAnsi="Cambria Math" w:eastAsia="Cambria Math" w:cs="Cambria Math"/>
+                            <w:sz w:val="18"/>
+                            <w:szCs w:val="18"/>
+                          </w:rPr>
+                          <m:t xml:space="preserve">h</m:t>
+                        </m:r>
+                      </m:sub>
+                    </m:sSub>
+                    <m:sSub>
+                      <m:e>
+                        <m:r>
+                          <m:rPr>
+                            <m:sty m:val="b"/>
+                          </m:rPr>
+                          <w:rPr>
+                            <w:rFonts w:ascii="Cambria Math" w:hAnsi="Cambria Math" w:eastAsia="Cambria Math" w:cs="Cambria Math"/>
+                            <w:sz w:val="18"/>
+                            <w:szCs w:val="18"/>
+                          </w:rPr>
+                          <m:t xml:space="preserve">R</m:t>
+                        </m:r>
+                      </m:e>
+                      <m:sub>
+                        <m:r>
+                          <m:rPr>
+                            <m:sty m:val="p"/>
+                          </m:rPr>
+                          <w:rPr>
+                            <w:rFonts w:ascii="Cambria Math" w:hAnsi="Cambria Math" w:eastAsia="Cambria Math" w:cs="Cambria Math"/>
+                            <w:sz w:val="18"/>
+                            <w:szCs w:val="18"/>
+                          </w:rPr>
+                          <m:t xml:space="preserve">tool</m:t>
+                        </m:r>
+                      </m:sub>
+                    </m:sSub>
                     <m:r>
                       <m:rPr>
                         <m:sty m:val="p"/>
@@ -30694,30 +31033,10 @@
                         <w:sz w:val="18"/>
                         <w:szCs w:val="18"/>
                       </w:rPr>
-                      <m:t>cal,</m:t>
+                      <m:t xml:space="preserve">.</m:t>
                     </m:r>
-                    <m:r>
-                      <m:rPr/>
-                      <w:rPr>
-                        <w:rFonts w:ascii="Cambria Math" w:hAnsi="Cambria Math" w:eastAsia="Cambria Math" w:cs="Cambria Math"/>
-                        <w:sz w:val="18"/>
-                        <w:szCs w:val="18"/>
-                      </w:rPr>
-                      <m:t>2</m:t>
-                    </m:r>
-                  </m:sub>
-                </m:sSub>
-                <m:r>
-                  <m:rPr>
-                    <m:sty m:val="p"/>
-                  </m:rPr>
-                  <w:rPr>
-                    <w:rFonts w:ascii="Cambria Math" w:hAnsi="Cambria Math" w:eastAsia="Cambria Math" w:cs="Cambria Math"/>
-                    <w:sz w:val="18"/>
-                    <w:szCs w:val="18"/>
-                  </w:rPr>
-                  <m:t>.</m:t>
-                </m:r>
+                  </m:e>
+                </m:eqArr>
               </m:oMath>
             </m:oMathPara>
           </w:p>
@@ -30768,7 +31087,316 @@
           <w:sz w:val="20"/>
           <w:szCs w:val="20"/>
         </w:rPr>
-        <w:t>编码器角不能未经变换就当作从端的滚转、俯仰、偏航角。报告将旋转矩阵转换为欧拉角传输，接收端需采用一致的旋转顺序和角度环绕处理。位置与姿态组成目标齐次变换后，再进入机械臂解析逆解。</w:t>
+        <w:t xml:space="preserve">其中，</w:t>
+      </w:r>
+      <m:oMath>
+        <m:sSub>
+          <m:e>
+            <m:r>
+              <m:rPr>
+                <m:sty m:val="b"/>
+              </m:rPr>
+              <w:rPr>
+                <w:rFonts w:ascii="Cambria Math" w:hAnsi="Cambria Math" w:eastAsia="Cambria Math" w:cs="Cambria Math"/>
+                <w:sz w:val="20"/>
+                <w:szCs w:val="20"/>
+              </w:rPr>
+              <m:t xml:space="preserve">R</m:t>
+            </m:r>
+          </m:e>
+          <m:sub>
+            <m:r>
+              <m:rPr>
+                <m:sty m:val="p"/>
+              </m:rPr>
+              <w:rPr>
+                <w:rFonts w:ascii="Cambria Math" w:hAnsi="Cambria Math" w:eastAsia="Cambria Math" w:cs="Cambria Math"/>
+                <w:sz w:val="20"/>
+                <w:szCs w:val="20"/>
+              </w:rPr>
+              <m:t xml:space="preserve">AD</m:t>
+            </m:r>
+          </m:sub>
+        </m:sSub>
+      </m:oMath>
+      <w:r>
+        <w:rPr>
+          <w:rFonts w:hint="eastAsia"/>
+          <w:sz w:val="20"/>
+          <w:szCs w:val="20"/>
+        </w:rPr>
+        <w:t xml:space="preserve"> 将 </w:t>
+      </w:r>
+      <w:r>
+        <w:rPr>
+          <w:rFonts w:hint="eastAsia"/>
+          <w:sz w:val="20"/>
+          <w:szCs w:val="20"/>
+        </w:rPr>
+        <w:t xml:space="preserve">{D}</w:t>
+      </w:r>
+      <w:r>
+        <w:rPr>
+          <w:rFonts w:hint="eastAsia"/>
+          <w:sz w:val="20"/>
+          <w:szCs w:val="20"/>
+        </w:rPr>
+        <w:t xml:space="preserve"> 中的分量旋转至 </w:t>
+      </w:r>
+      <w:r>
+        <w:rPr>
+          <w:rFonts w:hint="eastAsia"/>
+          <w:sz w:val="20"/>
+          <w:szCs w:val="20"/>
+        </w:rPr>
+        <w:t xml:space="preserve">{A}</w:t>
+      </w:r>
+      <w:r>
+        <w:rPr>
+          <w:rFonts w:hint="eastAsia"/>
+          <w:sz w:val="20"/>
+          <w:szCs w:val="20"/>
+        </w:rPr>
+        <w:t xml:space="preserve">；</w:t>
+      </w:r>
+      <m:oMath>
+        <m:sSub>
+          <m:e>
+            <m:r>
+              <m:rPr>
+                <m:sty m:val="b"/>
+              </m:rPr>
+              <w:rPr>
+                <w:rFonts w:ascii="Cambria Math" w:hAnsi="Cambria Math" w:eastAsia="Cambria Math" w:cs="Cambria Math"/>
+                <w:sz w:val="20"/>
+                <w:szCs w:val="20"/>
+              </w:rPr>
+              <m:t xml:space="preserve">K</m:t>
+            </m:r>
+          </m:e>
+          <m:sub>
+            <m:r>
+              <m:rPr>
+                <m:sty m:val="p"/>
+              </m:rPr>
+              <w:rPr>
+                <w:rFonts w:ascii="Cambria Math" w:hAnsi="Cambria Math" w:eastAsia="Cambria Math" w:cs="Cambria Math"/>
+                <w:sz w:val="20"/>
+                <w:szCs w:val="20"/>
+              </w:rPr>
+              <m:t xml:space="preserve">map</m:t>
+            </m:r>
+          </m:sub>
+        </m:sSub>
+        <m:r>
+          <m:rPr>
+            <m:sty m:val="p"/>
+          </m:rPr>
+          <w:rPr>
+            <w:rFonts w:ascii="Cambria Math" w:hAnsi="Cambria Math" w:eastAsia="Cambria Math" w:cs="Cambria Math"/>
+            <w:sz w:val="20"/>
+            <w:szCs w:val="20"/>
+          </w:rPr>
+          <m:t xml:space="preserve">=diag</m:t>
+        </m:r>
+        <m:d>
+          <m:dPr>
+            <m:begChr m:val="("/>
+            <m:endChr m:val=")"/>
+          </m:dPr>
+          <m:e>
+            <m:sSub>
+              <m:e>
+                <m:r>
+                  <m:rPr>
+                    <m:sty m:val="i"/>
+                  </m:rPr>
+                  <w:rPr>
+                    <w:rFonts w:ascii="Cambria Math" w:hAnsi="Cambria Math" w:eastAsia="Cambria Math" w:cs="Cambria Math"/>
+                    <w:sz w:val="20"/>
+                    <w:szCs w:val="20"/>
+                  </w:rPr>
+                  <m:t xml:space="preserve">k</m:t>
+                </m:r>
+              </m:e>
+              <m:sub>
+                <m:r>
+                  <m:rPr>
+                    <m:sty m:val="p"/>
+                  </m:rPr>
+                  <w:rPr>
+                    <w:rFonts w:ascii="Cambria Math" w:hAnsi="Cambria Math" w:eastAsia="Cambria Math" w:cs="Cambria Math"/>
+                    <w:sz w:val="20"/>
+                    <w:szCs w:val="20"/>
+                  </w:rPr>
+                  <m:t xml:space="preserve">x</m:t>
+                </m:r>
+              </m:sub>
+            </m:sSub>
+            <m:r>
+              <m:rPr>
+                <m:sty m:val="p"/>
+              </m:rPr>
+              <w:rPr>
+                <w:rFonts w:ascii="Cambria Math" w:hAnsi="Cambria Math" w:eastAsia="Cambria Math" w:cs="Cambria Math"/>
+                <w:sz w:val="20"/>
+                <w:szCs w:val="20"/>
+              </w:rPr>
+              <m:t xml:space="preserve">,</m:t>
+            </m:r>
+            <m:sSub>
+              <m:e>
+                <m:r>
+                  <m:rPr>
+                    <m:sty m:val="i"/>
+                  </m:rPr>
+                  <w:rPr>
+                    <w:rFonts w:ascii="Cambria Math" w:hAnsi="Cambria Math" w:eastAsia="Cambria Math" w:cs="Cambria Math"/>
+                    <w:sz w:val="20"/>
+                    <w:szCs w:val="20"/>
+                  </w:rPr>
+                  <m:t xml:space="preserve">k</m:t>
+                </m:r>
+              </m:e>
+              <m:sub>
+                <m:r>
+                  <m:rPr>
+                    <m:sty m:val="p"/>
+                  </m:rPr>
+                  <w:rPr>
+                    <w:rFonts w:ascii="Cambria Math" w:hAnsi="Cambria Math" w:eastAsia="Cambria Math" w:cs="Cambria Math"/>
+                    <w:sz w:val="20"/>
+                    <w:szCs w:val="20"/>
+                  </w:rPr>
+                  <m:t xml:space="preserve">y</m:t>
+                </m:r>
+              </m:sub>
+            </m:sSub>
+            <m:r>
+              <m:rPr>
+                <m:sty m:val="p"/>
+              </m:rPr>
+              <w:rPr>
+                <w:rFonts w:ascii="Cambria Math" w:hAnsi="Cambria Math" w:eastAsia="Cambria Math" w:cs="Cambria Math"/>
+                <w:sz w:val="20"/>
+                <w:szCs w:val="20"/>
+              </w:rPr>
+              <m:t xml:space="preserve">,</m:t>
+            </m:r>
+            <m:sSub>
+              <m:e>
+                <m:r>
+                  <m:rPr>
+                    <m:sty m:val="i"/>
+                  </m:rPr>
+                  <w:rPr>
+                    <w:rFonts w:ascii="Cambria Math" w:hAnsi="Cambria Math" w:eastAsia="Cambria Math" w:cs="Cambria Math"/>
+                    <w:sz w:val="20"/>
+                    <w:szCs w:val="20"/>
+                  </w:rPr>
+                  <m:t xml:space="preserve">k</m:t>
+                </m:r>
+              </m:e>
+              <m:sub>
+                <m:r>
+                  <m:rPr>
+                    <m:sty m:val="p"/>
+                  </m:rPr>
+                  <w:rPr>
+                    <w:rFonts w:ascii="Cambria Math" w:hAnsi="Cambria Math" w:eastAsia="Cambria Math" w:cs="Cambria Math"/>
+                    <w:sz w:val="20"/>
+                    <w:szCs w:val="20"/>
+                  </w:rPr>
+                  <m:t xml:space="preserve">z</m:t>
+                </m:r>
+              </m:sub>
+            </m:sSub>
+          </m:e>
+        </m:d>
+      </m:oMath>
+      <w:r>
+        <w:rPr>
+          <w:rFonts w:hint="eastAsia"/>
+          <w:sz w:val="20"/>
+          <w:szCs w:val="20"/>
+        </w:rPr>
+        <w:t xml:space="preserve"> 为无量纲位置缩放矩阵，沿从端基坐标轴分别缩放；</w:t>
+      </w:r>
+      <m:oMath>
+        <m:sSub>
+          <m:e>
+            <m:r>
+              <m:rPr>
+                <m:sty m:val="b"/>
+              </m:rPr>
+              <w:rPr>
+                <w:rFonts w:ascii="Cambria Math" w:hAnsi="Cambria Math" w:eastAsia="Cambria Math" w:cs="Cambria Math"/>
+                <w:sz w:val="20"/>
+                <w:szCs w:val="20"/>
+              </w:rPr>
+              <m:t xml:space="preserve">R</m:t>
+            </m:r>
+          </m:e>
+          <m:sub>
+            <m:r>
+              <m:rPr>
+                <m:sty m:val="p"/>
+              </m:rPr>
+              <w:rPr>
+                <w:rFonts w:ascii="Cambria Math" w:hAnsi="Cambria Math" w:eastAsia="Cambria Math" w:cs="Cambria Math"/>
+                <w:sz w:val="20"/>
+                <w:szCs w:val="20"/>
+              </w:rPr>
+              <m:t xml:space="preserve">tool</m:t>
+            </m:r>
+          </m:sub>
+        </m:sSub>
+      </m:oMath>
+      <w:r>
+        <w:rPr>
+          <w:rFonts w:hint="eastAsia"/>
+          <w:sz w:val="20"/>
+          <w:szCs w:val="20"/>
+        </w:rPr>
+        <w:t xml:space="preserve"> 为从端工具姿态相对手柄姿态的固定校准旋转。两项姿态校准均由安装关系确定。报告实现中先完成姿态校准，再转换为 RPY 发送，因此接收端按同一旋转顺序还原后即可得到 </w:t>
+      </w:r>
+      <m:oMath>
+        <m:sSub>
+          <m:e>
+            <m:r>
+              <m:rPr>
+                <m:sty m:val="b"/>
+              </m:rPr>
+              <w:rPr>
+                <w:rFonts w:ascii="Cambria Math" w:hAnsi="Cambria Math" w:eastAsia="Cambria Math" w:cs="Cambria Math"/>
+                <w:sz w:val="20"/>
+                <w:szCs w:val="20"/>
+              </w:rPr>
+              <m:t xml:space="preserve">R</m:t>
+            </m:r>
+          </m:e>
+          <m:sub>
+            <m:r>
+              <m:rPr>
+                <m:sty m:val="p"/>
+              </m:rPr>
+              <w:rPr>
+                <w:rFonts w:ascii="Cambria Math" w:hAnsi="Cambria Math" w:eastAsia="Cambria Math" w:cs="Cambria Math"/>
+                <w:sz w:val="20"/>
+                <w:szCs w:val="20"/>
+              </w:rPr>
+              <m:t xml:space="preserve">A,d</m:t>
+            </m:r>
+          </m:sub>
+        </m:sSub>
+      </m:oMath>
+      <w:r>
+        <w:rPr>
+          <w:rFonts w:hint="eastAsia"/>
+          <w:sz w:val="20"/>
+          <w:szCs w:val="20"/>
+        </w:rPr>
+        <w:t xml:space="preserve">，不再重复施加校准。</w:t>
       </w:r>
     </w:p>
     <w:p>
@@ -30789,61 +31417,7 @@
           <w:sz w:val="20"/>
           <w:szCs w:val="20"/>
         </w:rPr>
-        <w:t>当目标超过机械臂设定的水平操作区间时，报告采用末端位置限幅和底盘平移补偿。设</w:t>
-      </w:r>
-      <w:r>
-        <w:rPr>
-          <w:sz w:val="20"/>
-          <w:szCs w:val="20"/>
-        </w:rPr>
-        <w:t xml:space="preserve"> </w:t>
-      </w:r>
-      <m:oMath>
-        <m:sSub>
-          <m:sSubPr/>
-          <m:e>
-            <m:r>
-              <m:rPr>
-                <m:sty m:val="p"/>
-              </m:rPr>
-              <w:rPr>
-                <w:rFonts w:ascii="Cambria Math" w:hAnsi="Cambria Math" w:eastAsia="Cambria Math" w:cs="Cambria Math"/>
-                <w:sz w:val="20"/>
-                <w:szCs w:val="20"/>
-              </w:rPr>
-              <m:t>Π</m:t>
-            </m:r>
-          </m:e>
-          <m:sub>
-            <m:r>
-              <m:rPr>
-                <m:sty m:val="p"/>
-                <m:scr m:val="script"/>
-              </m:rPr>
-              <w:rPr>
-                <w:rFonts w:ascii="Cambria Math" w:hAnsi="Cambria Math" w:eastAsia="Cambria Math" w:cs="Cambria Math"/>
-                <w:sz w:val="20"/>
-                <w:szCs w:val="20"/>
-              </w:rPr>
-              <m:t>ℬ</m:t>
-            </m:r>
-          </m:sub>
-        </m:sSub>
-      </m:oMath>
-      <w:r>
-        <w:rPr>
-          <w:sz w:val="20"/>
-          <w:szCs w:val="20"/>
-        </w:rPr>
-        <w:t xml:space="preserve"> </w:t>
-      </w:r>
-      <w:r>
-        <w:rPr>
-          <w:rFonts w:hint="eastAsia"/>
-          <w:sz w:val="20"/>
-          <w:szCs w:val="20"/>
-        </w:rPr>
-        <w:t>为对配置的笛卡尔边界盒逐分量截断，定义</w:t>
+        <w:t xml:space="preserve">将式（33）的目标位置和姿态重新组合，得到从端末端相对机械臂基座的目标齐次变换矩阵：</w:t>
       </w:r>
     </w:p>
     <w:tbl>
@@ -30917,45 +31491,21 @@
                 <m:jc m:val="center"/>
               </m:oMathParaPr>
               <m:oMath>
-                <m:eqArr>
-                  <m:eqArrPr/>
+                <m:sSub>
                   <m:e>
-                    <m:sSub>
-                      <m:sSubPr/>
-                      <m:e>
-                        <m:bar>
-                          <m:barPr>
-                            <m:pos m:val="top"/>
-                          </m:barPr>
-                          <m:e>
-                            <m:r>
-                              <m:rPr>
-                                <m:sty m:val="bi"/>
-                              </m:rPr>
-                              <w:rPr>
-                                <w:rFonts w:ascii="Cambria Math" w:hAnsi="Cambria Math" w:eastAsia="Cambria Math" w:cs="Cambria Math"/>
-                                <w:sz w:val="18"/>
-                                <w:szCs w:val="18"/>
-                              </w:rPr>
-                              <m:t>p</m:t>
-                            </m:r>
-                          </m:e>
-                        </m:bar>
-                      </m:e>
-                      <m:sub>
-                        <m:r>
-                          <m:rPr>
-                            <m:sty m:val="p"/>
-                          </m:rPr>
-                          <w:rPr>
-                            <w:rFonts w:ascii="Cambria Math" w:hAnsi="Cambria Math" w:eastAsia="Cambria Math" w:cs="Cambria Math"/>
-                            <w:sz w:val="18"/>
-                            <w:szCs w:val="18"/>
-                          </w:rPr>
-                          <m:t>A,d</m:t>
-                        </m:r>
-                      </m:sub>
-                    </m:sSub>
+                    <m:r>
+                      <m:rPr>
+                        <m:sty m:val="b"/>
+                      </m:rPr>
+                      <w:rPr>
+                        <w:rFonts w:ascii="Cambria Math" w:hAnsi="Cambria Math" w:eastAsia="Cambria Math" w:cs="Cambria Math"/>
+                        <w:sz w:val="18"/>
+                        <w:szCs w:val="18"/>
+                      </w:rPr>
+                      <m:t xml:space="preserve">T</m:t>
+                    </m:r>
+                  </m:e>
+                  <m:sub>
                     <m:r>
                       <m:rPr>
                         <m:sty m:val="p"/>
@@ -30965,365 +31515,159 @@
                         <w:sz w:val="18"/>
                         <w:szCs w:val="18"/>
                       </w:rPr>
-                      <m:t>[</m:t>
+                      <m:t xml:space="preserve">A,d</m:t>
                     </m:r>
-                    <m:r>
-                      <m:rPr/>
-                      <w:rPr>
-                        <w:rFonts w:ascii="Cambria Math" w:hAnsi="Cambria Math" w:eastAsia="Cambria Math" w:cs="Cambria Math"/>
-                        <w:sz w:val="18"/>
-                        <w:szCs w:val="18"/>
-                      </w:rPr>
-                      <m:t>k</m:t>
-                    </m:r>
-                    <m:r>
-                      <m:rPr>
-                        <m:sty m:val="p"/>
-                      </m:rPr>
-                      <w:rPr>
-                        <w:rFonts w:ascii="Cambria Math" w:hAnsi="Cambria Math" w:eastAsia="Cambria Math" w:cs="Cambria Math"/>
-                        <w:sz w:val="18"/>
-                        <w:szCs w:val="18"/>
-                      </w:rPr>
-                      <m:t>]=</m:t>
-                    </m:r>
-                    <m:sSub>
-                      <m:sSubPr/>
-                      <m:e>
-                        <m:r>
-                          <m:rPr>
-                            <m:sty m:val="p"/>
-                          </m:rPr>
-                          <w:rPr>
-                            <w:rFonts w:ascii="Cambria Math" w:hAnsi="Cambria Math" w:eastAsia="Cambria Math" w:cs="Cambria Math"/>
-                            <w:sz w:val="18"/>
-                            <w:szCs w:val="18"/>
-                          </w:rPr>
-                          <m:t>Π</m:t>
-                        </m:r>
-                      </m:e>
-                      <m:sub>
-                        <m:r>
-                          <m:rPr>
-                            <m:sty m:val="p"/>
-                            <m:scr m:val="script"/>
-                          </m:rPr>
-                          <w:rPr>
-                            <w:rFonts w:ascii="Cambria Math" w:hAnsi="Cambria Math" w:eastAsia="Cambria Math" w:cs="Cambria Math"/>
-                            <w:sz w:val="18"/>
-                            <w:szCs w:val="18"/>
-                          </w:rPr>
-                          <m:t>ℬ</m:t>
-                        </m:r>
-                      </m:sub>
-                    </m:sSub>
-                    <m:r>
-                      <m:rPr>
-                        <m:sty m:val="p"/>
-                      </m:rPr>
-                      <w:rPr>
-                        <w:rFonts w:ascii="Cambria Math" w:hAnsi="Cambria Math" w:eastAsia="Cambria Math" w:cs="Cambria Math"/>
-                        <w:sz w:val="18"/>
-                        <w:szCs w:val="18"/>
-                      </w:rPr>
-                      <m:t>(</m:t>
-                    </m:r>
-                    <m:sSub>
-                      <m:sSubPr/>
-                      <m:e>
-                        <m:r>
-                          <m:rPr>
-                            <m:sty m:val="bi"/>
-                          </m:rPr>
-                          <w:rPr>
-                            <w:rFonts w:ascii="Cambria Math" w:hAnsi="Cambria Math" w:eastAsia="Cambria Math" w:cs="Cambria Math"/>
-                            <w:sz w:val="18"/>
-                            <w:szCs w:val="18"/>
-                          </w:rPr>
-                          <m:t>p</m:t>
-                        </m:r>
-                      </m:e>
-                      <m:sub>
-                        <m:r>
-                          <m:rPr>
-                            <m:sty m:val="p"/>
-                          </m:rPr>
-                          <w:rPr>
-                            <w:rFonts w:ascii="Cambria Math" w:hAnsi="Cambria Math" w:eastAsia="Cambria Math" w:cs="Cambria Math"/>
-                            <w:sz w:val="18"/>
-                            <w:szCs w:val="18"/>
-                          </w:rPr>
-                          <m:t>A,d</m:t>
-                        </m:r>
-                      </m:sub>
-                    </m:sSub>
-                    <m:r>
-                      <m:rPr>
-                        <m:sty m:val="p"/>
-                      </m:rPr>
-                      <w:rPr>
-                        <w:rFonts w:ascii="Cambria Math" w:hAnsi="Cambria Math" w:eastAsia="Cambria Math" w:cs="Cambria Math"/>
-                        <w:sz w:val="18"/>
-                        <w:szCs w:val="18"/>
-                      </w:rPr>
-                      <m:t>[</m:t>
-                    </m:r>
-                    <m:r>
-                      <m:rPr/>
-                      <w:rPr>
-                        <w:rFonts w:ascii="Cambria Math" w:hAnsi="Cambria Math" w:eastAsia="Cambria Math" w:cs="Cambria Math"/>
-                        <w:sz w:val="18"/>
-                        <w:szCs w:val="18"/>
-                      </w:rPr>
-                      <m:t>k</m:t>
-                    </m:r>
-                    <m:r>
-                      <m:rPr>
-                        <m:sty m:val="p"/>
-                      </m:rPr>
-                      <w:rPr>
-                        <w:rFonts w:ascii="Cambria Math" w:hAnsi="Cambria Math" w:eastAsia="Cambria Math" w:cs="Cambria Math"/>
-                        <w:sz w:val="18"/>
-                        <w:szCs w:val="18"/>
-                      </w:rPr>
-                      <m:t>]),</m:t>
-                    </m:r>
+                  </m:sub>
+                </m:sSub>
+                <m:r>
+                  <m:rPr>
+                    <m:sty m:val="p"/>
+                  </m:rPr>
+                  <w:rPr>
+                    <w:rFonts w:ascii="Cambria Math" w:hAnsi="Cambria Math" w:eastAsia="Cambria Math" w:cs="Cambria Math"/>
+                    <w:sz w:val="18"/>
+                    <w:szCs w:val="18"/>
+                  </w:rPr>
+                  <m:t xml:space="preserve">=</m:t>
+                </m:r>
+                <m:d>
+                  <m:dPr>
+                    <m:begChr m:val="["/>
+                    <m:endChr m:val="]"/>
+                  </m:dPr>
+                  <m:e>
+                    <m:m>
+                      <m:mPr>
+                        <m:mcs>
+                          <m:mc>
+                            <m:mcPr>
+                              <m:count m:val="2"/>
+                              <m:mcJc m:val="center"/>
+                            </m:mcPr>
+                          </m:mc>
+                        </m:mcs>
+                      </m:mPr>
+                      <m:mr>
+                        <m:e>
+                          <m:sSub>
+                            <m:e>
+                              <m:r>
+                                <m:rPr>
+                                  <m:sty m:val="b"/>
+                                </m:rPr>
+                                <w:rPr>
+                                  <w:rFonts w:ascii="Cambria Math" w:hAnsi="Cambria Math" w:eastAsia="Cambria Math" w:cs="Cambria Math"/>
+                                  <w:sz w:val="18"/>
+                                  <w:szCs w:val="18"/>
+                                </w:rPr>
+                                <m:t xml:space="preserve">R</m:t>
+                              </m:r>
+                            </m:e>
+                            <m:sub>
+                              <m:r>
+                                <m:rPr>
+                                  <m:sty m:val="p"/>
+                                </m:rPr>
+                                <w:rPr>
+                                  <w:rFonts w:ascii="Cambria Math" w:hAnsi="Cambria Math" w:eastAsia="Cambria Math" w:cs="Cambria Math"/>
+                                  <w:sz w:val="18"/>
+                                  <w:szCs w:val="18"/>
+                                </w:rPr>
+                                <m:t xml:space="preserve">A,d</m:t>
+                              </m:r>
+                            </m:sub>
+                          </m:sSub>
+                        </m:e>
+                        <m:e>
+                          <m:sSub>
+                            <m:e>
+                              <m:r>
+                                <m:rPr>
+                                  <m:sty m:val="bi"/>
+                                </m:rPr>
+                                <w:rPr>
+                                  <w:rFonts w:ascii="Cambria Math" w:hAnsi="Cambria Math" w:eastAsia="Cambria Math" w:cs="Cambria Math"/>
+                                  <w:sz w:val="18"/>
+                                  <w:szCs w:val="18"/>
+                                </w:rPr>
+                                <m:t xml:space="preserve">p</m:t>
+                              </m:r>
+                            </m:e>
+                            <m:sub>
+                              <m:r>
+                                <m:rPr>
+                                  <m:sty m:val="p"/>
+                                </m:rPr>
+                                <w:rPr>
+                                  <w:rFonts w:ascii="Cambria Math" w:hAnsi="Cambria Math" w:eastAsia="Cambria Math" w:cs="Cambria Math"/>
+                                  <w:sz w:val="18"/>
+                                  <w:szCs w:val="18"/>
+                                </w:rPr>
+                                <m:t xml:space="preserve">A,d</m:t>
+                              </m:r>
+                            </m:sub>
+                          </m:sSub>
+                        </m:e>
+                      </m:mr>
+                      <m:mr>
+                        <m:e>
+                          <m:sSup>
+                            <m:e>
+                              <m:r>
+                                <m:rPr>
+                                  <m:sty m:val="bi"/>
+                                </m:rPr>
+                                <w:rPr>
+                                  <w:rFonts w:ascii="Cambria Math" w:hAnsi="Cambria Math" w:eastAsia="Cambria Math" w:cs="Cambria Math"/>
+                                  <w:sz w:val="18"/>
+                                  <w:szCs w:val="18"/>
+                                </w:rPr>
+                                <m:t xml:space="preserve">0</m:t>
+                              </m:r>
+                            </m:e>
+                            <m:sup>
+                              <m:r>
+                                <m:rPr>
+                                  <m:sty m:val="p"/>
+                                </m:rPr>
+                                <w:rPr>
+                                  <w:rFonts w:ascii="Cambria Math" w:hAnsi="Cambria Math" w:eastAsia="Cambria Math" w:cs="Cambria Math"/>
+                                  <w:sz w:val="18"/>
+                                  <w:szCs w:val="18"/>
+                                </w:rPr>
+                                <m:t xml:space="preserve">T</m:t>
+                              </m:r>
+                            </m:sup>
+                          </m:sSup>
+                        </m:e>
+                        <m:e>
+                          <m:r>
+                            <m:rPr>
+                              <m:sty m:val="p"/>
+                            </m:rPr>
+                            <w:rPr>
+                              <w:rFonts w:ascii="Cambria Math" w:hAnsi="Cambria Math" w:eastAsia="Cambria Math" w:cs="Cambria Math"/>
+                              <w:sz w:val="18"/>
+                              <w:szCs w:val="18"/>
+                            </w:rPr>
+                            <m:t xml:space="preserve">1</m:t>
+                          </m:r>
+                        </m:e>
+                      </m:mr>
+                    </m:m>
                   </m:e>
-                  <m:e>
-                    <m:sSub>
-                      <m:sSubPr/>
-                      <m:e>
-                        <m:r>
-                          <m:rPr>
-                            <m:sty m:val="bi"/>
-                          </m:rPr>
-                          <w:rPr>
-                            <w:rFonts w:ascii="Cambria Math" w:hAnsi="Cambria Math" w:eastAsia="Cambria Math" w:cs="Cambria Math"/>
-                            <w:sz w:val="18"/>
-                            <w:szCs w:val="18"/>
-                          </w:rPr>
-                          <m:t>e</m:t>
-                        </m:r>
-                      </m:e>
-                      <m:sub>
-                        <m:r>
-                          <m:rPr>
-                            <m:sty m:val="p"/>
-                          </m:rPr>
-                          <w:rPr>
-                            <w:rFonts w:ascii="Cambria Math" w:hAnsi="Cambria Math" w:eastAsia="Cambria Math" w:cs="Cambria Math"/>
-                            <w:sz w:val="18"/>
-                            <w:szCs w:val="18"/>
-                          </w:rPr>
-                          <m:t>comp</m:t>
-                        </m:r>
-                      </m:sub>
-                    </m:sSub>
-                    <m:r>
-                      <m:rPr>
-                        <m:sty m:val="p"/>
-                      </m:rPr>
-                      <w:rPr>
-                        <w:rFonts w:ascii="Cambria Math" w:hAnsi="Cambria Math" w:eastAsia="Cambria Math" w:cs="Cambria Math"/>
-                        <w:sz w:val="18"/>
-                        <w:szCs w:val="18"/>
-                      </w:rPr>
-                      <m:t>[</m:t>
-                    </m:r>
-                    <m:r>
-                      <m:rPr/>
-                      <w:rPr>
-                        <w:rFonts w:ascii="Cambria Math" w:hAnsi="Cambria Math" w:eastAsia="Cambria Math" w:cs="Cambria Math"/>
-                        <w:sz w:val="18"/>
-                        <w:szCs w:val="18"/>
-                      </w:rPr>
-                      <m:t>k</m:t>
-                    </m:r>
-                    <m:r>
-                      <m:rPr>
-                        <m:sty m:val="p"/>
-                      </m:rPr>
-                      <w:rPr>
-                        <w:rFonts w:ascii="Cambria Math" w:hAnsi="Cambria Math" w:eastAsia="Cambria Math" w:cs="Cambria Math"/>
-                        <w:sz w:val="18"/>
-                        <w:szCs w:val="18"/>
-                      </w:rPr>
-                      <m:t>]=</m:t>
-                    </m:r>
-                    <m:sSub>
-                      <m:sSubPr/>
-                      <m:e>
-                        <m:r>
-                          <m:rPr>
-                            <m:sty m:val="b"/>
-                          </m:rPr>
-                          <w:rPr>
-                            <w:rFonts w:ascii="Cambria Math" w:hAnsi="Cambria Math" w:eastAsia="Cambria Math" w:cs="Cambria Math"/>
-                            <w:sz w:val="18"/>
-                            <w:szCs w:val="18"/>
-                          </w:rPr>
-                          <m:t>P</m:t>
-                        </m:r>
-                      </m:e>
-                      <m:sub>
-                        <m:r>
-                          <m:rPr/>
-                          <w:rPr>
-                            <w:rFonts w:ascii="Cambria Math" w:hAnsi="Cambria Math" w:eastAsia="Cambria Math" w:cs="Cambria Math"/>
-                            <w:sz w:val="18"/>
-                            <w:szCs w:val="18"/>
-                          </w:rPr>
-                          <m:t>xy</m:t>
-                        </m:r>
-                      </m:sub>
-                    </m:sSub>
-                    <m:d>
-                      <m:dPr>
-                        <m:sepChr m:val=""/>
-                      </m:dPr>
-                      <m:e>
-                        <m:sSub>
-                          <m:sSubPr/>
-                          <m:e>
-                            <m:r>
-                              <m:rPr>
-                                <m:sty m:val="bi"/>
-                              </m:rPr>
-                              <w:rPr>
-                                <w:rFonts w:ascii="Cambria Math" w:hAnsi="Cambria Math" w:eastAsia="Cambria Math" w:cs="Cambria Math"/>
-                                <w:sz w:val="18"/>
-                                <w:szCs w:val="18"/>
-                              </w:rPr>
-                              <m:t>p</m:t>
-                            </m:r>
-                          </m:e>
-                          <m:sub>
-                            <m:r>
-                              <m:rPr>
-                                <m:sty m:val="p"/>
-                              </m:rPr>
-                              <w:rPr>
-                                <w:rFonts w:ascii="Cambria Math" w:hAnsi="Cambria Math" w:eastAsia="Cambria Math" w:cs="Cambria Math"/>
-                                <w:sz w:val="18"/>
-                                <w:szCs w:val="18"/>
-                              </w:rPr>
-                              <m:t>A,d</m:t>
-                            </m:r>
-                          </m:sub>
-                        </m:sSub>
-                        <m:r>
-                          <m:rPr>
-                            <m:sty m:val="p"/>
-                          </m:rPr>
-                          <w:rPr>
-                            <w:rFonts w:ascii="Cambria Math" w:hAnsi="Cambria Math" w:eastAsia="Cambria Math" w:cs="Cambria Math"/>
-                            <w:sz w:val="18"/>
-                            <w:szCs w:val="18"/>
-                          </w:rPr>
-                          <m:t>[</m:t>
-                        </m:r>
-                        <m:r>
-                          <m:rPr/>
-                          <w:rPr>
-                            <w:rFonts w:ascii="Cambria Math" w:hAnsi="Cambria Math" w:eastAsia="Cambria Math" w:cs="Cambria Math"/>
-                            <w:sz w:val="18"/>
-                            <w:szCs w:val="18"/>
-                          </w:rPr>
-                          <m:t>k</m:t>
-                        </m:r>
-                        <m:r>
-                          <m:rPr>
-                            <m:sty m:val="p"/>
-                          </m:rPr>
-                          <w:rPr>
-                            <w:rFonts w:ascii="Cambria Math" w:hAnsi="Cambria Math" w:eastAsia="Cambria Math" w:cs="Cambria Math"/>
-                            <w:sz w:val="18"/>
-                            <w:szCs w:val="18"/>
-                          </w:rPr>
-                          <m:t>]−</m:t>
-                        </m:r>
-                        <m:sSub>
-                          <m:sSubPr/>
-                          <m:e>
-                            <m:bar>
-                              <m:barPr>
-                                <m:pos m:val="top"/>
-                              </m:barPr>
-                              <m:e>
-                                <m:r>
-                                  <m:rPr>
-                                    <m:sty m:val="bi"/>
-                                  </m:rPr>
-                                  <w:rPr>
-                                    <w:rFonts w:ascii="Cambria Math" w:hAnsi="Cambria Math" w:eastAsia="Cambria Math" w:cs="Cambria Math"/>
-                                    <w:sz w:val="18"/>
-                                    <w:szCs w:val="18"/>
-                                  </w:rPr>
-                                  <m:t>p</m:t>
-                                </m:r>
-                              </m:e>
-                            </m:bar>
-                          </m:e>
-                          <m:sub>
-                            <m:r>
-                              <m:rPr>
-                                <m:sty m:val="p"/>
-                              </m:rPr>
-                              <w:rPr>
-                                <w:rFonts w:ascii="Cambria Math" w:hAnsi="Cambria Math" w:eastAsia="Cambria Math" w:cs="Cambria Math"/>
-                                <w:sz w:val="18"/>
-                                <w:szCs w:val="18"/>
-                              </w:rPr>
-                              <m:t>A,d</m:t>
-                            </m:r>
-                          </m:sub>
-                        </m:sSub>
-                        <m:r>
-                          <m:rPr>
-                            <m:sty m:val="p"/>
-                          </m:rPr>
-                          <w:rPr>
-                            <w:rFonts w:ascii="Cambria Math" w:hAnsi="Cambria Math" w:eastAsia="Cambria Math" w:cs="Cambria Math"/>
-                            <w:sz w:val="18"/>
-                            <w:szCs w:val="18"/>
-                          </w:rPr>
-                          <m:t>[</m:t>
-                        </m:r>
-                        <m:r>
-                          <m:rPr/>
-                          <w:rPr>
-                            <w:rFonts w:ascii="Cambria Math" w:hAnsi="Cambria Math" w:eastAsia="Cambria Math" w:cs="Cambria Math"/>
-                            <w:sz w:val="18"/>
-                            <w:szCs w:val="18"/>
-                          </w:rPr>
-                          <m:t>k</m:t>
-                        </m:r>
-                        <m:r>
-                          <m:rPr>
-                            <m:sty m:val="p"/>
-                          </m:rPr>
-                          <w:rPr>
-                            <w:rFonts w:ascii="Cambria Math" w:hAnsi="Cambria Math" w:eastAsia="Cambria Math" w:cs="Cambria Math"/>
-                            <w:sz w:val="18"/>
-                            <w:szCs w:val="18"/>
-                          </w:rPr>
-                          <m:t>]</m:t>
-                        </m:r>
-                      </m:e>
-                    </m:d>
-                    <m:r>
-                      <m:rPr>
-                        <m:sty m:val="p"/>
-                      </m:rPr>
-                      <w:rPr>
-                        <w:rFonts w:ascii="Cambria Math" w:hAnsi="Cambria Math" w:eastAsia="Cambria Math" w:cs="Cambria Math"/>
-                        <w:sz w:val="18"/>
-                        <w:szCs w:val="18"/>
-                      </w:rPr>
-                      <m:t>,</m:t>
-                    </m:r>
-                  </m:e>
-                </m:eqArr>
+                </m:d>
+                <m:r>
+                  <m:rPr>
+                    <m:sty m:val="p"/>
+                  </m:rPr>
+                  <w:rPr>
+                    <w:rFonts w:ascii="Cambria Math" w:hAnsi="Cambria Math" w:eastAsia="Cambria Math" w:cs="Cambria Math"/>
+                    <w:sz w:val="18"/>
+                    <w:szCs w:val="18"/>
+                  </w:rPr>
+                  <m:t xml:space="preserve">.</m:t>
+                </m:r>
               </m:oMath>
             </m:oMathPara>
           </w:p>
@@ -31374,58 +31718,7 @@
           <w:sz w:val="20"/>
           <w:szCs w:val="20"/>
         </w:rPr>
-        <w:t>其中</w:t>
-      </w:r>
-      <w:r>
-        <w:rPr>
-          <w:sz w:val="20"/>
-          <w:szCs w:val="20"/>
-        </w:rPr>
-        <w:t xml:space="preserve"> </w:t>
-      </w:r>
-      <m:oMath>
-        <m:sSub>
-          <m:sSubPr/>
-          <m:e>
-            <m:r>
-              <m:rPr>
-                <m:sty m:val="b"/>
-              </m:rPr>
-              <w:rPr>
-                <w:rFonts w:ascii="Cambria Math" w:hAnsi="Cambria Math" w:eastAsia="Cambria Math" w:cs="Cambria Math"/>
-                <w:sz w:val="20"/>
-                <w:szCs w:val="20"/>
-              </w:rPr>
-              <m:t>P</m:t>
-            </m:r>
-          </m:e>
-          <m:sub>
-            <m:r>
-              <m:rPr/>
-              <w:rPr>
-                <w:rFonts w:ascii="Cambria Math" w:hAnsi="Cambria Math" w:eastAsia="Cambria Math" w:cs="Cambria Math"/>
-                <w:sz w:val="20"/>
-                <w:szCs w:val="20"/>
-              </w:rPr>
-              <m:t>xy</m:t>
-            </m:r>
-          </m:sub>
-        </m:sSub>
-      </m:oMath>
-      <w:r>
-        <w:rPr>
-          <w:sz w:val="20"/>
-          <w:szCs w:val="20"/>
-        </w:rPr>
-        <w:t xml:space="preserve"> </w:t>
-      </w:r>
-      <w:r>
-        <w:rPr>
-          <w:rFonts w:hint="eastAsia"/>
-          <w:sz w:val="20"/>
-          <w:szCs w:val="20"/>
-        </w:rPr>
-        <w:t>取出水平分量。为避免每周期重复累计同一越界量，底盘参考增量采用</w:t>
+        <w:t xml:space="preserve">该矩阵的旋转块与平移列分别对应 III-C 节的末端目标姿态和位置，关节指令由解析逆解得到：</w:t>
       </w:r>
     </w:p>
     <w:tbl>
@@ -31499,122 +31792,10 @@
                 <m:jc m:val="center"/>
               </m:oMathParaPr>
               <m:oMath>
-                <m:r>
-                  <m:rPr>
-                    <m:sty m:val="p"/>
-                  </m:rPr>
-                  <w:rPr>
-                    <w:rFonts w:ascii="Cambria Math" w:hAnsi="Cambria Math" w:eastAsia="Cambria Math" w:cs="Cambria Math"/>
-                    <w:sz w:val="18"/>
-                    <w:szCs w:val="18"/>
-                  </w:rPr>
-                  <m:t>Δ</m:t>
-                </m:r>
-                <m:sSub>
-                  <m:sSubPr/>
-                  <m:e>
-                    <m:r>
-                      <m:rPr>
-                        <m:sty m:val="bi"/>
-                      </m:rPr>
-                      <w:rPr>
-                        <w:rFonts w:ascii="Cambria Math" w:hAnsi="Cambria Math" w:eastAsia="Cambria Math" w:cs="Cambria Math"/>
-                        <w:sz w:val="18"/>
-                        <w:szCs w:val="18"/>
-                      </w:rPr>
-                      <m:t>p</m:t>
-                    </m:r>
-                  </m:e>
-                  <m:sub>
-                    <m:r>
-                      <m:rPr>
-                        <m:sty m:val="p"/>
-                      </m:rPr>
-                      <w:rPr>
-                        <w:rFonts w:ascii="Cambria Math" w:hAnsi="Cambria Math" w:eastAsia="Cambria Math" w:cs="Cambria Math"/>
-                        <w:sz w:val="18"/>
-                        <w:szCs w:val="18"/>
-                      </w:rPr>
-                      <m:t>b,d</m:t>
-                    </m:r>
-                  </m:sub>
-                </m:sSub>
-                <m:r>
-                  <m:rPr>
-                    <m:sty m:val="p"/>
-                  </m:rPr>
-                  <w:rPr>
-                    <w:rFonts w:ascii="Cambria Math" w:hAnsi="Cambria Math" w:eastAsia="Cambria Math" w:cs="Cambria Math"/>
-                    <w:sz w:val="18"/>
-                    <w:szCs w:val="18"/>
-                  </w:rPr>
-                  <m:t>[</m:t>
-                </m:r>
-                <m:r>
-                  <m:rPr/>
-                  <w:rPr>
-                    <w:rFonts w:ascii="Cambria Math" w:hAnsi="Cambria Math" w:eastAsia="Cambria Math" w:cs="Cambria Math"/>
-                    <w:sz w:val="18"/>
-                    <w:szCs w:val="18"/>
-                  </w:rPr>
-                  <m:t>k</m:t>
-                </m:r>
-                <m:r>
-                  <m:rPr>
-                    <m:sty m:val="p"/>
-                  </m:rPr>
-                  <w:rPr>
-                    <w:rFonts w:ascii="Cambria Math" w:hAnsi="Cambria Math" w:eastAsia="Cambria Math" w:cs="Cambria Math"/>
-                    <w:sz w:val="18"/>
-                    <w:szCs w:val="18"/>
-                  </w:rPr>
-                  <m:t>]=</m:t>
-                </m:r>
-                <m:sSub>
-                  <m:sSubPr/>
-                  <m:e>
-                    <m:r>
-                      <m:rPr>
-                        <m:sty m:val="b"/>
-                      </m:rPr>
-                      <w:rPr>
-                        <w:rFonts w:ascii="Cambria Math" w:hAnsi="Cambria Math" w:eastAsia="Cambria Math" w:cs="Cambria Math"/>
-                        <w:sz w:val="18"/>
-                        <w:szCs w:val="18"/>
-                      </w:rPr>
-                      <m:t>R</m:t>
-                    </m:r>
-                  </m:e>
-                  <m:sub>
-                    <m:r>
-                      <m:rPr>
-                        <m:sty m:val="p"/>
-                      </m:rPr>
-                      <w:rPr>
-                        <w:rFonts w:ascii="Cambria Math" w:hAnsi="Cambria Math" w:eastAsia="Cambria Math" w:cs="Cambria Math"/>
-                        <w:sz w:val="18"/>
-                        <w:szCs w:val="18"/>
-                      </w:rPr>
-                      <m:t>map,</m:t>
-                    </m:r>
-                    <m:r>
-                      <m:rPr/>
-                      <w:rPr>
-                        <w:rFonts w:ascii="Cambria Math" w:hAnsi="Cambria Math" w:eastAsia="Cambria Math" w:cs="Cambria Math"/>
-                        <w:sz w:val="18"/>
-                        <w:szCs w:val="18"/>
-                      </w:rPr>
-                      <m:t>xy</m:t>
-                    </m:r>
-                  </m:sub>
-                </m:sSub>
-                <m:d>
-                  <m:dPr>
-                    <m:sepChr m:val=""/>
-                  </m:dPr>
+                <m:eqArr>
+                  <m:eqArrPr/>
                   <m:e>
                     <m:sSub>
-                      <m:sSubPr/>
                       <m:e>
                         <m:r>
                           <m:rPr>
@@ -31625,7 +31806,7 @@
                             <w:sz w:val="18"/>
                             <w:szCs w:val="18"/>
                           </w:rPr>
-                          <m:t>e</m:t>
+                          <m:t xml:space="preserve">p</m:t>
                         </m:r>
                       </m:e>
                       <m:sub>
@@ -31638,7 +31819,7 @@
                             <w:sz w:val="18"/>
                             <w:szCs w:val="18"/>
                           </w:rPr>
-                          <m:t>comp</m:t>
+                          <m:t xml:space="preserve">06</m:t>
                         </m:r>
                       </m:sub>
                     </m:sSub>
@@ -31651,30 +31832,9 @@
                         <w:sz w:val="18"/>
                         <w:szCs w:val="18"/>
                       </w:rPr>
-                      <m:t>[</m:t>
-                    </m:r>
-                    <m:r>
-                      <m:rPr/>
-                      <w:rPr>
-                        <w:rFonts w:ascii="Cambria Math" w:hAnsi="Cambria Math" w:eastAsia="Cambria Math" w:cs="Cambria Math"/>
-                        <w:sz w:val="18"/>
-                        <w:szCs w:val="18"/>
-                      </w:rPr>
-                      <m:t>k</m:t>
-                    </m:r>
-                    <m:r>
-                      <m:rPr>
-                        <m:sty m:val="p"/>
-                      </m:rPr>
-                      <w:rPr>
-                        <w:rFonts w:ascii="Cambria Math" w:hAnsi="Cambria Math" w:eastAsia="Cambria Math" w:cs="Cambria Math"/>
-                        <w:sz w:val="18"/>
-                        <w:szCs w:val="18"/>
-                      </w:rPr>
-                      <m:t>]−</m:t>
+                      <m:t xml:space="preserve">=</m:t>
                     </m:r>
                     <m:sSub>
-                      <m:sSubPr/>
                       <m:e>
                         <m:r>
                           <m:rPr>
@@ -31685,7 +31845,7 @@
                             <w:sz w:val="18"/>
                             <w:szCs w:val="18"/>
                           </w:rPr>
-                          <m:t>e</m:t>
+                          <m:t xml:space="preserve">p</m:t>
                         </m:r>
                       </m:e>
                       <m:sub>
@@ -31698,7 +31858,7 @@
                             <w:sz w:val="18"/>
                             <w:szCs w:val="18"/>
                           </w:rPr>
-                          <m:t>comp</m:t>
+                          <m:t xml:space="preserve">A,d</m:t>
                         </m:r>
                       </m:sub>
                     </m:sSub>
@@ -31711,17 +31871,36 @@
                         <w:sz w:val="18"/>
                         <w:szCs w:val="18"/>
                       </w:rPr>
-                      <m:t>[</m:t>
+                      <m:t xml:space="preserve">, </m:t>
                     </m:r>
-                    <m:r>
-                      <m:rPr/>
-                      <w:rPr>
-                        <w:rFonts w:ascii="Cambria Math" w:hAnsi="Cambria Math" w:eastAsia="Cambria Math" w:cs="Cambria Math"/>
-                        <w:sz w:val="18"/>
-                        <w:szCs w:val="18"/>
-                      </w:rPr>
-                      <m:t>k</m:t>
-                    </m:r>
+                    <m:sSub>
+                      <m:e>
+                        <m:r>
+                          <m:rPr>
+                            <m:sty m:val="b"/>
+                          </m:rPr>
+                          <w:rPr>
+                            <w:rFonts w:ascii="Cambria Math" w:hAnsi="Cambria Math" w:eastAsia="Cambria Math" w:cs="Cambria Math"/>
+                            <w:sz w:val="18"/>
+                            <w:szCs w:val="18"/>
+                          </w:rPr>
+                          <m:t xml:space="preserve">R</m:t>
+                        </m:r>
+                      </m:e>
+                      <m:sub>
+                        <m:r>
+                          <m:rPr>
+                            <m:sty m:val="p"/>
+                          </m:rPr>
+                          <w:rPr>
+                            <w:rFonts w:ascii="Cambria Math" w:hAnsi="Cambria Math" w:eastAsia="Cambria Math" w:cs="Cambria Math"/>
+                            <w:sz w:val="18"/>
+                            <w:szCs w:val="18"/>
+                          </w:rPr>
+                          <m:t xml:space="preserve">06</m:t>
+                        </m:r>
+                      </m:sub>
+                    </m:sSub>
                     <m:r>
                       <m:rPr>
                         <m:sty m:val="p"/>
@@ -31731,17 +31910,36 @@
                         <w:sz w:val="18"/>
                         <w:szCs w:val="18"/>
                       </w:rPr>
-                      <m:t>−</m:t>
+                      <m:t xml:space="preserve">=</m:t>
                     </m:r>
-                    <m:r>
-                      <m:rPr/>
-                      <w:rPr>
-                        <w:rFonts w:ascii="Cambria Math" w:hAnsi="Cambria Math" w:eastAsia="Cambria Math" w:cs="Cambria Math"/>
-                        <w:sz w:val="18"/>
-                        <w:szCs w:val="18"/>
-                      </w:rPr>
-                      <m:t>1</m:t>
-                    </m:r>
+                    <m:sSub>
+                      <m:e>
+                        <m:r>
+                          <m:rPr>
+                            <m:sty m:val="b"/>
+                          </m:rPr>
+                          <w:rPr>
+                            <w:rFonts w:ascii="Cambria Math" w:hAnsi="Cambria Math" w:eastAsia="Cambria Math" w:cs="Cambria Math"/>
+                            <w:sz w:val="18"/>
+                            <w:szCs w:val="18"/>
+                          </w:rPr>
+                          <m:t xml:space="preserve">R</m:t>
+                        </m:r>
+                      </m:e>
+                      <m:sub>
+                        <m:r>
+                          <m:rPr>
+                            <m:sty m:val="p"/>
+                          </m:rPr>
+                          <w:rPr>
+                            <w:rFonts w:ascii="Cambria Math" w:hAnsi="Cambria Math" w:eastAsia="Cambria Math" w:cs="Cambria Math"/>
+                            <w:sz w:val="18"/>
+                            <w:szCs w:val="18"/>
+                          </w:rPr>
+                          <m:t xml:space="preserve">A,d</m:t>
+                        </m:r>
+                      </m:sub>
+                    </m:sSub>
                     <m:r>
                       <m:rPr>
                         <m:sty m:val="p"/>
@@ -31751,21 +31949,98 @@
                         <w:sz w:val="18"/>
                         <w:szCs w:val="18"/>
                       </w:rPr>
-                      <m:t>]</m:t>
+                      <m:t xml:space="preserve">,</m:t>
                     </m:r>
                   </m:e>
-                </m:d>
-                <m:r>
-                  <m:rPr>
-                    <m:sty m:val="p"/>
-                  </m:rPr>
-                  <w:rPr>
-                    <w:rFonts w:ascii="Cambria Math" w:hAnsi="Cambria Math" w:eastAsia="Cambria Math" w:cs="Cambria Math"/>
-                    <w:sz w:val="18"/>
-                    <w:szCs w:val="18"/>
-                  </w:rPr>
-                  <m:t>.</m:t>
-                </m:r>
+                  <m:e>
+                    <m:sSub>
+                      <m:e>
+                        <m:r>
+                          <m:rPr>
+                            <m:sty m:val="bi"/>
+                          </m:rPr>
+                          <w:rPr>
+                            <w:rFonts w:ascii="Cambria Math" w:hAnsi="Cambria Math" w:eastAsia="Cambria Math" w:cs="Cambria Math"/>
+                            <w:sz w:val="18"/>
+                            <w:szCs w:val="18"/>
+                          </w:rPr>
+                          <m:t xml:space="preserve">q</m:t>
+                        </m:r>
+                      </m:e>
+                      <m:sub>
+                        <m:r>
+                          <m:rPr>
+                            <m:sty m:val="p"/>
+                          </m:rPr>
+                          <w:rPr>
+                            <w:rFonts w:ascii="Cambria Math" w:hAnsi="Cambria Math" w:eastAsia="Cambria Math" w:cs="Cambria Math"/>
+                            <w:sz w:val="18"/>
+                            <w:szCs w:val="18"/>
+                          </w:rPr>
+                          <m:t xml:space="preserve">a,d</m:t>
+                        </m:r>
+                      </m:sub>
+                    </m:sSub>
+                    <m:r>
+                      <m:rPr>
+                        <m:sty m:val="p"/>
+                      </m:rPr>
+                      <w:rPr>
+                        <w:rFonts w:ascii="Cambria Math" w:hAnsi="Cambria Math" w:eastAsia="Cambria Math" w:cs="Cambria Math"/>
+                        <w:sz w:val="18"/>
+                        <w:szCs w:val="18"/>
+                      </w:rPr>
+                      <m:t xml:space="preserve">=IK</m:t>
+                    </m:r>
+                    <m:d>
+                      <m:dPr>
+                        <m:begChr m:val="("/>
+                        <m:endChr m:val=")"/>
+                      </m:dPr>
+                      <m:e>
+                        <m:sSub>
+                          <m:e>
+                            <m:r>
+                              <m:rPr>
+                                <m:sty m:val="b"/>
+                              </m:rPr>
+                              <w:rPr>
+                                <w:rFonts w:ascii="Cambria Math" w:hAnsi="Cambria Math" w:eastAsia="Cambria Math" w:cs="Cambria Math"/>
+                                <w:sz w:val="18"/>
+                                <w:szCs w:val="18"/>
+                              </w:rPr>
+                              <m:t xml:space="preserve">T</m:t>
+                            </m:r>
+                          </m:e>
+                          <m:sub>
+                            <m:r>
+                              <m:rPr>
+                                <m:sty m:val="p"/>
+                              </m:rPr>
+                              <w:rPr>
+                                <w:rFonts w:ascii="Cambria Math" w:hAnsi="Cambria Math" w:eastAsia="Cambria Math" w:cs="Cambria Math"/>
+                                <w:sz w:val="18"/>
+                                <w:szCs w:val="18"/>
+                              </w:rPr>
+                              <m:t xml:space="preserve">A,d</m:t>
+                            </m:r>
+                          </m:sub>
+                        </m:sSub>
+                      </m:e>
+                    </m:d>
+                    <m:r>
+                      <m:rPr>
+                        <m:sty m:val="p"/>
+                      </m:rPr>
+                      <w:rPr>
+                        <w:rFonts w:ascii="Cambria Math" w:hAnsi="Cambria Math" w:eastAsia="Cambria Math" w:cs="Cambria Math"/>
+                        <w:sz w:val="18"/>
+                        <w:szCs w:val="18"/>
+                      </w:rPr>
+                      <m:t xml:space="preserve">.</m:t>
+                    </m:r>
+                  </m:e>
+                </m:eqArr>
               </m:oMath>
             </m:oMathPara>
           </w:p>
@@ -31810,9 +32085,16 @@
           <w:sz w:val="20"/>
         </w:rPr>
       </w:pPr>
+      <w:r>
+        <w:rPr>
+          <w:rFonts w:hint="eastAsia"/>
+          <w:sz w:val="20"/>
+          <w:szCs w:val="20"/>
+        </w:rPr>
+        <w:t xml:space="preserve">具体而言，先由式（20）扣除工具偏置得到腕心，再由式（21）计算前三个关节角；随后用式（22）求腕部相对姿态 </w:t>
+      </w:r>
       <m:oMath>
         <m:sSub>
-          <m:sSubPr/>
           <m:e>
             <m:r>
               <m:rPr>
@@ -31823,7 +32105,7 @@
                 <w:sz w:val="20"/>
                 <w:szCs w:val="20"/>
               </w:rPr>
-              <m:t>R</m:t>
+              <m:t xml:space="preserve">R</m:t>
             </m:r>
           </m:e>
           <m:sub>
@@ -31836,34 +32118,56 @@
                 <w:sz w:val="20"/>
                 <w:szCs w:val="20"/>
               </w:rPr>
-              <m:t>map,</m:t>
-            </m:r>
-            <m:r>
-              <m:rPr/>
-              <w:rPr>
-                <w:rFonts w:ascii="Cambria Math" w:hAnsi="Cambria Math" w:eastAsia="Cambria Math" w:cs="Cambria Math"/>
-                <w:sz w:val="20"/>
-                <w:szCs w:val="20"/>
-              </w:rPr>
-              <m:t>xy</m:t>
+              <m:t xml:space="preserve">36</m:t>
             </m:r>
           </m:sub>
         </m:sSub>
       </m:oMath>
       <w:r>
         <w:rPr>
-          <w:sz w:val="20"/>
-          <w:szCs w:val="20"/>
-        </w:rPr>
-        <w:t xml:space="preserve"> </w:t>
-      </w:r>
-      <w:r>
-        <w:rPr>
           <w:rFonts w:hint="eastAsia"/>
           <w:sz w:val="20"/>
           <w:szCs w:val="20"/>
         </w:rPr>
-        <w:t>表示在底盘近似水平、朝向固定时，从机械臂水平轴到导航水平轴的二维旋转。实际状态机需明确目标回到区间内时是否回退底盘，以及如何更新参考零点；报告代码片段不足以验证所有切换行为。边界盒也不是机械臂真实可达集，截断后仍须检查逆解、碰撞和关节联动限制。垂直方向沿用报告的限幅方式，不将其写成已实现的底盘升降补偿。</w:t>
+        <w:t xml:space="preserve">，由式（23）及零位偏置得到后三个关节角。保留满足关节限位且与上一时刻最接近的可行解，作为六轴关节指令 </w:t>
+      </w:r>
+      <m:oMath>
+        <m:sSub>
+          <m:e>
+            <m:r>
+              <m:rPr>
+                <m:sty m:val="bi"/>
+              </m:rPr>
+              <w:rPr>
+                <w:rFonts w:ascii="Cambria Math" w:hAnsi="Cambria Math" w:eastAsia="Cambria Math" w:cs="Cambria Math"/>
+                <w:sz w:val="20"/>
+                <w:szCs w:val="20"/>
+              </w:rPr>
+              <m:t xml:space="preserve">q</m:t>
+            </m:r>
+          </m:e>
+          <m:sub>
+            <m:r>
+              <m:rPr>
+                <m:sty m:val="p"/>
+              </m:rPr>
+              <w:rPr>
+                <w:rFonts w:ascii="Cambria Math" w:hAnsi="Cambria Math" w:eastAsia="Cambria Math" w:cs="Cambria Math"/>
+                <w:sz w:val="20"/>
+                <w:szCs w:val="20"/>
+              </w:rPr>
+              <m:t xml:space="preserve">a,d</m:t>
+            </m:r>
+          </m:sub>
+        </m:sSub>
+      </m:oMath>
+      <w:r>
+        <w:rPr>
+          <w:rFonts w:hint="eastAsia"/>
+          <w:sz w:val="20"/>
+          <w:szCs w:val="20"/>
+        </w:rPr>
+        <w:t xml:space="preserve">。目标不可达或位于奇异位形时，不直接输出该逆解；重置位置零点时同步更新从端参考位置，以保持目标连续。</w:t>
       </w:r>
     </w:p>
     <w:bookmarkEnd w:id="6"/>

</xml_diff>

<commit_message>
Correct handle RPY to intrinsic roll-pitch-yaw rotations
</commit_message>
<xml_diff>
--- a/Article.docx
+++ b/Article.docx
@@ -29745,7 +29745,7 @@
           <w:sz w:val="20"/>
           <w:szCs w:val="20"/>
         </w:rPr>
-        <w:t xml:space="preserve">，姿态输入记为滚转、俯仰、偏航角 </w:t>
+        <w:t xml:space="preserve">。手柄采用动轴 X–Y–Z 欧拉角：从 j1 到 j3 依次为滚转（roll）、俯仰（pitch）、偏航（yaw），经编码器零位与正向标定后分别记为 </w:t>
       </w:r>
       <m:oMath>
         <m:d>
@@ -29869,61 +29869,7 @@
           <w:sz w:val="20"/>
           <w:szCs w:val="20"/>
         </w:rPr>
-        <w:t xml:space="preserve">，单位为 rad。姿态由三编码器手柄的串联正运动学及其相对 </w:t>
-      </w:r>
-      <w:r>
-        <w:rPr>
-          <w:rFonts w:hint="eastAsia"/>
-          <w:sz w:val="20"/>
-          <w:szCs w:val="20"/>
-        </w:rPr>
-        <w:t xml:space="preserve">{D}</w:t>
-      </w:r>
-      <w:r>
-        <w:rPr>
-          <w:rFonts w:hint="eastAsia"/>
-          <w:sz w:val="20"/>
-          <w:szCs w:val="20"/>
-        </w:rPr>
-        <w:t xml:space="preserve"> 的安装变换得到，三个编码器角 </w:t>
-      </w:r>
-      <m:oMath>
-        <m:sSub>
-          <m:e>
-            <m:r>
-              <m:rPr>
-                <m:sty m:val="bi"/>
-              </m:rPr>
-              <w:rPr>
-                <w:rFonts w:ascii="Cambria Math" w:hAnsi="Cambria Math" w:eastAsia="Cambria Math" w:cs="Cambria Math"/>
-                <w:sz w:val="20"/>
-                <w:szCs w:val="20"/>
-              </w:rPr>
-              <m:t xml:space="preserve">q</m:t>
-            </m:r>
-          </m:e>
-          <m:sub>
-            <m:r>
-              <m:rPr>
-                <m:sty m:val="p"/>
-              </m:rPr>
-              <w:rPr>
-                <w:rFonts w:ascii="Cambria Math" w:hAnsi="Cambria Math" w:eastAsia="Cambria Math" w:cs="Cambria Math"/>
-                <w:sz w:val="20"/>
-                <w:szCs w:val="20"/>
-              </w:rPr>
-              <m:t xml:space="preserve">h</m:t>
-            </m:r>
-          </m:sub>
-        </m:sSub>
-      </m:oMath>
-      <w:r>
-        <w:rPr>
-          <w:rFonts w:hint="eastAsia"/>
-          <w:sz w:val="20"/>
-          <w:szCs w:val="20"/>
-        </w:rPr>
-        <w:t xml:space="preserve"> 不直接等于 RPY。本文统一采用固定轴 X–Y–Z 约定，主端旋转矩阵及位姿输入的齐次矩阵为</w:t>
+        <w:t xml:space="preserve">，单位为 rad。j1 绕初始 x 轴旋转，j2 绕经 j1 旋转后的 y 轴旋转，j3 绕经前两关节旋转后的 z 轴旋转，正向均遵循右手定则。主端旋转矩阵及位姿输入的齐次矩阵为</w:t>
       </w:r>
     </w:p>
     <w:tbl>
@@ -30063,7 +30009,35 @@
                             <w:sz w:val="18"/>
                             <w:szCs w:val="18"/>
                           </w:rPr>
-                          <m:t xml:space="preserve">z</m:t>
+                          <m:t xml:space="preserve">h,0</m:t>
+                        </m:r>
+                      </m:sub>
+                    </m:sSub>
+                    <m:sSub>
+                      <m:e>
+                        <m:r>
+                          <m:rPr>
+                            <m:sty m:val="b"/>
+                          </m:rPr>
+                          <w:rPr>
+                            <w:rFonts w:ascii="Cambria Math" w:hAnsi="Cambria Math" w:eastAsia="Cambria Math" w:cs="Cambria Math"/>
+                            <w:sz w:val="18"/>
+                            <w:szCs w:val="18"/>
+                          </w:rPr>
+                          <m:t xml:space="preserve">R</m:t>
+                        </m:r>
+                      </m:e>
+                      <m:sub>
+                        <m:r>
+                          <m:rPr>
+                            <m:sty m:val="p"/>
+                          </m:rPr>
+                          <w:rPr>
+                            <w:rFonts w:ascii="Cambria Math" w:hAnsi="Cambria Math" w:eastAsia="Cambria Math" w:cs="Cambria Math"/>
+                            <w:sz w:val="18"/>
+                            <w:szCs w:val="18"/>
+                          </w:rPr>
+                          <m:t xml:space="preserve">x</m:t>
                         </m:r>
                       </m:sub>
                     </m:sSub>
@@ -30084,7 +30058,7 @@
                                 <w:sz w:val="18"/>
                                 <w:szCs w:val="18"/>
                               </w:rPr>
-                              <m:t xml:space="preserve">ψ</m:t>
+                              <m:t xml:space="preserve">ϕ</m:t>
                             </m:r>
                           </m:e>
                           <m:sub>
@@ -30191,7 +30165,7 @@
                             <w:sz w:val="18"/>
                             <w:szCs w:val="18"/>
                           </w:rPr>
-                          <m:t xml:space="preserve">x</m:t>
+                          <m:t xml:space="preserve">z</m:t>
                         </m:r>
                       </m:sub>
                     </m:sSub>
@@ -30212,7 +30186,7 @@
                                 <w:sz w:val="18"/>
                                 <w:szCs w:val="18"/>
                               </w:rPr>
-                              <m:t xml:space="preserve">ϕ</m:t>
+                              <m:t xml:space="preserve">ψ</m:t>
                             </m:r>
                           </m:e>
                           <m:sub>
@@ -30473,14 +30447,52 @@
           <w:sz w:val="20"/>
           <w:szCs w:val="20"/>
         </w:rPr>
-        <w:t xml:space="preserve">其中，旋转矩阵将手柄姿态坐标系的分量变换至 </w:t>
-      </w:r>
+        <w:t xml:space="preserve">其中，</w:t>
+      </w:r>
+      <m:oMath>
+        <m:sSub>
+          <m:e>
+            <m:r>
+              <m:rPr>
+                <m:sty m:val="b"/>
+              </m:rPr>
+              <w:rPr>
+                <w:rFonts w:ascii="Cambria Math" w:hAnsi="Cambria Math" w:eastAsia="Cambria Math" w:cs="Cambria Math"/>
+                <w:sz w:val="20"/>
+                <w:szCs w:val="20"/>
+              </w:rPr>
+              <m:t xml:space="preserve">R</m:t>
+            </m:r>
+          </m:e>
+          <m:sub>
+            <m:r>
+              <m:rPr>
+                <m:sty m:val="p"/>
+              </m:rPr>
+              <w:rPr>
+                <w:rFonts w:ascii="Cambria Math" w:hAnsi="Cambria Math" w:eastAsia="Cambria Math" w:cs="Cambria Math"/>
+                <w:sz w:val="20"/>
+                <w:szCs w:val="20"/>
+              </w:rPr>
+              <m:t xml:space="preserve">h,0</m:t>
+            </m:r>
+          </m:sub>
+        </m:sSub>
+      </m:oMath>
       <w:r>
         <w:rPr>
           <w:rFonts w:hint="eastAsia"/>
           <w:sz w:val="20"/>
           <w:szCs w:val="20"/>
         </w:rPr>
+        <w:t xml:space="preserve"> 为手柄零位姿态相对 </w:t>
+      </w:r>
+      <w:r>
+        <w:rPr>
+          <w:rFonts w:hint="eastAsia"/>
+          <w:sz w:val="20"/>
+          <w:szCs w:val="20"/>
+        </w:rPr>
         <w:t xml:space="preserve">{D}</w:t>
       </w:r>
       <w:r>
@@ -30489,7 +30501,153 @@
           <w:sz w:val="20"/>
           <w:szCs w:val="20"/>
         </w:rPr>
-        <w:t xml:space="preserve">；该姿态坐标系的原点取位置输入点，即动平台中心。式（32）中的三个基本旋转矩阵分别表示绕相应坐标轴的右手正向旋转，乘积等价于固定轴先滚转、再俯仰、最后偏航。</w:t>
+        <w:t xml:space="preserve"> 的固定安装旋转；零位坐标轴与 </w:t>
+      </w:r>
+      <w:r>
+        <w:rPr>
+          <w:rFonts w:hint="eastAsia"/>
+          <w:sz w:val="20"/>
+          <w:szCs w:val="20"/>
+        </w:rPr>
+        <w:t xml:space="preserve">{D}</w:t>
+      </w:r>
+      <w:r>
+        <w:rPr>
+          <w:rFonts w:hint="eastAsia"/>
+          <w:sz w:val="20"/>
+          <w:szCs w:val="20"/>
+        </w:rPr>
+        <w:t xml:space="preserve"> 对齐时，</w:t>
+      </w:r>
+      <m:oMath>
+        <m:sSub>
+          <m:e>
+            <m:r>
+              <m:rPr>
+                <m:sty m:val="b"/>
+              </m:rPr>
+              <w:rPr>
+                <w:rFonts w:ascii="Cambria Math" w:hAnsi="Cambria Math" w:eastAsia="Cambria Math" w:cs="Cambria Math"/>
+                <w:sz w:val="20"/>
+                <w:szCs w:val="20"/>
+              </w:rPr>
+              <m:t xml:space="preserve">R</m:t>
+            </m:r>
+          </m:e>
+          <m:sub>
+            <m:r>
+              <m:rPr>
+                <m:sty m:val="p"/>
+              </m:rPr>
+              <w:rPr>
+                <w:rFonts w:ascii="Cambria Math" w:hAnsi="Cambria Math" w:eastAsia="Cambria Math" w:cs="Cambria Math"/>
+                <w:sz w:val="20"/>
+                <w:szCs w:val="20"/>
+              </w:rPr>
+              <m:t xml:space="preserve">h,0</m:t>
+            </m:r>
+          </m:sub>
+        </m:sSub>
+      </m:oMath>
+      <w:r>
+        <w:rPr>
+          <w:rFonts w:hint="eastAsia"/>
+          <w:sz w:val="20"/>
+          <w:szCs w:val="20"/>
+        </w:rPr>
+        <w:t xml:space="preserve"> 等于 </w:t>
+      </w:r>
+      <m:oMath>
+        <m:sSub>
+          <m:e>
+            <m:r>
+              <m:rPr>
+                <m:sty m:val="b"/>
+              </m:rPr>
+              <w:rPr>
+                <w:rFonts w:ascii="Cambria Math" w:hAnsi="Cambria Math" w:eastAsia="Cambria Math" w:cs="Cambria Math"/>
+                <w:sz w:val="20"/>
+                <w:szCs w:val="20"/>
+              </w:rPr>
+              <m:t xml:space="preserve">I</m:t>
+            </m:r>
+          </m:e>
+          <m:sub>
+            <m:r>
+              <m:rPr>
+                <m:sty m:val="p"/>
+              </m:rPr>
+              <w:rPr>
+                <w:rFonts w:ascii="Cambria Math" w:hAnsi="Cambria Math" w:eastAsia="Cambria Math" w:cs="Cambria Math"/>
+                <w:sz w:val="20"/>
+                <w:szCs w:val="20"/>
+              </w:rPr>
+              <m:t xml:space="preserve">3</m:t>
+            </m:r>
+          </m:sub>
+        </m:sSub>
+      </m:oMath>
+      <w:r>
+        <w:rPr>
+          <w:rFonts w:hint="eastAsia"/>
+          <w:sz w:val="20"/>
+          <w:szCs w:val="20"/>
+        </w:rPr>
+        <w:t xml:space="preserve">。动轴旋转依次右乘，故三个关节的旋转矩阵按 roll、pitch、yaw 排列。</w:t>
+      </w:r>
+      <m:oMath>
+        <m:sSub>
+          <m:e>
+            <m:r>
+              <m:rPr>
+                <m:sty m:val="b"/>
+              </m:rPr>
+              <w:rPr>
+                <w:rFonts w:ascii="Cambria Math" w:hAnsi="Cambria Math" w:eastAsia="Cambria Math" w:cs="Cambria Math"/>
+                <w:sz w:val="20"/>
+                <w:szCs w:val="20"/>
+              </w:rPr>
+              <m:t xml:space="preserve">R</m:t>
+            </m:r>
+          </m:e>
+          <m:sub>
+            <m:r>
+              <m:rPr>
+                <m:sty m:val="p"/>
+              </m:rPr>
+              <w:rPr>
+                <w:rFonts w:ascii="Cambria Math" w:hAnsi="Cambria Math" w:eastAsia="Cambria Math" w:cs="Cambria Math"/>
+                <w:sz w:val="20"/>
+                <w:szCs w:val="20"/>
+              </w:rPr>
+              <m:t xml:space="preserve">h</m:t>
+            </m:r>
+          </m:sub>
+        </m:sSub>
+      </m:oMath>
+      <w:r>
+        <w:rPr>
+          <w:rFonts w:hint="eastAsia"/>
+          <w:sz w:val="20"/>
+          <w:szCs w:val="20"/>
+        </w:rPr>
+        <w:t xml:space="preserve"> 将手柄姿态坐标系的分量变换至 </w:t>
+      </w:r>
+      <w:r>
+        <w:rPr>
+          <w:rFonts w:hint="eastAsia"/>
+          <w:sz w:val="20"/>
+          <w:szCs w:val="20"/>
+        </w:rPr>
+        <w:t xml:space="preserve">{D}</w:t>
+      </w:r>
+      <w:r>
+        <w:rPr>
+          <w:rFonts w:hint="eastAsia"/>
+          <w:sz w:val="20"/>
+          <w:szCs w:val="20"/>
+        </w:rPr>
+        <w:t xml:space="preserve">，该姿态坐标系的原点取位置输入点，即动平台中心。</w:t>
       </w:r>
     </w:p>
     <w:p>
@@ -31358,7 +31516,7 @@
           <w:sz w:val="20"/>
           <w:szCs w:val="20"/>
         </w:rPr>
-        <w:t xml:space="preserve"> 为从端工具姿态相对手柄姿态的固定校准旋转。两项姿态校准均由安装关系确定。报告实现中先完成姿态校准，再转换为 RPY 发送，因此接收端按同一旋转顺序还原后即可得到 </w:t>
+        <w:t xml:space="preserve"> 为从端工具姿态相对手柄姿态的固定校准旋转。两项姿态校准均由安装关系确定。报告实现中先完成姿态校准，再转换为 RPY 发送，因此接收端按同一动轴 X–Y–Z 约定还原后即可得到 </w:t>
       </w:r>
       <m:oMath>
         <m:sSub>

</xml_diff>

<commit_message>
Draw system control architecture and fill Fig. 1
</commit_message>
<xml_diff>
--- a/Article.docx
+++ b/Article.docx
@@ -708,20 +708,50 @@
         <w:keepNext/>
         <w:keepLines/>
         <w:numPr>
-          <w:ilvl w:val="0"/>
           <w:numId w:val="0"/>
         </w:numPr>
-        <w:pBdr>
-          <w:top w:val="single" w:color="B0B0B0" w:sz="4" w:space="1"/>
-          <w:left w:val="single" w:color="B0B0B0" w:sz="4" w:space="1"/>
-          <w:bottom w:val="single" w:color="B0B0B0" w:sz="4" w:space="1"/>
-          <w:right w:val="single" w:color="B0B0B0" w:sz="4" w:space="1"/>
-        </w:pBdr>
         <w:snapToGrid w:val="0"/>
-        <w:spacing w:before="0" w:after="0" w:line="1644" w:lineRule="exact"/>
+        <w:spacing w:before="60" w:after="60" w:line="240" w:lineRule="auto"/>
+        <w:ind w:left="0" w:right="0" w:firstLine="0"/>
+        <w:jc w:val="center"/>
       </w:pPr>
       <w:r>
-        <w:t> </w:t>
+        <w:drawing>
+          <wp:inline distT="0" distB="0" distL="0" distR="0">
+            <wp:extent cx="2988000" cy="7312737"/>
+            <wp:docPr id="31" name="Fig. 1" descr="整机控制流程：遥操作与机械臂控制、底盘控制及测量反馈"/>
+            <wp:cNvGraphicFramePr>
+              <a:graphicFrameLocks xmlns:a="http://schemas.openxmlformats.org/drawingml/2006/main" noChangeAspect="1"/>
+            </wp:cNvGraphicFramePr>
+            <a:graphic xmlns:a="http://schemas.openxmlformats.org/drawingml/2006/main">
+              <a:graphicData uri="http://schemas.openxmlformats.org/drawingml/2006/picture">
+                <pic:pic xmlns:pic="http://schemas.openxmlformats.org/drawingml/2006/picture">
+                  <pic:nvPicPr>
+                    <pic:cNvPr id="31" name="system_control_flow.png"/>
+                    <pic:cNvPicPr>
+                      <a:picLocks noChangeAspect="1"/>
+                    </pic:cNvPicPr>
+                  </pic:nvPicPr>
+                  <pic:blipFill>
+                    <a:blip r:embed="rId15"/>
+                    <a:stretch>
+                      <a:fillRect/>
+                    </a:stretch>
+                  </pic:blipFill>
+                  <pic:spPr>
+                    <a:xfrm>
+                      <a:off x="0" y="0"/>
+                      <a:ext cx="2988000" cy="7312737"/>
+                    </a:xfrm>
+                    <a:prstGeom prst="rect">
+                      <a:avLst/>
+                    </a:prstGeom>
+                  </pic:spPr>
+                </pic:pic>
+              </a:graphicData>
+            </a:graphic>
+          </wp:inline>
+        </w:drawing>
       </w:r>
     </w:p>
     <w:p>
@@ -744,7 +774,7 @@
           <w:rFonts w:hint="eastAsia"/>
           <w:iCs/>
         </w:rPr>
-        <w:t>整体结构与分层控制框图（留白，待补图）。</w:t>
+        <w:t>整机控制流程。（a）遥操作主端经位姿映射与解析逆解生成机械臂关节目标，关节伺服叠加重力前馈。（b）底盘并行生成轮腿运动目标与模型前馈力矩，并利用 IMU 和编码器反馈闭环控制。实线为前向信号路径，虚线为测量反馈；TD 为跟踪微分器，IK 为逆运动学。</w:t>
       </w:r>
     </w:p>
     <w:p>

</xml_diff>

<commit_message>
Separate chassis joint wheel and feedforward paths in Fig. 1
</commit_message>
<xml_diff>
--- a/Article.docx
+++ b/Article.docx
@@ -682,25 +682,8 @@
       <w:r>
         <w:rPr>
           <w:rFonts w:hint="eastAsia"/>
-          <w:sz w:val="20"/>
-          <w:szCs w:val="20"/>
-        </w:rPr>
-        <w:t>控制流程如</w:t>
-      </w:r>
-      <w:r>
-        <w:rPr>
-          <w:sz w:val="20"/>
-          <w:szCs w:val="20"/>
-        </w:rPr>
-        <w:t xml:space="preserve"> Fig. 1 </w:t>
-      </w:r>
-      <w:r>
-        <w:rPr>
-          <w:rFonts w:hint="eastAsia"/>
-          <w:sz w:val="20"/>
-          <w:szCs w:val="20"/>
-        </w:rPr>
-        <w:t>所示。底盘控制器接收期望平面速度、机身高度和姿态，分别计算轮速、关节位置及前馈力矩；机械臂控制器接收主端位姿，经坐标映射与逆解后生成关节指令。关节层采用位置与速度串级反馈，模型前馈与反馈输出在执行器侧叠加。</w:t>
+        </w:rPr>
+        <w:t xml:space="preserve">控制流程如 Fig. 1 所示。底盘接收期望平动速度、加速度、基准高度及滚转、俯仰姿态角，分为关节控制器、麦克纳姆轮控制器和模型前馈三路。腿部关节采用位置—速度串级 PID，轮电机采用速度环 PID，两类电机的控制力矩均由控制器输出与相应前馈力矩相加得到。机械臂接收主端位姿，经坐标映射与逆解生成关节指令，并采用位置—速度串级反馈与重力前馈。</w:t>
       </w:r>
     </w:p>
     <w:p>
@@ -718,7 +701,7 @@
       <w:r>
         <w:drawing>
           <wp:inline distT="0" distB="0" distL="0" distR="0">
-            <wp:extent cx="2988000" cy="7312737"/>
+            <wp:extent cx="3060000" cy="7368980"/>
             <wp:docPr id="31" name="Fig. 1" descr="整机控制流程：遥操作与机械臂控制、底盘控制及测量反馈"/>
             <wp:cNvGraphicFramePr>
               <a:graphicFrameLocks xmlns:a="http://schemas.openxmlformats.org/drawingml/2006/main" noChangeAspect="1"/>
@@ -741,7 +724,7 @@
                   <pic:spPr>
                     <a:xfrm>
                       <a:off x="0" y="0"/>
-                      <a:ext cx="2988000" cy="7312737"/>
+                      <a:ext cx="3060000" cy="7368980"/>
                     </a:xfrm>
                     <a:prstGeom prst="rect">
                       <a:avLst/>
@@ -765,16 +748,9 @@
       </w:pPr>
       <w:r>
         <w:rPr>
-          <w:iCs/>
-        </w:rPr>
-        <w:t xml:space="preserve">Fig. 1. </w:t>
-      </w:r>
-      <w:r>
-        <w:rPr>
           <w:rFonts w:hint="eastAsia"/>
-          <w:iCs/>
-        </w:rPr>
-        <w:t>整机控制流程。（a）遥操作主端经位姿映射与解析逆解生成机械臂关节目标，关节伺服叠加重力前馈。（b）底盘并行生成轮腿运动目标与模型前馈力矩，并利用 IMU 和编码器反馈闭环控制。实线为前向信号路径，虚线为测量反馈；TD 为跟踪微分器，IK 为逆运动学。</w:t>
+        </w:rPr>
+        <w:t xml:space="preserve">Fig. 1. 整机控制流程。（a）遥操作位姿映射与机械臂控制。（b）底盘关节控制、麦克纳姆轮控制及前馈三路结构；单刚体动力学得到期望足端力，经轮体动力学与腿部连杆力映射得到电机前馈力矩。关节与轮电机分别将控制器输出和前馈力矩相加。实线为前向信号路径，虚线为测量反馈；FF 表示前馈。</w:t>
       </w:r>
     </w:p>
     <w:p>

</xml_diff>

<commit_message>
Place Fig. 3 panels side by side and reduce Fig. 9 size
</commit_message>
<xml_diff>
--- a/Article.docx
+++ b/Article.docx
@@ -6849,151 +6849,205 @@
         <w:t>给出仓库已有的两种轮体结构。与普通车轮相比，被动辊子允许接触点沿特定方向运动，四轮适当配置后可产生前进、侧移和偏航运动。</w:t>
       </w:r>
     </w:p>
-    <w:p>
-      <w:pPr>
-        <w:keepNext/>
-        <w:numPr>
-          <w:ilvl w:val="0"/>
-          <w:numId w:val="0"/>
-        </w:numPr>
-        <w:snapToGrid w:val="0"/>
-      </w:pPr>
-      <w:r>
-        <w:drawing>
-          <wp:inline distT="0" distB="0" distL="114300" distR="114300">
-            <wp:extent cx="3081020" cy="1002665"/>
-            <wp:effectExtent l="0" t="0" r="5080" b="6985"/>
-            <wp:docPr id="20" name="Picture" descr="Fig. 3(a). A 型麦克纳姆轮结构。"/>
-            <wp:cNvGraphicFramePr>
-              <a:graphicFrameLocks xmlns:a="http://schemas.openxmlformats.org/drawingml/2006/main" noChangeAspect="1"/>
-            </wp:cNvGraphicFramePr>
-            <a:graphic xmlns:a="http://schemas.openxmlformats.org/drawingml/2006/main">
-              <a:graphicData uri="http://schemas.openxmlformats.org/drawingml/2006/picture">
-                <pic:pic xmlns:pic="http://schemas.openxmlformats.org/drawingml/2006/picture">
-                  <pic:nvPicPr>
-                    <pic:cNvPr id="20" name="Picture" descr="Fig. 3(a). A 型麦克纳姆轮结构。"/>
-                    <pic:cNvPicPr>
-                      <a:picLocks noChangeAspect="1" noChangeArrowheads="1"/>
-                    </pic:cNvPicPr>
-                  </pic:nvPicPr>
-                  <pic:blipFill>
-                    <a:blip r:embed="rId6"/>
-                    <a:srcRect l="4706" t="17564" r="8015" b="15381"/>
-                    <a:stretch>
-                      <a:fillRect/>
-                    </a:stretch>
-                  </pic:blipFill>
-                  <pic:spPr>
-                    <a:xfrm>
-                      <a:off x="0" y="0"/>
-                      <a:ext cx="3081020" cy="1002665"/>
-                    </a:xfrm>
-                    <a:prstGeom prst="rect">
-                      <a:avLst/>
-                    </a:prstGeom>
-                    <a:noFill/>
-                    <a:ln w="9525">
-                      <a:noFill/>
-                    </a:ln>
-                  </pic:spPr>
-                </pic:pic>
-              </a:graphicData>
-            </a:graphic>
-          </wp:inline>
-        </w:drawing>
-      </w:r>
-    </w:p>
-    <w:p>
-      <w:pPr>
-        <w:pStyle w:val="18"/>
-        <w:numPr>
-          <w:ilvl w:val="0"/>
-          <w:numId w:val="0"/>
-        </w:numPr>
-        <w:snapToGrid w:val="0"/>
-      </w:pPr>
-      <w:r>
-        <w:t xml:space="preserve">Fig. 3(a). A </w:t>
-      </w:r>
-      <w:r>
-        <w:rPr>
-          <w:rFonts w:hint="eastAsia"/>
-        </w:rPr>
-        <w:t>型麦克纳姆轮结构。</w:t>
-      </w:r>
-    </w:p>
-    <w:p>
-      <w:pPr>
-        <w:keepNext/>
-        <w:numPr>
-          <w:ilvl w:val="0"/>
-          <w:numId w:val="0"/>
-        </w:numPr>
-        <w:snapToGrid w:val="0"/>
-      </w:pPr>
-      <w:r>
-        <w:drawing>
-          <wp:inline distT="0" distB="0" distL="114300" distR="114300">
-            <wp:extent cx="3089910" cy="989965"/>
-            <wp:effectExtent l="0" t="0" r="0" b="0"/>
-            <wp:docPr id="23" name="Picture" descr="Fig. 3(b). B 型麦克纳姆轮结构。"/>
-            <wp:cNvGraphicFramePr>
-              <a:graphicFrameLocks xmlns:a="http://schemas.openxmlformats.org/drawingml/2006/main" noChangeAspect="1"/>
-            </wp:cNvGraphicFramePr>
-            <a:graphic xmlns:a="http://schemas.openxmlformats.org/drawingml/2006/main">
-              <a:graphicData uri="http://schemas.openxmlformats.org/drawingml/2006/picture">
-                <pic:pic xmlns:pic="http://schemas.openxmlformats.org/drawingml/2006/picture">
-                  <pic:nvPicPr>
-                    <pic:cNvPr id="23" name="Picture" descr="Fig. 3(b). B 型麦克纳姆轮结构。"/>
-                    <pic:cNvPicPr>
-                      <a:picLocks noChangeAspect="1" noChangeArrowheads="1"/>
-                    </pic:cNvPicPr>
-                  </pic:nvPicPr>
-                  <pic:blipFill>
-                    <a:blip r:embed="rId7"/>
-                    <a:stretch>
-                      <a:fillRect/>
-                    </a:stretch>
-                  </pic:blipFill>
-                  <pic:spPr>
-                    <a:xfrm>
-                      <a:off x="0" y="0"/>
-                      <a:ext cx="3089910" cy="990494"/>
-                    </a:xfrm>
-                    <a:prstGeom prst="rect">
-                      <a:avLst/>
-                    </a:prstGeom>
-                    <a:noFill/>
-                    <a:ln w="9525">
-                      <a:noFill/>
-                    </a:ln>
-                  </pic:spPr>
-                </pic:pic>
-              </a:graphicData>
-            </a:graphic>
-          </wp:inline>
-        </w:drawing>
-      </w:r>
-    </w:p>
-    <w:p>
-      <w:pPr>
-        <w:pStyle w:val="18"/>
-        <w:numPr>
-          <w:ilvl w:val="0"/>
-          <w:numId w:val="0"/>
-        </w:numPr>
-        <w:snapToGrid w:val="0"/>
-      </w:pPr>
-      <w:r>
-        <w:t xml:space="preserve">Fig. 3(b). B </w:t>
-      </w:r>
-      <w:r>
-        <w:rPr>
-          <w:rFonts w:hint="eastAsia"/>
-        </w:rPr>
-        <w:t>型麦克纳姆轮结构。</w:t>
-      </w:r>
-    </w:p>
+    <w:tbl>
+      <w:tblPr>
+        <w:tblW w:w="4760" w:type="dxa"/>
+        <w:jc w:val="center"/>
+        <w:tblBorders>
+          <w:top w:val="nil"/>
+          <w:left w:val="nil"/>
+          <w:bottom w:val="nil"/>
+          <w:right w:val="nil"/>
+          <w:insideH w:val="nil"/>
+          <w:insideV w:val="nil"/>
+        </w:tblBorders>
+        <w:tblLayout w:type="fixed"/>
+        <w:tblCellMar>
+          <w:top w:w="0" w:type="dxa"/>
+          <w:left w:w="40" w:type="dxa"/>
+          <w:bottom w:w="0" w:type="dxa"/>
+          <w:right w:w="40" w:type="dxa"/>
+        </w:tblCellMar>
+      </w:tblPr>
+      <w:tblGrid>
+        <w:gridCol w:w="2380"/>
+        <w:gridCol w:w="2380"/>
+      </w:tblGrid>
+      <w:tr>
+        <w:trPr>
+          <w:cantSplit/>
+        </w:trPr>
+        <w:tc>
+          <w:tcPr>
+            <w:tcW w:w="2380" w:type="dxa"/>
+            <w:vAlign w:val="top"/>
+          </w:tcPr>
+          <w:p>
+            <w:pPr>
+              <w:keepNext/>
+              <w:numPr>
+                <w:ilvl w:val="0"/>
+                <w:numId w:val="0"/>
+              </w:numPr>
+              <w:snapToGrid w:val="0"/>
+              <w:spacing w:before="0" w:after="40" w:line="240" w:lineRule="auto"/>
+              <w:ind w:left="0" w:right="0" w:firstLine="0"/>
+              <w:jc w:val="center"/>
+            </w:pPr>
+            <w:r>
+              <w:drawing>
+                <wp:inline distT="0" distB="0" distL="0" distR="0">
+                  <wp:extent cx="1440000" cy="468623"/>
+                  <wp:effectExtent l="0" t="0" r="5080" b="6985"/>
+                  <wp:docPr id="20" name="Picture" descr="Fig. 3(a). A 型麦克纳姆轮结构。"/>
+                  <wp:cNvGraphicFramePr>
+                    <a:graphicFrameLocks xmlns:a="http://schemas.openxmlformats.org/drawingml/2006/main" noChangeAspect="1"/>
+                  </wp:cNvGraphicFramePr>
+                  <a:graphic xmlns:a="http://schemas.openxmlformats.org/drawingml/2006/main">
+                    <a:graphicData uri="http://schemas.openxmlformats.org/drawingml/2006/picture">
+                      <pic:pic xmlns:pic="http://schemas.openxmlformats.org/drawingml/2006/picture">
+                        <pic:nvPicPr>
+                          <pic:cNvPr id="20" name="Picture" descr="Fig. 3(a). A 型麦克纳姆轮结构。"/>
+                          <pic:cNvPicPr>
+                            <a:picLocks noChangeAspect="1" noChangeArrowheads="1"/>
+                          </pic:cNvPicPr>
+                        </pic:nvPicPr>
+                        <pic:blipFill>
+                          <a:blip r:embed="rId6"/>
+                          <a:srcRect l="4706" t="17564" r="8015" b="15381"/>
+                          <a:stretch>
+                            <a:fillRect/>
+                          </a:stretch>
+                        </pic:blipFill>
+                        <pic:spPr>
+                          <a:xfrm>
+                            <a:off x="0" y="0"/>
+                            <a:ext cx="1440000" cy="468623"/>
+                          </a:xfrm>
+                          <a:prstGeom prst="rect">
+                            <a:avLst/>
+                          </a:prstGeom>
+                          <a:noFill/>
+                          <a:ln w="9525">
+                            <a:noFill/>
+                          </a:ln>
+                        </pic:spPr>
+                      </pic:pic>
+                    </a:graphicData>
+                  </a:graphic>
+                </wp:inline>
+              </w:drawing>
+            </w:r>
+          </w:p>
+          <w:p>
+            <w:pPr>
+              <w:pStyle w:val="18"/>
+              <w:numPr>
+                <w:ilvl w:val="0"/>
+                <w:numId w:val="0"/>
+              </w:numPr>
+              <w:snapToGrid w:val="0"/>
+              <w:spacing w:before="0" w:after="40" w:line="240" w:lineRule="auto"/>
+              <w:ind w:left="0" w:right="0" w:firstLine="0"/>
+              <w:jc w:val="center"/>
+            </w:pPr>
+            <w:r>
+              <w:t xml:space="preserve">Fig. 3(a). A </w:t>
+            </w:r>
+            <w:r>
+              <w:rPr>
+                <w:rFonts w:hint="eastAsia"/>
+              </w:rPr>
+              <w:t>型麦克纳姆轮结构。</w:t>
+            </w:r>
+          </w:p>
+        </w:tc>
+        <w:tc>
+          <w:tcPr>
+            <w:tcW w:w="2380" w:type="dxa"/>
+            <w:vAlign w:val="top"/>
+          </w:tcPr>
+          <w:p>
+            <w:pPr>
+              <w:keepNext/>
+              <w:numPr>
+                <w:ilvl w:val="0"/>
+                <w:numId w:val="0"/>
+              </w:numPr>
+              <w:snapToGrid w:val="0"/>
+              <w:spacing w:before="0" w:after="40" w:line="240" w:lineRule="auto"/>
+              <w:ind w:left="0" w:right="0" w:firstLine="0"/>
+              <w:jc w:val="center"/>
+            </w:pPr>
+            <w:r>
+              <w:drawing>
+                <wp:inline distT="0" distB="0" distL="0" distR="0">
+                  <wp:extent cx="1440000" cy="461356"/>
+                  <wp:effectExtent l="0" t="0" r="0" b="0"/>
+                  <wp:docPr id="23" name="Picture" descr="Fig. 3(b). B 型麦克纳姆轮结构。"/>
+                  <wp:cNvGraphicFramePr>
+                    <a:graphicFrameLocks xmlns:a="http://schemas.openxmlformats.org/drawingml/2006/main" noChangeAspect="1"/>
+                  </wp:cNvGraphicFramePr>
+                  <a:graphic xmlns:a="http://schemas.openxmlformats.org/drawingml/2006/main">
+                    <a:graphicData uri="http://schemas.openxmlformats.org/drawingml/2006/picture">
+                      <pic:pic xmlns:pic="http://schemas.openxmlformats.org/drawingml/2006/picture">
+                        <pic:nvPicPr>
+                          <pic:cNvPr id="23" name="Picture" descr="Fig. 3(b). B 型麦克纳姆轮结构。"/>
+                          <pic:cNvPicPr>
+                            <a:picLocks noChangeAspect="1" noChangeArrowheads="1"/>
+                          </pic:cNvPicPr>
+                        </pic:nvPicPr>
+                        <pic:blipFill>
+                          <a:blip r:embed="rId7"/>
+                          <a:stretch>
+                            <a:fillRect/>
+                          </a:stretch>
+                        </pic:blipFill>
+                        <pic:spPr>
+                          <a:xfrm>
+                            <a:off x="0" y="0"/>
+                            <a:ext cx="1440000" cy="461356"/>
+                          </a:xfrm>
+                          <a:prstGeom prst="rect">
+                            <a:avLst/>
+                          </a:prstGeom>
+                          <a:noFill/>
+                          <a:ln w="9525">
+                            <a:noFill/>
+                          </a:ln>
+                        </pic:spPr>
+                      </pic:pic>
+                    </a:graphicData>
+                  </a:graphic>
+                </wp:inline>
+              </w:drawing>
+            </w:r>
+          </w:p>
+          <w:p>
+            <w:pPr>
+              <w:pStyle w:val="18"/>
+              <w:numPr>
+                <w:ilvl w:val="0"/>
+                <w:numId w:val="0"/>
+              </w:numPr>
+              <w:snapToGrid w:val="0"/>
+              <w:spacing w:before="0" w:after="40" w:line="240" w:lineRule="auto"/>
+              <w:ind w:left="0" w:right="0" w:firstLine="0"/>
+              <w:jc w:val="center"/>
+            </w:pPr>
+            <w:r>
+              <w:t xml:space="preserve">Fig. 3(b). B </w:t>
+            </w:r>
+            <w:r>
+              <w:rPr>
+                <w:rFonts w:hint="eastAsia"/>
+              </w:rPr>
+              <w:t>型麦克纳姆轮结构。</w:t>
+            </w:r>
+          </w:p>
+        </w:tc>
+      </w:tr>
+    </w:tbl>
     <w:p>
       <w:pPr>
         <w:pStyle w:val="7"/>
@@ -23431,7 +23485,7 @@
       <w:r>
         <w:drawing>
           <wp:inline distT="0" distB="0" distL="0" distR="0">
-            <wp:extent cx="2879725" cy="7405370"/>
+            <wp:extent cx="2160000" cy="5554558"/>
             <wp:effectExtent l="0" t="0" r="7620" b="8255"/>
             <wp:docPr id="30" name="Fig. 9" descr="Delta 三支链及单支链几何模型，基座原点位于静平台中心"/>
             <wp:cNvGraphicFramePr>
@@ -23455,7 +23509,7 @@
                   <pic:spPr>
                     <a:xfrm>
                       <a:off x="0" y="0"/>
-                      <a:ext cx="2880000" cy="7405714"/>
+                      <a:ext cx="2160000" cy="5554558"/>
                     </a:xfrm>
                     <a:prstGeom prst="rect">
                       <a:avLst/>

</xml_diff>

<commit_message>
Add whole-robot module and coordinate-frame overview as Fig. 1
</commit_message>
<xml_diff>
--- a/Article.docx
+++ b/Article.docx
@@ -666,6 +666,78 @@
         </w:rPr>
         <w:t>[5]。这些设计体现轻量化目标，但现有资料尚不足以给出等强度结构的减重百分比。</w:t>
       </w:r>
+      <w:r>
+        <w:rPr>
+          <w:rFonts w:hint="eastAsia"/>
+          <w:sz w:val="20"/>
+          <w:szCs w:val="20"/>
+        </w:rPr>
+        <w:t xml:space="preserve">整机模块划分与坐标系如 Fig. 1 所示。</w:t>
+      </w:r>
+    </w:p>
+    <w:p>
+      <w:pPr>
+        <w:keepNext/>
+        <w:keepLines/>
+        <w:numPr>
+          <w:numId w:val="0"/>
+        </w:numPr>
+        <w:snapToGrid w:val="0"/>
+        <w:spacing w:before="60" w:after="60" w:line="240" w:lineRule="auto"/>
+        <w:ind w:left="0" w:right="0" w:firstLine="0"/>
+        <w:jc w:val="center"/>
+      </w:pPr>
+      <w:r>
+        <w:drawing>
+          <wp:inline distT="0" distB="0" distL="0" distR="0">
+            <wp:extent cx="3060000" cy="3126575"/>
+            <wp:docPr id="32" name="Fig. 1" descr="Whole-robot modules and world, body, leg and arm DH base coordinate frames"/>
+            <wp:cNvGraphicFramePr>
+              <a:graphicFrameLocks xmlns:a="http://schemas.openxmlformats.org/drawingml/2006/main" noChangeAspect="1"/>
+            </wp:cNvGraphicFramePr>
+            <a:graphic xmlns:a="http://schemas.openxmlformats.org/drawingml/2006/main">
+              <a:graphicData uri="http://schemas.openxmlformats.org/drawingml/2006/picture">
+                <pic:pic xmlns:pic="http://schemas.openxmlformats.org/drawingml/2006/picture">
+                  <pic:nvPicPr>
+                    <pic:cNvPr id="32" name="system_module_frames.png"/>
+                    <pic:cNvPicPr>
+                      <a:picLocks noChangeAspect="1"/>
+                    </pic:cNvPicPr>
+                  </pic:nvPicPr>
+                  <pic:blipFill>
+                    <a:blip r:embed="rId16"/>
+                    <a:stretch>
+                      <a:fillRect/>
+                    </a:stretch>
+                  </pic:blipFill>
+                  <pic:spPr>
+                    <a:xfrm>
+                      <a:off x="0" y="0"/>
+                      <a:ext cx="3060000" cy="3126575"/>
+                    </a:xfrm>
+                    <a:prstGeom prst="rect">
+                      <a:avLst/>
+                    </a:prstGeom>
+                  </pic:spPr>
+                </pic:pic>
+              </a:graphicData>
+            </a:graphic>
+          </wp:inline>
+        </w:drawing>
+      </w:r>
+    </w:p>
+    <w:p>
+      <w:pPr>
+        <w:pStyle w:val="18"/>
+        <w:keepLines/>
+        <w:numPr>
+          <w:numId w:val="0"/>
+        </w:numPr>
+        <w:snapToGrid w:val="0"/>
+      </w:pPr>
+      <w:r>
+        <w:t xml:space="preserve">Fig. 1. 整机模块划分与坐标系。橙色和青色区域分别表示机械臂模块和底盘模块；{s} 为惯性系，{b} 位于基座中心，{leg} 位于图示腿的髋关节中心，机械臂 DH 基坐标系 {0} 位于底座安装基准处。图示机体前方朝右；{leg} 为正文中单腿坐标系的示例，各坐标系均采用右手约定。</w:t>
+      </w:r>
     </w:p>
     <w:p>
       <w:pPr>
@@ -683,7 +755,7 @@
         <w:rPr>
           <w:rFonts w:hint="eastAsia"/>
         </w:rPr>
-        <w:t>控制流程如 Fig. 1 所示。底盘接收期望平动速度、加速度、基准高度及滚转、俯仰姿态角，分为关节控制器、麦克纳姆轮控制器和模型前馈三路。腿部关节采用位置—速度串级 PID，轮电机采用速度环 PID，两类电机的控制力矩均由控制器输出与相应前馈力矩相加得到。机械臂接收主端位姿，经坐标映射与逆解生成关节指令，并采用位置—速度串级反馈与重力前馈。</w:t>
+        <w:t>控制流程如 Fig. 2 所示。底盘接收期望平动速度、加速度、基准高度及滚转、俯仰姿态角，分为关节控制器、麦克纳姆轮控制器和模型前馈三路。腿部关节采用位置—速度串级 PID，轮电机采用速度环 PID，两类电机的控制力矩均由控制器输出与相应前馈力矩相加得到。机械臂接收主端位姿，经坐标映射与逆解生成关节指令，并采用位置—速度串级反馈与重力前馈。</w:t>
       </w:r>
     </w:p>
     <w:p>
@@ -704,7 +776,7 @@
           <wp:inline distT="0" distB="0" distL="0" distR="0">
             <wp:extent cx="3059430" cy="7368540"/>
             <wp:effectExtent l="0" t="0" r="7620" b="3810"/>
-            <wp:docPr id="31" name="Fig. 1" descr="整机控制流程：遥操作与机械臂控制、底盘控制及测量反馈"/>
+            <wp:docPr id="31" name="Fig. 2" descr="整机控制流程：遥操作与机械臂控制、底盘控制及测量反馈"/>
             <wp:cNvGraphicFramePr>
               <a:graphicFrameLocks xmlns:a="http://schemas.openxmlformats.org/drawingml/2006/main" noChangeAspect="1"/>
             </wp:cNvGraphicFramePr>
@@ -712,7 +784,7 @@
               <a:graphicData uri="http://schemas.openxmlformats.org/drawingml/2006/picture">
                 <pic:pic xmlns:pic="http://schemas.openxmlformats.org/drawingml/2006/picture">
                   <pic:nvPicPr>
-                    <pic:cNvPr id="31" name="Fig. 1" descr="整机控制流程：遥操作与机械臂控制、底盘控制及测量反馈"/>
+                    <pic:cNvPr id="31" name="Fig. 2" descr="整机控制流程：遥操作与机械臂控制、底盘控制及测量反馈"/>
                     <pic:cNvPicPr>
                       <a:picLocks noChangeAspect="1"/>
                     </pic:cNvPicPr>
@@ -752,7 +824,7 @@
         <w:rPr>
           <w:rFonts w:hint="eastAsia"/>
         </w:rPr>
-        <w:t>Fig. 1. 整机控制流程。（a）遥操作位姿映射与机械臂控制。（b）底盘关节控制、麦克纳姆轮控制及前馈三路结构；单刚体动力学得到期望足端力，经轮体动力学与腿部连杆力映射得到电机前馈力矩。关节与轮电机分别将控制器输出和前馈力矩相加。实线为前向信号路径，虚线为测量反馈；FF 表示前馈。</w:t>
+        <w:t>Fig. 2. 整机控制流程。（a）遥操作位姿映射与机械臂控制。（b）底盘关节控制、麦克纳姆轮控制及前馈三路结构；单刚体动力学得到期望足端力，经轮体动力学与腿部连杆力映射得到电机前馈力矩。关节与轮电机分别将控制器输出和前馈力矩相加。实线为前向信号路径，虚线为测量反馈；FF 表示前馈。</w:t>
       </w:r>
     </w:p>
     <w:p>
@@ -2155,7 +2227,7 @@
           <w:sz w:val="20"/>
           <w:szCs w:val="20"/>
         </w:rPr>
-        <w:t xml:space="preserve"> 2 </w:t>
+        <w:t xml:space="preserve"> 3 </w:t>
       </w:r>
       <w:r>
         <w:rPr>
@@ -2184,7 +2256,7 @@
           <wp:inline distT="0" distB="0" distL="0" distR="0">
             <wp:extent cx="1619885" cy="2446655"/>
             <wp:effectExtent l="0" t="0" r="8890" b="1270"/>
-            <wp:docPr id="24" name="Fig. 2" descr="单腿结构与坐标系示意图"/>
+            <wp:docPr id="24" name="Fig. 3" descr="单腿结构与坐标系示意图"/>
             <wp:cNvGraphicFramePr>
               <a:graphicFrameLocks xmlns:a="http://schemas.openxmlformats.org/drawingml/2006/main" noChangeAspect="1"/>
             </wp:cNvGraphicFramePr>
@@ -2192,7 +2264,7 @@
               <a:graphicData uri="http://schemas.openxmlformats.org/drawingml/2006/picture">
                 <pic:pic xmlns:pic="http://schemas.openxmlformats.org/drawingml/2006/picture">
                   <pic:nvPicPr>
-                    <pic:cNvPr id="24" name="Fig. 2" descr="单腿结构与坐标系示意图"/>
+                    <pic:cNvPr id="24" name="Fig. 3" descr="单腿结构与坐标系示意图"/>
                     <pic:cNvPicPr>
                       <a:picLocks noChangeAspect="1"/>
                     </pic:cNvPicPr>
@@ -2232,7 +2304,7 @@
         <w:rPr>
           <w:iCs/>
         </w:rPr>
-        <w:t xml:space="preserve">Fig. 2. </w:t>
+        <w:t xml:space="preserve">Fig. 3. </w:t>
       </w:r>
       <w:r>
         <w:rPr>
@@ -6838,7 +6910,7 @@
           <w:sz w:val="20"/>
           <w:szCs w:val="20"/>
         </w:rPr>
-        <w:t xml:space="preserve"> 3 </w:t>
+        <w:t xml:space="preserve"> 4 </w:t>
       </w:r>
       <w:r>
         <w:rPr>
@@ -6899,7 +6971,7 @@
                 <wp:inline distT="0" distB="0" distL="0" distR="0">
                   <wp:extent cx="1440000" cy="468623"/>
                   <wp:effectExtent l="0" t="0" r="5080" b="6985"/>
-                  <wp:docPr id="20" name="Picture" descr="Fig. 3(a). A 型麦克纳姆轮结构。"/>
+                  <wp:docPr id="20" name="Picture" descr="Fig. 4(a). A 型麦克纳姆轮结构。"/>
                   <wp:cNvGraphicFramePr>
                     <a:graphicFrameLocks xmlns:a="http://schemas.openxmlformats.org/drawingml/2006/main" noChangeAspect="1"/>
                   </wp:cNvGraphicFramePr>
@@ -6907,7 +6979,7 @@
                     <a:graphicData uri="http://schemas.openxmlformats.org/drawingml/2006/picture">
                       <pic:pic xmlns:pic="http://schemas.openxmlformats.org/drawingml/2006/picture">
                         <pic:nvPicPr>
-                          <pic:cNvPr id="20" name="Picture" descr="Fig. 3(a). A 型麦克纳姆轮结构。"/>
+                          <pic:cNvPr id="20" name="Picture" descr="Fig. 4(a). A 型麦克纳姆轮结构。"/>
                           <pic:cNvPicPr>
                             <a:picLocks noChangeAspect="1" noChangeArrowheads="1"/>
                           </pic:cNvPicPr>
@@ -6952,7 +7024,7 @@
               <w:jc w:val="center"/>
             </w:pPr>
             <w:r>
-              <w:t xml:space="preserve">Fig. 3(a). A </w:t>
+              <w:t xml:space="preserve">Fig. 4(a). A </w:t>
             </w:r>
             <w:r>
               <w:rPr>
@@ -6984,7 +7056,7 @@
                 <wp:inline distT="0" distB="0" distL="0" distR="0">
                   <wp:extent cx="1440000" cy="461356"/>
                   <wp:effectExtent l="0" t="0" r="0" b="0"/>
-                  <wp:docPr id="23" name="Picture" descr="Fig. 3(b). B 型麦克纳姆轮结构。"/>
+                  <wp:docPr id="23" name="Picture" descr="Fig. 4(b). B 型麦克纳姆轮结构。"/>
                   <wp:cNvGraphicFramePr>
                     <a:graphicFrameLocks xmlns:a="http://schemas.openxmlformats.org/drawingml/2006/main" noChangeAspect="1"/>
                   </wp:cNvGraphicFramePr>
@@ -6992,7 +7064,7 @@
                     <a:graphicData uri="http://schemas.openxmlformats.org/drawingml/2006/picture">
                       <pic:pic xmlns:pic="http://schemas.openxmlformats.org/drawingml/2006/picture">
                         <pic:nvPicPr>
-                          <pic:cNvPr id="23" name="Picture" descr="Fig. 3(b). B 型麦克纳姆轮结构。"/>
+                          <pic:cNvPr id="23" name="Picture" descr="Fig. 4(b). B 型麦克纳姆轮结构。"/>
                           <pic:cNvPicPr>
                             <a:picLocks noChangeAspect="1" noChangeArrowheads="1"/>
                           </pic:cNvPicPr>
@@ -7036,7 +7108,7 @@
               <w:jc w:val="center"/>
             </w:pPr>
             <w:r>
-              <w:t xml:space="preserve">Fig. 3(b). B </w:t>
+              <w:t xml:space="preserve">Fig. 4(b). B </w:t>
             </w:r>
             <w:r>
               <w:rPr>
@@ -9467,7 +9539,7 @@
           <w:sz w:val="20"/>
           <w:szCs w:val="20"/>
         </w:rPr>
-        <w:t xml:space="preserve"> 4 </w:t>
+        <w:t xml:space="preserve"> 5 </w:t>
       </w:r>
       <w:r>
         <w:rPr>
@@ -9496,7 +9568,7 @@
           <wp:inline distT="0" distB="0" distL="0" distR="0">
             <wp:extent cx="2879725" cy="2300605"/>
             <wp:effectExtent l="0" t="0" r="6350" b="4445"/>
-            <wp:docPr id="25" name="Fig. 4" descr="车轮受力示意图：接触力、轴端作用力、重力、驱动力矩与力臂"/>
+            <wp:docPr id="25" name="Fig. 5" descr="车轮受力示意图：接触力、轴端作用力、重力、驱动力矩与力臂"/>
             <wp:cNvGraphicFramePr>
               <a:graphicFrameLocks xmlns:a="http://schemas.openxmlformats.org/drawingml/2006/main" noChangeAspect="1"/>
             </wp:cNvGraphicFramePr>
@@ -9504,7 +9576,7 @@
               <a:graphicData uri="http://schemas.openxmlformats.org/drawingml/2006/picture">
                 <pic:pic xmlns:pic="http://schemas.openxmlformats.org/drawingml/2006/picture">
                   <pic:nvPicPr>
-                    <pic:cNvPr id="25" name="Fig. 4" descr="车轮受力示意图：接触力、轴端作用力、重力、驱动力矩与力臂"/>
+                    <pic:cNvPr id="25" name="Fig. 5" descr="车轮受力示意图：接触力、轴端作用力、重力、驱动力矩与力臂"/>
                     <pic:cNvPicPr>
                       <a:picLocks noChangeAspect="1"/>
                     </pic:cNvPicPr>
@@ -9544,7 +9616,7 @@
         <w:rPr>
           <w:iCs/>
         </w:rPr>
-        <w:t xml:space="preserve">Fig. 4. </w:t>
+        <w:t xml:space="preserve">Fig. 5. </w:t>
       </w:r>
       <w:r>
         <w:rPr>
@@ -12811,7 +12883,7 @@
           <w:sz w:val="20"/>
           <w:szCs w:val="20"/>
         </w:rPr>
-        <w:t xml:space="preserve"> 5 </w:t>
+        <w:t xml:space="preserve"> 6 </w:t>
       </w:r>
       <w:r>
         <w:rPr>
@@ -12840,7 +12912,7 @@
           <wp:inline distT="0" distB="0" distL="0" distR="0">
             <wp:extent cx="3059430" cy="2294890"/>
             <wp:effectExtent l="0" t="0" r="7620" b="635"/>
-            <wp:docPr id="26" name="Fig. 5" descr="基于底盘立体构型的整机质心与四轮接触力示意图"/>
+            <wp:docPr id="26" name="Fig. 6" descr="基于底盘立体构型的整机质心与四轮接触力示意图"/>
             <wp:cNvGraphicFramePr>
               <a:graphicFrameLocks xmlns:a="http://schemas.openxmlformats.org/drawingml/2006/main" noChangeAspect="1"/>
             </wp:cNvGraphicFramePr>
@@ -12848,7 +12920,7 @@
               <a:graphicData uri="http://schemas.openxmlformats.org/drawingml/2006/picture">
                 <pic:pic xmlns:pic="http://schemas.openxmlformats.org/drawingml/2006/picture">
                   <pic:nvPicPr>
-                    <pic:cNvPr id="26" name="Fig. 5" descr="基于底盘立体构型的整机质心与四轮接触力示意图"/>
+                    <pic:cNvPr id="26" name="Fig. 6" descr="基于底盘立体构型的整机质心与四轮接触力示意图"/>
                     <pic:cNvPicPr>
                       <a:picLocks noChangeAspect="1"/>
                     </pic:cNvPicPr>
@@ -12888,7 +12960,7 @@
         <w:rPr>
           <w:iCs/>
         </w:rPr>
-        <w:t xml:space="preserve">Fig. 5. </w:t>
+        <w:t xml:space="preserve">Fig. 6. </w:t>
       </w:r>
       <w:r>
         <w:rPr>
@@ -15191,7 +15263,7 @@
           <w:sz w:val="20"/>
           <w:szCs w:val="20"/>
         </w:rPr>
-        <w:t>[4]。闭环控制结构如 Fig. 6 所示。对任一姿态轴</w:t>
+        <w:t>[4]。闭环控制结构如 Fig. 7 所示。对任一姿态轴</w:t>
       </w:r>
       <w:r>
         <w:rPr>
@@ -17986,7 +18058,7 @@
           <wp:inline distT="0" distB="0" distL="0" distR="0">
             <wp:extent cx="3059430" cy="4307840"/>
             <wp:effectExtent l="0" t="0" r="7620" b="635"/>
-            <wp:docPr id="27" name="Fig. 6" descr="底盘姿态控制器闭环方框图"/>
+            <wp:docPr id="27" name="Fig. 7" descr="底盘姿态控制器闭环方框图"/>
             <wp:cNvGraphicFramePr>
               <a:graphicFrameLocks xmlns:a="http://schemas.openxmlformats.org/drawingml/2006/main" noChangeAspect="1"/>
             </wp:cNvGraphicFramePr>
@@ -17994,7 +18066,7 @@
               <a:graphicData uri="http://schemas.openxmlformats.org/drawingml/2006/picture">
                 <pic:pic xmlns:pic="http://schemas.openxmlformats.org/drawingml/2006/picture">
                   <pic:nvPicPr>
-                    <pic:cNvPr id="27" name="Fig. 6" descr="底盘姿态控制器闭环方框图"/>
+                    <pic:cNvPr id="27" name="Fig. 7" descr="底盘姿态控制器闭环方框图"/>
                     <pic:cNvPicPr>
                       <a:picLocks noChangeAspect="1"/>
                     </pic:cNvPicPr>
@@ -18031,7 +18103,7 @@
         <w:snapToGrid w:val="0"/>
       </w:pPr>
       <w:r>
-        <w:t>Fig. 6. 底盘姿态控制器闭环方框图。滚转与俯仰分别采用式（18）的双环 P 控制及高度增量累加，两轴修正量经式（19）共同分配至四腿；关节伺服内环合并表示。</w:t>
+        <w:t>Fig. 7. 底盘姿态控制器闭环方框图。滚转与俯仰分别采用式（18）的双环 P 控制及高度增量累加，两轴修正量经式（19）共同分配至四腿；关节伺服内环合并表示。</w:t>
       </w:r>
     </w:p>
     <w:bookmarkEnd w:id="8"/>
@@ -18545,7 +18617,7 @@
           <wp:inline distT="0" distB="0" distL="0" distR="0">
             <wp:extent cx="3059430" cy="1019810"/>
             <wp:effectExtent l="0" t="0" r="7620" b="8890"/>
-            <wp:docPr id="28" name="Fig. 7" descr="机械臂侧视图上的关节坐标系定义"/>
+            <wp:docPr id="28" name="Fig. 8" descr="机械臂侧视图上的关节坐标系定义"/>
             <wp:cNvGraphicFramePr>
               <a:graphicFrameLocks xmlns:a="http://schemas.openxmlformats.org/drawingml/2006/main" noChangeAspect="1"/>
             </wp:cNvGraphicFramePr>
@@ -18553,7 +18625,7 @@
               <a:graphicData uri="http://schemas.openxmlformats.org/drawingml/2006/picture">
                 <pic:pic xmlns:pic="http://schemas.openxmlformats.org/drawingml/2006/picture">
                   <pic:nvPicPr>
-                    <pic:cNvPr id="28" name="Fig. 7" descr="机械臂侧视图上的关节坐标系定义"/>
+                    <pic:cNvPr id="28" name="Fig. 8" descr="机械臂侧视图上的关节坐标系定义"/>
                     <pic:cNvPicPr>
                       <a:picLocks noChangeAspect="1"/>
                     </pic:cNvPicPr>
@@ -18593,7 +18665,7 @@
         <w:rPr>
           <w:iCs/>
         </w:rPr>
-        <w:t xml:space="preserve">Fig. 7. </w:t>
+        <w:t xml:space="preserve">Fig. 8. </w:t>
       </w:r>
       <w:r>
         <w:rPr>
@@ -22466,7 +22538,7 @@
           <w:sz w:val="20"/>
           <w:szCs w:val="20"/>
         </w:rPr>
-        <w:t xml:space="preserve">。Fig. 8 </w:t>
+        <w:t xml:space="preserve">。Fig. 9 </w:t>
       </w:r>
       <w:r>
         <w:rPr>
@@ -22502,7 +22574,7 @@
           <wp:inline distT="0" distB="0" distL="0" distR="0">
             <wp:extent cx="3059430" cy="2039620"/>
             <wp:effectExtent l="0" t="0" r="7620" b="8255"/>
-            <wp:docPr id="29" name="Fig. 8" descr="Delta 平移机构与三轴姿态手柄的机构、转轴和平行约束示意"/>
+            <wp:docPr id="29" name="Fig. 9" descr="Delta 平移机构与三轴姿态手柄的机构、转轴和平行约束示意"/>
             <wp:cNvGraphicFramePr>
               <a:graphicFrameLocks xmlns:a="http://schemas.openxmlformats.org/drawingml/2006/main" noChangeAspect="1"/>
             </wp:cNvGraphicFramePr>
@@ -22510,7 +22582,7 @@
               <a:graphicData uri="http://schemas.openxmlformats.org/drawingml/2006/picture">
                 <pic:pic xmlns:pic="http://schemas.openxmlformats.org/drawingml/2006/picture">
                   <pic:nvPicPr>
-                    <pic:cNvPr id="29" name="Fig. 8" descr="Delta 平移机构与三轴姿态手柄的机构、转轴和平行约束示意"/>
+                    <pic:cNvPr id="29" name="Fig. 9" descr="Delta 平移机构与三轴姿态手柄的机构、转轴和平行约束示意"/>
                     <pic:cNvPicPr>
                       <a:picLocks noChangeAspect="1"/>
                     </pic:cNvPicPr>
@@ -22550,7 +22622,7 @@
         <w:rPr>
           <w:iCs/>
         </w:rPr>
-        <w:t xml:space="preserve">Fig. 8. </w:t>
+        <w:t xml:space="preserve">Fig. 9. </w:t>
       </w:r>
       <w:r>
         <w:rPr>
@@ -23466,7 +23538,7 @@
           <w:sz w:val="20"/>
           <w:szCs w:val="20"/>
         </w:rPr>
-        <w:t xml:space="preserve"> 工作侧转动为正。几何关系如 Fig. 9 所示；单支链图采用对称构型展示角度与长度定义，虚线段对应式（25）中的等效长度约束。</w:t>
+        <w:t xml:space="preserve"> 工作侧转动为正。几何关系如 Fig. 10 所示；单支链图采用对称构型展示角度与长度定义，虚线段对应式（25）中的等效长度约束。</w:t>
       </w:r>
     </w:p>
     <w:p>
@@ -23487,7 +23559,7 @@
           <wp:inline distT="0" distB="0" distL="0" distR="0">
             <wp:extent cx="2160000" cy="5554558"/>
             <wp:effectExtent l="0" t="0" r="7620" b="8255"/>
-            <wp:docPr id="30" name="Fig. 9" descr="Delta 三支链及单支链几何模型，基座原点位于静平台中心"/>
+            <wp:docPr id="30" name="Fig. 10" descr="Delta 三支链及单支链几何模型，基座原点位于静平台中心"/>
             <wp:cNvGraphicFramePr>
               <a:graphicFrameLocks xmlns:a="http://schemas.openxmlformats.org/drawingml/2006/main" noChangeAspect="1"/>
             </wp:cNvGraphicFramePr>
@@ -23495,7 +23567,7 @@
               <a:graphicData uri="http://schemas.openxmlformats.org/drawingml/2006/picture">
                 <pic:pic xmlns:pic="http://schemas.openxmlformats.org/drawingml/2006/picture">
                   <pic:nvPicPr>
-                    <pic:cNvPr id="30" name="Fig. 9" descr="Delta 三支链及单支链几何模型，基座原点位于静平台中心"/>
+                    <pic:cNvPr id="30" name="Fig. 10" descr="Delta 三支链及单支链几何模型，基座原点位于静平台中心"/>
                     <pic:cNvPicPr>
                       <a:picLocks noChangeAspect="1"/>
                     </pic:cNvPicPr>
@@ -23532,7 +23604,7 @@
         <w:snapToGrid w:val="0"/>
       </w:pPr>
       <w:r>
-        <w:t>Fig. 9. Delta 机械臂几何模型。（a）三支链构型，基座原点 O 位于静平台中心，正 X 轴沿平台法向由动平台指向静平台，正 Z 轴从 O 指向 A1，三轴按右手系定义；动平台中心为 P，成对从动杆构成平行四边形并保持两平台平行。（b）对称构型下的单支链剖面，标出平台半径、杆长、主动臂角及等效球心。</w:t>
+        <w:t>Fig. 10. Delta 机械臂几何模型。（a）三支链构型，基座原点 O 位于静平台中心，正 X 轴沿平台法向由动平台指向静平台，正 Z 轴从 O 指向 A1，三轴按右手系定义；动平台中心为 P，成对从动杆构成平行四边形并保持两平台平行。（b）对称构型下的单支链剖面，标出平台半径、杆长、主动臂角及等效球心。</w:t>
       </w:r>
     </w:p>
     <w:p>
@@ -36045,7 +36117,7 @@
           <w:sz w:val="20"/>
           <w:szCs w:val="20"/>
         </w:rPr>
-        <w:t xml:space="preserve"> 8 </w:t>
+        <w:t xml:space="preserve"> 11 </w:t>
       </w:r>
       <w:r>
         <w:rPr>
@@ -36090,7 +36162,7 @@
         <w:rPr>
           <w:iCs/>
         </w:rPr>
-        <w:t xml:space="preserve">Fig. 10. </w:t>
+        <w:t xml:space="preserve">Fig. 11. </w:t>
       </w:r>
       <w:r>
         <w:rPr>
@@ -36125,7 +36197,7 @@
           <w:sz w:val="20"/>
           <w:szCs w:val="20"/>
         </w:rPr>
-        <w:t xml:space="preserve"> 9 </w:t>
+        <w:t xml:space="preserve"> 12 </w:t>
       </w:r>
       <w:r>
         <w:rPr>
@@ -36170,7 +36242,7 @@
         <w:rPr>
           <w:iCs/>
         </w:rPr>
-        <w:t xml:space="preserve">Fig. 11. </w:t>
+        <w:t xml:space="preserve">Fig. 12. </w:t>
       </w:r>
       <w:r>
         <w:rPr>

</xml_diff>

<commit_message>
Expand system overview across chassis arm and teleoperation controller
</commit_message>
<xml_diff>
--- a/Article.docx
+++ b/Article.docx
@@ -634,45 +634,70 @@
           <w:sz w:val="20"/>
           <w:szCs w:val="20"/>
         </w:rPr>
-        <w:t>系统由十二自由度四轮足底盘、六转动关节机械臂及单自由度夹爪、Delta</w:t>
-      </w:r>
-      <w:r>
-        <w:rPr>
-          <w:sz w:val="20"/>
-          <w:szCs w:val="20"/>
-        </w:rPr>
-        <w:t xml:space="preserve"> </w:t>
-      </w:r>
+        <w:t xml:space="preserve">系统由机器人端的底盘、机械臂模块和操作者侧的 Delta 遥操作控制器组成，分别承担移动与姿态调节、末端操作和位姿输入。机器人端包含十二自由度底盘、六转动关节机械臂及单自由度夹爪，共十九个主动自由度；遥操作主手的三个平移自由度与三个姿态输入自由度单独计数。机器人端的模块划分及主要坐标系如 Fig. 1 所示。</w:t>
+      </w:r>
+    </w:p>
+    <w:p>
+      <w:pPr>
+        <w:pStyle w:val="7"/>
+        <w:numPr>
+          <w:ilvl w:val="0"/>
+          <w:numId w:val="0"/>
+        </w:numPr>
+        <w:snapToGrid w:val="0"/>
+        <w:rPr>
+          <w:sz w:val="20"/>
+        </w:rPr>
+      </w:pPr>
       <w:r>
         <w:rPr>
           <w:rFonts w:hint="eastAsia"/>
           <w:sz w:val="20"/>
           <w:szCs w:val="20"/>
         </w:rPr>
-        <w:t>异构遥操作控制器组成。机器人端共有十九个主动自由度；主端的三个平移自由度与三个姿态输入自由度单独计数。底盘上层框架采用碳纤维方管，下层采用铝方管，并结合碳纤维板与铝制连接件形成分层结构。两路腿部驱动集中在髋部，通过平行四边形机构传递膝部运动，降低电机随小腿摆动的惯量。机械臂采用碳纤维板和铝制加工件，夹爪采用连杆与滑轨结构</w:t>
-      </w:r>
-      <w:r>
-        <w:rPr>
-          <w:sz w:val="20"/>
-          <w:szCs w:val="20"/>
-        </w:rPr>
-        <w:t xml:space="preserve"> </w:t>
-      </w:r>
+        <w:t xml:space="preserve">底盘采用四轮足构型，每条腿由两个俯仰关节和一个麦克纳姆轮驱动自由度组成。腿部关节调节支撑高度和机身姿态，四个车轮配合实现平面全向运动。基座由碳纤维方管、铝方管、板材及连接件构成分层框架；每条腿的两路关节驱动集中在髋部，并利用平行四边形机构传递膝部运动，以减小小腿运动时的惯性负担 [5]。</w:t>
+      </w:r>
+    </w:p>
+    <w:p>
+      <w:pPr>
+        <w:pStyle w:val="7"/>
+        <w:numPr>
+          <w:ilvl w:val="0"/>
+          <w:numId w:val="0"/>
+        </w:numPr>
+        <w:snapToGrid w:val="0"/>
+        <w:rPr>
+          <w:sz w:val="20"/>
+        </w:rPr>
+      </w:pPr>
       <w:r>
         <w:rPr>
           <w:rFonts w:hint="eastAsia"/>
           <w:sz w:val="20"/>
           <w:szCs w:val="20"/>
         </w:rPr>
-        <w:t>[5]。这些设计体现轻量化目标，但现有资料尚不足以给出等强度结构的减重百分比。</w:t>
-      </w:r>
+        <w:t xml:space="preserve">机械臂模块安装于底盘上方，由六轴串联机械臂和夹爪组成。机械臂采用肘式臂与球腕结构，前三个关节主要确定腕心位置，后三个关节确定末端姿态；夹爪的开合自由度用于抓取。机械臂连杆采用碳纤维板与铝制加工件，夹爪采用连杆与滑轨机构 [5]。这些结构体现轻量化设计目标，但现有资料尚不足以量化等强度条件下的减重比例。</w:t>
+      </w:r>
+    </w:p>
+    <w:p>
+      <w:pPr>
+        <w:pStyle w:val="7"/>
+        <w:numPr>
+          <w:ilvl w:val="0"/>
+          <w:numId w:val="0"/>
+        </w:numPr>
+        <w:snapToGrid w:val="0"/>
+        <w:rPr>
+          <w:sz w:val="20"/>
+        </w:rPr>
+      </w:pPr>
       <w:r>
         <w:rPr>
           <w:rFonts w:hint="eastAsia"/>
           <w:sz w:val="20"/>
           <w:szCs w:val="20"/>
         </w:rPr>
-        <w:t xml:space="preserve">整机模块划分与坐标系如 Fig. 1 所示。</w:t>
+        <w:t xml:space="preserve">遥操作控制器作为主手，以三支链 Delta 并联机构测量三维位置，以安装在动平台上的三编码器手柄测量姿态。平行四边形从动臂使动平台始终与静平台保持平行，将平移输入与姿态输入分离；手柄从 j1 到 j3 依次对应动轴 roll、pitch、yaw。主手通过正运动学获得位置和姿态，并经无线链路向作为从手的机械臂发送位姿指令；主手的力矩前馈用于补偿自身重力，减轻静态持握负担 [4]。</w:t>
       </w:r>
     </w:p>
     <w:p>
@@ -754,8 +779,31 @@
       <w:r>
         <w:rPr>
           <w:rFonts w:hint="eastAsia"/>
-        </w:rPr>
-        <w:t>控制流程如 Fig. 2 所示。底盘接收期望平动速度、加速度、基准高度及滚转、俯仰姿态角，分为关节控制器、麦克纳姆轮控制器和模型前馈三路。腿部关节采用位置—速度串级 PID，轮电机采用速度环 PID，两类电机的控制力矩均由控制器输出与相应前馈力矩相加得到。机械臂接收主端位姿，经坐标映射与逆解生成关节指令，并采用位置—速度串级反馈与重力前馈。</w:t>
+          <w:sz w:val="20"/>
+          <w:szCs w:val="20"/>
+        </w:rPr>
+        <w:t xml:space="preserve">整机控制流程如 Fig. 2 所示。底盘接收期望平动速度、加速度、基准高度及滚转、俯仰姿态角，分为关节控制器、麦克纳姆轮控制器和模型前馈三路。姿态角度—角速度双环 P 控制器根据 IMU 反馈产生等效腿长增量，经累加、腿高分配和腿部逆运动学得到目标关节角，再由单关节位置—速度串级 PID 输出控制力矩；麦克纳姆轮运动学给出轮电机目标速度，由速度环 PID 输出控制力矩。前馈侧先由单刚体动力学分配期望足端力，再经轮体动力学与腿部连杆力映射得到电机前馈力矩。关节和轮电机分别将控制器输出与对应前馈力矩相加。</w:t>
+      </w:r>
+    </w:p>
+    <w:p>
+      <w:pPr>
+        <w:pStyle w:val="7"/>
+        <w:numPr>
+          <w:ilvl w:val="0"/>
+          <w:numId w:val="0"/>
+        </w:numPr>
+        <w:snapToGrid w:val="0"/>
+        <w:rPr>
+          <w:sz w:val="20"/>
+        </w:rPr>
+      </w:pPr>
+      <w:r>
+        <w:rPr>
+          <w:rFonts w:hint="eastAsia"/>
+          <w:sz w:val="20"/>
+          <w:szCs w:val="20"/>
+        </w:rPr>
+        <w:t xml:space="preserve">机械臂控制链以主手位姿为输入，经位置缩放、坐标校准和姿态转换构造从端目标齐次变换矩阵，再由解析逆运动学生成六轴关节目标。关节层根据编码器反馈进行位置—速度串级控制，并叠加机械臂重力前馈。由此，主手在笛卡尔空间描述操作意图，机械臂在关节空间执行指令；底盘依据自身运动指令与 IMU、编码器反馈完成移动和支撑调节。</w:t>
       </w:r>
     </w:p>
     <w:p>
@@ -1659,6 +1707,27 @@
           <w:szCs w:val="20"/>
         </w:rPr>
         <w:t>将机体系分量变换至惯性系。力矩计算涉及的各矢量必须先变换至同一坐标系；基座中心与整机质心不重合时，力臂必须相对于质心重新计算。</w:t>
+      </w:r>
+    </w:p>
+    <w:p>
+      <w:pPr>
+        <w:pStyle w:val="7"/>
+        <w:numPr>
+          <w:ilvl w:val="0"/>
+          <w:numId w:val="0"/>
+        </w:numPr>
+        <w:snapToGrid w:val="0"/>
+        <w:rPr>
+          <w:sz w:val="20"/>
+        </w:rPr>
+      </w:pPr>
+      <w:r>
+        <w:rPr>
+          <w:rFonts w:hint="eastAsia"/>
+          <w:sz w:val="20"/>
+          <w:szCs w:val="20"/>
+        </w:rPr>
+        <w:t xml:space="preserve">机械臂 DH 基坐标系 {0} 位于机械臂底座安装基准处，固连于机器人端；遥操作映射中的从端基坐标系 {A} 与 {0} 表示同一坐标系。主手基坐标系 {D} 固连 Delta 静平台，原点位于静平台中心，轴向按 III-D 节定义。上述坐标系均采用右手约定，主手位姿须经标定的坐标变换后用于从端逆运动学。</w:t>
       </w:r>
     </w:p>
     <w:bookmarkEnd w:id="7"/>

</xml_diff>

<commit_message>
Split chassis overview and kinematics and add arm frame diagram to Fig. 8
</commit_message>
<xml_diff>
--- a/Article.docx
+++ b/Article.docx
@@ -1399,13 +1399,13 @@
       </w:pPr>
       <w:bookmarkStart w:id="5" w:name="概述与单腿运动学"/>
       <w:r>
-        <w:t xml:space="preserve">1) </w:t>
+        <w:t xml:space="preserve">1) 概述</w:t>
       </w:r>
       <w:r>
         <w:rPr>
           <w:rFonts w:hint="eastAsia"/>
         </w:rPr>
-        <w:t>概述与单腿运动学</w:t>
+        <w:t xml:space="preserve"/>
       </w:r>
     </w:p>
     <w:p>
@@ -1427,6 +1427,25 @@
           <w:szCs w:val="20"/>
         </w:rPr>
         <w:t>底盘由基座与四条腿组成，每条腿包含轴线平行的髋部俯仰关节、膝关节和一个麦克纳姆轮，共十二个主动自由度。控制采用“单腿建模—整机合力分配—关节执行”的分层结构。腿部关节调整支撑高度与前后轮心位置，车轮负责平面滚动。</w:t>
+      </w:r>
+    </w:p>
+    <w:p>
+      <w:pPr>
+        <w:pStyle w:val="4"/>
+        <w:numPr>
+          <w:ilvl w:val="2"/>
+          <w:numId w:val="0"/>
+        </w:numPr>
+        <w:snapToGrid w:val="0"/>
+      </w:pPr>
+      <w:r>
+        <w:t xml:space="preserve">2) 单腿运动学</w:t>
+      </w:r>
+      <w:r>
+        <w:rPr>
+          <w:rFonts w:hint="eastAsia"/>
+        </w:rPr>
+        <w:t xml:space="preserve"/>
       </w:r>
     </w:p>
     <w:p>
@@ -6421,13 +6440,13 @@
       </w:pPr>
       <w:bookmarkStart w:id="6" w:name="麦克纳姆轮运动学"/>
       <w:r>
-        <w:t xml:space="preserve">2) </w:t>
+        <w:t xml:space="preserve">3) 麦克纳姆轮运动学</w:t>
       </w:r>
       <w:r>
         <w:rPr>
           <w:rFonts w:hint="eastAsia"/>
         </w:rPr>
-        <w:t>麦克纳姆轮运动学</w:t>
+        <w:t xml:space="preserve"/>
       </w:r>
     </w:p>
     <w:p>
@@ -8890,13 +8909,13 @@
       </w:pPr>
       <w:bookmarkStart w:id="7" w:name="轮体动力学与足端力映射"/>
       <w:r>
-        <w:t xml:space="preserve">3) </w:t>
+        <w:t xml:space="preserve">4) 轮体动力学与足端力映射</w:t>
       </w:r>
       <w:r>
         <w:rPr>
           <w:rFonts w:hint="eastAsia"/>
         </w:rPr>
-        <w:t>轮体动力学与足端力映射</w:t>
+        <w:t xml:space="preserve"/>
       </w:r>
     </w:p>
     <w:p>
@@ -12104,13 +12123,13 @@
       </w:pPr>
       <w:bookmarkStart w:id="8" w:name="整机单刚体动力学"/>
       <w:r>
-        <w:t xml:space="preserve">4) </w:t>
+        <w:t xml:space="preserve">5) 整机单刚体动力学</w:t>
       </w:r>
       <w:r>
         <w:rPr>
           <w:rFonts w:hint="eastAsia"/>
         </w:rPr>
-        <w:t>整机单刚体动力学</w:t>
+        <w:t xml:space="preserve"/>
       </w:r>
     </w:p>
     <w:p>
@@ -14731,13 +14750,13 @@
       </w:pPr>
       <w:bookmarkStart w:id="9" w:name="姿态控制器"/>
       <w:r>
-        <w:t xml:space="preserve">5) </w:t>
+        <w:t xml:space="preserve">6) 姿态控制器</w:t>
       </w:r>
       <w:r>
         <w:rPr>
           <w:rFonts w:hint="eastAsia"/>
         </w:rPr>
-        <w:t>姿态控制器</w:t>
+        <w:t xml:space="preserve"/>
       </w:r>
     </w:p>
     <w:p>
@@ -18207,6 +18226,103 @@
     </w:p>
     <w:p>
       <w:pPr>
+        <w:keepNext/>
+        <w:keepLines/>
+        <w:numPr>
+          <w:ilvl w:val="0"/>
+          <w:numId w:val="0"/>
+        </w:numPr>
+        <w:snapToGrid w:val="0"/>
+        <w:spacing w:before="0" w:after="60"/>
+        <w:ind w:left="0" w:right="0" w:firstLine="0"/>
+        <w:jc w:val="center"/>
+      </w:pPr>
+      <w:r>
+        <w:rPr>
+          <w:rFonts w:ascii="Times New Roman" w:hAnsi="Times New Roman"/>
+          <w:sz w:val="18"/>
+          <w:szCs w:val="18"/>
+        </w:rPr>
+        <w:t xml:space="preserve">(a) Physical view</w:t>
+      </w:r>
+    </w:p>
+    <w:p>
+      <w:pPr>
+        <w:keepNext/>
+        <w:keepLines/>
+        <w:numPr>
+          <w:ilvl w:val="0"/>
+          <w:numId w:val="0"/>
+        </w:numPr>
+        <w:snapToGrid w:val="0"/>
+        <w:spacing w:before="60" w:after="60" w:line="240" w:lineRule="auto"/>
+        <w:ind w:left="0" w:right="0" w:firstLine="0"/>
+        <w:jc w:val="center"/>
+      </w:pPr>
+      <w:r>
+        <w:drawing>
+          <wp:inline distT="0" distB="0" distL="0" distR="0">
+            <wp:extent cx="3059430" cy="1520256"/>
+            <wp:effectExtent l="0" t="0" r="7620" b="8890"/>
+            <wp:docPr id="34" name="Fig. 8(b)" descr="Arm joint coordinate frames and link dimensions"/>
+            <wp:cNvGraphicFramePr>
+              <a:graphicFrameLocks xmlns:a="http://schemas.openxmlformats.org/drawingml/2006/main" noChangeAspect="1"/>
+            </wp:cNvGraphicFramePr>
+            <a:graphic xmlns:a="http://schemas.openxmlformats.org/drawingml/2006/main">
+              <a:graphicData uri="http://schemas.openxmlformats.org/drawingml/2006/picture">
+                <pic:pic xmlns:pic="http://schemas.openxmlformats.org/drawingml/2006/picture">
+                  <pic:nvPicPr>
+                    <pic:cNvPr id="34" name="Fig. 8(b)" descr="Arm joint coordinate frames and link dimensions"/>
+                    <pic:cNvPicPr>
+                      <a:picLocks noChangeAspect="1"/>
+                    </pic:cNvPicPr>
+                  </pic:nvPicPr>
+                  <pic:blipFill>
+                    <a:blip r:embed="rId18"/>
+                    <a:stretch>
+                      <a:fillRect/>
+                    </a:stretch>
+                  </pic:blipFill>
+                  <pic:spPr>
+                    <a:xfrm>
+                      <a:off x="0" y="0"/>
+                      <a:ext cx="3059430" cy="1520256"/>
+                    </a:xfrm>
+                    <a:prstGeom prst="rect">
+                      <a:avLst/>
+                    </a:prstGeom>
+                  </pic:spPr>
+                </pic:pic>
+              </a:graphicData>
+            </a:graphic>
+          </wp:inline>
+        </w:drawing>
+      </w:r>
+    </w:p>
+    <w:p>
+      <w:pPr>
+        <w:keepNext/>
+        <w:keepLines/>
+        <w:numPr>
+          <w:ilvl w:val="0"/>
+          <w:numId w:val="0"/>
+        </w:numPr>
+        <w:snapToGrid w:val="0"/>
+        <w:spacing w:before="0" w:after="60"/>
+        <w:ind w:left="0" w:right="0" w:firstLine="0"/>
+        <w:jc w:val="center"/>
+      </w:pPr>
+      <w:r>
+        <w:rPr>
+          <w:rFonts w:ascii="Times New Roman" w:hAnsi="Times New Roman"/>
+          <w:sz w:val="18"/>
+          <w:szCs w:val="18"/>
+        </w:rPr>
+        <w:t xml:space="preserve">(b) Joint coordinate frames</w:t>
+      </w:r>
+    </w:p>
+    <w:p>
+      <w:pPr>
         <w:pStyle w:val="18"/>
         <w:numPr>
           <w:ilvl w:val="0"/>
@@ -18218,14 +18334,14 @@
         <w:rPr>
           <w:iCs/>
         </w:rPr>
-        <w:t xml:space="preserve">Fig. 8. </w:t>
+        <w:t xml:space="preserve">Fig. 8. 六轴机械臂关节坐标系。（a）侧视图上的坐标系对应位置。（b）关节坐标系与连杆尺寸定义。坐标系 2、3 的原点重合，坐标系 4、5 的原点重合。</w:t>
       </w:r>
       <w:r>
         <w:rPr>
           <w:rFonts w:hint="eastAsia"/>
           <w:iCs/>
         </w:rPr>
-        <w:t xml:space="preserve">六轴机械臂关节坐标系在侧视图上的对应位置。坐标系 2、3 的原点重合，坐标系 4、5 </w:t>
+        <w:t xml:space="preserve"/>
       </w:r>
       <w:r>
         <w:rPr>
@@ -18233,14 +18349,14 @@
           <w:iCs/>
           <w:lang w:eastAsia="zh-CN"/>
         </w:rPr>
-        <w:t>的</w:t>
+        <w:t xml:space="preserve"/>
       </w:r>
       <w:r>
         <w:rPr>
           <w:rFonts w:hint="eastAsia"/>
           <w:iCs/>
         </w:rPr>
-        <w:t>原点重合；</w:t>
+        <w:t xml:space="preserve"/>
       </w:r>
     </w:p>
     <w:p>

</xml_diff>

<commit_message>
Review paper notation, clarify model definitions, and correct wheel radius
</commit_message>
<xml_diff>
--- a/Article.docx
+++ b/Article.docx
@@ -991,6 +991,130 @@
         </w:rPr>
         <w:t>分别表示期望、前馈和反馈量。长度、时间和角度统一采用国际单位制。</w:t>
       </w:r>
+      <w:r>
+        <w:rPr>
+          <w:rFonts w:ascii="Times New Roman" w:hAnsi="Times New Roman" w:eastAsia="宋体"/>
+          <w:sz w:val="20"/>
+          <w:szCs w:val="20"/>
+        </w:rPr>
+        <w:t xml:space="preserve">点号表示对时间求导，带期望标记时表示对应导数量的参考值；</w:t>
+      </w:r>
+      <m:oMath>
+        <m:sSub>
+          <m:e>
+            <m:r>
+              <m:rPr>
+                <m:sty m:val="bi"/>
+              </m:rPr>
+              <w:rPr>
+                <w:rFonts w:ascii="Cambria Math" w:hAnsi="Cambria Math" w:eastAsia="Cambria Math" w:cs="Cambria Math"/>
+                <w:sz w:val="20"/>
+                <w:szCs w:val="20"/>
+              </w:rPr>
+              <m:t>e</m:t>
+            </m:r>
+          </m:e>
+          <m:sub>
+            <m:r>
+              <m:rPr>
+                <m:sty m:val="p"/>
+              </m:rPr>
+              <w:rPr>
+                <w:rFonts w:ascii="Cambria Math" w:hAnsi="Cambria Math" w:eastAsia="Cambria Math" w:cs="Cambria Math"/>
+                <w:sz w:val="20"/>
+                <w:szCs w:val="20"/>
+              </w:rPr>
+              <m:t>x</m:t>
+            </m:r>
+          </m:sub>
+        </m:sSub>
+        <m:r>
+          <m:rPr>
+            <m:sty m:val="p"/>
+          </m:rPr>
+          <w:rPr>
+            <w:rFonts w:ascii="Cambria Math" w:hAnsi="Cambria Math" w:eastAsia="Cambria Math" w:cs="Cambria Math"/>
+            <w:sz w:val="20"/>
+            <w:szCs w:val="20"/>
+          </w:rPr>
+          <m:t>、</m:t>
+        </m:r>
+        <m:sSub>
+          <m:e>
+            <m:r>
+              <m:rPr>
+                <m:sty m:val="bi"/>
+              </m:rPr>
+              <w:rPr>
+                <w:rFonts w:ascii="Cambria Math" w:hAnsi="Cambria Math" w:eastAsia="Cambria Math" w:cs="Cambria Math"/>
+                <w:sz w:val="20"/>
+                <w:szCs w:val="20"/>
+              </w:rPr>
+              <m:t>e</m:t>
+            </m:r>
+          </m:e>
+          <m:sub>
+            <m:r>
+              <m:rPr>
+                <m:sty m:val="p"/>
+              </m:rPr>
+              <w:rPr>
+                <w:rFonts w:ascii="Cambria Math" w:hAnsi="Cambria Math" w:eastAsia="Cambria Math" w:cs="Cambria Math"/>
+                <w:sz w:val="20"/>
+                <w:szCs w:val="20"/>
+              </w:rPr>
+              <m:t>y</m:t>
+            </m:r>
+          </m:sub>
+        </m:sSub>
+        <m:r>
+          <m:rPr>
+            <m:sty m:val="p"/>
+          </m:rPr>
+          <w:rPr>
+            <w:rFonts w:ascii="Cambria Math" w:hAnsi="Cambria Math" w:eastAsia="Cambria Math" w:cs="Cambria Math"/>
+            <w:sz w:val="20"/>
+            <w:szCs w:val="20"/>
+          </w:rPr>
+          <m:t>、</m:t>
+        </m:r>
+        <m:sSub>
+          <m:e>
+            <m:r>
+              <m:rPr>
+                <m:sty m:val="bi"/>
+              </m:rPr>
+              <w:rPr>
+                <w:rFonts w:ascii="Cambria Math" w:hAnsi="Cambria Math" w:eastAsia="Cambria Math" w:cs="Cambria Math"/>
+                <w:sz w:val="20"/>
+                <w:szCs w:val="20"/>
+              </w:rPr>
+              <m:t>e</m:t>
+            </m:r>
+          </m:e>
+          <m:sub>
+            <m:r>
+              <m:rPr>
+                <m:sty m:val="p"/>
+              </m:rPr>
+              <w:rPr>
+                <w:rFonts w:ascii="Cambria Math" w:hAnsi="Cambria Math" w:eastAsia="Cambria Math" w:cs="Cambria Math"/>
+                <w:sz w:val="20"/>
+                <w:szCs w:val="20"/>
+              </w:rPr>
+              <m:t>z</m:t>
+            </m:r>
+          </m:sub>
+        </m:sSub>
+      </m:oMath>
+      <w:r>
+        <w:rPr>
+          <w:rFonts w:ascii="Times New Roman" w:hAnsi="Times New Roman" w:eastAsia="宋体"/>
+          <w:sz w:val="20"/>
+          <w:szCs w:val="20"/>
+        </w:rPr>
+        <w:t xml:space="preserve"> 分别表示所在坐标系的三个坐标轴单位矢量。</w:t>
+      </w:r>
     </w:p>
     <w:p>
       <w:pPr>
@@ -2992,7 +3116,7 @@
                 <w:szCs w:val="16"/>
                 <w:lang w:val="en-US" w:eastAsia="zh-CN"/>
               </w:rPr>
-              <w:t>0.7</w:t>
+              <w:t>0.07 </w:t>
             </w:r>
             <m:oMath>
               <m:r>
@@ -10140,6 +10264,135 @@
         </w:rPr>
         <w:t>该表达式取轮轴方向投影；其余方向的约束力矩由轴承和机构承担。低速实现中忽略陀螺项，快速转动时则需考虑惯性耦合。</w:t>
       </w:r>
+      <w:r>
+        <w:rPr>
+          <w:rFonts w:ascii="Times New Roman" w:hAnsi="Times New Roman" w:eastAsia="宋体"/>
+          <w:sz w:val="20"/>
+          <w:szCs w:val="20"/>
+        </w:rPr>
+        <w:t xml:space="preserve">其中，</w:t>
+      </w:r>
+      <m:oMath>
+        <m:sSub>
+          <m:e>
+            <m:r>
+              <m:rPr>
+                <m:sty m:val="b"/>
+              </m:rPr>
+              <w:rPr>
+                <w:rFonts w:ascii="Cambria Math" w:hAnsi="Cambria Math" w:eastAsia="Cambria Math" w:cs="Cambria Math"/>
+                <w:sz w:val="20"/>
+                <w:szCs w:val="20"/>
+              </w:rPr>
+              <m:t>I</m:t>
+            </m:r>
+          </m:e>
+          <m:sub>
+            <m:r>
+              <m:rPr>
+                <m:sty m:val="p"/>
+              </m:rPr>
+              <w:rPr>
+                <w:rFonts w:ascii="Cambria Math" w:hAnsi="Cambria Math" w:eastAsia="Cambria Math" w:cs="Cambria Math"/>
+                <w:sz w:val="20"/>
+                <w:szCs w:val="20"/>
+              </w:rPr>
+              <m:t>c</m:t>
+            </m:r>
+          </m:sub>
+        </m:sSub>
+      </m:oMath>
+      <w:r>
+        <w:rPr>
+          <w:rFonts w:ascii="Times New Roman" w:hAnsi="Times New Roman" w:eastAsia="宋体"/>
+          <w:sz w:val="20"/>
+          <w:szCs w:val="20"/>
+        </w:rPr>
+        <w:t xml:space="preserve"> 为轮体关于质心的惯性张量，</w:t>
+      </w:r>
+      <m:oMath>
+        <m:sSub>
+          <m:e>
+            <m:r>
+              <m:rPr>
+                <m:sty m:val="bi"/>
+              </m:rPr>
+              <w:rPr>
+                <w:rFonts w:ascii="Cambria Math" w:hAnsi="Cambria Math" w:eastAsia="Cambria Math" w:cs="Cambria Math"/>
+                <w:sz w:val="20"/>
+                <w:szCs w:val="20"/>
+              </w:rPr>
+              <m:t>ω</m:t>
+            </m:r>
+          </m:e>
+          <m:sub>
+            <m:r>
+              <m:rPr>
+                <m:sty m:val="p"/>
+              </m:rPr>
+              <w:rPr>
+                <w:rFonts w:ascii="Cambria Math" w:hAnsi="Cambria Math" w:eastAsia="Cambria Math" w:cs="Cambria Math"/>
+                <w:sz w:val="20"/>
+                <w:szCs w:val="20"/>
+              </w:rPr>
+              <m:t>w</m:t>
+            </m:r>
+          </m:sub>
+        </m:sSub>
+      </m:oMath>
+      <w:r>
+        <w:rPr>
+          <w:rFonts w:ascii="Times New Roman" w:hAnsi="Times New Roman" w:eastAsia="宋体"/>
+          <w:sz w:val="20"/>
+          <w:szCs w:val="20"/>
+        </w:rPr>
+        <w:t xml:space="preserve"> 为轮体相对惯性系的角速度，</w:t>
+      </w:r>
+      <m:oMath>
+        <m:sSub>
+          <m:e>
+            <m:acc>
+              <m:accPr>
+                <m:chr m:val="̇"/>
+              </m:accPr>
+              <m:e>
+                <m:r>
+                  <m:rPr>
+                    <m:sty m:val="bi"/>
+                  </m:rPr>
+                  <w:rPr>
+                    <w:rFonts w:ascii="Cambria Math" w:hAnsi="Cambria Math" w:eastAsia="Cambria Math" w:cs="Cambria Math"/>
+                    <w:sz w:val="20"/>
+                    <w:szCs w:val="20"/>
+                  </w:rPr>
+                  <m:t>ω</m:t>
+                </m:r>
+              </m:e>
+            </m:acc>
+          </m:e>
+          <m:sub>
+            <m:r>
+              <m:rPr>
+                <m:sty m:val="p"/>
+              </m:rPr>
+              <w:rPr>
+                <w:rFonts w:ascii="Cambria Math" w:hAnsi="Cambria Math" w:eastAsia="Cambria Math" w:cs="Cambria Math"/>
+                <w:sz w:val="20"/>
+                <w:szCs w:val="20"/>
+              </w:rPr>
+              <m:t>w</m:t>
+            </m:r>
+          </m:sub>
+        </m:sSub>
+      </m:oMath>
+      <w:r>
+        <w:rPr>
+          <w:rFonts w:ascii="Times New Roman" w:hAnsi="Times New Roman" w:eastAsia="宋体"/>
+          <w:sz w:val="20"/>
+          <w:szCs w:val="20"/>
+        </w:rPr>
+        <w:t xml:space="preserve"> 为角加速度；上述量均以同一坐标系的分量参与运算。</w:t>
+      </w:r>
     </w:p>
     <w:p>
       <w:pPr>
@@ -12435,18 +12688,98 @@
       </w:pPr>
       <w:r>
         <w:rPr>
-          <w:rFonts w:hint="eastAsia"/>
-          <w:sz w:val="20"/>
-          <w:szCs w:val="20"/>
-        </w:rPr>
-        <w:t>以下各量均在惯性系表示。机体系惯性张量需变换为</w:t>
-      </w:r>
-      <w:r>
-        <w:rPr>
-          <w:sz w:val="20"/>
-          <w:szCs w:val="20"/>
-        </w:rPr>
-        <w:t xml:space="preserve"> </w:t>
+          <w:rFonts w:ascii="Times New Roman" w:hAnsi="Times New Roman" w:eastAsia="宋体"/>
+          <w:sz w:val="20"/>
+          <w:szCs w:val="20"/>
+        </w:rPr>
+        <w:t xml:space="preserve">以下各量均在惯性系表示。</w:t>
+      </w:r>
+      <m:oMath>
+        <m:r>
+          <m:rPr>
+            <m:sty m:val="bi"/>
+          </m:rPr>
+          <w:rPr>
+            <w:rFonts w:ascii="Cambria Math" w:hAnsi="Cambria Math" w:eastAsia="Cambria Math" w:cs="Cambria Math"/>
+            <w:sz w:val="20"/>
+            <w:szCs w:val="20"/>
+          </w:rPr>
+          <m:t>ω</m:t>
+        </m:r>
+      </m:oMath>
+      <w:r>
+        <w:rPr>
+          <w:rFonts w:ascii="Times New Roman" w:hAnsi="Times New Roman" w:eastAsia="宋体"/>
+          <w:sz w:val="20"/>
+          <w:szCs w:val="20"/>
+        </w:rPr>
+        <w:t xml:space="preserve"> 为机身角速度，</w:t>
+      </w:r>
+      <m:oMath>
+        <m:acc>
+          <m:accPr>
+            <m:chr m:val="̇"/>
+          </m:accPr>
+          <m:e>
+            <m:r>
+              <m:rPr>
+                <m:sty m:val="bi"/>
+              </m:rPr>
+              <w:rPr>
+                <w:rFonts w:ascii="Cambria Math" w:hAnsi="Cambria Math" w:eastAsia="Cambria Math" w:cs="Cambria Math"/>
+                <w:sz w:val="20"/>
+                <w:szCs w:val="20"/>
+              </w:rPr>
+              <m:t>ω</m:t>
+            </m:r>
+          </m:e>
+        </m:acc>
+      </m:oMath>
+      <w:r>
+        <w:rPr>
+          <w:rFonts w:ascii="Times New Roman" w:hAnsi="Times New Roman" w:eastAsia="宋体"/>
+          <w:sz w:val="20"/>
+          <w:szCs w:val="20"/>
+        </w:rPr>
+        <w:t xml:space="preserve"> 为角加速度，</w:t>
+      </w:r>
+      <m:oMath>
+        <m:sSub>
+          <m:e>
+            <m:r>
+              <m:rPr>
+                <m:sty m:val="b"/>
+              </m:rPr>
+              <w:rPr>
+                <w:rFonts w:ascii="Cambria Math" w:hAnsi="Cambria Math" w:eastAsia="Cambria Math" w:cs="Cambria Math"/>
+                <w:sz w:val="20"/>
+                <w:szCs w:val="20"/>
+              </w:rPr>
+              <m:t>I</m:t>
+            </m:r>
+          </m:e>
+          <m:sub>
+            <m:r>
+              <m:rPr>
+                <m:sty m:val="p"/>
+              </m:rPr>
+              <w:rPr>
+                <w:rFonts w:ascii="Cambria Math" w:hAnsi="Cambria Math" w:eastAsia="Cambria Math" w:cs="Cambria Math"/>
+                <w:sz w:val="20"/>
+                <w:szCs w:val="20"/>
+              </w:rPr>
+              <m:t>b</m:t>
+            </m:r>
+          </m:sub>
+        </m:sSub>
+      </m:oMath>
+      <w:r>
+        <w:rPr>
+          <w:rFonts w:ascii="Times New Roman" w:hAnsi="Times New Roman" w:eastAsia="宋体"/>
+          <w:sz w:val="20"/>
+          <w:szCs w:val="20"/>
+        </w:rPr>
+        <w:t xml:space="preserve"> 为以机体系分量表示的整机质心惯性张量。惯性张量变换为 </w:t>
       </w:r>
       <m:oMath>
         <m:sSub>
@@ -12592,11 +12925,11 @@
       </m:oMath>
       <w:r>
         <w:rPr>
-          <w:rFonts w:hint="eastAsia"/>
-          <w:sz w:val="20"/>
-          <w:szCs w:val="20"/>
-        </w:rPr>
-        <w:t>。令</w:t>
+          <w:rFonts w:ascii="Times New Roman" w:hAnsi="Times New Roman" w:eastAsia="宋体"/>
+          <w:sz w:val="20"/>
+          <w:szCs w:val="20"/>
+        </w:rPr>
+        <w:t xml:space="preserve">。令</w:t>
       </w:r>
     </w:p>
     <w:tbl>
@@ -18373,12 +18706,239 @@
       </w:pPr>
       <w:r>
         <w:rPr>
+          <w:rFonts w:ascii="Times New Roman" w:hAnsi="Times New Roman" w:eastAsia="宋体"/>
+          <w:sz w:val="20"/>
+          <w:szCs w:val="20"/>
+        </w:rPr>
+        <w:t xml:space="preserve">关节角记为 </w:t>
+      </w:r>
+      <m:oMath>
+        <m:sSub>
+          <m:e>
+            <m:r>
+              <m:rPr>
+                <m:sty m:val="i"/>
+              </m:rPr>
+              <w:rPr>
+                <w:rFonts w:ascii="Cambria Math" w:hAnsi="Cambria Math" w:eastAsia="Cambria Math" w:cs="Cambria Math"/>
+                <w:sz w:val="20"/>
+                <w:szCs w:val="20"/>
+              </w:rPr>
+              <m:t>q</m:t>
+            </m:r>
+          </m:e>
+          <m:sub>
+            <m:r>
+              <m:rPr>
+                <m:sty m:val="p"/>
+              </m:rPr>
+              <w:rPr>
+                <w:rFonts w:ascii="Cambria Math" w:hAnsi="Cambria Math" w:eastAsia="Cambria Math" w:cs="Cambria Math"/>
+                <w:sz w:val="20"/>
+                <w:szCs w:val="20"/>
+              </w:rPr>
+              <m:t>a,</m:t>
+            </m:r>
+            <m:r>
+              <m:rPr>
+                <m:sty m:val="i"/>
+              </m:rPr>
+              <w:rPr>
+                <w:rFonts w:ascii="Cambria Math" w:hAnsi="Cambria Math" w:eastAsia="Cambria Math" w:cs="Cambria Math"/>
+                <w:sz w:val="20"/>
+                <w:szCs w:val="20"/>
+              </w:rPr>
+              <m:t>j</m:t>
+            </m:r>
+          </m:sub>
+        </m:sSub>
+      </m:oMath>
+      <w:r>
+        <w:rPr>
+          <w:rFonts w:ascii="Times New Roman" w:hAnsi="Times New Roman" w:eastAsia="宋体"/>
+          <w:sz w:val="20"/>
+          <w:szCs w:val="20"/>
+        </w:rPr>
+        <w:t xml:space="preserve">（</w:t>
+      </w:r>
+      <m:oMath>
+        <m:r>
+          <m:rPr>
+            <m:sty m:val="i"/>
+          </m:rPr>
+          <w:rPr>
+            <w:rFonts w:ascii="Cambria Math" w:hAnsi="Cambria Math" w:eastAsia="Cambria Math" w:cs="Cambria Math"/>
+            <w:sz w:val="20"/>
+            <w:szCs w:val="20"/>
+          </w:rPr>
+          <m:t>j</m:t>
+        </m:r>
+        <m:r>
+          <m:rPr>
+            <m:sty m:val="p"/>
+          </m:rPr>
+          <w:rPr>
+            <w:rFonts w:ascii="Cambria Math" w:hAnsi="Cambria Math" w:eastAsia="Cambria Math" w:cs="Cambria Math"/>
+            <w:sz w:val="20"/>
+            <w:szCs w:val="20"/>
+          </w:rPr>
+          <m:t>=1,…,6</m:t>
+        </m:r>
+      </m:oMath>
+      <w:r>
+        <w:rPr>
+          <w:rFonts w:ascii="Times New Roman" w:hAnsi="Times New Roman" w:eastAsia="宋体"/>
+          <w:sz w:val="20"/>
+          <w:szCs w:val="20"/>
+        </w:rPr>
+        <w:t xml:space="preserve">），末端位置和姿态均相对于基坐标系 {0} 表示。</w:t>
+      </w:r>
+      <m:oMath>
+        <m:sSub>
+          <m:e>
+            <m:r>
+              <m:rPr>
+                <m:sty m:val="i"/>
+              </m:rPr>
+              <w:rPr>
+                <w:rFonts w:ascii="Cambria Math" w:hAnsi="Cambria Math" w:eastAsia="Cambria Math" w:cs="Cambria Math"/>
+                <w:sz w:val="20"/>
+                <w:szCs w:val="20"/>
+              </w:rPr>
+              <m:t>a</m:t>
+            </m:r>
+          </m:e>
+          <m:sub>
+            <m:r>
+              <m:rPr>
+                <m:sty m:val="p"/>
+              </m:rPr>
+              <w:rPr>
+                <w:rFonts w:ascii="Cambria Math" w:hAnsi="Cambria Math" w:eastAsia="Cambria Math" w:cs="Cambria Math"/>
+                <w:sz w:val="20"/>
+                <w:szCs w:val="20"/>
+              </w:rPr>
+              <m:t>3</m:t>
+            </m:r>
+          </m:sub>
+        </m:sSub>
+      </m:oMath>
+      <w:r>
+        <w:rPr>
+          <w:rFonts w:ascii="Times New Roman" w:hAnsi="Times New Roman" w:eastAsia="宋体"/>
+          <w:sz w:val="20"/>
+          <w:szCs w:val="20"/>
+        </w:rPr>
+        <w:t xml:space="preserve"> 为肘部连杆偏置，</w:t>
+      </w:r>
+      <m:oMath>
+        <m:sSub>
+          <m:e>
+            <m:r>
+              <m:rPr>
+                <m:sty m:val="i"/>
+              </m:rPr>
+              <w:rPr>
+                <w:rFonts w:ascii="Cambria Math" w:hAnsi="Cambria Math" w:eastAsia="Cambria Math" w:cs="Cambria Math"/>
+                <w:sz w:val="20"/>
+                <w:szCs w:val="20"/>
+              </w:rPr>
+              <m:t>d</m:t>
+            </m:r>
+          </m:e>
+          <m:sub>
+            <m:r>
+              <m:rPr>
+                <m:sty m:val="p"/>
+              </m:rPr>
+              <w:rPr>
+                <w:rFonts w:ascii="Cambria Math" w:hAnsi="Cambria Math" w:eastAsia="Cambria Math" w:cs="Cambria Math"/>
+                <w:sz w:val="20"/>
+                <w:szCs w:val="20"/>
+              </w:rPr>
+              <m:t>4</m:t>
+            </m:r>
+          </m:sub>
+        </m:sSub>
+      </m:oMath>
+      <w:r>
+        <w:rPr>
+          <w:rFonts w:ascii="Times New Roman" w:hAnsi="Times New Roman" w:eastAsia="宋体"/>
+          <w:sz w:val="20"/>
+          <w:szCs w:val="20"/>
+        </w:rPr>
+        <w:t xml:space="preserve"> 为沿第三坐标系 z 轴从其原点至腕心的距离。Fig. 8 所示构型中，坐标系 2、3 原点重合，故取 </w:t>
+      </w:r>
+      <m:oMath>
+        <m:sSub>
+          <m:e>
+            <m:r>
+              <m:rPr>
+                <m:sty m:val="i"/>
+              </m:rPr>
+              <w:rPr>
+                <w:rFonts w:ascii="Cambria Math" w:hAnsi="Cambria Math" w:eastAsia="Cambria Math" w:cs="Cambria Math"/>
+                <w:sz w:val="20"/>
+                <w:szCs w:val="20"/>
+              </w:rPr>
+              <m:t>a</m:t>
+            </m:r>
+          </m:e>
+          <m:sub>
+            <m:r>
+              <m:rPr>
+                <m:sty m:val="p"/>
+              </m:rPr>
+              <w:rPr>
+                <w:rFonts w:ascii="Cambria Math" w:hAnsi="Cambria Math" w:eastAsia="Cambria Math" w:cs="Cambria Math"/>
+                <w:sz w:val="20"/>
+                <w:szCs w:val="20"/>
+              </w:rPr>
+              <m:t>3</m:t>
+            </m:r>
+          </m:sub>
+        </m:sSub>
+        <m:r>
+          <m:rPr>
+            <m:sty m:val="p"/>
+          </m:rPr>
+          <w:rPr>
+            <w:rFonts w:ascii="Cambria Math" w:hAnsi="Cambria Math" w:eastAsia="Cambria Math" w:cs="Cambria Math"/>
+            <w:sz w:val="20"/>
+            <w:szCs w:val="20"/>
+          </w:rPr>
+          <m:t>=0</m:t>
+        </m:r>
+      </m:oMath>
+      <w:r>
+        <w:rPr>
+          <w:rFonts w:ascii="Times New Roman" w:hAnsi="Times New Roman" w:eastAsia="宋体"/>
+          <w:sz w:val="20"/>
+          <w:szCs w:val="20"/>
+        </w:rPr>
+        <w:t xml:space="preserve">。</w:t>
+      </w:r>
+    </w:p>
+    <w:p>
+      <w:pPr>
+        <w:pStyle w:val="7"/>
+        <w:numPr>
+          <w:ilvl w:val="0"/>
+          <w:numId w:val="0"/>
+        </w:numPr>
+        <w:snapToGrid w:val="0"/>
+        <w:rPr>
+          <w:sz w:val="20"/>
+        </w:rPr>
+      </w:pPr>
+      <w:r>
+        <w:rPr>
           <w:rFonts w:hint="eastAsia"/>
           <w:sz w:val="20"/>
           <w:szCs w:val="20"/>
           <w:lang w:eastAsia="zh-CN"/>
         </w:rPr>
-        <w:t>称坐标系</w:t>
+        <w:t>将坐标系 4、5 的重合原点定义为腕心，</w:t>
       </w:r>
       <w:r>
         <w:rPr>
@@ -18387,7 +18947,7 @@
           <w:szCs w:val="20"/>
           <w:lang w:val="en-US" w:eastAsia="zh-CN"/>
         </w:rPr>
-        <w:t>4、5的原点为腕心，</w:t>
+        <w:t/>
       </w:r>
       <w:r>
         <w:rPr>
@@ -23313,7 +23873,7 @@
         <w:snapToGrid w:val="0"/>
       </w:pPr>
       <w:r>
-        <w:t>Fig. 10. Delta 机械臂几何模型。（a）三支链构型，基座原点 O 位于静平台中心，正 X 轴沿平台法向由动平台指向静平台，正 Z 轴从 O 指向 A1，三轴按右手系定义；动平台中心为 P，成对从动杆构成平行四边形并保持两平台平行。（b）对称构型下的单支链剖面，标出平台半径、杆长、主动臂角及等效球心。</w:t>
+        <w:t>Fig. 10. Delta 机械臂几何模型。（a）三支链构型，基座原点 O 位于静平台中心，正 x 轴沿平台法向由动平台指向静平台，正 z 轴从 O 指向 A1，三轴按右手系定义；动平台中心为 P，成对从动杆构成平行四边形并保持两平台平行。（b）对称构型下的单支链剖面，标出平台半径、杆长、主动臂角及等效球心。</w:t>
       </w:r>
     </w:p>
     <w:p>
@@ -27402,18 +27962,166 @@
       </w:pPr>
       <w:r>
         <w:rPr>
-          <w:rFonts w:hint="eastAsia"/>
-          <w:sz w:val="20"/>
-          <w:szCs w:val="20"/>
-        </w:rPr>
-        <w:t>代回第一球面，得到</w:t>
-      </w:r>
-      <w:r>
-        <w:rPr>
-          <w:sz w:val="20"/>
-          <w:szCs w:val="20"/>
-        </w:rPr>
-        <w:t xml:space="preserve"> </w:t>
+          <w:rFonts w:ascii="Times New Roman" w:hAnsi="Times New Roman" w:eastAsia="宋体"/>
+          <w:sz w:val="20"/>
+          <w:szCs w:val="20"/>
+        </w:rPr>
+        <w:t xml:space="preserve">记 </w:t>
+      </w:r>
+      <m:oMath>
+        <m:sSub>
+          <m:e>
+            <m:r>
+              <m:rPr>
+                <m:sty m:val="bi"/>
+              </m:rPr>
+              <w:rPr>
+                <w:rFonts w:ascii="Cambria Math" w:hAnsi="Cambria Math" w:eastAsia="Cambria Math" w:cs="Cambria Math"/>
+                <w:sz w:val="20"/>
+                <w:szCs w:val="20"/>
+              </w:rPr>
+              <m:t>c</m:t>
+            </m:r>
+          </m:e>
+          <m:sub>
+            <m:r>
+              <m:rPr>
+                <m:sty m:val="p"/>
+              </m:rPr>
+              <w:rPr>
+                <w:rFonts w:ascii="Cambria Math" w:hAnsi="Cambria Math" w:eastAsia="Cambria Math" w:cs="Cambria Math"/>
+                <w:sz w:val="20"/>
+                <w:szCs w:val="20"/>
+              </w:rPr>
+              <m:t>1,yz</m:t>
+            </m:r>
+          </m:sub>
+        </m:sSub>
+        <m:r>
+          <m:rPr>
+            <m:sty m:val="p"/>
+          </m:rPr>
+          <w:rPr>
+            <w:rFonts w:ascii="Cambria Math" w:hAnsi="Cambria Math" w:eastAsia="Cambria Math" w:cs="Cambria Math"/>
+            <w:sz w:val="20"/>
+            <w:szCs w:val="20"/>
+          </w:rPr>
+          <m:t>=</m:t>
+        </m:r>
+        <m:sSup>
+          <m:e>
+            <m:r>
+              <m:rPr>
+                <m:sty m:val="p"/>
+              </m:rPr>
+              <w:rPr>
+                <w:rFonts w:ascii="Cambria Math" w:hAnsi="Cambria Math" w:eastAsia="Cambria Math" w:cs="Cambria Math"/>
+                <w:sz w:val="20"/>
+                <w:szCs w:val="20"/>
+              </w:rPr>
+              <m:t>[</m:t>
+            </m:r>
+            <m:sSub>
+              <m:e>
+                <m:r>
+                  <m:rPr>
+                    <m:sty m:val="i"/>
+                  </m:rPr>
+                  <w:rPr>
+                    <w:rFonts w:ascii="Cambria Math" w:hAnsi="Cambria Math" w:eastAsia="Cambria Math" w:cs="Cambria Math"/>
+                    <w:sz w:val="20"/>
+                    <w:szCs w:val="20"/>
+                  </w:rPr>
+                  <m:t>c</m:t>
+                </m:r>
+              </m:e>
+              <m:sub>
+                <m:r>
+                  <m:rPr>
+                    <m:sty m:val="p"/>
+                  </m:rPr>
+                  <w:rPr>
+                    <w:rFonts w:ascii="Cambria Math" w:hAnsi="Cambria Math" w:eastAsia="Cambria Math" w:cs="Cambria Math"/>
+                    <w:sz w:val="20"/>
+                    <w:szCs w:val="20"/>
+                  </w:rPr>
+                  <m:t>1y</m:t>
+                </m:r>
+              </m:sub>
+            </m:sSub>
+            <m:r>
+              <m:rPr>
+                <m:sty m:val="p"/>
+              </m:rPr>
+              <w:rPr>
+                <w:rFonts w:ascii="Cambria Math" w:hAnsi="Cambria Math" w:eastAsia="Cambria Math" w:cs="Cambria Math"/>
+                <w:sz w:val="20"/>
+                <w:szCs w:val="20"/>
+              </w:rPr>
+              <m:t>,</m:t>
+            </m:r>
+            <m:sSub>
+              <m:e>
+                <m:r>
+                  <m:rPr>
+                    <m:sty m:val="i"/>
+                  </m:rPr>
+                  <w:rPr>
+                    <w:rFonts w:ascii="Cambria Math" w:hAnsi="Cambria Math" w:eastAsia="Cambria Math" w:cs="Cambria Math"/>
+                    <w:sz w:val="20"/>
+                    <w:szCs w:val="20"/>
+                  </w:rPr>
+                  <m:t>c</m:t>
+                </m:r>
+              </m:e>
+              <m:sub>
+                <m:r>
+                  <m:rPr>
+                    <m:sty m:val="p"/>
+                  </m:rPr>
+                  <w:rPr>
+                    <w:rFonts w:ascii="Cambria Math" w:hAnsi="Cambria Math" w:eastAsia="Cambria Math" w:cs="Cambria Math"/>
+                    <w:sz w:val="20"/>
+                    <w:szCs w:val="20"/>
+                  </w:rPr>
+                  <m:t>1z</m:t>
+                </m:r>
+              </m:sub>
+            </m:sSub>
+            <m:r>
+              <m:rPr>
+                <m:sty m:val="p"/>
+              </m:rPr>
+              <w:rPr>
+                <w:rFonts w:ascii="Cambria Math" w:hAnsi="Cambria Math" w:eastAsia="Cambria Math" w:cs="Cambria Math"/>
+                <w:sz w:val="20"/>
+                <w:szCs w:val="20"/>
+              </w:rPr>
+              <m:t>]</m:t>
+            </m:r>
+          </m:e>
+          <m:sup>
+            <m:r>
+              <m:rPr>
+                <m:sty m:val="p"/>
+              </m:rPr>
+              <w:rPr>
+                <w:rFonts w:ascii="Cambria Math" w:hAnsi="Cambria Math" w:eastAsia="Cambria Math" w:cs="Cambria Math"/>
+                <w:sz w:val="20"/>
+                <w:szCs w:val="20"/>
+              </w:rPr>
+              <m:t>T</m:t>
+            </m:r>
+          </m:sup>
+        </m:sSup>
+      </m:oMath>
+      <w:r>
+        <w:rPr>
+          <w:rFonts w:ascii="Times New Roman" w:hAnsi="Times New Roman" w:eastAsia="宋体"/>
+          <w:sz w:val="20"/>
+          <w:szCs w:val="20"/>
+        </w:rPr>
+        <w:t xml:space="preserve">，代回第一球面，得到 </w:t>
       </w:r>
       <m:oMath>
         <m:sSub>
@@ -27607,11 +28315,11 @@
       </m:oMath>
       <w:r>
         <w:rPr>
-          <w:rFonts w:hint="eastAsia"/>
-          <w:sz w:val="20"/>
-          <w:szCs w:val="20"/>
-        </w:rPr>
-        <w:t>，其中</w:t>
+          <w:rFonts w:ascii="Times New Roman" w:hAnsi="Times New Roman" w:eastAsia="宋体"/>
+          <w:sz w:val="20"/>
+          <w:szCs w:val="20"/>
+        </w:rPr>
+        <w:t xml:space="preserve">，其中</w:t>
       </w:r>
     </w:p>
     <w:tbl>
@@ -28307,7 +29015,7 @@
           <w:szCs w:val="20"/>
           <w:lang w:eastAsia="zh-CN"/>
         </w:rPr>
-        <w:t xml:space="preserve"> </w:t>
+        <w:t xml:space="preserve">从二次方程候选根中</w:t>
       </w:r>
       <w:r>
         <w:rPr>
@@ -28315,7 +29023,7 @@
           <w:sz w:val="20"/>
           <w:szCs w:val="20"/>
         </w:rPr>
-        <w:t>从二次方程候选根中选择满足工作侧、机构装配分支和连续性条件的根。</w:t>
+        <w:t>选择满足工作侧、机构装配分支和连续性条件的根。</w:t>
       </w:r>
     </w:p>
     <w:bookmarkEnd w:id="12"/>
@@ -28361,7 +29069,7 @@
           <w:szCs w:val="20"/>
           <w:lang w:eastAsia="zh-CN"/>
         </w:rPr>
-        <w:t>为了降低操作员的手部施力负担，进一步提高控制精度，遥操作控制器需要利用</w:t>
+        <w:t>为降低操作员的手部施力负担并改善操作精度，遥操作控制器通过 Delta 机构的三个主动关节施加前馈力矩，补偿机构自重的部分影响。</w:t>
       </w:r>
       <w:r>
         <w:rPr>
@@ -28370,7 +29078,7 @@
           <w:szCs w:val="20"/>
           <w:lang w:val="en-US" w:eastAsia="zh-CN"/>
         </w:rPr>
-        <w:t>Delta机械臂的3个主动关节进行力矩前馈补偿以抵消机构自重的部分影响。</w:t>
+        <w:t/>
       </w:r>
     </w:p>
     <w:p>
@@ -30348,7 +31056,7 @@
           <w:sz w:val="20"/>
           <w:szCs w:val="20"/>
         </w:rPr>
-        <w:t xml:space="preserve">将从端机械臂基坐标系记为 {A}，与 I-C 节的坐标系 0 一致。初始化时记录主端位置零点 </w:t>
+        <w:t xml:space="preserve">将从端机械臂基坐标系记为 {A}，与 I-C 节的坐标系 {0} 一致。初始化时记录主端位置零点 </w:t>
       </w:r>
       <m:oMath>
         <m:sSub>

</xml_diff>

<commit_message>
Specialize arm inverse kinematics to zero elbow offset
</commit_message>
<xml_diff>
--- a/Article.docx
+++ b/Article.docx
@@ -18805,7 +18805,7 @@
                 <w:sz w:val="20"/>
                 <w:szCs w:val="20"/>
               </w:rPr>
-              <m:t>a</m:t>
+              <m:t>d</m:t>
             </m:r>
           </m:e>
           <m:sub>
@@ -18818,7 +18818,7 @@
                 <w:sz w:val="20"/>
                 <w:szCs w:val="20"/>
               </w:rPr>
-              <m:t>3</m:t>
+              <m:t>4</m:t>
             </m:r>
           </m:sub>
         </m:sSub>
@@ -18829,94 +18829,7 @@
           <w:sz w:val="20"/>
           <w:szCs w:val="20"/>
         </w:rPr>
-        <w:t xml:space="preserve"> 为肘部连杆偏置，</w:t>
-      </w:r>
-      <m:oMath>
-        <m:sSub>
-          <m:e>
-            <m:r>
-              <m:rPr>
-                <m:sty m:val="i"/>
-              </m:rPr>
-              <w:rPr>
-                <w:rFonts w:ascii="Cambria Math" w:hAnsi="Cambria Math" w:eastAsia="Cambria Math" w:cs="Cambria Math"/>
-                <w:sz w:val="20"/>
-                <w:szCs w:val="20"/>
-              </w:rPr>
-              <m:t>d</m:t>
-            </m:r>
-          </m:e>
-          <m:sub>
-            <m:r>
-              <m:rPr>
-                <m:sty m:val="p"/>
-              </m:rPr>
-              <w:rPr>
-                <w:rFonts w:ascii="Cambria Math" w:hAnsi="Cambria Math" w:eastAsia="Cambria Math" w:cs="Cambria Math"/>
-                <w:sz w:val="20"/>
-                <w:szCs w:val="20"/>
-              </w:rPr>
-              <m:t>4</m:t>
-            </m:r>
-          </m:sub>
-        </m:sSub>
-      </m:oMath>
-      <w:r>
-        <w:rPr>
-          <w:rFonts w:ascii="Times New Roman" w:hAnsi="Times New Roman" w:eastAsia="宋体"/>
-          <w:sz w:val="20"/>
-          <w:szCs w:val="20"/>
-        </w:rPr>
-        <w:t xml:space="preserve"> 为沿第三坐标系 z 轴从其原点至腕心的距离。Fig. 8 所示构型中，坐标系 2、3 原点重合，故取 </w:t>
-      </w:r>
-      <m:oMath>
-        <m:sSub>
-          <m:e>
-            <m:r>
-              <m:rPr>
-                <m:sty m:val="i"/>
-              </m:rPr>
-              <w:rPr>
-                <w:rFonts w:ascii="Cambria Math" w:hAnsi="Cambria Math" w:eastAsia="Cambria Math" w:cs="Cambria Math"/>
-                <w:sz w:val="20"/>
-                <w:szCs w:val="20"/>
-              </w:rPr>
-              <m:t>a</m:t>
-            </m:r>
-          </m:e>
-          <m:sub>
-            <m:r>
-              <m:rPr>
-                <m:sty m:val="p"/>
-              </m:rPr>
-              <w:rPr>
-                <w:rFonts w:ascii="Cambria Math" w:hAnsi="Cambria Math" w:eastAsia="Cambria Math" w:cs="Cambria Math"/>
-                <w:sz w:val="20"/>
-                <w:szCs w:val="20"/>
-              </w:rPr>
-              <m:t>3</m:t>
-            </m:r>
-          </m:sub>
-        </m:sSub>
-        <m:r>
-          <m:rPr>
-            <m:sty m:val="p"/>
-          </m:rPr>
-          <w:rPr>
-            <w:rFonts w:ascii="Cambria Math" w:hAnsi="Cambria Math" w:eastAsia="Cambria Math" w:cs="Cambria Math"/>
-            <w:sz w:val="20"/>
-            <w:szCs w:val="20"/>
-          </w:rPr>
-          <m:t>=0</m:t>
-        </m:r>
-      </m:oMath>
-      <w:r>
-        <w:rPr>
-          <w:rFonts w:ascii="Times New Roman" w:hAnsi="Times New Roman" w:eastAsia="宋体"/>
-          <w:sz w:val="20"/>
-          <w:szCs w:val="20"/>
-        </w:rPr>
-        <w:t xml:space="preserve">。</w:t>
+        <w:t xml:space="preserve"> 为沿第三坐标系 z 轴从其原点至腕心的距离。</w:t>
       </w:r>
     </w:p>
     <w:p>
@@ -19441,48 +19354,21 @@
           </w:rPr>
           <m:t>=</m:t>
         </m:r>
-        <m:rad>
-          <m:radPr>
-            <m:degHide m:val="1"/>
-          </m:radPr>
-          <m:deg/>
+        <m:sSub>
           <m:e>
-            <m:sSubSup>
-              <m:sSubSupPr/>
-              <m:e>
-                <m:r>
-                  <m:rPr/>
-                  <w:rPr>
-                    <w:rFonts w:ascii="Cambria Math" w:hAnsi="Cambria Math" w:eastAsia="Cambria Math" w:cs="Cambria Math"/>
-                    <w:sz w:val="20"/>
-                    <w:szCs w:val="20"/>
-                  </w:rPr>
-                  <m:t>a</m:t>
-                </m:r>
-              </m:e>
-              <m:sub>
-                <m:r>
-                  <m:rPr/>
-                  <w:rPr>
-                    <w:rFonts w:ascii="Cambria Math" w:hAnsi="Cambria Math" w:eastAsia="Cambria Math" w:cs="Cambria Math"/>
-                    <w:sz w:val="20"/>
-                    <w:szCs w:val="20"/>
-                  </w:rPr>
-                  <m:t>3</m:t>
-                </m:r>
-              </m:sub>
-              <m:sup>
-                <m:r>
-                  <m:rPr/>
-                  <w:rPr>
-                    <w:rFonts w:ascii="Cambria Math" w:hAnsi="Cambria Math" w:eastAsia="Cambria Math" w:cs="Cambria Math"/>
-                    <w:sz w:val="20"/>
-                    <w:szCs w:val="20"/>
-                  </w:rPr>
-                  <m:t>2</m:t>
-                </m:r>
-              </m:sup>
-            </m:sSubSup>
+            <m:r>
+              <m:rPr>
+                <m:sty m:val="i"/>
+              </m:rPr>
+              <w:rPr>
+                <w:rFonts w:ascii="Cambria Math" w:hAnsi="Cambria Math" w:eastAsia="Cambria Math" w:cs="Cambria Math"/>
+                <w:sz w:val="20"/>
+                <w:szCs w:val="20"/>
+              </w:rPr>
+              <m:t>d</m:t>
+            </m:r>
+          </m:e>
+          <m:sub>
             <m:r>
               <m:rPr>
                 <m:sty m:val="p"/>
@@ -19492,173 +19378,10 @@
                 <w:sz w:val="20"/>
                 <w:szCs w:val="20"/>
               </w:rPr>
-              <m:t>+</m:t>
-            </m:r>
-            <m:sSubSup>
-              <m:sSubSupPr/>
-              <m:e>
-                <m:r>
-                  <m:rPr/>
-                  <w:rPr>
-                    <w:rFonts w:ascii="Cambria Math" w:hAnsi="Cambria Math" w:eastAsia="Cambria Math" w:cs="Cambria Math"/>
-                    <w:sz w:val="20"/>
-                    <w:szCs w:val="20"/>
-                  </w:rPr>
-                  <m:t>d</m:t>
-                </m:r>
-              </m:e>
-              <m:sub>
-                <m:r>
-                  <m:rPr/>
-                  <w:rPr>
-                    <w:rFonts w:ascii="Cambria Math" w:hAnsi="Cambria Math" w:eastAsia="Cambria Math" w:cs="Cambria Math"/>
-                    <w:sz w:val="20"/>
-                    <w:szCs w:val="20"/>
-                  </w:rPr>
-                  <m:t>4</m:t>
-                </m:r>
-              </m:sub>
-              <m:sup>
-                <m:r>
-                  <m:rPr/>
-                  <w:rPr>
-                    <w:rFonts w:ascii="Cambria Math" w:hAnsi="Cambria Math" w:eastAsia="Cambria Math" w:cs="Cambria Math"/>
-                    <w:sz w:val="20"/>
-                    <w:szCs w:val="20"/>
-                  </w:rPr>
-                  <m:t>2</m:t>
-                </m:r>
-              </m:sup>
-            </m:sSubSup>
-          </m:e>
-        </m:rad>
-      </m:oMath>
-      <w:r>
-        <w:rPr>
-          <w:rFonts w:hint="eastAsia"/>
-          <w:sz w:val="20"/>
-          <w:szCs w:val="20"/>
-        </w:rPr>
-        <w:t>，肘部偏角为</w:t>
-      </w:r>
-      <w:r>
-        <w:rPr>
-          <w:sz w:val="20"/>
-          <w:szCs w:val="20"/>
-        </w:rPr>
-        <w:t xml:space="preserve"> </w:t>
-      </w:r>
-      <m:oMath>
-        <m:sSub>
-          <m:sSubPr/>
-          <m:e>
-            <m:r>
-              <m:rPr/>
-              <w:rPr>
-                <w:rFonts w:ascii="Cambria Math" w:hAnsi="Cambria Math" w:eastAsia="Cambria Math" w:cs="Cambria Math"/>
-                <w:sz w:val="20"/>
-                <w:szCs w:val="20"/>
-              </w:rPr>
-              <m:t>δ</m:t>
-            </m:r>
-          </m:e>
-          <m:sub>
-            <m:r>
-              <m:rPr>
-                <m:sty m:val="p"/>
-              </m:rPr>
-              <w:rPr>
-                <w:rFonts w:ascii="Cambria Math" w:hAnsi="Cambria Math" w:eastAsia="Cambria Math" w:cs="Cambria Math"/>
-                <w:sz w:val="20"/>
-                <w:szCs w:val="20"/>
-              </w:rPr>
-              <m:t>A</m:t>
+              <m:t>4</m:t>
             </m:r>
           </m:sub>
         </m:sSub>
-        <m:r>
-          <m:rPr>
-            <m:sty m:val="p"/>
-          </m:rPr>
-          <w:rPr>
-            <w:rFonts w:ascii="Cambria Math" w:hAnsi="Cambria Math" w:eastAsia="Cambria Math" w:cs="Cambria Math"/>
-            <w:sz w:val="20"/>
-            <w:szCs w:val="20"/>
-          </w:rPr>
-          <m:t>=atan2(</m:t>
-        </m:r>
-        <m:sSub>
-          <m:sSubPr/>
-          <m:e>
-            <m:r>
-              <m:rPr/>
-              <w:rPr>
-                <w:rFonts w:ascii="Cambria Math" w:hAnsi="Cambria Math" w:eastAsia="Cambria Math" w:cs="Cambria Math"/>
-                <w:sz w:val="20"/>
-                <w:szCs w:val="20"/>
-              </w:rPr>
-              <m:t>a</m:t>
-            </m:r>
-          </m:e>
-          <m:sub>
-            <m:r>
-              <m:rPr/>
-              <w:rPr>
-                <w:rFonts w:ascii="Cambria Math" w:hAnsi="Cambria Math" w:eastAsia="Cambria Math" w:cs="Cambria Math"/>
-                <w:sz w:val="20"/>
-                <w:szCs w:val="20"/>
-              </w:rPr>
-              <m:t>3</m:t>
-            </m:r>
-          </m:sub>
-        </m:sSub>
-        <m:r>
-          <m:rPr>
-            <m:sty m:val="p"/>
-          </m:rPr>
-          <w:rPr>
-            <w:rFonts w:ascii="Cambria Math" w:hAnsi="Cambria Math" w:eastAsia="Cambria Math" w:cs="Cambria Math"/>
-            <w:sz w:val="20"/>
-            <w:szCs w:val="20"/>
-          </w:rPr>
-          <m:t>,</m:t>
-        </m:r>
-        <m:sSub>
-          <m:sSubPr/>
-          <m:e>
-            <m:r>
-              <m:rPr/>
-              <w:rPr>
-                <w:rFonts w:ascii="Cambria Math" w:hAnsi="Cambria Math" w:eastAsia="Cambria Math" w:cs="Cambria Math"/>
-                <w:sz w:val="20"/>
-                <w:szCs w:val="20"/>
-              </w:rPr>
-              <m:t>d</m:t>
-            </m:r>
-          </m:e>
-          <m:sub>
-            <m:r>
-              <m:rPr/>
-              <w:rPr>
-                <w:rFonts w:ascii="Cambria Math" w:hAnsi="Cambria Math" w:eastAsia="Cambria Math" w:cs="Cambria Math"/>
-                <w:sz w:val="20"/>
-                <w:szCs w:val="20"/>
-              </w:rPr>
-              <m:t>4</m:t>
-            </m:r>
-          </m:sub>
-        </m:sSub>
-        <m:r>
-          <m:rPr>
-            <m:sty m:val="p"/>
-          </m:rPr>
-          <w:rPr>
-            <w:rFonts w:ascii="Cambria Math" w:hAnsi="Cambria Math" w:eastAsia="Cambria Math" w:cs="Cambria Math"/>
-            <w:sz w:val="20"/>
-            <w:szCs w:val="20"/>
-          </w:rPr>
-          <m:t>)</m:t>
-        </m:r>
       </m:oMath>
       <w:r>
         <w:rPr>
@@ -20899,44 +20622,6 @@
                         </m:sSub>
                       </m:den>
                     </m:f>
-                    <m:r>
-                      <m:rPr>
-                        <m:sty m:val="p"/>
-                      </m:rPr>
-                      <w:rPr>
-                        <w:rFonts w:ascii="Cambria Math" w:hAnsi="Cambria Math" w:eastAsia="Cambria Math" w:cs="Cambria Math"/>
-                        <w:sz w:val="18"/>
-                        <w:szCs w:val="18"/>
-                      </w:rPr>
-                      <m:t>−</m:t>
-                    </m:r>
-                    <m:sSub>
-                      <m:sSubPr/>
-                      <m:e>
-                        <m:r>
-                          <m:rPr/>
-                          <w:rPr>
-                            <w:rFonts w:ascii="Cambria Math" w:hAnsi="Cambria Math" w:eastAsia="Cambria Math" w:cs="Cambria Math"/>
-                            <w:sz w:val="18"/>
-                            <w:szCs w:val="18"/>
-                          </w:rPr>
-                          <m:t>δ</m:t>
-                        </m:r>
-                      </m:e>
-                      <m:sub>
-                        <m:r>
-                          <m:rPr>
-                            <m:sty m:val="p"/>
-                          </m:rPr>
-                          <w:rPr>
-                            <w:rFonts w:ascii="Cambria Math" w:hAnsi="Cambria Math" w:eastAsia="Cambria Math" w:cs="Cambria Math"/>
-                            <w:sz w:val="18"/>
-                            <w:szCs w:val="18"/>
-                          </w:rPr>
-                          <m:t>A</m:t>
-                        </m:r>
-                      </m:sub>
-                    </m:sSub>
                     <m:r>
                       <m:rPr>
                         <m:sty m:val="p"/>

</xml_diff>

<commit_message>
Clarify velocity and rotation notation after full paper recheck
</commit_message>
<xml_diff>
--- a/Article.docx
+++ b/Article.docx
@@ -6840,6 +6840,52 @@
       </w:pPr>
       <w:r>
         <w:rPr>
+          <w:rFonts w:ascii="Times New Roman" w:hAnsi="Times New Roman" w:eastAsia="宋体"/>
+          <w:sz w:val="20"/>
+          <w:szCs w:val="20"/>
+        </w:rPr>
+        <w:t xml:space="preserve">用 </w:t>
+      </w:r>
+      <m:oMath>
+        <m:sSub>
+          <m:e>
+            <m:r>
+              <m:rPr>
+                <m:sty m:val="bi"/>
+              </m:rPr>
+              <w:rPr>
+                <w:rFonts w:ascii="Cambria Math" w:hAnsi="Cambria Math" w:eastAsia="Cambria Math" w:cs="Cambria Math"/>
+                <w:sz w:val="20"/>
+                <w:szCs w:val="20"/>
+              </w:rPr>
+              <m:t>v</m:t>
+            </m:r>
+          </m:e>
+          <m:sub>
+            <m:r>
+              <m:rPr>
+                <m:sty m:val="i"/>
+              </m:rPr>
+              <w:rPr>
+                <w:rFonts w:ascii="Cambria Math" w:hAnsi="Cambria Math" w:eastAsia="Cambria Math" w:cs="Cambria Math"/>
+                <w:sz w:val="20"/>
+                <w:szCs w:val="20"/>
+              </w:rPr>
+              <m:t>i</m:t>
+            </m:r>
+          </m:sub>
+        </m:sSub>
+      </m:oMath>
+      <w:r>
+        <w:rPr>
+          <w:rFonts w:ascii="Times New Roman" w:hAnsi="Times New Roman" w:eastAsia="宋体"/>
+          <w:sz w:val="20"/>
+          <w:szCs w:val="20"/>
+        </w:rPr>
+        <w:t xml:space="preserve"> 表示第 i 个轮心相对惯性系的速度，其分量在机体系中表示。</w:t>
+      </w:r>
+      <w:r>
+        <w:rPr>
           <w:rFonts w:hint="eastAsia"/>
           <w:sz w:val="20"/>
           <w:szCs w:val="20"/>
@@ -12692,7 +12738,7 @@
           <w:sz w:val="20"/>
           <w:szCs w:val="20"/>
         </w:rPr>
-        <w:t xml:space="preserve">以下各量均在惯性系表示。</w:t>
+        <w:t xml:space="preserve">将整机动力学方程统一写在惯性系下。</w:t>
       </w:r>
       <m:oMath>
         <m:r>
@@ -19857,7 +19903,7 @@
           <w:sz w:val="20"/>
           <w:szCs w:val="20"/>
         </w:rPr>
-        <w:t>，由平面三角形余弦定理，正向高臂分支为</w:t>
+        <w:t>，由平面三角形余弦定理，正对高臂分支为</w:t>
       </w:r>
     </w:p>
     <w:tbl>
@@ -30721,6 +30767,128 @@
           <w:szCs w:val="20"/>
         </w:rPr>
         <w:t xml:space="preserve"> 将手柄姿态坐标系的分量变换至 {D}，该姿态坐标系的原点取位置输入点，即动平台中心。</w:t>
+      </w:r>
+      <w:r>
+        <w:rPr>
+          <w:rFonts w:ascii="Times New Roman" w:hAnsi="Times New Roman" w:eastAsia="宋体"/>
+          <w:sz w:val="20"/>
+          <w:szCs w:val="20"/>
+        </w:rPr>
+        <w:t xml:space="preserve">其中，</w:t>
+      </w:r>
+      <m:oMath>
+        <m:sSub>
+          <m:e>
+            <m:r>
+              <m:rPr>
+                <m:sty m:val="b"/>
+              </m:rPr>
+              <w:rPr>
+                <w:rFonts w:ascii="Cambria Math" w:hAnsi="Cambria Math" w:eastAsia="Cambria Math" w:cs="Cambria Math"/>
+                <w:sz w:val="20"/>
+                <w:szCs w:val="20"/>
+              </w:rPr>
+              <m:t>R</m:t>
+            </m:r>
+          </m:e>
+          <m:sub>
+            <m:r>
+              <m:rPr>
+                <m:sty m:val="p"/>
+              </m:rPr>
+              <w:rPr>
+                <w:rFonts w:ascii="Cambria Math" w:hAnsi="Cambria Math" w:eastAsia="Cambria Math" w:cs="Cambria Math"/>
+                <w:sz w:val="20"/>
+                <w:szCs w:val="20"/>
+              </w:rPr>
+              <m:t>x</m:t>
+            </m:r>
+          </m:sub>
+        </m:sSub>
+      </m:oMath>
+      <w:r>
+        <w:rPr>
+          <w:rFonts w:ascii="Times New Roman" w:hAnsi="Times New Roman" w:eastAsia="宋体"/>
+          <w:sz w:val="20"/>
+          <w:szCs w:val="20"/>
+        </w:rPr>
+        <w:t xml:space="preserve">、</w:t>
+      </w:r>
+      <m:oMath>
+        <m:sSub>
+          <m:e>
+            <m:r>
+              <m:rPr>
+                <m:sty m:val="b"/>
+              </m:rPr>
+              <w:rPr>
+                <w:rFonts w:ascii="Cambria Math" w:hAnsi="Cambria Math" w:eastAsia="Cambria Math" w:cs="Cambria Math"/>
+                <w:sz w:val="20"/>
+                <w:szCs w:val="20"/>
+              </w:rPr>
+              <m:t>R</m:t>
+            </m:r>
+          </m:e>
+          <m:sub>
+            <m:r>
+              <m:rPr>
+                <m:sty m:val="p"/>
+              </m:rPr>
+              <w:rPr>
+                <w:rFonts w:ascii="Cambria Math" w:hAnsi="Cambria Math" w:eastAsia="Cambria Math" w:cs="Cambria Math"/>
+                <w:sz w:val="20"/>
+                <w:szCs w:val="20"/>
+              </w:rPr>
+              <m:t>y</m:t>
+            </m:r>
+          </m:sub>
+        </m:sSub>
+      </m:oMath>
+      <w:r>
+        <w:rPr>
+          <w:rFonts w:ascii="Times New Roman" w:hAnsi="Times New Roman" w:eastAsia="宋体"/>
+          <w:sz w:val="20"/>
+          <w:szCs w:val="20"/>
+        </w:rPr>
+        <w:t xml:space="preserve">、</w:t>
+      </w:r>
+      <m:oMath>
+        <m:sSub>
+          <m:e>
+            <m:r>
+              <m:rPr>
+                <m:sty m:val="b"/>
+              </m:rPr>
+              <w:rPr>
+                <w:rFonts w:ascii="Cambria Math" w:hAnsi="Cambria Math" w:eastAsia="Cambria Math" w:cs="Cambria Math"/>
+                <w:sz w:val="20"/>
+                <w:szCs w:val="20"/>
+              </w:rPr>
+              <m:t>R</m:t>
+            </m:r>
+          </m:e>
+          <m:sub>
+            <m:r>
+              <m:rPr>
+                <m:sty m:val="p"/>
+              </m:rPr>
+              <w:rPr>
+                <w:rFonts w:ascii="Cambria Math" w:hAnsi="Cambria Math" w:eastAsia="Cambria Math" w:cs="Cambria Math"/>
+                <w:sz w:val="20"/>
+                <w:szCs w:val="20"/>
+              </w:rPr>
+              <m:t>z</m:t>
+            </m:r>
+          </m:sub>
+        </m:sSub>
+      </m:oMath>
+      <w:r>
+        <w:rPr>
+          <w:rFonts w:ascii="Times New Roman" w:hAnsi="Times New Roman" w:eastAsia="宋体"/>
+          <w:sz w:val="20"/>
+          <w:szCs w:val="20"/>
+        </w:rPr>
+        <w:t xml:space="preserve"> 分别为绕相应坐标轴的右手基本旋转矩阵。</w:t>
       </w:r>
     </w:p>
     <w:p>

</xml_diff>

<commit_message>
Apply conference template content requirements without changing layout
</commit_message>
<xml_diff>
--- a/Article.docx
+++ b/Article.docx
@@ -47,7 +47,7 @@
         <w:rPr>
           <w:rFonts w:hint="eastAsia"/>
         </w:rPr>
-        <w:t>作者、单位及通信邮箱：待作者确认。</w:t>
+        <w:t/>
       </w:r>
     </w:p>
     <w:p>
@@ -213,7 +213,7 @@
           <w:sz w:val="20"/>
           <w:szCs w:val="20"/>
         </w:rPr>
-        <w:t>机械臂模块安装于底盘上方，由六轴串联机械臂和夹爪组成。机械臂采用肘式臂与球腕结构，前三个关节主要确定腕心位置，后三个关节确定末端姿态；夹爪的开合自由度用于抓取。机械臂连杆采用碳纤维板与铝制加工件，夹爪采用连杆与滑轨机构 [1]。</w:t>
+        <w:t>机械臂模块安装于底盘上方，由六轴串联机械臂和夹爪组成。机械臂采用肘式臂与球腕结构，并按 Denavit–Hartenberg（DH）法定义关节坐标系；前三个关节主要确定腕心位置，后三个关节确定末端姿态；夹爪的开合自由度用于抓取。机械臂连杆采用碳纤维板与铝制加工件，夹爪采用连杆与滑轨机构 [1]。</w:t>
       </w:r>
     </w:p>
     <w:p>
@@ -234,7 +234,7 @@
           <w:sz w:val="20"/>
           <w:szCs w:val="20"/>
         </w:rPr>
-        <w:t>遥操作控制器作为主手，以三支链 Delta 并联机构测量三维位置，以安装在动平台上的三编码器手柄测量姿态。平行四边形从动臂使动平台始终与静平台保持平行，将平移输入与姿态输入分离；手柄从 j1 到 j3 依次对应动轴 roll、pitch、yaw。主手通过正运动学获得位置和姿态，并经无线链路向作为从手的机械臂发送位姿指令；主手的力矩前馈用于补偿自身重力，减轻静态持握负担。</w:t>
+        <w:t>遥操作控制器作为主手，以三支链 Delta 并联机构测量三维位置，以安装在动平台上的三编码器手柄测量姿态。平行四边形从动臂使动平台始终与静平台保持平行，将平移输入与姿态输入分离；手柄从 j1 到 j3 依次对应动轴滚转（roll）、俯仰（pitch）和偏航（yaw），简称 RPY。主手通过正运动学获得位置和姿态，并经无线链路向作为从手的机械臂发送位姿指令；主手的力矩前馈用于补偿自身重力，减轻静态持握负担。</w:t>
       </w:r>
     </w:p>
     <w:p>
@@ -419,7 +419,7 @@
           <w:sz w:val="20"/>
           <w:szCs w:val="20"/>
         </w:rPr>
-        <w:t>整机控制流程如 Fig. 2 所示。底盘接收期望平动速度、加速度、基准高度及滚转、俯仰姿态角，分为关节控制器、麦克纳姆轮控制器和模型前馈三路。姿态角度—角速度双环 P 控制器根据 IMU 反馈产生等效腿长增量，经累加、腿高分配和腿部逆运动学得到目标关节角，再由单关节位置—速度串级 PID 输出控制力矩；麦克纳姆轮运动学给出轮电机目标速度，由速度环 PID 输出控制力矩。前馈侧先由单刚体动力学分配期望足端力，再经轮体动力学与腿部连杆力映射得到电机前馈力矩。关节和轮电机分别将控制器输出与对应前馈力矩相加。</w:t>
+        <w:t>整机控制流程如 Fig. 2 所示。底盘接收期望平动速度、加速度、基准高度及滚转、俯仰姿态角，分为关节控制器、麦克纳姆轮控制器和模型前馈三路。姿态角度—角速度双环比例（proportional，P）控制器根据惯性测量单元（inertial measurement unit，IMU）的反馈产生等效腿长增量，经累加、腿高分配和腿部逆运动学得到目标关节角，再由单关节位置—速度串级比例–积分–微分（proportional–integral–derivative，PID）控制输出控制力矩；麦克纳姆轮运动学给出轮电机目标速度，由速度环 PID 输出控制力矩。前馈侧先由单刚体动力学分配期望足端力，再经轮体动力学与腿部连杆力映射得到电机前馈力矩。关节和轮电机分别将控制器输出与对应前馈力矩相加。</w:t>
       </w:r>
     </w:p>
     <w:p>
@@ -509,7 +509,7 @@
         <w:rPr>
           <w:rFonts w:hint="eastAsia"/>
         </w:rPr>
-        <w:t>Fig. 2. 整机控制流程。（a）遥操作位姿映射与机械臂控制。（b）底盘关节控制、麦克纳姆轮控制及前馈三路结构；单刚体动力学得到期望足端力，经轮体动力学与腿部连杆力映射得到电机前馈力矩。关节与轮电机分别将控制器输出和前馈力矩相加。实线为前向信号路径，虚线为测量反馈；FF 表示前馈。</w:t>
+        <w:t>Fig. 2. 整机控制流程。（a）遥操作位姿映射与机械臂控制。（b）底盘关节控制、麦克纳姆轮控制及前馈三路结构；单刚体动力学得到期望足端力，经轮体动力学与腿部连杆力映射得到电机前馈力矩。关节与轮电机分别将控制器输出和前馈力矩相加。实线为前向信号路径，虚线为测量反馈；FF 表示前馈（feedforward）。</w:t>
       </w:r>
     </w:p>
     <w:p>
@@ -7093,7 +7093,7 @@
           <w:sz w:val="20"/>
           <w:szCs w:val="20"/>
         </w:rPr>
-        <w:t>为基座原点速度，</w:t>
+        <w:t>为基座原点速度，机身角速度为 </w:t>
       </w:r>
       <m:oMath>
         <m:sSub>
@@ -7480,6 +7480,52 @@
           <w:sz w:val="20"/>
         </w:rPr>
       </w:pPr>
+      <w:r>
+        <w:rPr>
+          <w:rFonts w:ascii="Times New Roman" w:hAnsi="Times New Roman" w:eastAsia="宋体"/>
+          <w:sz w:val="20"/>
+          <w:szCs w:val="20"/>
+        </w:rPr>
+        <w:t xml:space="preserve">轮毂自转角速度标量记为 </w:t>
+      </w:r>
+      <m:oMath>
+        <m:sSub>
+          <m:e>
+            <m:r>
+              <m:rPr>
+                <m:sty m:val="i"/>
+              </m:rPr>
+              <w:rPr>
+                <w:rFonts w:ascii="Cambria Math" w:hAnsi="Cambria Math" w:eastAsia="Cambria Math" w:cs="Cambria Math"/>
+                <w:sz w:val="20"/>
+                <w:szCs w:val="20"/>
+              </w:rPr>
+              <m:t>ω</m:t>
+            </m:r>
+          </m:e>
+          <m:sub>
+            <m:r>
+              <m:rPr>
+                <m:sty m:val="i"/>
+              </m:rPr>
+              <w:rPr>
+                <w:rFonts w:ascii="Cambria Math" w:hAnsi="Cambria Math" w:eastAsia="Cambria Math" w:cs="Cambria Math"/>
+                <w:sz w:val="20"/>
+                <w:szCs w:val="20"/>
+              </w:rPr>
+              <m:t>i</m:t>
+            </m:r>
+          </m:sub>
+        </m:sSub>
+      </m:oMath>
+      <w:r>
+        <w:rPr>
+          <w:rFonts w:ascii="Times New Roman" w:hAnsi="Times New Roman" w:eastAsia="宋体"/>
+          <w:sz w:val="20"/>
+          <w:szCs w:val="20"/>
+        </w:rPr>
+        <w:t xml:space="preserve">。</w:t>
+      </w:r>
       <w:r>
         <w:rPr>
           <w:rFonts w:hint="eastAsia"/>
@@ -9064,7 +9110,7 @@
           <w:sz w:val="20"/>
           <w:szCs w:val="20"/>
         </w:rPr>
-        <w:t>式（8）保留了普通车轮的滚动项与辊子带来的侧向项。轮毂相对小腿的编码器速度与绝对自转速度还相差小腿绕轮轴的转速；腿部运动时应进行相应补偿。</w:t>
+        <w:t>式 (8)保留了普通车轮的滚动项与辊子带来的侧向项。轮毂相对小腿的编码器速度与绝对自转速度还相差小腿绕轮轴的转速；腿部运动时应进行相应补偿。</w:t>
       </w:r>
     </w:p>
     <w:bookmarkEnd w:id="6"/>
@@ -10833,6 +10879,55 @@
           <w:szCs w:val="20"/>
         </w:rPr>
         <w:t>该关系描述机构几何耦合，电机转子侧减速比需要另行换算。令</w:t>
+      </w:r>
+      <m:oMath>
+        <m:r>
+          <m:rPr>
+            <m:sty m:val="i"/>
+          </m:rPr>
+          <w:rPr>
+            <w:rFonts w:ascii="Cambria Math" w:hAnsi="Cambria Math" w:eastAsia="Cambria Math" w:cs="Cambria Math"/>
+            <w:sz w:val="20"/>
+            <w:szCs w:val="20"/>
+          </w:rPr>
+          <m:t>δ</m:t>
+        </m:r>
+        <m:sSub>
+          <m:e>
+            <m:r>
+              <m:rPr>
+                <m:sty m:val="bi"/>
+              </m:rPr>
+              <w:rPr>
+                <w:rFonts w:ascii="Cambria Math" w:hAnsi="Cambria Math" w:eastAsia="Cambria Math" w:cs="Cambria Math"/>
+                <w:sz w:val="20"/>
+                <w:szCs w:val="20"/>
+              </w:rPr>
+              <m:t>q</m:t>
+            </m:r>
+          </m:e>
+          <m:sub>
+            <m:r>
+              <m:rPr>
+                <m:sty m:val="p"/>
+              </m:rPr>
+              <w:rPr>
+                <w:rFonts w:ascii="Cambria Math" w:hAnsi="Cambria Math" w:eastAsia="Cambria Math" w:cs="Cambria Math"/>
+                <w:sz w:val="20"/>
+                <w:szCs w:val="20"/>
+              </w:rPr>
+              <m:t>leg</m:t>
+            </m:r>
+          </m:sub>
+        </m:sSub>
+      </m:oMath>
+      <w:r>
+        <w:rPr>
+          <w:rFonts w:ascii="Times New Roman" w:hAnsi="Times New Roman" w:eastAsia="宋体"/>
+          <w:sz w:val="20"/>
+          <w:szCs w:val="20"/>
+        </w:rPr>
+        <w:t xml:space="preserve"> 表示虚关节位移。</w:t>
       </w:r>
       <w:r>
         <w:rPr>
@@ -14160,6 +14255,111 @@
       </w:pPr>
       <w:r>
         <w:rPr>
+          <w:rFonts w:ascii="Times New Roman" w:hAnsi="Times New Roman" w:eastAsia="宋体"/>
+          <w:sz w:val="20"/>
+          <w:szCs w:val="20"/>
+        </w:rPr>
+        <w:t xml:space="preserve">其中，</w:t>
+      </w:r>
+      <m:oMath>
+        <m:r>
+          <m:rPr>
+            <m:sty m:val="b"/>
+          </m:rPr>
+          <w:rPr>
+            <w:rFonts w:ascii="Cambria Math" w:hAnsi="Cambria Math" w:eastAsia="Cambria Math" w:cs="Cambria Math"/>
+            <w:sz w:val="20"/>
+            <w:szCs w:val="20"/>
+          </w:rPr>
+          <m:t>H</m:t>
+        </m:r>
+      </m:oMath>
+      <w:r>
+        <w:rPr>
+          <w:rFonts w:ascii="Times New Roman" w:hAnsi="Times New Roman" w:eastAsia="宋体"/>
+          <w:sz w:val="20"/>
+          <w:szCs w:val="20"/>
+        </w:rPr>
+        <w:t xml:space="preserve"> 将各接触力映射为整机合力与合力矩，</w:t>
+      </w:r>
+      <m:oMath>
+        <m:sSub>
+          <m:e>
+            <m:r>
+              <m:rPr>
+                <m:sty m:val="bi"/>
+              </m:rPr>
+              <w:rPr>
+                <w:rFonts w:ascii="Cambria Math" w:hAnsi="Cambria Math" w:eastAsia="Cambria Math" w:cs="Cambria Math"/>
+                <w:sz w:val="20"/>
+                <w:szCs w:val="20"/>
+              </w:rPr>
+              <m:t>f</m:t>
+            </m:r>
+          </m:e>
+          <m:sub>
+            <m:r>
+              <m:rPr>
+                <m:sty m:val="p"/>
+              </m:rPr>
+              <w:rPr>
+                <w:rFonts w:ascii="Cambria Math" w:hAnsi="Cambria Math" w:eastAsia="Cambria Math" w:cs="Cambria Math"/>
+                <w:sz w:val="20"/>
+                <w:szCs w:val="20"/>
+              </w:rPr>
+              <m:t>e</m:t>
+            </m:r>
+          </m:sub>
+        </m:sSub>
+      </m:oMath>
+      <w:r>
+        <w:rPr>
+          <w:rFonts w:ascii="Times New Roman" w:hAnsi="Times New Roman" w:eastAsia="宋体"/>
+          <w:sz w:val="20"/>
+          <w:szCs w:val="20"/>
+        </w:rPr>
+        <w:t xml:space="preserve"> 为四轮接触力的堆叠向量，</w:t>
+      </w:r>
+      <m:oMath>
+        <m:sSub>
+          <m:e>
+            <m:r>
+              <m:rPr>
+                <m:sty m:val="bi"/>
+              </m:rPr>
+              <w:rPr>
+                <w:rFonts w:ascii="Cambria Math" w:hAnsi="Cambria Math" w:eastAsia="Cambria Math" w:cs="Cambria Math"/>
+                <w:sz w:val="20"/>
+                <w:szCs w:val="20"/>
+              </w:rPr>
+              <m:t>b</m:t>
+            </m:r>
+          </m:e>
+          <m:sub>
+            <m:r>
+              <m:rPr>
+                <m:sty m:val="p"/>
+              </m:rPr>
+              <w:rPr>
+                <w:rFonts w:ascii="Cambria Math" w:hAnsi="Cambria Math" w:eastAsia="Cambria Math" w:cs="Cambria Math"/>
+                <w:sz w:val="20"/>
+                <w:szCs w:val="20"/>
+              </w:rPr>
+              <m:t>dyn</m:t>
+            </m:r>
+          </m:sub>
+        </m:sSub>
+      </m:oMath>
+      <w:r>
+        <w:rPr>
+          <w:rFonts w:ascii="Times New Roman" w:hAnsi="Times New Roman" w:eastAsia="宋体"/>
+          <w:sz w:val="20"/>
+          <w:szCs w:val="20"/>
+        </w:rPr>
+        <w:t xml:space="preserve"> 为所需接触合力与合力矩组成的向量。</w:t>
+      </w:r>
+      <w:r>
+        <w:rPr>
           <w:rFonts w:hint="eastAsia"/>
           <w:sz w:val="20"/>
           <w:szCs w:val="20"/>
@@ -16362,7 +16562,7 @@
           <w:sz w:val="20"/>
           <w:szCs w:val="20"/>
         </w:rPr>
-        <w:t xml:space="preserve"> 为姿态角误差，单位均为 rad。</w:t>
+        <w:t xml:space="preserve"> 为姿态角误差，单位均为弧度。</w:t>
       </w:r>
       <m:oMath>
         <m:acc>
@@ -16494,7 +16694,7 @@
           <w:sz w:val="20"/>
           <w:szCs w:val="20"/>
         </w:rPr>
-        <w:t xml:space="preserve"> 为角度环给出的期望角速度，单位为 rad/s。</w:t>
+        <w:t xml:space="preserve"> 为角度环给出的期望角速度，单位为弧度每秒。</w:t>
       </w:r>
     </w:p>
     <w:p>
@@ -16808,7 +17008,7 @@
           <w:sz w:val="20"/>
           <w:szCs w:val="20"/>
         </w:rPr>
-        <w:t xml:space="preserve"> 为上一周期的值；高度修正量及其增量的单位均为 m。</w:t>
+        <w:t xml:space="preserve"> 为上一周期的值；高度修正量及其增量的单位均为米。</w:t>
       </w:r>
     </w:p>
     <w:p>
@@ -17032,7 +17232,7 @@
           <w:sz w:val="20"/>
           <w:szCs w:val="20"/>
         </w:rPr>
-        <w:t xml:space="preserve"> 分别为前后、左右轮心间距的一半，均为正值，上述长度的单位均为 m。在四腿近似对称、小姿态角和触点高度暂时固定的条件下，可将修正分配为</w:t>
+        <w:t xml:space="preserve"> 分别为前后、左右轮心间距的一半，均为正值，上述长度的单位均为米。在四腿近似对称、小姿态角和触点高度暂时固定的条件下，可将修正分配为</w:t>
       </w:r>
     </w:p>
     <w:tbl>
@@ -17641,7 +17841,7 @@
           <w:sz w:val="20"/>
           <w:szCs w:val="20"/>
         </w:rPr>
-        <w:t xml:space="preserve"> 条腿的期望支撑高度，均以向下为正、单位为 m；</w:t>
+        <w:t xml:space="preserve"> 条腿的期望支撑高度，均以向下为正、单位为米；</w:t>
       </w:r>
       <m:oMath>
         <m:sSub>
@@ -18063,7 +18263,7 @@
         <w:snapToGrid w:val="0"/>
       </w:pPr>
       <w:r>
-        <w:t>Fig. 7. 底盘姿态控制器闭环方框图。滚转与俯仰分别采用式（18）的双环 P 控制及高度增量累加，两轴修正量经式（19）共同分配至四腿；关节伺服内环合并表示。</w:t>
+        <w:t>Fig. 7. 底盘姿态控制器闭环方框图。滚转与俯仰分别采用(18)的双环 P 控制及高度增量累加，两轴修正量经(19)共同分配至四腿；关节伺服内环合并表示。</w:t>
       </w:r>
     </w:p>
     <w:bookmarkEnd w:id="4"/>
@@ -18106,7 +18306,7 @@
           <w:sz w:val="20"/>
           <w:szCs w:val="20"/>
         </w:rPr>
-        <w:t>六轴机械臂采用肘式臂与球腕结构，末三轴交于腕心，可将逆解分为前三轴定位和后三轴定姿。给定末端目标位置</w:t>
+        <w:t>六轴机械臂采用肘式臂与球腕结构，末三轴交于腕心，可将逆解分为前三轴定位和后三轴定姿。关节坐标系与连杆尺寸如 Fig. 8 所示。给定基坐标系 {0} 下的末端目标位置</w:t>
       </w:r>
       <w:r>
         <w:rPr>
@@ -18201,7 +18401,7 @@
           <w:sz w:val="20"/>
           <w:szCs w:val="20"/>
         </w:rPr>
-        <w:t>，按照本文的工具坐标约定，腕心沿工具负</w:t>
+        <w:t>，按照本文的工具坐标约定，腕心位置由末端沿工具负</w:t>
       </w:r>
       <w:r>
         <w:rPr>
@@ -18276,7 +18476,45 @@
           <w:sz w:val="20"/>
           <w:szCs w:val="20"/>
         </w:rPr>
-        <w:t>：</w:t>
+        <w:t> 得到，记为 </w:t>
+      </w:r>
+      <m:oMath>
+        <m:sSub>
+          <m:e>
+            <m:r>
+              <m:rPr>
+                <m:sty m:val="bi"/>
+              </m:rPr>
+              <w:rPr>
+                <w:rFonts w:ascii="Cambria Math" w:hAnsi="Cambria Math" w:eastAsia="Cambria Math" w:cs="Cambria Math"/>
+                <w:sz w:val="20"/>
+                <w:szCs w:val="20"/>
+              </w:rPr>
+              <m:t>p</m:t>
+            </m:r>
+          </m:e>
+          <m:sub>
+            <m:r>
+              <m:rPr>
+                <m:sty m:val="p"/>
+              </m:rPr>
+              <w:rPr>
+                <w:rFonts w:ascii="Cambria Math" w:hAnsi="Cambria Math" w:eastAsia="Cambria Math" w:cs="Cambria Math"/>
+                <w:sz w:val="20"/>
+                <w:szCs w:val="20"/>
+              </w:rPr>
+              <m:t>W</m:t>
+            </m:r>
+          </m:sub>
+        </m:sSub>
+      </m:oMath>
+      <w:r>
+        <w:rPr>
+          <w:rFonts w:ascii="Times New Roman" w:hAnsi="Times New Roman" w:eastAsia="宋体"/>
+          <w:sz w:val="20"/>
+          <w:szCs w:val="20"/>
+        </w:rPr>
+        <w:t xml:space="preserve">：</w:t>
       </w:r>
     </w:p>
     <w:tbl>
@@ -20731,7 +20969,7 @@
           <w:sz w:val="20"/>
           <w:szCs w:val="20"/>
         </w:rPr>
-        <w:t>前三轴确定旋转矩阵</w:t>
+        <w:t>由前三轴关节角确定坐标系 {3} 到 {0} 的旋转矩阵</w:t>
       </w:r>
       <w:r>
         <w:rPr>
@@ -21617,11 +21855,57 @@
       </m:oMath>
       <w:r>
         <w:rPr>
+          <w:rFonts w:ascii="Times New Roman" w:hAnsi="Times New Roman" w:eastAsia="宋体"/>
+          <w:sz w:val="20"/>
+          <w:szCs w:val="20"/>
+        </w:rPr>
+        <w:t xml:space="preserve">；</w:t>
+      </w:r>
+      <m:oMath>
+        <m:sSub>
+          <m:e>
+            <m:r>
+              <m:rPr>
+                <m:sty m:val="i"/>
+              </m:rPr>
+              <w:rPr>
+                <w:rFonts w:ascii="Cambria Math" w:hAnsi="Cambria Math" w:eastAsia="Cambria Math" w:cs="Cambria Math"/>
+                <w:sz w:val="20"/>
+                <w:szCs w:val="20"/>
+              </w:rPr>
+              <m:t>θ</m:t>
+            </m:r>
+          </m:e>
+          <m:sub>
+            <m:r>
+              <m:rPr>
+                <m:sty m:val="i"/>
+              </m:rPr>
+              <w:rPr>
+                <w:rFonts w:ascii="Cambria Math" w:hAnsi="Cambria Math" w:eastAsia="Cambria Math" w:cs="Cambria Math"/>
+                <w:sz w:val="20"/>
+                <w:szCs w:val="20"/>
+              </w:rPr>
+              <m:t>j</m:t>
+            </m:r>
+          </m:sub>
+        </m:sSub>
+      </m:oMath>
+      <w:r>
+        <w:rPr>
+          <w:rFonts w:ascii="Times New Roman" w:hAnsi="Times New Roman" w:eastAsia="宋体"/>
+          <w:sz w:val="20"/>
+          <w:szCs w:val="20"/>
+        </w:rPr>
+        <w:t xml:space="preserve"> 为标准 DH 关节角，其中</w:t>
+      </w:r>
+      <w:r>
+        <w:rPr>
           <w:rFonts w:hint="eastAsia"/>
           <w:sz w:val="20"/>
           <w:szCs w:val="20"/>
         </w:rPr>
-        <w:t>，其中</w:t>
+        <w:t/>
       </w:r>
       <w:r>
         <w:rPr>
@@ -22737,7 +23021,7 @@
           <w:sz w:val="20"/>
           <w:szCs w:val="20"/>
         </w:rPr>
-        <w:t xml:space="preserve"> 轴在静平台平面内从 O 指向 </w:t>
+        <w:t xml:space="preserve"> 轴在静平台平面内从 O 指向第一支链的静平台连接点 </w:t>
       </w:r>
       <m:oMath>
         <m:sSub>
@@ -23538,7 +23822,7 @@
           <w:sz w:val="20"/>
           <w:szCs w:val="20"/>
         </w:rPr>
-        <w:t xml:space="preserve"> 工作侧转动为正。几何关系如 Fig. 10 所示；单支链图采用对称构型展示角度与长度定义，虚线段对应式（25）中的等效长度约束。</w:t>
+        <w:t xml:space="preserve"> 工作侧转动为正。几何关系如 Fig. 10 所示；单支链图采用对称构型展示角度与长度定义，虚线段对应(25)中的等效长度约束。</w:t>
       </w:r>
     </w:p>
     <w:p>
@@ -30035,7 +30319,7 @@
           <w:sz w:val="20"/>
           <w:szCs w:val="20"/>
         </w:rPr>
-        <w:t>，单位为 rad。j1 绕初始 x 轴旋转，j2 绕经 j1 旋转后的 y 轴旋转，j3 绕经前两关节旋转后的 z 轴旋转，正向均遵循右手定则。主端旋转矩阵及位姿输入的齐次矩阵为</w:t>
+        <w:t>，单位为弧度。j1 绕初始 x 轴旋转，j2 绕经 j1 旋转后的 y 轴旋转，j3 绕经前两关节旋转后的 z 轴旋转，正向均遵循右手定则。主端旋转矩阵及位姿输入的齐次矩阵为</w:t>
       </w:r>
     </w:p>
     <w:tbl>
@@ -31775,7 +32059,7 @@
           <w:sz w:val="20"/>
           <w:szCs w:val="20"/>
         </w:rPr>
-        <w:t>将式（33）的目标位置和姿态重新组合，得到从端末端相对机械臂基座的目标齐次变换矩阵：</w:t>
+        <w:t>将(33)的目标位置和姿态重新组合，得到从端末端相对机械臂基座的目标齐次变换矩阵：</w:t>
       </w:r>
       <w:bookmarkStart w:id="18" w:name="_GoBack"/>
       <w:bookmarkEnd w:id="18"/>
@@ -32082,7 +32366,7 @@
           <w:sz w:val="20"/>
           <w:szCs w:val="20"/>
         </w:rPr>
-        <w:t>该矩阵的旋转块与平移列分别对应 I-C 节的末端目标姿态和位置，关节指令由解析逆解得到：</w:t>
+        <w:t>该矩阵的旋转块与平移列分别对应 I-C 节的末端目标姿态和位置，关节指令由解析逆运动学（inverse kinematics，IK）映射得到：</w:t>
       </w:r>
     </w:p>
     <w:tbl>
@@ -32458,7 +32742,7 @@
           <w:sz w:val="20"/>
           <w:szCs w:val="20"/>
         </w:rPr>
-        <w:t xml:space="preserve">具体而言，先由式（20）扣除工具偏置得到腕心，再由式（21）计算前三个关节角；随后用式（22）求腕部相对姿态 </w:t>
+        <w:t xml:space="preserve">具体而言，先由(20)扣除工具偏置得到腕心，再由(21)计算前三个关节角；随后用(22)求腕部相对姿态 </w:t>
       </w:r>
       <m:oMath>
         <m:sSub>
@@ -32497,7 +32781,7 @@
           <w:sz w:val="20"/>
           <w:szCs w:val="20"/>
         </w:rPr>
-        <w:t xml:space="preserve">，由式（23）及零位偏置得到后三个关节角。保留满足关节限位且与上一时刻最接近的可行解，作为六轴关节指令 </w:t>
+        <w:t xml:space="preserve">，由(23)及零位偏置得到后三个关节角。保留满足关节限位且与上一时刻最接近的可行解，作为六轴关节指令 </w:t>
       </w:r>
       <m:oMath>
         <m:sSub>
@@ -32671,7 +32955,7 @@
           <w:sz w:val="20"/>
           <w:szCs w:val="20"/>
         </w:rPr>
-        <w:t>资助项目、合作单位及需致谢人员待作者确认。</w:t>
+        <w:t/>
       </w:r>
     </w:p>
     <w:bookmarkEnd w:id="16"/>
@@ -32709,7 +32993,7 @@
         <w:rPr>
           <w:rFonts w:hint="eastAsia"/>
         </w:rPr>
-        <w:t>“机械部分，”项目机械设计资料，未正式出版，作者与成稿日期待确认，仓库文件：机械部分.docx。</w:t>
+        <w:t>“机械部分，”项目机械设计资料，未出版。</w:t>
       </w:r>
     </w:p>
     <w:bookmarkEnd w:id="0"/>

</xml_diff>

<commit_message>
Introduce mechanical structure before module controls and remove stop descriptions
</commit_message>
<xml_diff>
--- a/Article.docx
+++ b/Article.docx
@@ -1550,7 +1550,49 @@
           <w:sz w:val="20"/>
           <w:szCs w:val="20"/>
         </w:rPr>
-        <w:t>底盘由基座与四条腿组成，每条腿包含轴线平行的髋部俯仰关节、膝关节和一个麦克纳姆轮，共十二个主动自由度。控制采用“单腿建模—整机合力分配—关节执行”的分层结构。腿部关节调整支撑高度与前后轮心位置，车轮负责平面滚动。</w:t>
+        <w:t>底盘由基座与四条腿组成，每条腿包含轴线平行的髋部俯仰关节、膝关节和一个麦克纳姆轮，共十二个主动自由度。前后腿采用相同的几何参数，左右腿呈镜像布置。机身采用上下分层框架，上层以碳纤维方管和板件构成承载结构，下层采用铝方管，并在框架内部布置电源、电气元件、线束及机械臂基座传动组件。底部导向滚轮用于辅助接触过渡并减少底面刮擦。</w:t>
+      </w:r>
+    </w:p>
+    <w:p>
+      <w:pPr>
+        <w:pStyle w:val="7"/>
+        <w:numPr>
+          <w:ilvl w:val="0"/>
+          <w:numId w:val="0"/>
+        </w:numPr>
+        <w:snapToGrid w:val="0"/>
+        <w:rPr>
+          <w:sz w:val="20"/>
+        </w:rPr>
+      </w:pPr>
+      <w:r>
+        <w:rPr>
+          <w:rFonts w:ascii="Times New Roman" w:hAnsi="Times New Roman" w:eastAsia="宋体"/>
+          <w:sz w:val="20"/>
+          <w:szCs w:val="20"/>
+        </w:rPr>
+        <w:t xml:space="preserve">两路腿部驱动同轴集中布置于髋部，其中一路直接驱动大腿，另一路通过平行四边形连杆向小腿传递运动与力矩。该布置使膝部无需安装随腿摆动的驱动电机，并使轮心定位可采用等效二转动关节模型描述。杆件上的局部镂空与走线槽分别服务于减重和线束布置，便于结构与电气系统集成。</w:t>
+      </w:r>
+    </w:p>
+    <w:p>
+      <w:pPr>
+        <w:pStyle w:val="7"/>
+        <w:numPr>
+          <w:ilvl w:val="0"/>
+          <w:numId w:val="0"/>
+        </w:numPr>
+        <w:snapToGrid w:val="0"/>
+        <w:rPr>
+          <w:sz w:val="20"/>
+        </w:rPr>
+      </w:pPr>
+      <w:r>
+        <w:rPr>
+          <w:rFonts w:ascii="Times New Roman" w:hAnsi="Times New Roman" w:eastAsia="宋体"/>
+          <w:sz w:val="20"/>
+          <w:szCs w:val="20"/>
+        </w:rPr>
+        <w:t xml:space="preserve">控制采用“单腿建模—整机合力分配—关节执行”的分层结构。腿部关节调整支撑高度与前后轮心位置，车轮负责平面滚动。</w:t>
       </w:r>
     </w:p>
     <w:p>
@@ -18285,7 +18327,64 @@
         <w:rPr>
           <w:rFonts w:hint="eastAsia"/>
         </w:rPr>
-        <w:t>机械臂逆运动学</w:t>
+        <w:t>机械臂模块</w:t>
+      </w:r>
+    </w:p>
+    <w:p>
+      <w:pPr>
+        <w:pStyle w:val="4"/>
+        <w:numPr>
+          <w:ilvl w:val="2"/>
+          <w:numId w:val="0"/>
+        </w:numPr>
+        <w:snapToGrid w:val="0"/>
+      </w:pPr>
+      <w:r>
+        <w:rPr>
+          <w:rFonts w:ascii="Times New Roman" w:hAnsi="Times New Roman" w:eastAsia="宋体"/>
+          <w:sz w:val="20"/>
+          <w:szCs w:val="20"/>
+        </w:rPr>
+        <w:t xml:space="preserve">1) 结构概述</w:t>
+      </w:r>
+    </w:p>
+    <w:p>
+      <w:pPr>
+        <w:pStyle w:val="7"/>
+        <w:numPr>
+          <w:ilvl w:val="0"/>
+          <w:numId w:val="0"/>
+        </w:numPr>
+        <w:snapToGrid w:val="0"/>
+        <w:rPr>
+          <w:sz w:val="20"/>
+        </w:rPr>
+      </w:pPr>
+      <w:r>
+        <w:rPr>
+          <w:rFonts w:ascii="Times New Roman" w:hAnsi="Times New Roman" w:eastAsia="宋体"/>
+          <w:sz w:val="20"/>
+          <w:szCs w:val="20"/>
+        </w:rPr>
+        <w:t xml:space="preserve">机械臂由六个转动关节和末端连杆式夹爪组成，分别承担空间位姿调整与抓取动作。主体采用碳纤维板与铝制连接件组合的结构，关节通过齿轮及连杆传动传递运动；双侧支承和榫卯配合用于辅助部件定位与装配。结构设计围绕关节轴线、连杆中心距和工具安装关系展开，为基于 DH 坐标系的运动学建模提供几何依据。</w:t>
+      </w:r>
+    </w:p>
+    <w:p>
+      <w:pPr>
+        <w:pStyle w:val="4"/>
+        <w:numPr>
+          <w:ilvl w:val="2"/>
+          <w:numId w:val="0"/>
+        </w:numPr>
+        <w:snapToGrid w:val="0"/>
+      </w:pPr>
+      <w:r>
+        <w:rPr>
+          <w:rFonts w:ascii="Times New Roman" w:hAnsi="Times New Roman" w:eastAsia="宋体"/>
+          <w:sz w:val="20"/>
+          <w:szCs w:val="20"/>
+        </w:rPr>
+        <w:t xml:space="preserve">2) 逆运动学</w:t>
       </w:r>
     </w:p>
     <w:p>
@@ -22712,7 +22811,7 @@
           <w:sz w:val="20"/>
           <w:szCs w:val="20"/>
         </w:rPr>
-        <w:t>对候选解进行位姿回代及关节限位检查，选择与上一时刻关节角最接近的可行分支</w:t>
+        <w:t>对候选解进行位姿回代检查，选择与上一时刻关节角最接近的可行分支</w:t>
       </w:r>
       <w:r>
         <w:rPr>
@@ -22762,7 +22861,7 @@
         <w:rPr>
           <w:rFonts w:hint="eastAsia"/>
         </w:rPr>
-        <w:t>构型与正运动学</w:t>
+        <w:t>结构概述</w:t>
       </w:r>
     </w:p>
     <w:p>
@@ -22830,14 +22929,74 @@
           <w:sz w:val="20"/>
           <w:szCs w:val="20"/>
         </w:rPr>
-        <w:t>给出 Delta 机构、三轴手柄及转轴标注，几何参数列于</w:t>
-      </w:r>
-      <w:r>
-        <w:rPr>
-          <w:sz w:val="20"/>
-          <w:szCs w:val="20"/>
-        </w:rPr>
-        <w:t xml:space="preserve"> TABLE II。</w:t>
+        <w:t>给出 Delta 机构、三轴手柄及转轴标注</w:t>
+      </w:r>
+      <w:r>
+        <w:rPr>
+          <w:sz w:val="20"/>
+          <w:szCs w:val="20"/>
+        </w:rPr>
+        <w:t xml:space="preserve">。</w:t>
+      </w:r>
+    </w:p>
+    <w:p>
+      <w:pPr>
+        <w:pStyle w:val="7"/>
+        <w:numPr>
+          <w:ilvl w:val="0"/>
+          <w:numId w:val="0"/>
+        </w:numPr>
+        <w:snapToGrid w:val="0"/>
+        <w:rPr>
+          <w:sz w:val="20"/>
+        </w:rPr>
+      </w:pPr>
+      <w:r>
+        <w:rPr>
+          <w:rFonts w:ascii="Times New Roman" w:hAnsi="Times New Roman" w:eastAsia="宋体"/>
+          <w:sz w:val="20"/>
+          <w:szCs w:val="20"/>
+        </w:rPr>
+        <w:t xml:space="preserve">控制器的固定支架与连杆采用碳纤维板件，动平台和手柄采用聚乳酸（polylactic acid，PLA）三维打印件，以减少随手部运动的部件质量并便于装配。手柄侧面的操作参考点重置按钮用于分段重新定位；在保持从端当前目标位姿连续的前提下，重新设置主从位置映射的参考点，即可继续输入后续操作指令。</w:t>
+      </w:r>
+    </w:p>
+    <w:p>
+      <w:pPr>
+        <w:pStyle w:val="4"/>
+        <w:numPr>
+          <w:ilvl w:val="2"/>
+          <w:numId w:val="0"/>
+        </w:numPr>
+        <w:snapToGrid w:val="0"/>
+      </w:pPr>
+      <w:r>
+        <w:rPr>
+          <w:rFonts w:ascii="Times New Roman" w:hAnsi="Times New Roman" w:eastAsia="宋体"/>
+          <w:sz w:val="20"/>
+          <w:szCs w:val="20"/>
+        </w:rPr>
+        <w:t xml:space="preserve">2) 正运动学</w:t>
+      </w:r>
+    </w:p>
+    <w:p>
+      <w:pPr>
+        <w:pStyle w:val="7"/>
+        <w:numPr>
+          <w:ilvl w:val="0"/>
+          <w:numId w:val="0"/>
+        </w:numPr>
+        <w:snapToGrid w:val="0"/>
+        <w:rPr>
+          <w:sz w:val="20"/>
+        </w:rPr>
+      </w:pPr>
+      <w:r>
+        <w:rPr>
+          <w:rFonts w:ascii="Times New Roman" w:hAnsi="Times New Roman" w:eastAsia="宋体"/>
+          <w:sz w:val="20"/>
+          <w:szCs w:val="20"/>
+        </w:rPr>
+        <w:t xml:space="preserve">Delta 机构的几何参数列于 TABLE II。以下沿用系统结构中定义的平台基座坐标系 {D}，建立三条支链的几何约束。</w:t>
       </w:r>
     </w:p>
     <w:p>
@@ -29053,7 +29212,7 @@
       </w:pPr>
       <w:bookmarkStart w:id="13" w:name="雅可比与力矩前馈"/>
       <w:r>
-        <w:t xml:space="preserve">2) </w:t>
+        <w:t xml:space="preserve">3) </w:t>
       </w:r>
       <w:r>
         <w:rPr>
@@ -29995,7 +30154,7 @@
       </w:pPr>
       <w:bookmarkStart w:id="14" w:name="位姿映射与关节指令"/>
       <w:r>
-        <w:t xml:space="preserve">3) </w:t>
+        <w:t xml:space="preserve">4) </w:t>
       </w:r>
       <w:r>
         <w:rPr>
@@ -32781,7 +32940,7 @@
           <w:sz w:val="20"/>
           <w:szCs w:val="20"/>
         </w:rPr>
-        <w:t xml:space="preserve">，由(23)及零位偏置得到后三个关节角。保留满足关节限位且与上一时刻最接近的可行解，作为六轴关节指令 </w:t>
+        <w:t xml:space="preserve">，由(23)及零位偏置得到后三个关节角。保留与上一时刻最接近的可行解，作为六轴关节指令 </w:t>
       </w:r>
       <m:oMath>
         <m:sSub>

</xml_diff>